<commit_message>
Add post-announcement drift and accuracy results
The engine now reports windows starting at +2, and a separate script computes
direction-adjusted 3/6/12-month returns and hit rates. The memo records the
drift pattern, the accuracy table and the clustering caveat.

Co-Authored-By: Claude Code <noreply@anthropic.com>
</commit_message>
<xml_diff>
--- a/文档/项目进度与技术备忘_20261018.docx
+++ b/文档/项目进度与技术备忘_20261018.docx
@@ -4773,7 +4773,940 @@
           <w:color w:val="000000"/>
           <w:sz w:val="24"/>
         </w:rPr>
-        <w:t>读法：明星上调在公告日确有更大的价格与成交量反应，但下调没有；权威溢价只出现在上调一侧，与卖方评级偏乐观的已知现象一致。长窗口的 [0,+120] 结果包含公告日反应本身，还不能当作漂移证据，需另算剔除公告日后的窗口（如 +2 到 +120）再判断反转。</w:t>
+        <w:t>读法：明星上调在公告日确有更大的价格与成交量反应，但下调没有；权威溢价只出现在上调一侧，与卖方评级偏乐观的已知现象一致。长窗口的 [0,+120] 结果包含公告日反应本身，不能当作漂移证据。</w:t>
+      </w:r>
+    </w:p>
+    <w:p>
+      <w:pPr>
+        <w:pStyle w:val="Heading2"/>
+        <w:keepNext/>
+        <w:spacing w:before="200" w:after="120"/>
+      </w:pPr>
+      <w:r>
+        <w:rPr>
+          <w:rFonts w:ascii="Times New Roman" w:hAnsi="Times New Roman" w:eastAsia="黑体"/>
+          <w:b/>
+          <w:color w:val="000000"/>
+          <w:sz w:val="26"/>
+        </w:rPr>
+        <w:t>8.2 公告日之后的漂移与事后准确度（2026-10-18）</w:t>
+      </w:r>
+    </w:p>
+    <w:p>
+      <w:r>
+        <w:rPr>
+          <w:rFonts w:ascii="Times New Roman" w:hAnsi="Times New Roman" w:eastAsia="宋体"/>
+          <w:color w:val="000000"/>
+          <w:sz w:val="24"/>
+        </w:rPr>
+        <w:t>漂移从 +2 起算，市场调整 CAR，明星减非明星：</w:t>
+      </w:r>
+    </w:p>
+    <w:tbl>
+      <w:tblPr>
+        <w:tblStyle w:val="TableGrid"/>
+        <w:tblW w:type="auto" w:w="0"/>
+        <w:jc w:val="center"/>
+        <w:tblLayout w:type="autofit"/>
+        <w:tblLook w:firstColumn="1" w:firstRow="1" w:lastColumn="0" w:lastRow="0" w:noHBand="0" w:noVBand="1" w:val="04A0"/>
+      </w:tblPr>
+      <w:tblGrid>
+        <w:gridCol w:w="3137"/>
+        <w:gridCol w:w="3137"/>
+        <w:gridCol w:w="3137"/>
+      </w:tblGrid>
+      <w:tr>
+        <w:trPr>
+          <w:tblHeader w:val="true"/>
+          <w:cantSplit/>
+        </w:trPr>
+        <w:tc>
+          <w:tcPr>
+            <w:tcW w:type="dxa" w:w="3137"/>
+            <w:shd w:val="clear" w:fill="F2F2F2"/>
+          </w:tcPr>
+          <w:p>
+            <w:pPr>
+              <w:spacing w:after="40" w:line="276" w:lineRule="auto"/>
+            </w:pPr>
+            <w:r/>
+            <w:r>
+              <w:rPr>
+                <w:rFonts w:ascii="Times New Roman" w:hAnsi="Times New Roman" w:eastAsia="宋体"/>
+                <w:b/>
+                <w:color w:val="000000"/>
+                <w:sz w:val="21"/>
+              </w:rPr>
+              <w:t>窗口</w:t>
+            </w:r>
+          </w:p>
+        </w:tc>
+        <w:tc>
+          <w:tcPr>
+            <w:tcW w:type="dxa" w:w="3137"/>
+            <w:shd w:val="clear" w:fill="F2F2F2"/>
+          </w:tcPr>
+          <w:p>
+            <w:pPr>
+              <w:spacing w:after="40" w:line="276" w:lineRule="auto"/>
+            </w:pPr>
+            <w:r/>
+            <w:r>
+              <w:rPr>
+                <w:rFonts w:ascii="Times New Roman" w:hAnsi="Times New Roman" w:eastAsia="宋体"/>
+                <w:b/>
+                <w:color w:val="000000"/>
+                <w:sz w:val="21"/>
+              </w:rPr>
+              <w:t>调高</w:t>
+            </w:r>
+          </w:p>
+        </w:tc>
+        <w:tc>
+          <w:tcPr>
+            <w:tcW w:type="dxa" w:w="3137"/>
+            <w:shd w:val="clear" w:fill="F2F2F2"/>
+          </w:tcPr>
+          <w:p>
+            <w:pPr>
+              <w:spacing w:after="40" w:line="276" w:lineRule="auto"/>
+            </w:pPr>
+            <w:r/>
+            <w:r>
+              <w:rPr>
+                <w:rFonts w:ascii="Times New Roman" w:hAnsi="Times New Roman" w:eastAsia="宋体"/>
+                <w:b/>
+                <w:color w:val="000000"/>
+                <w:sz w:val="21"/>
+              </w:rPr>
+              <w:t>调低</w:t>
+            </w:r>
+          </w:p>
+        </w:tc>
+      </w:tr>
+      <w:tr>
+        <w:trPr>
+          <w:cantSplit/>
+        </w:trPr>
+        <w:tc>
+          <w:tcPr>
+            <w:tcW w:type="dxa" w:w="3137"/>
+          </w:tcPr>
+          <w:p>
+            <w:pPr>
+              <w:spacing w:after="40" w:line="276" w:lineRule="auto"/>
+            </w:pPr>
+            <w:r/>
+            <w:r>
+              <w:rPr>
+                <w:rFonts w:ascii="Times New Roman" w:hAnsi="Times New Roman" w:eastAsia="宋体"/>
+                <w:color w:val="000000"/>
+                <w:sz w:val="21"/>
+              </w:rPr>
+              <w:t>+2 至 +60</w:t>
+            </w:r>
+          </w:p>
+        </w:tc>
+        <w:tc>
+          <w:tcPr>
+            <w:tcW w:type="dxa" w:w="3137"/>
+          </w:tcPr>
+          <w:p>
+            <w:pPr>
+              <w:spacing w:after="40" w:line="276" w:lineRule="auto"/>
+            </w:pPr>
+            <w:r/>
+            <w:r>
+              <w:rPr>
+                <w:rFonts w:ascii="Times New Roman" w:hAnsi="Times New Roman" w:eastAsia="宋体"/>
+                <w:color w:val="000000"/>
+                <w:sz w:val="21"/>
+              </w:rPr>
+              <w:t>−0.03（p=0.96）</w:t>
+            </w:r>
+          </w:p>
+        </w:tc>
+        <w:tc>
+          <w:tcPr>
+            <w:tcW w:type="dxa" w:w="3137"/>
+          </w:tcPr>
+          <w:p>
+            <w:pPr>
+              <w:spacing w:after="40" w:line="276" w:lineRule="auto"/>
+            </w:pPr>
+            <w:r/>
+            <w:r>
+              <w:rPr>
+                <w:rFonts w:ascii="Times New Roman" w:hAnsi="Times New Roman" w:eastAsia="宋体"/>
+                <w:b/>
+                <w:color w:val="000000"/>
+                <w:sz w:val="21"/>
+              </w:rPr>
+              <w:t>−1.63（p=0.002）</w:t>
+            </w:r>
+          </w:p>
+        </w:tc>
+      </w:tr>
+      <w:tr>
+        <w:trPr>
+          <w:cantSplit/>
+        </w:trPr>
+        <w:tc>
+          <w:tcPr>
+            <w:tcW w:type="dxa" w:w="3137"/>
+          </w:tcPr>
+          <w:p>
+            <w:pPr>
+              <w:spacing w:after="40" w:line="276" w:lineRule="auto"/>
+            </w:pPr>
+            <w:r/>
+            <w:r>
+              <w:rPr>
+                <w:rFonts w:ascii="Times New Roman" w:hAnsi="Times New Roman" w:eastAsia="宋体"/>
+                <w:color w:val="000000"/>
+                <w:sz w:val="21"/>
+              </w:rPr>
+              <w:t>+2 至 +120</w:t>
+            </w:r>
+          </w:p>
+        </w:tc>
+        <w:tc>
+          <w:tcPr>
+            <w:tcW w:type="dxa" w:w="3137"/>
+          </w:tcPr>
+          <w:p>
+            <w:pPr>
+              <w:spacing w:after="40" w:line="276" w:lineRule="auto"/>
+            </w:pPr>
+            <w:r/>
+            <w:r>
+              <w:rPr>
+                <w:rFonts w:ascii="Times New Roman" w:hAnsi="Times New Roman" w:eastAsia="宋体"/>
+                <w:color w:val="000000"/>
+                <w:sz w:val="21"/>
+              </w:rPr>
+              <w:t>+1.07（p=0.13）</w:t>
+            </w:r>
+          </w:p>
+        </w:tc>
+        <w:tc>
+          <w:tcPr>
+            <w:tcW w:type="dxa" w:w="3137"/>
+          </w:tcPr>
+          <w:p>
+            <w:pPr>
+              <w:spacing w:after="40" w:line="276" w:lineRule="auto"/>
+            </w:pPr>
+            <w:r/>
+            <w:r>
+              <w:rPr>
+                <w:rFonts w:ascii="Times New Roman" w:hAnsi="Times New Roman" w:eastAsia="宋体"/>
+                <w:color w:val="000000"/>
+                <w:sz w:val="21"/>
+              </w:rPr>
+              <w:t>−0.74（p=0.34）</w:t>
+            </w:r>
+          </w:p>
+        </w:tc>
+      </w:tr>
+      <w:tr>
+        <w:trPr>
+          <w:cantSplit/>
+        </w:trPr>
+        <w:tc>
+          <w:tcPr>
+            <w:tcW w:type="dxa" w:w="3137"/>
+          </w:tcPr>
+          <w:p>
+            <w:pPr>
+              <w:spacing w:after="40" w:line="276" w:lineRule="auto"/>
+            </w:pPr>
+            <w:r/>
+            <w:r>
+              <w:rPr>
+                <w:rFonts w:ascii="Times New Roman" w:hAnsi="Times New Roman" w:eastAsia="宋体"/>
+                <w:color w:val="000000"/>
+                <w:sz w:val="21"/>
+              </w:rPr>
+              <w:t>+2 至 +250</w:t>
+            </w:r>
+          </w:p>
+        </w:tc>
+        <w:tc>
+          <w:tcPr>
+            <w:tcW w:type="dxa" w:w="3137"/>
+          </w:tcPr>
+          <w:p>
+            <w:pPr>
+              <w:spacing w:after="40" w:line="276" w:lineRule="auto"/>
+            </w:pPr>
+            <w:r/>
+            <w:r>
+              <w:rPr>
+                <w:rFonts w:ascii="Times New Roman" w:hAnsi="Times New Roman" w:eastAsia="宋体"/>
+                <w:color w:val="000000"/>
+                <w:sz w:val="21"/>
+              </w:rPr>
+              <w:t>+0.47（p=0.65）</w:t>
+            </w:r>
+          </w:p>
+        </w:tc>
+        <w:tc>
+          <w:tcPr>
+            <w:tcW w:type="dxa" w:w="3137"/>
+          </w:tcPr>
+          <w:p>
+            <w:pPr>
+              <w:spacing w:after="40" w:line="276" w:lineRule="auto"/>
+            </w:pPr>
+            <w:r/>
+            <w:r>
+              <w:rPr>
+                <w:rFonts w:ascii="Times New Roman" w:hAnsi="Times New Roman" w:eastAsia="宋体"/>
+                <w:color w:val="000000"/>
+                <w:sz w:val="21"/>
+              </w:rPr>
+              <w:t>+1.49（p=0.19）</w:t>
+            </w:r>
+          </w:p>
+        </w:tc>
+      </w:tr>
+    </w:tbl>
+    <w:p>
+      <w:pPr>
+        <w:spacing w:after="0"/>
+      </w:pPr>
+    </w:p>
+    <w:p>
+      <w:r>
+        <w:rPr>
+          <w:rFonts w:ascii="Times New Roman" w:hAnsi="Times New Roman" w:eastAsia="宋体"/>
+          <w:color w:val="000000"/>
+          <w:sz w:val="24"/>
+        </w:rPr>
+        <w:t>明星下调后 60 个交易日内，标的相对市场多跌 1.6 个百分点，短期更准；到 120 日差异消失，250 日符号翻正，是过反之后修复的形态。明星上调没有显著的漂移差异。</w:t>
+      </w:r>
+    </w:p>
+    <w:p>
+      <w:r>
+        <w:rPr>
+          <w:rFonts w:ascii="Times New Roman" w:hAnsi="Times New Roman" w:eastAsia="宋体"/>
+          <w:color w:val="000000"/>
+          <w:sz w:val="24"/>
+        </w:rPr>
+        <w:t>事后准确度，按评级方向持有（下调做空），市场调整，正数表示跟随该推荐赚钱：</w:t>
+      </w:r>
+    </w:p>
+    <w:tbl>
+      <w:tblPr>
+        <w:tblStyle w:val="TableGrid"/>
+        <w:tblW w:type="auto" w:w="0"/>
+        <w:jc w:val="center"/>
+        <w:tblLayout w:type="autofit"/>
+        <w:tblLook w:firstColumn="1" w:firstRow="1" w:lastColumn="0" w:lastRow="0" w:noHBand="0" w:noVBand="1" w:val="04A0"/>
+      </w:tblPr>
+      <w:tblGrid>
+        <w:gridCol w:w="1345"/>
+        <w:gridCol w:w="1345"/>
+        <w:gridCol w:w="1345"/>
+        <w:gridCol w:w="1345"/>
+        <w:gridCol w:w="1345"/>
+        <w:gridCol w:w="1345"/>
+        <w:gridCol w:w="1345"/>
+      </w:tblGrid>
+      <w:tr>
+        <w:trPr>
+          <w:tblHeader w:val="true"/>
+          <w:cantSplit/>
+        </w:trPr>
+        <w:tc>
+          <w:tcPr>
+            <w:tcW w:type="dxa" w:w="1345"/>
+            <w:shd w:val="clear" w:fill="F2F2F2"/>
+          </w:tcPr>
+          <w:p>
+            <w:pPr>
+              <w:spacing w:after="40" w:line="276" w:lineRule="auto"/>
+            </w:pPr>
+            <w:r/>
+            <w:r>
+              <w:rPr>
+                <w:rFonts w:ascii="Times New Roman" w:hAnsi="Times New Roman" w:eastAsia="宋体"/>
+                <w:b/>
+                <w:color w:val="000000"/>
+                <w:sz w:val="21"/>
+              </w:rPr>
+              <w:t>持有期</w:t>
+            </w:r>
+          </w:p>
+        </w:tc>
+        <w:tc>
+          <w:tcPr>
+            <w:tcW w:type="dxa" w:w="1345"/>
+            <w:shd w:val="clear" w:fill="F2F2F2"/>
+          </w:tcPr>
+          <w:p>
+            <w:pPr>
+              <w:spacing w:after="40" w:line="276" w:lineRule="auto"/>
+            </w:pPr>
+            <w:r/>
+            <w:r>
+              <w:rPr>
+                <w:rFonts w:ascii="Times New Roman" w:hAnsi="Times New Roman" w:eastAsia="宋体"/>
+                <w:b/>
+                <w:color w:val="000000"/>
+                <w:sz w:val="21"/>
+              </w:rPr>
+              <w:t>调高：明星</w:t>
+            </w:r>
+          </w:p>
+        </w:tc>
+        <w:tc>
+          <w:tcPr>
+            <w:tcW w:type="dxa" w:w="1345"/>
+            <w:shd w:val="clear" w:fill="F2F2F2"/>
+          </w:tcPr>
+          <w:p>
+            <w:pPr>
+              <w:spacing w:after="40" w:line="276" w:lineRule="auto"/>
+            </w:pPr>
+            <w:r/>
+            <w:r>
+              <w:rPr>
+                <w:rFonts w:ascii="Times New Roman" w:hAnsi="Times New Roman" w:eastAsia="宋体"/>
+                <w:b/>
+                <w:color w:val="000000"/>
+                <w:sz w:val="21"/>
+              </w:rPr>
+              <w:t>非明星</w:t>
+            </w:r>
+          </w:p>
+        </w:tc>
+        <w:tc>
+          <w:tcPr>
+            <w:tcW w:type="dxa" w:w="1345"/>
+            <w:shd w:val="clear" w:fill="F2F2F2"/>
+          </w:tcPr>
+          <w:p>
+            <w:pPr>
+              <w:spacing w:after="40" w:line="276" w:lineRule="auto"/>
+            </w:pPr>
+            <w:r/>
+            <w:r>
+              <w:rPr>
+                <w:rFonts w:ascii="Times New Roman" w:hAnsi="Times New Roman" w:eastAsia="宋体"/>
+                <w:b/>
+                <w:color w:val="000000"/>
+                <w:sz w:val="21"/>
+              </w:rPr>
+              <w:t>差</w:t>
+            </w:r>
+          </w:p>
+        </w:tc>
+        <w:tc>
+          <w:tcPr>
+            <w:tcW w:type="dxa" w:w="1345"/>
+            <w:shd w:val="clear" w:fill="F2F2F2"/>
+          </w:tcPr>
+          <w:p>
+            <w:pPr>
+              <w:spacing w:after="40" w:line="276" w:lineRule="auto"/>
+            </w:pPr>
+            <w:r/>
+            <w:r>
+              <w:rPr>
+                <w:rFonts w:ascii="Times New Roman" w:hAnsi="Times New Roman" w:eastAsia="宋体"/>
+                <w:b/>
+                <w:color w:val="000000"/>
+                <w:sz w:val="21"/>
+              </w:rPr>
+              <w:t>调低：明星</w:t>
+            </w:r>
+          </w:p>
+        </w:tc>
+        <w:tc>
+          <w:tcPr>
+            <w:tcW w:type="dxa" w:w="1345"/>
+            <w:shd w:val="clear" w:fill="F2F2F2"/>
+          </w:tcPr>
+          <w:p>
+            <w:pPr>
+              <w:spacing w:after="40" w:line="276" w:lineRule="auto"/>
+            </w:pPr>
+            <w:r/>
+            <w:r>
+              <w:rPr>
+                <w:rFonts w:ascii="Times New Roman" w:hAnsi="Times New Roman" w:eastAsia="宋体"/>
+                <w:b/>
+                <w:color w:val="000000"/>
+                <w:sz w:val="21"/>
+              </w:rPr>
+              <w:t>非明星</w:t>
+            </w:r>
+          </w:p>
+        </w:tc>
+        <w:tc>
+          <w:tcPr>
+            <w:tcW w:type="dxa" w:w="1345"/>
+            <w:shd w:val="clear" w:fill="F2F2F2"/>
+          </w:tcPr>
+          <w:p>
+            <w:pPr>
+              <w:spacing w:after="40" w:line="276" w:lineRule="auto"/>
+            </w:pPr>
+            <w:r/>
+            <w:r>
+              <w:rPr>
+                <w:rFonts w:ascii="Times New Roman" w:hAnsi="Times New Roman" w:eastAsia="宋体"/>
+                <w:b/>
+                <w:color w:val="000000"/>
+                <w:sz w:val="21"/>
+              </w:rPr>
+              <w:t>差</w:t>
+            </w:r>
+          </w:p>
+        </w:tc>
+      </w:tr>
+      <w:tr>
+        <w:trPr>
+          <w:cantSplit/>
+        </w:trPr>
+        <w:tc>
+          <w:tcPr>
+            <w:tcW w:type="dxa" w:w="1345"/>
+          </w:tcPr>
+          <w:p>
+            <w:pPr>
+              <w:spacing w:after="40" w:line="276" w:lineRule="auto"/>
+            </w:pPr>
+            <w:r/>
+            <w:r>
+              <w:rPr>
+                <w:rFonts w:ascii="Times New Roman" w:hAnsi="Times New Roman" w:eastAsia="宋体"/>
+                <w:color w:val="000000"/>
+                <w:sz w:val="21"/>
+              </w:rPr>
+              <w:t>3 个月</w:t>
+            </w:r>
+          </w:p>
+        </w:tc>
+        <w:tc>
+          <w:tcPr>
+            <w:tcW w:type="dxa" w:w="1345"/>
+          </w:tcPr>
+          <w:p>
+            <w:pPr>
+              <w:spacing w:after="40" w:line="276" w:lineRule="auto"/>
+            </w:pPr>
+            <w:r/>
+            <w:r>
+              <w:rPr>
+                <w:rFonts w:ascii="Times New Roman" w:hAnsi="Times New Roman" w:eastAsia="宋体"/>
+                <w:color w:val="000000"/>
+                <w:sz w:val="21"/>
+              </w:rPr>
+              <w:t>+3.54</w:t>
+            </w:r>
+          </w:p>
+        </w:tc>
+        <w:tc>
+          <w:tcPr>
+            <w:tcW w:type="dxa" w:w="1345"/>
+          </w:tcPr>
+          <w:p>
+            <w:pPr>
+              <w:spacing w:after="40" w:line="276" w:lineRule="auto"/>
+            </w:pPr>
+            <w:r/>
+            <w:r>
+              <w:rPr>
+                <w:rFonts w:ascii="Times New Roman" w:hAnsi="Times New Roman" w:eastAsia="宋体"/>
+                <w:color w:val="000000"/>
+                <w:sz w:val="21"/>
+              </w:rPr>
+              <w:t>+3.08</w:t>
+            </w:r>
+          </w:p>
+        </w:tc>
+        <w:tc>
+          <w:tcPr>
+            <w:tcW w:type="dxa" w:w="1345"/>
+          </w:tcPr>
+          <w:p>
+            <w:pPr>
+              <w:spacing w:after="40" w:line="276" w:lineRule="auto"/>
+            </w:pPr>
+            <w:r/>
+            <w:r>
+              <w:rPr>
+                <w:rFonts w:ascii="Times New Roman" w:hAnsi="Times New Roman" w:eastAsia="宋体"/>
+                <w:color w:val="000000"/>
+                <w:sz w:val="21"/>
+              </w:rPr>
+              <w:t>+0.46（p=0.42）</w:t>
+            </w:r>
+          </w:p>
+        </w:tc>
+        <w:tc>
+          <w:tcPr>
+            <w:tcW w:type="dxa" w:w="1345"/>
+          </w:tcPr>
+          <w:p>
+            <w:pPr>
+              <w:spacing w:after="40" w:line="276" w:lineRule="auto"/>
+            </w:pPr>
+            <w:r/>
+            <w:r>
+              <w:rPr>
+                <w:rFonts w:ascii="Times New Roman" w:hAnsi="Times New Roman" w:eastAsia="宋体"/>
+                <w:color w:val="000000"/>
+                <w:sz w:val="21"/>
+              </w:rPr>
+              <w:t>+0.72</w:t>
+            </w:r>
+          </w:p>
+        </w:tc>
+        <w:tc>
+          <w:tcPr>
+            <w:tcW w:type="dxa" w:w="1345"/>
+          </w:tcPr>
+          <w:p>
+            <w:pPr>
+              <w:spacing w:after="40" w:line="276" w:lineRule="auto"/>
+            </w:pPr>
+            <w:r/>
+            <w:r>
+              <w:rPr>
+                <w:rFonts w:ascii="Times New Roman" w:hAnsi="Times New Roman" w:eastAsia="宋体"/>
+                <w:color w:val="000000"/>
+                <w:sz w:val="21"/>
+              </w:rPr>
+              <w:t>−1.06</w:t>
+            </w:r>
+          </w:p>
+        </w:tc>
+        <w:tc>
+          <w:tcPr>
+            <w:tcW w:type="dxa" w:w="1345"/>
+          </w:tcPr>
+          <w:p>
+            <w:pPr>
+              <w:spacing w:after="40" w:line="276" w:lineRule="auto"/>
+            </w:pPr>
+            <w:r/>
+            <w:r>
+              <w:rPr>
+                <w:rFonts w:ascii="Times New Roman" w:hAnsi="Times New Roman" w:eastAsia="宋体"/>
+                <w:b/>
+                <w:color w:val="000000"/>
+                <w:sz w:val="21"/>
+              </w:rPr>
+              <w:t>+1.77（p=0.001）</w:t>
+            </w:r>
+          </w:p>
+        </w:tc>
+      </w:tr>
+      <w:tr>
+        <w:trPr>
+          <w:cantSplit/>
+        </w:trPr>
+        <w:tc>
+          <w:tcPr>
+            <w:tcW w:type="dxa" w:w="1345"/>
+          </w:tcPr>
+          <w:p>
+            <w:pPr>
+              <w:spacing w:after="40" w:line="276" w:lineRule="auto"/>
+            </w:pPr>
+            <w:r/>
+            <w:r>
+              <w:rPr>
+                <w:rFonts w:ascii="Times New Roman" w:hAnsi="Times New Roman" w:eastAsia="宋体"/>
+                <w:color w:val="000000"/>
+                <w:sz w:val="21"/>
+              </w:rPr>
+              <w:t>6 个月</w:t>
+            </w:r>
+          </w:p>
+        </w:tc>
+        <w:tc>
+          <w:tcPr>
+            <w:tcW w:type="dxa" w:w="1345"/>
+          </w:tcPr>
+          <w:p>
+            <w:pPr>
+              <w:spacing w:after="40" w:line="276" w:lineRule="auto"/>
+            </w:pPr>
+            <w:r/>
+            <w:r>
+              <w:rPr>
+                <w:rFonts w:ascii="Times New Roman" w:hAnsi="Times New Roman" w:eastAsia="宋体"/>
+                <w:color w:val="000000"/>
+                <w:sz w:val="21"/>
+              </w:rPr>
+              <w:t>+6.52</w:t>
+            </w:r>
+          </w:p>
+        </w:tc>
+        <w:tc>
+          <w:tcPr>
+            <w:tcW w:type="dxa" w:w="1345"/>
+          </w:tcPr>
+          <w:p>
+            <w:pPr>
+              <w:spacing w:after="40" w:line="276" w:lineRule="auto"/>
+            </w:pPr>
+            <w:r/>
+            <w:r>
+              <w:rPr>
+                <w:rFonts w:ascii="Times New Roman" w:hAnsi="Times New Roman" w:eastAsia="宋体"/>
+                <w:color w:val="000000"/>
+                <w:sz w:val="21"/>
+              </w:rPr>
+              <w:t>+4.92</w:t>
+            </w:r>
+          </w:p>
+        </w:tc>
+        <w:tc>
+          <w:tcPr>
+            <w:tcW w:type="dxa" w:w="1345"/>
+          </w:tcPr>
+          <w:p>
+            <w:pPr>
+              <w:spacing w:after="40" w:line="276" w:lineRule="auto"/>
+            </w:pPr>
+            <w:r/>
+            <w:r>
+              <w:rPr>
+                <w:rFonts w:ascii="Times New Roman" w:hAnsi="Times New Roman" w:eastAsia="宋体"/>
+                <w:b/>
+                <w:color w:val="000000"/>
+                <w:sz w:val="21"/>
+              </w:rPr>
+              <w:t>+1.60（p=0.037）</w:t>
+            </w:r>
+          </w:p>
+        </w:tc>
+        <w:tc>
+          <w:tcPr>
+            <w:tcW w:type="dxa" w:w="1345"/>
+          </w:tcPr>
+          <w:p>
+            <w:pPr>
+              <w:spacing w:after="40" w:line="276" w:lineRule="auto"/>
+            </w:pPr>
+            <w:r/>
+            <w:r>
+              <w:rPr>
+                <w:rFonts w:ascii="Times New Roman" w:hAnsi="Times New Roman" w:eastAsia="宋体"/>
+                <w:color w:val="000000"/>
+                <w:sz w:val="21"/>
+              </w:rPr>
+              <w:t>−1.62</w:t>
+            </w:r>
+          </w:p>
+        </w:tc>
+        <w:tc>
+          <w:tcPr>
+            <w:tcW w:type="dxa" w:w="1345"/>
+          </w:tcPr>
+          <w:p>
+            <w:pPr>
+              <w:spacing w:after="40" w:line="276" w:lineRule="auto"/>
+            </w:pPr>
+            <w:r/>
+            <w:r>
+              <w:rPr>
+                <w:rFonts w:ascii="Times New Roman" w:hAnsi="Times New Roman" w:eastAsia="宋体"/>
+                <w:color w:val="000000"/>
+                <w:sz w:val="21"/>
+              </w:rPr>
+              <w:t>−2.64</w:t>
+            </w:r>
+          </w:p>
+        </w:tc>
+        <w:tc>
+          <w:tcPr>
+            <w:tcW w:type="dxa" w:w="1345"/>
+          </w:tcPr>
+          <w:p>
+            <w:pPr>
+              <w:spacing w:after="40" w:line="276" w:lineRule="auto"/>
+            </w:pPr>
+            <w:r/>
+            <w:r>
+              <w:rPr>
+                <w:rFonts w:ascii="Times New Roman" w:hAnsi="Times New Roman" w:eastAsia="宋体"/>
+                <w:color w:val="000000"/>
+                <w:sz w:val="21"/>
+              </w:rPr>
+              <w:t>+1.02（p=0.20）</w:t>
+            </w:r>
+          </w:p>
+        </w:tc>
+      </w:tr>
+      <w:tr>
+        <w:trPr>
+          <w:cantSplit/>
+        </w:trPr>
+        <w:tc>
+          <w:tcPr>
+            <w:tcW w:type="dxa" w:w="1345"/>
+          </w:tcPr>
+          <w:p>
+            <w:pPr>
+              <w:spacing w:after="40" w:line="276" w:lineRule="auto"/>
+            </w:pPr>
+            <w:r/>
+            <w:r>
+              <w:rPr>
+                <w:rFonts w:ascii="Times New Roman" w:hAnsi="Times New Roman" w:eastAsia="宋体"/>
+                <w:color w:val="000000"/>
+                <w:sz w:val="21"/>
+              </w:rPr>
+              <w:t>12 个月</w:t>
+            </w:r>
+          </w:p>
+        </w:tc>
+        <w:tc>
+          <w:tcPr>
+            <w:tcW w:type="dxa" w:w="1345"/>
+          </w:tcPr>
+          <w:p>
+            <w:pPr>
+              <w:spacing w:after="40" w:line="276" w:lineRule="auto"/>
+            </w:pPr>
+            <w:r/>
+            <w:r>
+              <w:rPr>
+                <w:rFonts w:ascii="Times New Roman" w:hAnsi="Times New Roman" w:eastAsia="宋体"/>
+                <w:color w:val="000000"/>
+                <w:sz w:val="21"/>
+              </w:rPr>
+              <w:t>+9.26</w:t>
+            </w:r>
+          </w:p>
+        </w:tc>
+        <w:tc>
+          <w:tcPr>
+            <w:tcW w:type="dxa" w:w="1345"/>
+          </w:tcPr>
+          <w:p>
+            <w:pPr>
+              <w:spacing w:after="40" w:line="276" w:lineRule="auto"/>
+            </w:pPr>
+            <w:r/>
+            <w:r>
+              <w:rPr>
+                <w:rFonts w:ascii="Times New Roman" w:hAnsi="Times New Roman" w:eastAsia="宋体"/>
+                <w:color w:val="000000"/>
+                <w:sz w:val="21"/>
+              </w:rPr>
+              <w:t>+8.34</w:t>
+            </w:r>
+          </w:p>
+        </w:tc>
+        <w:tc>
+          <w:tcPr>
+            <w:tcW w:type="dxa" w:w="1345"/>
+          </w:tcPr>
+          <w:p>
+            <w:pPr>
+              <w:spacing w:after="40" w:line="276" w:lineRule="auto"/>
+            </w:pPr>
+            <w:r/>
+            <w:r>
+              <w:rPr>
+                <w:rFonts w:ascii="Times New Roman" w:hAnsi="Times New Roman" w:eastAsia="宋体"/>
+                <w:color w:val="000000"/>
+                <w:sz w:val="21"/>
+              </w:rPr>
+              <w:t>+0.92（p=0.39）</w:t>
+            </w:r>
+          </w:p>
+        </w:tc>
+        <w:tc>
+          <w:tcPr>
+            <w:tcW w:type="dxa" w:w="1345"/>
+          </w:tcPr>
+          <w:p>
+            <w:pPr>
+              <w:spacing w:after="40" w:line="276" w:lineRule="auto"/>
+            </w:pPr>
+            <w:r/>
+            <w:r>
+              <w:rPr>
+                <w:rFonts w:ascii="Times New Roman" w:hAnsi="Times New Roman" w:eastAsia="宋体"/>
+                <w:color w:val="000000"/>
+                <w:sz w:val="21"/>
+              </w:rPr>
+              <w:t>−7.24</w:t>
+            </w:r>
+          </w:p>
+        </w:tc>
+        <w:tc>
+          <w:tcPr>
+            <w:tcW w:type="dxa" w:w="1345"/>
+          </w:tcPr>
+          <w:p>
+            <w:pPr>
+              <w:spacing w:after="40" w:line="276" w:lineRule="auto"/>
+            </w:pPr>
+            <w:r/>
+            <w:r>
+              <w:rPr>
+                <w:rFonts w:ascii="Times New Roman" w:hAnsi="Times New Roman" w:eastAsia="宋体"/>
+                <w:color w:val="000000"/>
+                <w:sz w:val="21"/>
+              </w:rPr>
+              <w:t>−5.88</w:t>
+            </w:r>
+          </w:p>
+        </w:tc>
+        <w:tc>
+          <w:tcPr>
+            <w:tcW w:type="dxa" w:w="1345"/>
+          </w:tcPr>
+          <w:p>
+            <w:pPr>
+              <w:spacing w:after="40" w:line="276" w:lineRule="auto"/>
+            </w:pPr>
+            <w:r/>
+            <w:r>
+              <w:rPr>
+                <w:rFonts w:ascii="Times New Roman" w:hAnsi="Times New Roman" w:eastAsia="宋体"/>
+                <w:color w:val="000000"/>
+                <w:sz w:val="21"/>
+              </w:rPr>
+              <w:t>−1.36（p=0.24）</w:t>
+            </w:r>
+          </w:p>
+        </w:tc>
+      </w:tr>
+    </w:tbl>
+    <w:p>
+      <w:pPr>
+        <w:spacing w:after="0"/>
+      </w:pPr>
+    </w:p>
+    <w:p>
+      <w:r>
+        <w:rPr>
+          <w:rFonts w:ascii="Times New Roman" w:hAnsi="Times New Roman" w:eastAsia="宋体"/>
+          <w:color w:val="000000"/>
+          <w:sz w:val="24"/>
+        </w:rPr>
+        <w:t>命中率与均值同向：调高 6 个月 56.0% 对 53.3%，调低 3 个月 54.5% 对 51.4%，12 个月反转。</w:t>
+      </w:r>
+    </w:p>
+    <w:p>
+      <w:r>
+        <w:rPr>
+          <w:rFonts w:ascii="Times New Roman" w:hAnsi="Times New Roman" w:eastAsia="宋体"/>
+          <w:color w:val="000000"/>
+          <w:sz w:val="24"/>
+        </w:rPr>
+        <w:t>合起来的故事：明星身份带来更大的公告日冲击，并且在短期（下调 60 日、上调 6 个月）略更准，但优势到 12 个月不延续甚至反转。更像是"短期有信息、长期被追随"的混合，而不是稳定的能力溢价。注意：以上 t 检验把重叠事件当独立观测，显著性会被高估，最终版必须按股票或研报聚类。</w:t>
       </w:r>
     </w:p>
     <w:p>
@@ -4991,7 +5924,7 @@
           <w:color w:val="000000"/>
           <w:sz w:val="24"/>
         </w:rPr>
-        <w:t>1. 首轮已跑通；下一步算剔除公告日后的漂移窗口（+2 到 +120、+2 到 +250）与事后准确度。</w:t>
+        <w:t>1. 第 1 至 3 问的首轮都已跑出；下一步做聚类稳健标准误、涨跌停与停牌稳健性、以及三张主图。</w:t>
       </w:r>
     </w:p>
     <w:p>

</xml_diff>

<commit_message>
Add a one-page status summary to the memo and the README
Both now state the three first-pass findings, the short-run information and
long-run following interpretation, and the robustness work still outstanding.

Co-Authored-By: Claude Code <noreply@anthropic.com>
</commit_message>
<xml_diff>
--- a/文档/项目进度与技术备忘_20261018.docx
+++ b/文档/项目进度与技术备忘_20261018.docx
@@ -53,6 +53,74 @@
         <w:fldChar w:fldCharType="separate"/>
         <w:t>Open in Word and update the field to build the contents.</w:t>
         <w:fldChar w:fldCharType="end"/>
+      </w:r>
+    </w:p>
+    <w:p>
+      <w:pPr>
+        <w:pStyle w:val="Heading1"/>
+        <w:keepNext/>
+        <w:spacing w:before="280" w:after="120"/>
+      </w:pPr>
+      <w:r>
+        <w:rPr>
+          <w:rFonts w:ascii="Times New Roman" w:hAnsi="Times New Roman" w:eastAsia="黑体"/>
+          <w:b/>
+          <w:color w:val="000000"/>
+          <w:sz w:val="30"/>
+        </w:rPr>
+        <w:t>0. 结论速览（2026-10-18，首轮）</w:t>
+      </w:r>
+    </w:p>
+    <w:p>
+      <w:pPr>
+        <w:spacing w:after="80"/>
+        <w:ind w:left="425" w:hanging="425"/>
+      </w:pPr>
+      <w:r>
+        <w:rPr>
+          <w:rFonts w:ascii="Times New Roman" w:hAnsi="Times New Roman" w:eastAsia="宋体"/>
+          <w:color w:val="000000"/>
+          <w:sz w:val="24"/>
+        </w:rPr>
+        <w:t>1. 公告日：明星上调的 CAR 与异常成交量显著更大（[-1,+1] +0.38pp，t=2.19；成交量 +0.053，t=2.85），同股同日聚类后同向。明星下调没有差异。</w:t>
+      </w:r>
+    </w:p>
+    <w:p>
+      <w:pPr>
+        <w:spacing w:after="80"/>
+        <w:ind w:left="425" w:hanging="425"/>
+      </w:pPr>
+      <w:r>
+        <w:rPr>
+          <w:rFonts w:ascii="Times New Roman" w:hAnsi="Times New Roman" w:eastAsia="宋体"/>
+          <w:color w:val="000000"/>
+          <w:sz w:val="24"/>
+        </w:rPr>
+        <w:t>2. 公告日之后：明星下调的标的在 60 个交易日内相对市场多跌 1.6pp（p=0.002），到 250 日符号翻正；明星上调没有显著漂移。形态是先过度反应、后修复。</w:t>
+      </w:r>
+    </w:p>
+    <w:p>
+      <w:pPr>
+        <w:spacing w:after="80"/>
+        <w:ind w:left="425" w:hanging="425"/>
+      </w:pPr>
+      <w:r>
+        <w:rPr>
+          <w:rFonts w:ascii="Times New Roman" w:hAnsi="Times New Roman" w:eastAsia="宋体"/>
+          <w:color w:val="000000"/>
+          <w:sz w:val="24"/>
+        </w:rPr>
+        <w:t>3. 事后准确度：明星在短期略准（下调 3 个月差 +1.77pp，p=0.001；上调 6 个月差 +1.60pp，p=0.037），12 个月优势消失甚至反转。</w:t>
+      </w:r>
+    </w:p>
+    <w:p>
+      <w:r>
+        <w:rPr>
+          <w:rFonts w:ascii="Times New Roman" w:hAnsi="Times New Roman" w:eastAsia="宋体"/>
+          <w:color w:val="000000"/>
+          <w:sz w:val="24"/>
+        </w:rPr>
+        <w:t>一句话：短期有信息、长期被追随，不是稳定的能力溢价。以上为首轮单变量结果，尚未做聚类标准误与涨跌停、停牌稳健性。</w:t>
       </w:r>
     </w:p>
     <w:p>

</xml_diff>

<commit_message>
Add analyst EPS forecasts and the forecast-error test
Pull 528,477 analyst-level forecast rows and realised annual EPS for 2018-2024,
match each event's own forecast on stock, report date, analyst and broker, and
report the absolute and signed errors for star versus non-star analysts.

Co-Authored-By: Claude Code <noreply@anthropic.com>
</commit_message>
<xml_diff>
--- a/文档/项目进度与技术备忘_20261018.docx
+++ b/文档/项目进度与技术备忘_20261018.docx
@@ -118,7 +118,7 @@
         </w:rPr>
         <w:fldChar w:fldCharType="separate"/>
       </w:r>
-      <w:hyperlink w:anchor="_Toc243217401" w:history="1">
+      <w:hyperlink w:anchor="_Toc243218765" w:history="1">
         <w:r>
           <w:rPr>
             <w:rStyle w:val="aff9"/>
@@ -180,7 +180,7 @@
             <w:noProof/>
             <w:webHidden/>
           </w:rPr>
-          <w:instrText>PAGEREF _Toc243217401 \h</w:instrText>
+          <w:instrText>PAGEREF _Toc243218765 \h</w:instrText>
         </w:r>
         <w:r>
           <w:rPr>
@@ -238,7 +238,7 @@
           <w14:ligatures w14:val="standardContextual"/>
         </w:rPr>
       </w:pPr>
-      <w:hyperlink w:anchor="_Toc243217402" w:history="1">
+      <w:hyperlink w:anchor="_Toc243218766" w:history="1">
         <w:r>
           <w:rPr>
             <w:rStyle w:val="aff9"/>
@@ -284,7 +284,7 @@
             <w:noProof/>
             <w:webHidden/>
           </w:rPr>
-          <w:instrText>PAGEREF _Toc243217402 \h</w:instrText>
+          <w:instrText>PAGEREF _Toc243218766 \h</w:instrText>
         </w:r>
         <w:r>
           <w:rPr>
@@ -343,7 +343,7 @@
           <w14:ligatures w14:val="standardContextual"/>
         </w:rPr>
       </w:pPr>
-      <w:hyperlink w:anchor="_Toc243217403" w:history="1">
+      <w:hyperlink w:anchor="_Toc243218767" w:history="1">
         <w:r>
           <w:rPr>
             <w:rStyle w:val="aff9"/>
@@ -389,7 +389,7 @@
             <w:noProof/>
             <w:webHidden/>
           </w:rPr>
-          <w:instrText>PAGEREF _Toc243217403 \h</w:instrText>
+          <w:instrText>PAGEREF _Toc243218767 \h</w:instrText>
         </w:r>
         <w:r>
           <w:rPr>
@@ -448,7 +448,7 @@
           <w14:ligatures w14:val="standardContextual"/>
         </w:rPr>
       </w:pPr>
-      <w:hyperlink w:anchor="_Toc243217404" w:history="1">
+      <w:hyperlink w:anchor="_Toc243218768" w:history="1">
         <w:r>
           <w:rPr>
             <w:rStyle w:val="aff9"/>
@@ -494,7 +494,7 @@
             <w:noProof/>
             <w:webHidden/>
           </w:rPr>
-          <w:instrText>PAGEREF _Toc243217404 \h</w:instrText>
+          <w:instrText>PAGEREF _Toc243218768 \h</w:instrText>
         </w:r>
         <w:r>
           <w:rPr>
@@ -553,7 +553,7 @@
           <w14:ligatures w14:val="standardContextual"/>
         </w:rPr>
       </w:pPr>
-      <w:hyperlink w:anchor="_Toc243217405" w:history="1">
+      <w:hyperlink w:anchor="_Toc243218769" w:history="1">
         <w:r>
           <w:rPr>
             <w:rStyle w:val="aff9"/>
@@ -599,7 +599,7 @@
             <w:noProof/>
             <w:webHidden/>
           </w:rPr>
-          <w:instrText>PAGEREF _Toc243217405 \h</w:instrText>
+          <w:instrText>PAGEREF _Toc243218769 \h</w:instrText>
         </w:r>
         <w:r>
           <w:rPr>
@@ -658,7 +658,7 @@
           <w14:ligatures w14:val="standardContextual"/>
         </w:rPr>
       </w:pPr>
-      <w:hyperlink w:anchor="_Toc243217406" w:history="1">
+      <w:hyperlink w:anchor="_Toc243218770" w:history="1">
         <w:r>
           <w:rPr>
             <w:rStyle w:val="aff9"/>
@@ -704,7 +704,7 @@
             <w:noProof/>
             <w:webHidden/>
           </w:rPr>
-          <w:instrText>PAGEREF _Toc243217406 \h</w:instrText>
+          <w:instrText>PAGEREF _Toc243218770 \h</w:instrText>
         </w:r>
         <w:r>
           <w:rPr>
@@ -734,7 +734,7 @@
             <w:noProof/>
             <w:webHidden/>
           </w:rPr>
-          <w:t>3</w:t>
+          <w:t>4</w:t>
         </w:r>
         <w:r>
           <w:rPr>
@@ -763,7 +763,7 @@
           <w14:ligatures w14:val="standardContextual"/>
         </w:rPr>
       </w:pPr>
-      <w:hyperlink w:anchor="_Toc243217407" w:history="1">
+      <w:hyperlink w:anchor="_Toc243218771" w:history="1">
         <w:r>
           <w:rPr>
             <w:rStyle w:val="aff9"/>
@@ -809,7 +809,7 @@
             <w:noProof/>
             <w:webHidden/>
           </w:rPr>
-          <w:instrText>PAGEREF _Toc243217407 \h</w:instrText>
+          <w:instrText>PAGEREF _Toc243218771 \h</w:instrText>
         </w:r>
         <w:r>
           <w:rPr>
@@ -868,7 +868,7 @@
           <w14:ligatures w14:val="standardContextual"/>
         </w:rPr>
       </w:pPr>
-      <w:hyperlink w:anchor="_Toc243217408" w:history="1">
+      <w:hyperlink w:anchor="_Toc243218772" w:history="1">
         <w:r>
           <w:rPr>
             <w:rStyle w:val="aff9"/>
@@ -914,7 +914,7 @@
             <w:noProof/>
             <w:webHidden/>
           </w:rPr>
-          <w:instrText>PAGEREF _Toc243217408 \h</w:instrText>
+          <w:instrText>PAGEREF _Toc243218772 \h</w:instrText>
         </w:r>
         <w:r>
           <w:rPr>
@@ -973,7 +973,7 @@
           <w14:ligatures w14:val="standardContextual"/>
         </w:rPr>
       </w:pPr>
-      <w:hyperlink w:anchor="_Toc243217409" w:history="1">
+      <w:hyperlink w:anchor="_Toc243218773" w:history="1">
         <w:r>
           <w:rPr>
             <w:rStyle w:val="aff9"/>
@@ -1019,7 +1019,7 @@
             <w:noProof/>
             <w:webHidden/>
           </w:rPr>
-          <w:instrText>PAGEREF _Toc243217409 \h</w:instrText>
+          <w:instrText>PAGEREF _Toc243218773 \h</w:instrText>
         </w:r>
         <w:r>
           <w:rPr>
@@ -1077,7 +1077,7 @@
           <w14:ligatures w14:val="standardContextual"/>
         </w:rPr>
       </w:pPr>
-      <w:hyperlink w:anchor="_Toc243217410" w:history="1">
+      <w:hyperlink w:anchor="_Toc243218774" w:history="1">
         <w:r>
           <w:rPr>
             <w:rStyle w:val="aff9"/>
@@ -1123,7 +1123,7 @@
             <w:noProof/>
             <w:webHidden/>
           </w:rPr>
-          <w:instrText>PAGEREF _Toc243217410 \h</w:instrText>
+          <w:instrText>PAGEREF _Toc243218774 \h</w:instrText>
         </w:r>
         <w:r>
           <w:rPr>
@@ -1181,7 +1181,7 @@
           <w14:ligatures w14:val="standardContextual"/>
         </w:rPr>
       </w:pPr>
-      <w:hyperlink w:anchor="_Toc243217411" w:history="1">
+      <w:hyperlink w:anchor="_Toc243218775" w:history="1">
         <w:r>
           <w:rPr>
             <w:rStyle w:val="aff9"/>
@@ -1227,7 +1227,7 @@
             <w:noProof/>
             <w:webHidden/>
           </w:rPr>
-          <w:instrText>PAGEREF _Toc243217411 \h</w:instrText>
+          <w:instrText>PAGEREF _Toc243218775 \h</w:instrText>
         </w:r>
         <w:r>
           <w:rPr>
@@ -1285,7 +1285,7 @@
           <w14:ligatures w14:val="standardContextual"/>
         </w:rPr>
       </w:pPr>
-      <w:hyperlink w:anchor="_Toc243217412" w:history="1">
+      <w:hyperlink w:anchor="_Toc243218776" w:history="1">
         <w:r>
           <w:rPr>
             <w:rStyle w:val="aff9"/>
@@ -1331,7 +1331,7 @@
             <w:noProof/>
             <w:webHidden/>
           </w:rPr>
-          <w:instrText>PAGEREF _Toc243217412 \h</w:instrText>
+          <w:instrText>PAGEREF _Toc243218776 \h</w:instrText>
         </w:r>
         <w:r>
           <w:rPr>
@@ -1389,7 +1389,7 @@
           <w14:ligatures w14:val="standardContextual"/>
         </w:rPr>
       </w:pPr>
-      <w:hyperlink w:anchor="_Toc243217413" w:history="1">
+      <w:hyperlink w:anchor="_Toc243218777" w:history="1">
         <w:r>
           <w:rPr>
             <w:rStyle w:val="aff9"/>
@@ -1435,7 +1435,7 @@
             <w:noProof/>
             <w:webHidden/>
           </w:rPr>
-          <w:instrText>PAGEREF _Toc243217413 \h</w:instrText>
+          <w:instrText>PAGEREF _Toc243218777 \h</w:instrText>
         </w:r>
         <w:r>
           <w:rPr>
@@ -1493,7 +1493,7 @@
           <w14:ligatures w14:val="standardContextual"/>
         </w:rPr>
       </w:pPr>
-      <w:hyperlink w:anchor="_Toc243217414" w:history="1">
+      <w:hyperlink w:anchor="_Toc243218778" w:history="1">
         <w:r>
           <w:rPr>
             <w:rStyle w:val="aff9"/>
@@ -1539,7 +1539,7 @@
             <w:noProof/>
             <w:webHidden/>
           </w:rPr>
-          <w:instrText>PAGEREF _Toc243217414 \h</w:instrText>
+          <w:instrText>PAGEREF _Toc243218778 \h</w:instrText>
         </w:r>
         <w:r>
           <w:rPr>
@@ -1598,7 +1598,7 @@
           <w14:ligatures w14:val="standardContextual"/>
         </w:rPr>
       </w:pPr>
-      <w:hyperlink w:anchor="_Toc243217415" w:history="1">
+      <w:hyperlink w:anchor="_Toc243218779" w:history="1">
         <w:r>
           <w:rPr>
             <w:rStyle w:val="aff9"/>
@@ -1644,7 +1644,7 @@
             <w:noProof/>
             <w:webHidden/>
           </w:rPr>
-          <w:instrText>PAGEREF _Toc243217415 \h</w:instrText>
+          <w:instrText>PAGEREF _Toc243218779 \h</w:instrText>
         </w:r>
         <w:r>
           <w:rPr>
@@ -1703,7 +1703,7 @@
           <w14:ligatures w14:val="standardContextual"/>
         </w:rPr>
       </w:pPr>
-      <w:hyperlink w:anchor="_Toc243217416" w:history="1">
+      <w:hyperlink w:anchor="_Toc243218780" w:history="1">
         <w:r>
           <w:rPr>
             <w:rStyle w:val="aff9"/>
@@ -1749,7 +1749,7 @@
             <w:noProof/>
             <w:webHidden/>
           </w:rPr>
-          <w:instrText>PAGEREF _Toc243217416 \h</w:instrText>
+          <w:instrText>PAGEREF _Toc243218780 \h</w:instrText>
         </w:r>
         <w:r>
           <w:rPr>
@@ -1808,7 +1808,7 @@
           <w14:ligatures w14:val="standardContextual"/>
         </w:rPr>
       </w:pPr>
-      <w:hyperlink w:anchor="_Toc243217417" w:history="1">
+      <w:hyperlink w:anchor="_Toc243218781" w:history="1">
         <w:r>
           <w:rPr>
             <w:rStyle w:val="aff9"/>
@@ -1854,7 +1854,7 @@
             <w:noProof/>
             <w:webHidden/>
           </w:rPr>
-          <w:instrText>PAGEREF _Toc243217417 \h</w:instrText>
+          <w:instrText>PAGEREF _Toc243218781 \h</w:instrText>
         </w:r>
         <w:r>
           <w:rPr>
@@ -1884,7 +1884,7 @@
             <w:noProof/>
             <w:webHidden/>
           </w:rPr>
-          <w:t>6</w:t>
+          <w:t>7</w:t>
         </w:r>
         <w:r>
           <w:rPr>
@@ -1912,7 +1912,7 @@
           <w14:ligatures w14:val="standardContextual"/>
         </w:rPr>
       </w:pPr>
-      <w:hyperlink w:anchor="_Toc243217418" w:history="1">
+      <w:hyperlink w:anchor="_Toc243218782" w:history="1">
         <w:r>
           <w:rPr>
             <w:rStyle w:val="aff9"/>
@@ -1958,7 +1958,7 @@
             <w:noProof/>
             <w:webHidden/>
           </w:rPr>
-          <w:instrText>PAGEREF _Toc243217418 \h</w:instrText>
+          <w:instrText>PAGEREF _Toc243218782 \h</w:instrText>
         </w:r>
         <w:r>
           <w:rPr>
@@ -2017,7 +2017,7 @@
           <w14:ligatures w14:val="standardContextual"/>
         </w:rPr>
       </w:pPr>
-      <w:hyperlink w:anchor="_Toc243217419" w:history="1">
+      <w:hyperlink w:anchor="_Toc243218783" w:history="1">
         <w:r>
           <w:rPr>
             <w:rStyle w:val="aff9"/>
@@ -2063,7 +2063,7 @@
             <w:noProof/>
             <w:webHidden/>
           </w:rPr>
-          <w:instrText>PAGEREF _Toc243217419 \h</w:instrText>
+          <w:instrText>PAGEREF _Toc243218783 \h</w:instrText>
         </w:r>
         <w:r>
           <w:rPr>
@@ -2122,7 +2122,7 @@
           <w14:ligatures w14:val="standardContextual"/>
         </w:rPr>
       </w:pPr>
-      <w:hyperlink w:anchor="_Toc243217420" w:history="1">
+      <w:hyperlink w:anchor="_Toc243218784" w:history="1">
         <w:r>
           <w:rPr>
             <w:rStyle w:val="aff9"/>
@@ -2168,7 +2168,7 @@
             <w:noProof/>
             <w:webHidden/>
           </w:rPr>
-          <w:instrText>PAGEREF _Toc243217420 \h</w:instrText>
+          <w:instrText>PAGEREF _Toc243218784 \h</w:instrText>
         </w:r>
         <w:r>
           <w:rPr>
@@ -2227,7 +2227,7 @@
           <w14:ligatures w14:val="standardContextual"/>
         </w:rPr>
       </w:pPr>
-      <w:hyperlink w:anchor="_Toc243217421" w:history="1">
+      <w:hyperlink w:anchor="_Toc243218785" w:history="1">
         <w:r>
           <w:rPr>
             <w:rStyle w:val="aff9"/>
@@ -2273,7 +2273,7 @@
             <w:noProof/>
             <w:webHidden/>
           </w:rPr>
-          <w:instrText>PAGEREF _Toc243217421 \h</w:instrText>
+          <w:instrText>PAGEREF _Toc243218785 \h</w:instrText>
         </w:r>
         <w:r>
           <w:rPr>
@@ -2332,7 +2332,7 @@
           <w14:ligatures w14:val="standardContextual"/>
         </w:rPr>
       </w:pPr>
-      <w:hyperlink w:anchor="_Toc243217422" w:history="1">
+      <w:hyperlink w:anchor="_Toc243218786" w:history="1">
         <w:r>
           <w:rPr>
             <w:rStyle w:val="aff9"/>
@@ -2378,7 +2378,7 @@
             <w:noProof/>
             <w:webHidden/>
           </w:rPr>
-          <w:instrText>PAGEREF _Toc243217422 \h</w:instrText>
+          <w:instrText>PAGEREF _Toc243218786 \h</w:instrText>
         </w:r>
         <w:r>
           <w:rPr>
@@ -2437,7 +2437,7 @@
           <w14:ligatures w14:val="standardContextual"/>
         </w:rPr>
       </w:pPr>
-      <w:hyperlink w:anchor="_Toc243217423" w:history="1">
+      <w:hyperlink w:anchor="_Toc243218787" w:history="1">
         <w:r>
           <w:rPr>
             <w:rStyle w:val="aff9"/>
@@ -2483,7 +2483,7 @@
             <w:noProof/>
             <w:webHidden/>
           </w:rPr>
-          <w:instrText>PAGEREF _Toc243217423 \h</w:instrText>
+          <w:instrText>PAGEREF _Toc243218787 \h</w:instrText>
         </w:r>
         <w:r>
           <w:rPr>
@@ -2542,7 +2542,7 @@
           <w14:ligatures w14:val="standardContextual"/>
         </w:rPr>
       </w:pPr>
-      <w:hyperlink w:anchor="_Toc243217424" w:history="1">
+      <w:hyperlink w:anchor="_Toc243218788" w:history="1">
         <w:r>
           <w:rPr>
             <w:rStyle w:val="aff9"/>
@@ -2604,7 +2604,7 @@
             <w:noProof/>
             <w:webHidden/>
           </w:rPr>
-          <w:instrText>PAGEREF _Toc243217424 \h</w:instrText>
+          <w:instrText>PAGEREF _Toc243218788 \h</w:instrText>
         </w:r>
         <w:r>
           <w:rPr>
@@ -2663,7 +2663,7 @@
           <w14:ligatures w14:val="standardContextual"/>
         </w:rPr>
       </w:pPr>
-      <w:hyperlink w:anchor="_Toc243217425" w:history="1">
+      <w:hyperlink w:anchor="_Toc243218789" w:history="1">
         <w:r>
           <w:rPr>
             <w:rStyle w:val="aff9"/>
@@ -2709,7 +2709,7 @@
             <w:noProof/>
             <w:webHidden/>
           </w:rPr>
-          <w:instrText>PAGEREF _Toc243217425 \h</w:instrText>
+          <w:instrText>PAGEREF _Toc243218789 \h</w:instrText>
         </w:r>
         <w:r>
           <w:rPr>
@@ -2768,7 +2768,7 @@
           <w14:ligatures w14:val="standardContextual"/>
         </w:rPr>
       </w:pPr>
-      <w:hyperlink w:anchor="_Toc243217426" w:history="1">
+      <w:hyperlink w:anchor="_Toc243218790" w:history="1">
         <w:r>
           <w:rPr>
             <w:rStyle w:val="aff9"/>
@@ -2814,7 +2814,7 @@
             <w:noProof/>
             <w:webHidden/>
           </w:rPr>
-          <w:instrText>PAGEREF _Toc243217426 \h</w:instrText>
+          <w:instrText>PAGEREF _Toc243218790 \h</w:instrText>
         </w:r>
         <w:r>
           <w:rPr>
@@ -2844,7 +2844,7 @@
             <w:noProof/>
             <w:webHidden/>
           </w:rPr>
-          <w:t>8</w:t>
+          <w:t>9</w:t>
         </w:r>
         <w:r>
           <w:rPr>
@@ -2873,7 +2873,7 @@
           <w14:ligatures w14:val="standardContextual"/>
         </w:rPr>
       </w:pPr>
-      <w:hyperlink w:anchor="_Toc243217427" w:history="1">
+      <w:hyperlink w:anchor="_Toc243218791" w:history="1">
         <w:r>
           <w:rPr>
             <w:rStyle w:val="aff9"/>
@@ -2919,7 +2919,7 @@
             <w:noProof/>
             <w:webHidden/>
           </w:rPr>
-          <w:instrText>PAGEREF _Toc243217427 \h</w:instrText>
+          <w:instrText>PAGEREF _Toc243218791 \h</w:instrText>
         </w:r>
         <w:r>
           <w:rPr>
@@ -2978,7 +2978,7 @@
           <w14:ligatures w14:val="standardContextual"/>
         </w:rPr>
       </w:pPr>
-      <w:hyperlink w:anchor="_Toc243217428" w:history="1">
+      <w:hyperlink w:anchor="_Toc243218792" w:history="1">
         <w:r>
           <w:rPr>
             <w:rStyle w:val="aff9"/>
@@ -3024,7 +3024,7 @@
             <w:noProof/>
             <w:webHidden/>
           </w:rPr>
-          <w:instrText>PAGEREF _Toc243217428 \h</w:instrText>
+          <w:instrText>PAGEREF _Toc243218792 \h</w:instrText>
         </w:r>
         <w:r>
           <w:rPr>
@@ -3083,7 +3083,7 @@
           <w14:ligatures w14:val="standardContextual"/>
         </w:rPr>
       </w:pPr>
-      <w:hyperlink w:anchor="_Toc243217429" w:history="1">
+      <w:hyperlink w:anchor="_Toc243218793" w:history="1">
         <w:r>
           <w:rPr>
             <w:rStyle w:val="aff9"/>
@@ -3145,7 +3145,7 @@
             <w:noProof/>
             <w:webHidden/>
           </w:rPr>
-          <w:instrText>PAGEREF _Toc243217429 \h</w:instrText>
+          <w:instrText>PAGEREF _Toc243218793 \h</w:instrText>
         </w:r>
         <w:r>
           <w:rPr>
@@ -3204,7 +3204,7 @@
           <w14:ligatures w14:val="standardContextual"/>
         </w:rPr>
       </w:pPr>
-      <w:hyperlink w:anchor="_Toc243217430" w:history="1">
+      <w:hyperlink w:anchor="_Toc243218794" w:history="1">
         <w:r>
           <w:rPr>
             <w:rStyle w:val="aff9"/>
@@ -3250,7 +3250,7 @@
             <w:noProof/>
             <w:webHidden/>
           </w:rPr>
-          <w:instrText>PAGEREF _Toc243217430 \h</w:instrText>
+          <w:instrText>PAGEREF _Toc243218794 \h</w:instrText>
         </w:r>
         <w:r>
           <w:rPr>
@@ -3309,7 +3309,7 @@
           <w14:ligatures w14:val="standardContextual"/>
         </w:rPr>
       </w:pPr>
-      <w:hyperlink w:anchor="_Toc243217431" w:history="1">
+      <w:hyperlink w:anchor="_Toc243218795" w:history="1">
         <w:r>
           <w:rPr>
             <w:rStyle w:val="aff9"/>
@@ -3355,7 +3355,7 @@
             <w:noProof/>
             <w:webHidden/>
           </w:rPr>
-          <w:instrText>PAGEREF _Toc243217431 \h</w:instrText>
+          <w:instrText>PAGEREF _Toc243218795 \h</w:instrText>
         </w:r>
         <w:r>
           <w:rPr>
@@ -3413,7 +3413,7 @@
           <w14:ligatures w14:val="standardContextual"/>
         </w:rPr>
       </w:pPr>
-      <w:hyperlink w:anchor="_Toc243217432" w:history="1">
+      <w:hyperlink w:anchor="_Toc243218796" w:history="1">
         <w:r>
           <w:rPr>
             <w:rStyle w:val="aff9"/>
@@ -3467,7 +3467,7 @@
             <w:noProof/>
             <w:webHidden/>
           </w:rPr>
-          <w:instrText>PAGEREF _Toc243217432 \h</w:instrText>
+          <w:instrText>PAGEREF _Toc243218796 \h</w:instrText>
         </w:r>
         <w:r>
           <w:rPr>
@@ -3497,7 +3497,7 @@
             <w:noProof/>
             <w:webHidden/>
           </w:rPr>
-          <w:t>9</w:t>
+          <w:t>10</w:t>
         </w:r>
         <w:r>
           <w:rPr>
@@ -3526,7 +3526,7 @@
           <w14:ligatures w14:val="standardContextual"/>
         </w:rPr>
       </w:pPr>
-      <w:hyperlink w:anchor="_Toc243217433" w:history="1">
+      <w:hyperlink w:anchor="_Toc243218797" w:history="1">
         <w:r>
           <w:rPr>
             <w:rStyle w:val="aff9"/>
@@ -3588,7 +3588,7 @@
             <w:noProof/>
             <w:webHidden/>
           </w:rPr>
-          <w:instrText>PAGEREF _Toc243217433 \h</w:instrText>
+          <w:instrText>PAGEREF _Toc243218797 \h</w:instrText>
         </w:r>
         <w:r>
           <w:rPr>
@@ -3647,7 +3647,7 @@
           <w14:ligatures w14:val="standardContextual"/>
         </w:rPr>
       </w:pPr>
-      <w:hyperlink w:anchor="_Toc243217434" w:history="1">
+      <w:hyperlink w:anchor="_Toc243218798" w:history="1">
         <w:r>
           <w:rPr>
             <w:rStyle w:val="aff9"/>
@@ -3709,7 +3709,7 @@
             <w:noProof/>
             <w:webHidden/>
           </w:rPr>
-          <w:instrText>PAGEREF _Toc243217434 \h</w:instrText>
+          <w:instrText>PAGEREF _Toc243218798 \h</w:instrText>
         </w:r>
         <w:r>
           <w:rPr>
@@ -3740,6 +3740,127 @@
             <w:webHidden/>
           </w:rPr>
           <w:t>11</w:t>
+        </w:r>
+        <w:r>
+          <w:rPr>
+            <w:rFonts w:hint="eastAsia"/>
+            <w:noProof/>
+            <w:webHidden/>
+          </w:rPr>
+          <w:fldChar w:fldCharType="end"/>
+        </w:r>
+      </w:hyperlink>
+    </w:p>
+    <w:p>
+      <w:pPr>
+        <w:pStyle w:val="TOC2"/>
+        <w:tabs>
+          <w:tab w:val="right" w:leader="dot" w:pos="9402"/>
+        </w:tabs>
+        <w:ind w:left="480"/>
+        <w:rPr>
+          <w:rFonts w:asciiTheme="minorHAnsi" w:eastAsiaTheme="minorEastAsia" w:hAnsiTheme="minorHAnsi" w:hint="eastAsia"/>
+          <w:noProof/>
+          <w:kern w:val="2"/>
+          <w:sz w:val="22"/>
+          <w:szCs w:val="24"/>
+          <w:lang w:eastAsia="zh-CN"/>
+          <w14:ligatures w14:val="standardContextual"/>
+        </w:rPr>
+      </w:pPr>
+      <w:hyperlink w:anchor="_Toc243218799" w:history="1">
+        <w:r>
+          <w:rPr>
+            <w:rStyle w:val="aff9"/>
+            <w:rFonts w:eastAsia="黑体"/>
+            <w:noProof/>
+          </w:rPr>
+          <w:t xml:space="preserve">8.3 </w:t>
+        </w:r>
+        <w:r>
+          <w:rPr>
+            <w:rStyle w:val="aff9"/>
+            <w:rFonts w:eastAsia="黑体"/>
+            <w:noProof/>
+          </w:rPr>
+          <w:t>盈余预测误差（</w:t>
+        </w:r>
+        <w:r>
+          <w:rPr>
+            <w:rStyle w:val="aff9"/>
+            <w:rFonts w:eastAsia="黑体"/>
+            <w:noProof/>
+          </w:rPr>
+          <w:t>2026-10-18</w:t>
+        </w:r>
+        <w:r>
+          <w:rPr>
+            <w:rStyle w:val="aff9"/>
+            <w:rFonts w:eastAsia="黑体"/>
+            <w:noProof/>
+          </w:rPr>
+          <w:t>）</w:t>
+        </w:r>
+        <w:r>
+          <w:rPr>
+            <w:rFonts w:hint="eastAsia"/>
+            <w:noProof/>
+            <w:webHidden/>
+          </w:rPr>
+          <w:tab/>
+        </w:r>
+        <w:r>
+          <w:rPr>
+            <w:rFonts w:hint="eastAsia"/>
+            <w:noProof/>
+            <w:webHidden/>
+          </w:rPr>
+          <w:fldChar w:fldCharType="begin"/>
+        </w:r>
+        <w:r>
+          <w:rPr>
+            <w:rFonts w:hint="eastAsia"/>
+            <w:noProof/>
+            <w:webHidden/>
+          </w:rPr>
+          <w:instrText xml:space="preserve"> </w:instrText>
+        </w:r>
+        <w:r>
+          <w:rPr>
+            <w:noProof/>
+            <w:webHidden/>
+          </w:rPr>
+          <w:instrText>PAGEREF _Toc243218799 \h</w:instrText>
+        </w:r>
+        <w:r>
+          <w:rPr>
+            <w:rFonts w:hint="eastAsia"/>
+            <w:noProof/>
+            <w:webHidden/>
+          </w:rPr>
+          <w:instrText xml:space="preserve"> </w:instrText>
+        </w:r>
+        <w:r>
+          <w:rPr>
+            <w:rFonts w:hint="eastAsia"/>
+            <w:noProof/>
+            <w:webHidden/>
+          </w:rPr>
+        </w:r>
+        <w:r>
+          <w:rPr>
+            <w:rFonts w:hint="eastAsia"/>
+            <w:noProof/>
+            <w:webHidden/>
+          </w:rPr>
+          <w:fldChar w:fldCharType="separate"/>
+        </w:r>
+        <w:r>
+          <w:rPr>
+            <w:noProof/>
+            <w:webHidden/>
+          </w:rPr>
+          <w:t>12</w:t>
         </w:r>
         <w:r>
           <w:rPr>
@@ -3767,7 +3888,7 @@
           <w14:ligatures w14:val="standardContextual"/>
         </w:rPr>
       </w:pPr>
-      <w:hyperlink w:anchor="_Toc243217435" w:history="1">
+      <w:hyperlink w:anchor="_Toc243218800" w:history="1">
         <w:r>
           <w:rPr>
             <w:rStyle w:val="aff9"/>
@@ -3813,7 +3934,7 @@
             <w:noProof/>
             <w:webHidden/>
           </w:rPr>
-          <w:instrText>PAGEREF _Toc243217435 \h</w:instrText>
+          <w:instrText>PAGEREF _Toc243218800 \h</w:instrText>
         </w:r>
         <w:r>
           <w:rPr>
@@ -3843,7 +3964,7 @@
             <w:noProof/>
             <w:webHidden/>
           </w:rPr>
-          <w:t>11</w:t>
+          <w:t>12</w:t>
         </w:r>
         <w:r>
           <w:rPr>
@@ -3871,7 +3992,7 @@
           <w14:ligatures w14:val="standardContextual"/>
         </w:rPr>
       </w:pPr>
-      <w:hyperlink w:anchor="_Toc243217436" w:history="1">
+      <w:hyperlink w:anchor="_Toc243218801" w:history="1">
         <w:r>
           <w:rPr>
             <w:rStyle w:val="aff9"/>
@@ -3917,7 +4038,7 @@
             <w:noProof/>
             <w:webHidden/>
           </w:rPr>
-          <w:instrText>PAGEREF _Toc243217436 \h</w:instrText>
+          <w:instrText>PAGEREF _Toc243218801 \h</w:instrText>
         </w:r>
         <w:r>
           <w:rPr>
@@ -3947,7 +4068,7 @@
             <w:noProof/>
             <w:webHidden/>
           </w:rPr>
-          <w:t>12</w:t>
+          <w:t>13</w:t>
         </w:r>
         <w:r>
           <w:rPr>
@@ -3975,7 +4096,7 @@
           <w14:ligatures w14:val="standardContextual"/>
         </w:rPr>
       </w:pPr>
-      <w:hyperlink w:anchor="_Toc243217437" w:history="1">
+      <w:hyperlink w:anchor="_Toc243218802" w:history="1">
         <w:r>
           <w:rPr>
             <w:rStyle w:val="aff9"/>
@@ -4021,7 +4142,7 @@
             <w:noProof/>
             <w:webHidden/>
           </w:rPr>
-          <w:instrText>PAGEREF _Toc243217437 \h</w:instrText>
+          <w:instrText>PAGEREF _Toc243218802 \h</w:instrText>
         </w:r>
         <w:r>
           <w:rPr>
@@ -4051,7 +4172,7 @@
             <w:noProof/>
             <w:webHidden/>
           </w:rPr>
-          <w:t>12</w:t>
+          <w:t>13</w:t>
         </w:r>
         <w:r>
           <w:rPr>
@@ -4076,7 +4197,7 @@
         <w:pStyle w:val="1"/>
         <w:spacing w:before="280" w:after="120"/>
       </w:pPr>
-      <w:bookmarkStart w:id="0" w:name="_Toc243217401"/>
+      <w:bookmarkStart w:id="0" w:name="_Toc243218765"/>
       <w:r>
         <w:rPr>
           <w:rFonts w:ascii="Times New Roman" w:eastAsia="黑体" w:hAnsi="Times New Roman"/>
@@ -4270,7 +4391,7 @@
         <w:rPr>
           <w:color w:val="000000"/>
         </w:rPr>
-        <w:t>事后准确度：明星在短期略准（下调</w:t>
+        <w:t>事后准确度（持有收益）：明星在短期略准（下调</w:t>
       </w:r>
       <w:r>
         <w:rPr>
@@ -4358,11 +4479,114 @@
       </w:r>
     </w:p>
     <w:p>
-      <w:r>
-        <w:rPr>
-          <w:color w:val="000000"/>
-        </w:rPr>
-        <w:t>一句话：短期有信息、长期被追随，不是稳定的能力溢价。以上为首轮单变量结果，尚未做聚类标准误与涨跌停、停牌稳健性。</w:t>
+      <w:pPr>
+        <w:spacing w:after="80"/>
+        <w:ind w:left="425" w:hanging="425"/>
+      </w:pPr>
+      <w:r>
+        <w:rPr>
+          <w:color w:val="000000"/>
+        </w:rPr>
+        <w:t xml:space="preserve">4. </w:t>
+      </w:r>
+      <w:r>
+        <w:rPr>
+          <w:color w:val="000000"/>
+        </w:rPr>
+        <w:t>事后准确度（盈余预测误差）：明星的绝对预测误差反而更大。当年</w:t>
+      </w:r>
+      <w:r>
+        <w:rPr>
+          <w:color w:val="000000"/>
+        </w:rPr>
+        <w:t xml:space="preserve"> EPS</w:t>
+      </w:r>
+      <w:r>
+        <w:rPr>
+          <w:color w:val="000000"/>
+        </w:rPr>
+        <w:t>，上调组</w:t>
+      </w:r>
+      <w:r>
+        <w:rPr>
+          <w:color w:val="000000"/>
+        </w:rPr>
+        <w:t xml:space="preserve"> 2.18 </w:t>
+      </w:r>
+      <w:r>
+        <w:rPr>
+          <w:color w:val="000000"/>
+        </w:rPr>
+        <w:t>对</w:t>
+      </w:r>
+      <w:r>
+        <w:rPr>
+          <w:color w:val="000000"/>
+        </w:rPr>
+        <w:t xml:space="preserve"> 1.89</w:t>
+      </w:r>
+      <w:r>
+        <w:rPr>
+          <w:color w:val="000000"/>
+        </w:rPr>
+        <w:t>（</w:t>
+      </w:r>
+      <w:r>
+        <w:rPr>
+          <w:color w:val="000000"/>
+        </w:rPr>
+        <w:t>p=0.001</w:t>
+      </w:r>
+      <w:r>
+        <w:rPr>
+          <w:color w:val="000000"/>
+        </w:rPr>
+        <w:t>），下调组</w:t>
+      </w:r>
+      <w:r>
+        <w:rPr>
+          <w:color w:val="000000"/>
+        </w:rPr>
+        <w:t xml:space="preserve"> 3.07 </w:t>
+      </w:r>
+      <w:r>
+        <w:rPr>
+          <w:color w:val="000000"/>
+        </w:rPr>
+        <w:t>对</w:t>
+      </w:r>
+      <w:r>
+        <w:rPr>
+          <w:color w:val="000000"/>
+        </w:rPr>
+        <w:t xml:space="preserve"> 2.61</w:t>
+      </w:r>
+      <w:r>
+        <w:rPr>
+          <w:color w:val="000000"/>
+        </w:rPr>
+        <w:t>（</w:t>
+      </w:r>
+      <w:r>
+        <w:rPr>
+          <w:color w:val="000000"/>
+        </w:rPr>
+        <w:t>p=0.002</w:t>
+      </w:r>
+      <w:r>
+        <w:rPr>
+          <w:color w:val="000000"/>
+        </w:rPr>
+        <w:t>）；次年误差更大。符号误差（乐观程度）无显著差异。</w:t>
+      </w:r>
+    </w:p>
+    <w:p>
+      <w:r>
+        <w:rPr>
+          <w:color w:val="000000"/>
+        </w:rPr>
+        <w:lastRenderedPageBreak/>
+        <w:t>一句话：市场影响力明确存在；准确度证据混合，持有收益短期略优，但盈余预测并不更准。整体更接近影响力假说，但不能说明星完全没有信息优势。以上为首轮单变量结果，尚未做聚类标准误与涨跌停、停牌稳健性。</w:t>
       </w:r>
     </w:p>
     <w:p>
@@ -4370,14 +4594,13 @@
         <w:pStyle w:val="1"/>
         <w:spacing w:before="280" w:after="120"/>
       </w:pPr>
-      <w:bookmarkStart w:id="1" w:name="_Toc243217402"/>
+      <w:bookmarkStart w:id="1" w:name="_Toc243218766"/>
       <w:r>
         <w:rPr>
           <w:rFonts w:ascii="Times New Roman" w:eastAsia="黑体" w:hAnsi="Times New Roman"/>
           <w:color w:val="000000"/>
           <w:sz w:val="30"/>
         </w:rPr>
-        <w:lastRenderedPageBreak/>
         <w:t xml:space="preserve">1. </w:t>
       </w:r>
       <w:r>
@@ -4395,7 +4618,7 @@
         <w:pStyle w:val="21"/>
         <w:spacing w:after="120"/>
       </w:pPr>
-      <w:bookmarkStart w:id="2" w:name="_Toc243217403"/>
+      <w:bookmarkStart w:id="2" w:name="_Toc243218767"/>
       <w:r>
         <w:rPr>
           <w:rFonts w:ascii="Times New Roman" w:eastAsia="黑体" w:hAnsi="Times New Roman"/>
@@ -4501,7 +4724,7 @@
         <w:pStyle w:val="21"/>
         <w:spacing w:after="120"/>
       </w:pPr>
-      <w:bookmarkStart w:id="3" w:name="_Toc243217404"/>
+      <w:bookmarkStart w:id="3" w:name="_Toc243218768"/>
       <w:r>
         <w:rPr>
           <w:rFonts w:ascii="Times New Roman" w:eastAsia="黑体" w:hAnsi="Times New Roman"/>
@@ -4910,7 +5133,7 @@
         <w:pStyle w:val="21"/>
         <w:spacing w:after="120"/>
       </w:pPr>
-      <w:bookmarkStart w:id="4" w:name="_Toc243217405"/>
+      <w:bookmarkStart w:id="4" w:name="_Toc243218769"/>
       <w:r>
         <w:rPr>
           <w:rFonts w:ascii="Times New Roman" w:eastAsia="黑体" w:hAnsi="Times New Roman"/>
@@ -5020,12 +5243,13 @@
         <w:pStyle w:val="21"/>
         <w:spacing w:after="120"/>
       </w:pPr>
-      <w:bookmarkStart w:id="5" w:name="_Toc243217406"/>
+      <w:bookmarkStart w:id="5" w:name="_Toc243218770"/>
       <w:r>
         <w:rPr>
           <w:rFonts w:ascii="Times New Roman" w:eastAsia="黑体" w:hAnsi="Times New Roman"/>
           <w:color w:val="000000"/>
         </w:rPr>
+        <w:lastRenderedPageBreak/>
         <w:t xml:space="preserve">1.4 </w:t>
       </w:r>
       <w:r>
@@ -5094,7 +5318,6 @@
         <w:rPr>
           <w:color w:val="000000"/>
         </w:rPr>
-        <w:lastRenderedPageBreak/>
         <w:t>事后准确度：信息假说预测明星更准，影响力假说预测无差异。若公告日反应更大而事后并不更准，则「仅仅更有影响力」成立，这正是本项目的核心发现。</w:t>
       </w:r>
     </w:p>
@@ -5103,7 +5326,7 @@
         <w:pStyle w:val="21"/>
         <w:spacing w:after="120"/>
       </w:pPr>
-      <w:bookmarkStart w:id="6" w:name="_Toc243217407"/>
+      <w:bookmarkStart w:id="6" w:name="_Toc243218771"/>
       <w:r>
         <w:rPr>
           <w:rFonts w:ascii="Times New Roman" w:eastAsia="黑体" w:hAnsi="Times New Roman"/>
@@ -5175,7 +5398,7 @@
         <w:pStyle w:val="21"/>
         <w:spacing w:after="120"/>
       </w:pPr>
-      <w:bookmarkStart w:id="7" w:name="_Toc243217408"/>
+      <w:bookmarkStart w:id="7" w:name="_Toc243218772"/>
       <w:r>
         <w:rPr>
           <w:rFonts w:ascii="Times New Roman" w:eastAsia="黑体" w:hAnsi="Times New Roman"/>
@@ -5271,7 +5494,7 @@
         <w:pStyle w:val="21"/>
         <w:spacing w:after="120"/>
       </w:pPr>
-      <w:bookmarkStart w:id="8" w:name="_Toc243217409"/>
+      <w:bookmarkStart w:id="8" w:name="_Toc243218773"/>
       <w:r>
         <w:rPr>
           <w:rFonts w:ascii="Times New Roman" w:eastAsia="黑体" w:hAnsi="Times New Roman"/>
@@ -5325,7 +5548,7 @@
         <w:pStyle w:val="1"/>
         <w:spacing w:before="280" w:after="120"/>
       </w:pPr>
-      <w:bookmarkStart w:id="9" w:name="_Toc243217410"/>
+      <w:bookmarkStart w:id="9" w:name="_Toc243218774"/>
       <w:r>
         <w:rPr>
           <w:rFonts w:ascii="Times New Roman" w:eastAsia="黑体" w:hAnsi="Times New Roman"/>
@@ -5479,7 +5702,7 @@
         <w:pStyle w:val="1"/>
         <w:spacing w:before="280" w:after="120"/>
       </w:pPr>
-      <w:bookmarkStart w:id="10" w:name="_Toc243217411"/>
+      <w:bookmarkStart w:id="10" w:name="_Toc243218775"/>
       <w:r>
         <w:rPr>
           <w:rFonts w:ascii="Times New Roman" w:eastAsia="黑体" w:hAnsi="Times New Roman"/>
@@ -5626,6 +5849,7 @@
                 <w:color w:val="000000"/>
                 <w:sz w:val="21"/>
               </w:rPr>
+              <w:lastRenderedPageBreak/>
               <w:t>是否新财富上榜</w:t>
             </w:r>
           </w:p>
@@ -5793,7 +6017,6 @@
         <w:rPr>
           <w:color w:val="000000"/>
         </w:rPr>
-        <w:lastRenderedPageBreak/>
         <w:t>事件的定义：同一位分析师对同一只股票的评级调整，只取</w:t>
       </w:r>
       <w:r>
@@ -5906,7 +6129,7 @@
         <w:pStyle w:val="1"/>
         <w:spacing w:before="280" w:after="120"/>
       </w:pPr>
-      <w:bookmarkStart w:id="11" w:name="_Toc243217412"/>
+      <w:bookmarkStart w:id="11" w:name="_Toc243218776"/>
       <w:r>
         <w:rPr>
           <w:rFonts w:ascii="Times New Roman" w:eastAsia="黑体" w:hAnsi="Times New Roman"/>
@@ -7130,7 +7353,7 @@
         <w:pStyle w:val="1"/>
         <w:spacing w:before="280" w:after="120"/>
       </w:pPr>
-      <w:bookmarkStart w:id="12" w:name="_Toc243217413"/>
+      <w:bookmarkStart w:id="12" w:name="_Toc243218777"/>
       <w:r>
         <w:rPr>
           <w:rFonts w:ascii="Times New Roman" w:eastAsia="黑体" w:hAnsi="Times New Roman"/>
@@ -7435,6 +7658,7 @@
                 <w:color w:val="000000"/>
                 <w:sz w:val="21"/>
               </w:rPr>
+              <w:lastRenderedPageBreak/>
               <w:t>剔除上市未满</w:t>
             </w:r>
             <w:r>
@@ -7677,7 +7901,6 @@
           <w:color w:val="000000"/>
           <w:sz w:val="22"/>
         </w:rPr>
-        <w:lastRenderedPageBreak/>
         <w:t>star = 1</w:t>
       </w:r>
       <w:r>
@@ -8210,7 +8433,7 @@
         <w:pStyle w:val="1"/>
         <w:spacing w:before="280" w:after="120"/>
       </w:pPr>
-      <w:bookmarkStart w:id="13" w:name="_Toc243217414"/>
+      <w:bookmarkStart w:id="13" w:name="_Toc243218778"/>
       <w:r>
         <w:rPr>
           <w:rFonts w:ascii="Times New Roman" w:eastAsia="黑体" w:hAnsi="Times New Roman"/>
@@ -8234,7 +8457,7 @@
         <w:pStyle w:val="21"/>
         <w:spacing w:after="120"/>
       </w:pPr>
-      <w:bookmarkStart w:id="14" w:name="_Toc243217415"/>
+      <w:bookmarkStart w:id="14" w:name="_Toc243218779"/>
       <w:r>
         <w:rPr>
           <w:rFonts w:ascii="Times New Roman" w:eastAsia="黑体" w:hAnsi="Times New Roman"/>
@@ -8442,7 +8665,7 @@
         <w:pStyle w:val="21"/>
         <w:spacing w:after="120"/>
       </w:pPr>
-      <w:bookmarkStart w:id="15" w:name="_Toc243217416"/>
+      <w:bookmarkStart w:id="15" w:name="_Toc243218780"/>
       <w:r>
         <w:rPr>
           <w:rFonts w:ascii="Times New Roman" w:eastAsia="黑体" w:hAnsi="Times New Roman"/>
@@ -8528,12 +8751,13 @@
         <w:pStyle w:val="21"/>
         <w:spacing w:after="120"/>
       </w:pPr>
-      <w:bookmarkStart w:id="16" w:name="_Toc243217417"/>
+      <w:bookmarkStart w:id="16" w:name="_Toc243218781"/>
       <w:r>
         <w:rPr>
           <w:rFonts w:ascii="Times New Roman" w:eastAsia="黑体" w:hAnsi="Times New Roman"/>
           <w:color w:val="000000"/>
         </w:rPr>
+        <w:lastRenderedPageBreak/>
         <w:t xml:space="preserve">6.3 </w:t>
       </w:r>
       <w:r>
@@ -8630,14 +8854,13 @@
         <w:pStyle w:val="1"/>
         <w:spacing w:before="280" w:after="120"/>
       </w:pPr>
-      <w:bookmarkStart w:id="17" w:name="_Toc243217418"/>
+      <w:bookmarkStart w:id="17" w:name="_Toc243218782"/>
       <w:r>
         <w:rPr>
           <w:rFonts w:ascii="Times New Roman" w:eastAsia="黑体" w:hAnsi="Times New Roman"/>
           <w:color w:val="000000"/>
           <w:sz w:val="30"/>
         </w:rPr>
-        <w:lastRenderedPageBreak/>
         <w:t xml:space="preserve">7. </w:t>
       </w:r>
       <w:r>
@@ -8663,7 +8886,7 @@
         <w:pStyle w:val="21"/>
         <w:spacing w:after="120"/>
       </w:pPr>
-      <w:bookmarkStart w:id="18" w:name="_Toc243217419"/>
+      <w:bookmarkStart w:id="18" w:name="_Toc243218783"/>
       <w:r>
         <w:rPr>
           <w:rFonts w:ascii="Times New Roman" w:eastAsia="黑体" w:hAnsi="Times New Roman"/>
@@ -8929,7 +9152,7 @@
         <w:pStyle w:val="21"/>
         <w:spacing w:after="120"/>
       </w:pPr>
-      <w:bookmarkStart w:id="19" w:name="_Toc243217420"/>
+      <w:bookmarkStart w:id="19" w:name="_Toc243218784"/>
       <w:r>
         <w:rPr>
           <w:rFonts w:ascii="Times New Roman" w:eastAsia="黑体" w:hAnsi="Times New Roman"/>
@@ -9045,7 +9268,7 @@
         <w:pStyle w:val="21"/>
         <w:spacing w:after="120"/>
       </w:pPr>
-      <w:bookmarkStart w:id="20" w:name="_Toc243217421"/>
+      <w:bookmarkStart w:id="20" w:name="_Toc243218785"/>
       <w:r>
         <w:rPr>
           <w:rFonts w:ascii="Times New Roman" w:eastAsia="黑体" w:hAnsi="Times New Roman"/>
@@ -9271,6 +9494,7 @@
         <w:rPr>
           <w:color w:val="000000"/>
         </w:rPr>
+        <w:lastRenderedPageBreak/>
         <w:t>还有三类名字坑：</w:t>
       </w:r>
     </w:p>
@@ -9403,7 +9627,6 @@
         <w:rPr>
           <w:color w:val="000000"/>
         </w:rPr>
-        <w:lastRenderedPageBreak/>
         <w:t>中金公司在评级明细里以它为研究机构的记录是</w:t>
       </w:r>
       <w:r>
@@ -9436,7 +9659,7 @@
         <w:pStyle w:val="21"/>
         <w:spacing w:after="120"/>
       </w:pPr>
-      <w:bookmarkStart w:id="21" w:name="_Toc243217422"/>
+      <w:bookmarkStart w:id="21" w:name="_Toc243218786"/>
       <w:r>
         <w:rPr>
           <w:rFonts w:ascii="Times New Roman" w:eastAsia="黑体" w:hAnsi="Times New Roman"/>
@@ -9558,7 +9781,7 @@
         <w:pStyle w:val="21"/>
         <w:spacing w:after="120"/>
       </w:pPr>
-      <w:bookmarkStart w:id="22" w:name="_Toc243217423"/>
+      <w:bookmarkStart w:id="22" w:name="_Toc243218787"/>
       <w:r>
         <w:rPr>
           <w:rFonts w:ascii="Times New Roman" w:eastAsia="黑体" w:hAnsi="Times New Roman"/>
@@ -9696,7 +9919,7 @@
         <w:pStyle w:val="21"/>
         <w:spacing w:after="120"/>
       </w:pPr>
-      <w:bookmarkStart w:id="23" w:name="_Toc243217424"/>
+      <w:bookmarkStart w:id="23" w:name="_Toc243218788"/>
       <w:r>
         <w:rPr>
           <w:rFonts w:ascii="Times New Roman" w:eastAsia="黑体" w:hAnsi="Times New Roman"/>
@@ -9932,7 +10155,7 @@
         <w:pStyle w:val="21"/>
         <w:spacing w:after="120"/>
       </w:pPr>
-      <w:bookmarkStart w:id="24" w:name="_Toc243217425"/>
+      <w:bookmarkStart w:id="24" w:name="_Toc243218789"/>
       <w:r>
         <w:rPr>
           <w:rFonts w:ascii="Times New Roman" w:eastAsia="黑体" w:hAnsi="Times New Roman"/>
@@ -10048,12 +10271,13 @@
         <w:pStyle w:val="21"/>
         <w:spacing w:after="120"/>
       </w:pPr>
-      <w:bookmarkStart w:id="25" w:name="_Toc243217426"/>
+      <w:bookmarkStart w:id="25" w:name="_Toc243218790"/>
       <w:r>
         <w:rPr>
           <w:rFonts w:ascii="Times New Roman" w:eastAsia="黑体" w:hAnsi="Times New Roman"/>
           <w:color w:val="000000"/>
         </w:rPr>
+        <w:lastRenderedPageBreak/>
         <w:t xml:space="preserve">7.8 2018 </w:t>
       </w:r>
       <w:r>
@@ -10346,7 +10570,6 @@
         <w:rPr>
           <w:color w:val="000000"/>
         </w:rPr>
-        <w:lastRenderedPageBreak/>
         <w:t>榜单。沿用后</w:t>
       </w:r>
       <w:r>
@@ -10379,7 +10602,7 @@
         <w:pStyle w:val="21"/>
         <w:spacing w:after="120"/>
       </w:pPr>
-      <w:bookmarkStart w:id="26" w:name="_Toc243217427"/>
+      <w:bookmarkStart w:id="26" w:name="_Toc243218791"/>
       <w:r>
         <w:rPr>
           <w:rFonts w:ascii="Times New Roman" w:eastAsia="黑体" w:hAnsi="Times New Roman"/>
@@ -10481,7 +10704,7 @@
         <w:pStyle w:val="21"/>
         <w:spacing w:after="120"/>
       </w:pPr>
-      <w:bookmarkStart w:id="27" w:name="_Toc243217428"/>
+      <w:bookmarkStart w:id="27" w:name="_Toc243218792"/>
       <w:r>
         <w:rPr>
           <w:rFonts w:ascii="Times New Roman" w:eastAsia="黑体" w:hAnsi="Times New Roman"/>
@@ -10619,7 +10842,7 @@
         <w:pStyle w:val="21"/>
         <w:spacing w:after="120"/>
       </w:pPr>
-      <w:bookmarkStart w:id="28" w:name="_Toc243217429"/>
+      <w:bookmarkStart w:id="28" w:name="_Toc243218793"/>
       <w:r>
         <w:rPr>
           <w:rFonts w:ascii="Times New Roman" w:eastAsia="黑体" w:hAnsi="Times New Roman"/>
@@ -10687,7 +10910,7 @@
         <w:pStyle w:val="21"/>
         <w:spacing w:after="120"/>
       </w:pPr>
-      <w:bookmarkStart w:id="29" w:name="_Toc243217430"/>
+      <w:bookmarkStart w:id="29" w:name="_Toc243218794"/>
       <w:r>
         <w:rPr>
           <w:rFonts w:ascii="Times New Roman" w:eastAsia="黑体" w:hAnsi="Times New Roman"/>
@@ -10735,7 +10958,7 @@
         <w:pStyle w:val="21"/>
         <w:spacing w:after="120"/>
       </w:pPr>
-      <w:bookmarkStart w:id="30" w:name="_Toc243217431"/>
+      <w:bookmarkStart w:id="30" w:name="_Toc243218795"/>
       <w:r>
         <w:rPr>
           <w:rFonts w:ascii="Times New Roman" w:eastAsia="黑体" w:hAnsi="Times New Roman"/>
@@ -10899,13 +11122,14 @@
         <w:pStyle w:val="1"/>
         <w:spacing w:before="280" w:after="120"/>
       </w:pPr>
-      <w:bookmarkStart w:id="31" w:name="_Toc243217432"/>
+      <w:bookmarkStart w:id="31" w:name="_Toc243218796"/>
       <w:r>
         <w:rPr>
           <w:rFonts w:ascii="Times New Roman" w:eastAsia="黑体" w:hAnsi="Times New Roman"/>
           <w:color w:val="000000"/>
           <w:sz w:val="30"/>
         </w:rPr>
+        <w:lastRenderedPageBreak/>
         <w:t xml:space="preserve">8. </w:t>
       </w:r>
       <w:r>
@@ -11170,7 +11394,6 @@
                 <w:color w:val="000000"/>
                 <w:sz w:val="21"/>
               </w:rPr>
-              <w:lastRenderedPageBreak/>
               <w:t>停牌、缺失、节假日不能用同一种删除方法</w:t>
             </w:r>
           </w:p>
@@ -11698,7 +11921,7 @@
         <w:pStyle w:val="21"/>
         <w:spacing w:after="120"/>
       </w:pPr>
-      <w:bookmarkStart w:id="32" w:name="_Toc243217433"/>
+      <w:bookmarkStart w:id="32" w:name="_Toc243218797"/>
       <w:r>
         <w:rPr>
           <w:rFonts w:ascii="Times New Roman" w:eastAsia="黑体" w:hAnsi="Times New Roman"/>
@@ -11963,6 +12186,7 @@
                 <w:color w:val="000000"/>
                 <w:sz w:val="21"/>
               </w:rPr>
+              <w:lastRenderedPageBreak/>
               <w:t>CAR[-1,+1]</w:t>
             </w:r>
           </w:p>
@@ -12558,7 +12782,6 @@
         <w:rPr>
           <w:color w:val="000000"/>
         </w:rPr>
-        <w:lastRenderedPageBreak/>
         <w:t>同股同日先取均值的聚类稳健版结论一致：调高</w:t>
       </w:r>
       <w:r>
@@ -12707,7 +12930,7 @@
         <w:pStyle w:val="21"/>
         <w:spacing w:after="120"/>
       </w:pPr>
-      <w:bookmarkStart w:id="33" w:name="_Toc243217434"/>
+      <w:bookmarkStart w:id="33" w:name="_Toc243218798"/>
       <w:r>
         <w:rPr>
           <w:rFonts w:ascii="Times New Roman" w:eastAsia="黑体" w:hAnsi="Times New Roman"/>
@@ -14112,6 +14335,7 @@
         <w:rPr>
           <w:color w:val="000000"/>
         </w:rPr>
+        <w:lastRenderedPageBreak/>
         <w:t>合起来的故事：明星身份带来更大的公告日冲击，并且在短期（下调</w:t>
       </w:r>
       <w:r>
@@ -14185,6 +14409,933 @@
           <w:color w:val="000000"/>
         </w:rPr>
         <w:t>检验把重叠事件当独立观测，显著性会被高估，最终版必须按股票或研报聚类。</w:t>
+      </w:r>
+    </w:p>
+    <w:p>
+      <w:pPr>
+        <w:pStyle w:val="21"/>
+        <w:spacing w:after="120"/>
+      </w:pPr>
+      <w:bookmarkStart w:id="34" w:name="_Toc243218799"/>
+      <w:r>
+        <w:rPr>
+          <w:rFonts w:ascii="Times New Roman" w:eastAsia="黑体" w:hAnsi="Times New Roman"/>
+          <w:color w:val="000000"/>
+        </w:rPr>
+        <w:t xml:space="preserve">8.3 </w:t>
+      </w:r>
+      <w:r>
+        <w:rPr>
+          <w:rFonts w:ascii="Times New Roman" w:eastAsia="黑体" w:hAnsi="Times New Roman"/>
+          <w:color w:val="000000"/>
+        </w:rPr>
+        <w:t>盈余预测误差（</w:t>
+      </w:r>
+      <w:r>
+        <w:rPr>
+          <w:rFonts w:ascii="Times New Roman" w:eastAsia="黑体" w:hAnsi="Times New Roman"/>
+          <w:color w:val="000000"/>
+        </w:rPr>
+        <w:t>2026-10-18</w:t>
+      </w:r>
+      <w:r>
+        <w:rPr>
+          <w:rFonts w:ascii="Times New Roman" w:eastAsia="黑体" w:hAnsi="Times New Roman"/>
+          <w:color w:val="000000"/>
+        </w:rPr>
+        <w:t>）</w:t>
+      </w:r>
+      <w:bookmarkEnd w:id="34"/>
+    </w:p>
+    <w:p>
+      <w:r>
+        <w:rPr>
+          <w:color w:val="000000"/>
+        </w:rPr>
+        <w:t>匹配</w:t>
+      </w:r>
+      <w:r>
+        <w:rPr>
+          <w:color w:val="000000"/>
+        </w:rPr>
+        <w:t xml:space="preserve"> 20,236 </w:t>
+      </w:r>
+      <w:r>
+        <w:rPr>
+          <w:color w:val="000000"/>
+        </w:rPr>
+        <w:t>条事件（占</w:t>
+      </w:r>
+      <w:r>
+        <w:rPr>
+          <w:color w:val="000000"/>
+        </w:rPr>
+        <w:t xml:space="preserve"> 96.5%</w:t>
+      </w:r>
+      <w:r>
+        <w:rPr>
+          <w:color w:val="000000"/>
+        </w:rPr>
+        <w:t>），当年</w:t>
+      </w:r>
+      <w:r>
+        <w:rPr>
+          <w:color w:val="000000"/>
+        </w:rPr>
+        <w:t xml:space="preserve"> EPS </w:t>
+      </w:r>
+      <w:r>
+        <w:rPr>
+          <w:color w:val="000000"/>
+        </w:rPr>
+        <w:t>实际值可用</w:t>
+      </w:r>
+      <w:r>
+        <w:rPr>
+          <w:color w:val="000000"/>
+        </w:rPr>
+        <w:t xml:space="preserve"> 20,055 </w:t>
+      </w:r>
+      <w:r>
+        <w:rPr>
+          <w:color w:val="000000"/>
+        </w:rPr>
+        <w:t>条，次年</w:t>
+      </w:r>
+      <w:r>
+        <w:rPr>
+          <w:color w:val="000000"/>
+        </w:rPr>
+        <w:t xml:space="preserve"> 17,020 </w:t>
+      </w:r>
+      <w:r>
+        <w:rPr>
+          <w:color w:val="000000"/>
+        </w:rPr>
+        <w:t>条（</w:t>
+      </w:r>
+      <w:r>
+        <w:rPr>
+          <w:color w:val="000000"/>
+        </w:rPr>
+        <w:t xml:space="preserve">2024 </w:t>
+      </w:r>
+      <w:r>
+        <w:rPr>
+          <w:color w:val="000000"/>
+        </w:rPr>
+        <w:t>年事件的次年实际值尚未拉取）。误差</w:t>
+      </w:r>
+      <w:r>
+        <w:rPr>
+          <w:color w:val="000000"/>
+        </w:rPr>
+        <w:t xml:space="preserve"> = |</w:t>
+      </w:r>
+      <w:r>
+        <w:rPr>
+          <w:color w:val="000000"/>
+        </w:rPr>
+        <w:t>预测</w:t>
+      </w:r>
+      <w:r>
+        <w:rPr>
+          <w:color w:val="000000"/>
+        </w:rPr>
+        <w:t xml:space="preserve"> EPS − </w:t>
+      </w:r>
+      <w:r>
+        <w:rPr>
+          <w:color w:val="000000"/>
+        </w:rPr>
+        <w:t>实际</w:t>
+      </w:r>
+      <w:r>
+        <w:rPr>
+          <w:color w:val="000000"/>
+        </w:rPr>
+        <w:t xml:space="preserve"> EPS| / </w:t>
+      </w:r>
+      <w:r>
+        <w:rPr>
+          <w:color w:val="000000"/>
+        </w:rPr>
+        <w:t>事件日收盘价</w:t>
+      </w:r>
+      <w:r>
+        <w:rPr>
+          <w:color w:val="000000"/>
+        </w:rPr>
+        <w:t xml:space="preserve"> × 100</w:t>
+      </w:r>
+      <w:r>
+        <w:rPr>
+          <w:color w:val="000000"/>
+        </w:rPr>
+        <w:t>，按</w:t>
+      </w:r>
+      <w:r>
+        <w:rPr>
+          <w:color w:val="000000"/>
+        </w:rPr>
+        <w:t xml:space="preserve"> 1% </w:t>
+      </w:r>
+      <w:r>
+        <w:rPr>
+          <w:color w:val="000000"/>
+        </w:rPr>
+        <w:t>与</w:t>
+      </w:r>
+      <w:r>
+        <w:rPr>
+          <w:color w:val="000000"/>
+        </w:rPr>
+        <w:t xml:space="preserve"> 99% </w:t>
+      </w:r>
+      <w:r>
+        <w:rPr>
+          <w:color w:val="000000"/>
+        </w:rPr>
+        <w:t>分位缩尾。</w:t>
+      </w:r>
+    </w:p>
+    <w:tbl>
+      <w:tblPr>
+        <w:tblStyle w:val="aff1"/>
+        <w:tblW w:w="0" w:type="auto"/>
+        <w:jc w:val="center"/>
+        <w:tblLook w:val="04A0" w:firstRow="1" w:lastRow="0" w:firstColumn="1" w:lastColumn="0" w:noHBand="0" w:noVBand="1"/>
+      </w:tblPr>
+      <w:tblGrid>
+        <w:gridCol w:w="1345"/>
+        <w:gridCol w:w="1345"/>
+        <w:gridCol w:w="1345"/>
+        <w:gridCol w:w="1347"/>
+        <w:gridCol w:w="1345"/>
+        <w:gridCol w:w="1345"/>
+        <w:gridCol w:w="1347"/>
+      </w:tblGrid>
+      <w:tr>
+        <w:trPr>
+          <w:cantSplit/>
+          <w:tblHeader/>
+          <w:jc w:val="center"/>
+        </w:trPr>
+        <w:tc>
+          <w:tcPr>
+            <w:tcW w:w="1345" w:type="dxa"/>
+            <w:shd w:val="clear" w:color="auto" w:fill="F2F2F2"/>
+          </w:tcPr>
+          <w:p>
+            <w:pPr>
+              <w:spacing w:after="40" w:line="276" w:lineRule="auto"/>
+            </w:pPr>
+            <w:r>
+              <w:rPr>
+                <w:b/>
+                <w:color w:val="000000"/>
+                <w:sz w:val="21"/>
+              </w:rPr>
+              <w:t>指标</w:t>
+            </w:r>
+          </w:p>
+        </w:tc>
+        <w:tc>
+          <w:tcPr>
+            <w:tcW w:w="1345" w:type="dxa"/>
+            <w:shd w:val="clear" w:color="auto" w:fill="F2F2F2"/>
+          </w:tcPr>
+          <w:p>
+            <w:pPr>
+              <w:spacing w:after="40" w:line="276" w:lineRule="auto"/>
+            </w:pPr>
+            <w:r>
+              <w:rPr>
+                <w:b/>
+                <w:color w:val="000000"/>
+                <w:sz w:val="21"/>
+              </w:rPr>
+              <w:t>调高：明星</w:t>
+            </w:r>
+          </w:p>
+        </w:tc>
+        <w:tc>
+          <w:tcPr>
+            <w:tcW w:w="1345" w:type="dxa"/>
+            <w:shd w:val="clear" w:color="auto" w:fill="F2F2F2"/>
+          </w:tcPr>
+          <w:p>
+            <w:pPr>
+              <w:spacing w:after="40" w:line="276" w:lineRule="auto"/>
+            </w:pPr>
+            <w:r>
+              <w:rPr>
+                <w:b/>
+                <w:color w:val="000000"/>
+                <w:sz w:val="21"/>
+              </w:rPr>
+              <w:t>非明星</w:t>
+            </w:r>
+          </w:p>
+        </w:tc>
+        <w:tc>
+          <w:tcPr>
+            <w:tcW w:w="1345" w:type="dxa"/>
+            <w:shd w:val="clear" w:color="auto" w:fill="F2F2F2"/>
+          </w:tcPr>
+          <w:p>
+            <w:pPr>
+              <w:spacing w:after="40" w:line="276" w:lineRule="auto"/>
+            </w:pPr>
+            <w:r>
+              <w:rPr>
+                <w:b/>
+                <w:color w:val="000000"/>
+                <w:sz w:val="21"/>
+              </w:rPr>
+              <w:t>差</w:t>
+            </w:r>
+          </w:p>
+        </w:tc>
+        <w:tc>
+          <w:tcPr>
+            <w:tcW w:w="1345" w:type="dxa"/>
+            <w:shd w:val="clear" w:color="auto" w:fill="F2F2F2"/>
+          </w:tcPr>
+          <w:p>
+            <w:pPr>
+              <w:spacing w:after="40" w:line="276" w:lineRule="auto"/>
+            </w:pPr>
+            <w:r>
+              <w:rPr>
+                <w:b/>
+                <w:color w:val="000000"/>
+                <w:sz w:val="21"/>
+              </w:rPr>
+              <w:t>调低：明星</w:t>
+            </w:r>
+          </w:p>
+        </w:tc>
+        <w:tc>
+          <w:tcPr>
+            <w:tcW w:w="1345" w:type="dxa"/>
+            <w:shd w:val="clear" w:color="auto" w:fill="F2F2F2"/>
+          </w:tcPr>
+          <w:p>
+            <w:pPr>
+              <w:spacing w:after="40" w:line="276" w:lineRule="auto"/>
+            </w:pPr>
+            <w:r>
+              <w:rPr>
+                <w:b/>
+                <w:color w:val="000000"/>
+                <w:sz w:val="21"/>
+              </w:rPr>
+              <w:t>非明星</w:t>
+            </w:r>
+          </w:p>
+        </w:tc>
+        <w:tc>
+          <w:tcPr>
+            <w:tcW w:w="1345" w:type="dxa"/>
+            <w:shd w:val="clear" w:color="auto" w:fill="F2F2F2"/>
+          </w:tcPr>
+          <w:p>
+            <w:pPr>
+              <w:spacing w:after="40" w:line="276" w:lineRule="auto"/>
+            </w:pPr>
+            <w:r>
+              <w:rPr>
+                <w:b/>
+                <w:color w:val="000000"/>
+                <w:sz w:val="21"/>
+              </w:rPr>
+              <w:t>差</w:t>
+            </w:r>
+          </w:p>
+        </w:tc>
+      </w:tr>
+      <w:tr>
+        <w:trPr>
+          <w:cantSplit/>
+          <w:jc w:val="center"/>
+        </w:trPr>
+        <w:tc>
+          <w:tcPr>
+            <w:tcW w:w="1345" w:type="dxa"/>
+          </w:tcPr>
+          <w:p>
+            <w:pPr>
+              <w:spacing w:after="40" w:line="276" w:lineRule="auto"/>
+            </w:pPr>
+            <w:r>
+              <w:rPr>
+                <w:color w:val="000000"/>
+                <w:sz w:val="21"/>
+              </w:rPr>
+              <w:t>当年</w:t>
+            </w:r>
+            <w:r>
+              <w:rPr>
+                <w:color w:val="000000"/>
+                <w:sz w:val="21"/>
+              </w:rPr>
+              <w:t xml:space="preserve"> EPS </w:t>
+            </w:r>
+            <w:r>
+              <w:rPr>
+                <w:color w:val="000000"/>
+                <w:sz w:val="21"/>
+              </w:rPr>
+              <w:t>绝对误差</w:t>
+            </w:r>
+          </w:p>
+        </w:tc>
+        <w:tc>
+          <w:tcPr>
+            <w:tcW w:w="1345" w:type="dxa"/>
+          </w:tcPr>
+          <w:p>
+            <w:pPr>
+              <w:spacing w:after="40" w:line="276" w:lineRule="auto"/>
+            </w:pPr>
+            <w:r>
+              <w:rPr>
+                <w:color w:val="000000"/>
+                <w:sz w:val="21"/>
+              </w:rPr>
+              <w:t>2.18</w:t>
+            </w:r>
+          </w:p>
+        </w:tc>
+        <w:tc>
+          <w:tcPr>
+            <w:tcW w:w="1345" w:type="dxa"/>
+          </w:tcPr>
+          <w:p>
+            <w:pPr>
+              <w:spacing w:after="40" w:line="276" w:lineRule="auto"/>
+            </w:pPr>
+            <w:r>
+              <w:rPr>
+                <w:color w:val="000000"/>
+                <w:sz w:val="21"/>
+              </w:rPr>
+              <w:t>1.89</w:t>
+            </w:r>
+          </w:p>
+        </w:tc>
+        <w:tc>
+          <w:tcPr>
+            <w:tcW w:w="1345" w:type="dxa"/>
+          </w:tcPr>
+          <w:p>
+            <w:pPr>
+              <w:spacing w:after="40" w:line="276" w:lineRule="auto"/>
+            </w:pPr>
+            <w:r>
+              <w:rPr>
+                <w:b/>
+                <w:color w:val="000000"/>
+                <w:sz w:val="21"/>
+              </w:rPr>
+              <w:t>+0.28</w:t>
+            </w:r>
+            <w:r>
+              <w:rPr>
+                <w:b/>
+                <w:color w:val="000000"/>
+                <w:sz w:val="21"/>
+              </w:rPr>
+              <w:t>（</w:t>
+            </w:r>
+            <w:r>
+              <w:rPr>
+                <w:b/>
+                <w:color w:val="000000"/>
+                <w:sz w:val="21"/>
+              </w:rPr>
+              <w:t>p=0.001</w:t>
+            </w:r>
+            <w:r>
+              <w:rPr>
+                <w:b/>
+                <w:color w:val="000000"/>
+                <w:sz w:val="21"/>
+              </w:rPr>
+              <w:t>）</w:t>
+            </w:r>
+          </w:p>
+        </w:tc>
+        <w:tc>
+          <w:tcPr>
+            <w:tcW w:w="1345" w:type="dxa"/>
+          </w:tcPr>
+          <w:p>
+            <w:pPr>
+              <w:spacing w:after="40" w:line="276" w:lineRule="auto"/>
+            </w:pPr>
+            <w:r>
+              <w:rPr>
+                <w:color w:val="000000"/>
+                <w:sz w:val="21"/>
+              </w:rPr>
+              <w:t>3.07</w:t>
+            </w:r>
+          </w:p>
+        </w:tc>
+        <w:tc>
+          <w:tcPr>
+            <w:tcW w:w="1345" w:type="dxa"/>
+          </w:tcPr>
+          <w:p>
+            <w:pPr>
+              <w:spacing w:after="40" w:line="276" w:lineRule="auto"/>
+            </w:pPr>
+            <w:r>
+              <w:rPr>
+                <w:color w:val="000000"/>
+                <w:sz w:val="21"/>
+              </w:rPr>
+              <w:t>2.61</w:t>
+            </w:r>
+          </w:p>
+        </w:tc>
+        <w:tc>
+          <w:tcPr>
+            <w:tcW w:w="1345" w:type="dxa"/>
+          </w:tcPr>
+          <w:p>
+            <w:pPr>
+              <w:spacing w:after="40" w:line="276" w:lineRule="auto"/>
+            </w:pPr>
+            <w:r>
+              <w:rPr>
+                <w:b/>
+                <w:color w:val="000000"/>
+                <w:sz w:val="21"/>
+              </w:rPr>
+              <w:t>+0.46</w:t>
+            </w:r>
+            <w:r>
+              <w:rPr>
+                <w:b/>
+                <w:color w:val="000000"/>
+                <w:sz w:val="21"/>
+              </w:rPr>
+              <w:t>（</w:t>
+            </w:r>
+            <w:r>
+              <w:rPr>
+                <w:b/>
+                <w:color w:val="000000"/>
+                <w:sz w:val="21"/>
+              </w:rPr>
+              <w:t>p=0.002</w:t>
+            </w:r>
+            <w:r>
+              <w:rPr>
+                <w:b/>
+                <w:color w:val="000000"/>
+                <w:sz w:val="21"/>
+              </w:rPr>
+              <w:t>）</w:t>
+            </w:r>
+          </w:p>
+        </w:tc>
+      </w:tr>
+      <w:tr>
+        <w:trPr>
+          <w:cantSplit/>
+          <w:jc w:val="center"/>
+        </w:trPr>
+        <w:tc>
+          <w:tcPr>
+            <w:tcW w:w="1345" w:type="dxa"/>
+          </w:tcPr>
+          <w:p>
+            <w:pPr>
+              <w:spacing w:after="40" w:line="276" w:lineRule="auto"/>
+            </w:pPr>
+            <w:r>
+              <w:rPr>
+                <w:color w:val="000000"/>
+                <w:sz w:val="21"/>
+              </w:rPr>
+              <w:t>次年</w:t>
+            </w:r>
+            <w:r>
+              <w:rPr>
+                <w:color w:val="000000"/>
+                <w:sz w:val="21"/>
+              </w:rPr>
+              <w:t xml:space="preserve"> EPS </w:t>
+            </w:r>
+            <w:r>
+              <w:rPr>
+                <w:color w:val="000000"/>
+                <w:sz w:val="21"/>
+              </w:rPr>
+              <w:t>绝对误差</w:t>
+            </w:r>
+          </w:p>
+        </w:tc>
+        <w:tc>
+          <w:tcPr>
+            <w:tcW w:w="1345" w:type="dxa"/>
+          </w:tcPr>
+          <w:p>
+            <w:pPr>
+              <w:spacing w:after="40" w:line="276" w:lineRule="auto"/>
+            </w:pPr>
+            <w:r>
+              <w:rPr>
+                <w:color w:val="000000"/>
+                <w:sz w:val="21"/>
+              </w:rPr>
+              <w:t>4.60</w:t>
+            </w:r>
+          </w:p>
+        </w:tc>
+        <w:tc>
+          <w:tcPr>
+            <w:tcW w:w="1345" w:type="dxa"/>
+          </w:tcPr>
+          <w:p>
+            <w:pPr>
+              <w:spacing w:after="40" w:line="276" w:lineRule="auto"/>
+            </w:pPr>
+            <w:r>
+              <w:rPr>
+                <w:color w:val="000000"/>
+                <w:sz w:val="21"/>
+              </w:rPr>
+              <w:t>4.20</w:t>
+            </w:r>
+          </w:p>
+        </w:tc>
+        <w:tc>
+          <w:tcPr>
+            <w:tcW w:w="1345" w:type="dxa"/>
+          </w:tcPr>
+          <w:p>
+            <w:pPr>
+              <w:spacing w:after="40" w:line="276" w:lineRule="auto"/>
+            </w:pPr>
+            <w:r>
+              <w:rPr>
+                <w:b/>
+                <w:color w:val="000000"/>
+                <w:sz w:val="21"/>
+              </w:rPr>
+              <w:t>+0.41</w:t>
+            </w:r>
+            <w:r>
+              <w:rPr>
+                <w:b/>
+                <w:color w:val="000000"/>
+                <w:sz w:val="21"/>
+              </w:rPr>
+              <w:t>（</w:t>
+            </w:r>
+            <w:r>
+              <w:rPr>
+                <w:b/>
+                <w:color w:val="000000"/>
+                <w:sz w:val="21"/>
+              </w:rPr>
+              <w:t>p=0.013</w:t>
+            </w:r>
+            <w:r>
+              <w:rPr>
+                <w:b/>
+                <w:color w:val="000000"/>
+                <w:sz w:val="21"/>
+              </w:rPr>
+              <w:t>）</w:t>
+            </w:r>
+          </w:p>
+        </w:tc>
+        <w:tc>
+          <w:tcPr>
+            <w:tcW w:w="1345" w:type="dxa"/>
+          </w:tcPr>
+          <w:p>
+            <w:pPr>
+              <w:spacing w:after="40" w:line="276" w:lineRule="auto"/>
+            </w:pPr>
+            <w:r>
+              <w:rPr>
+                <w:color w:val="000000"/>
+                <w:sz w:val="21"/>
+              </w:rPr>
+              <w:t>5.60</w:t>
+            </w:r>
+          </w:p>
+        </w:tc>
+        <w:tc>
+          <w:tcPr>
+            <w:tcW w:w="1345" w:type="dxa"/>
+          </w:tcPr>
+          <w:p>
+            <w:pPr>
+              <w:spacing w:after="40" w:line="276" w:lineRule="auto"/>
+            </w:pPr>
+            <w:r>
+              <w:rPr>
+                <w:color w:val="000000"/>
+                <w:sz w:val="21"/>
+              </w:rPr>
+              <w:t>4.64</w:t>
+            </w:r>
+          </w:p>
+        </w:tc>
+        <w:tc>
+          <w:tcPr>
+            <w:tcW w:w="1345" w:type="dxa"/>
+          </w:tcPr>
+          <w:p>
+            <w:pPr>
+              <w:spacing w:after="40" w:line="276" w:lineRule="auto"/>
+            </w:pPr>
+            <w:r>
+              <w:rPr>
+                <w:b/>
+                <w:color w:val="000000"/>
+                <w:sz w:val="21"/>
+              </w:rPr>
+              <w:t>+0.96</w:t>
+            </w:r>
+            <w:r>
+              <w:rPr>
+                <w:b/>
+                <w:color w:val="000000"/>
+                <w:sz w:val="21"/>
+              </w:rPr>
+              <w:t>（</w:t>
+            </w:r>
+            <w:r>
+              <w:rPr>
+                <w:b/>
+                <w:color w:val="000000"/>
+                <w:sz w:val="21"/>
+              </w:rPr>
+              <w:t>p&lt;0.001</w:t>
+            </w:r>
+            <w:r>
+              <w:rPr>
+                <w:b/>
+                <w:color w:val="000000"/>
+                <w:sz w:val="21"/>
+              </w:rPr>
+              <w:t>）</w:t>
+            </w:r>
+          </w:p>
+        </w:tc>
+      </w:tr>
+      <w:tr>
+        <w:trPr>
+          <w:cantSplit/>
+          <w:jc w:val="center"/>
+        </w:trPr>
+        <w:tc>
+          <w:tcPr>
+            <w:tcW w:w="1345" w:type="dxa"/>
+          </w:tcPr>
+          <w:p>
+            <w:pPr>
+              <w:spacing w:after="40" w:line="276" w:lineRule="auto"/>
+            </w:pPr>
+            <w:r>
+              <w:rPr>
+                <w:color w:val="000000"/>
+                <w:sz w:val="21"/>
+              </w:rPr>
+              <w:t>当年符号误差</w:t>
+            </w:r>
+          </w:p>
+        </w:tc>
+        <w:tc>
+          <w:tcPr>
+            <w:tcW w:w="1345" w:type="dxa"/>
+          </w:tcPr>
+          <w:p>
+            <w:pPr>
+              <w:spacing w:after="40" w:line="276" w:lineRule="auto"/>
+            </w:pPr>
+            <w:r>
+              <w:rPr>
+                <w:color w:val="000000"/>
+                <w:sz w:val="21"/>
+              </w:rPr>
+              <w:t>+1.28</w:t>
+            </w:r>
+          </w:p>
+        </w:tc>
+        <w:tc>
+          <w:tcPr>
+            <w:tcW w:w="1345" w:type="dxa"/>
+          </w:tcPr>
+          <w:p>
+            <w:pPr>
+              <w:spacing w:after="40" w:line="276" w:lineRule="auto"/>
+            </w:pPr>
+            <w:r>
+              <w:rPr>
+                <w:color w:val="000000"/>
+                <w:sz w:val="21"/>
+              </w:rPr>
+              <w:t>+1.13</w:t>
+            </w:r>
+          </w:p>
+        </w:tc>
+        <w:tc>
+          <w:tcPr>
+            <w:tcW w:w="1345" w:type="dxa"/>
+          </w:tcPr>
+          <w:p>
+            <w:pPr>
+              <w:spacing w:after="40" w:line="276" w:lineRule="auto"/>
+            </w:pPr>
+            <w:r>
+              <w:rPr>
+                <w:color w:val="000000"/>
+                <w:sz w:val="21"/>
+              </w:rPr>
+              <w:t>+0.15</w:t>
+            </w:r>
+            <w:r>
+              <w:rPr>
+                <w:color w:val="000000"/>
+                <w:sz w:val="21"/>
+              </w:rPr>
+              <w:t>（</w:t>
+            </w:r>
+            <w:r>
+              <w:rPr>
+                <w:color w:val="000000"/>
+                <w:sz w:val="21"/>
+              </w:rPr>
+              <w:t>p=0.11</w:t>
+            </w:r>
+            <w:r>
+              <w:rPr>
+                <w:color w:val="000000"/>
+                <w:sz w:val="21"/>
+              </w:rPr>
+              <w:t>）</w:t>
+            </w:r>
+          </w:p>
+        </w:tc>
+        <w:tc>
+          <w:tcPr>
+            <w:tcW w:w="1345" w:type="dxa"/>
+          </w:tcPr>
+          <w:p>
+            <w:pPr>
+              <w:spacing w:after="40" w:line="276" w:lineRule="auto"/>
+            </w:pPr>
+            <w:r>
+              <w:rPr>
+                <w:color w:val="000000"/>
+                <w:sz w:val="21"/>
+              </w:rPr>
+              <w:t>+2.10</w:t>
+            </w:r>
+          </w:p>
+        </w:tc>
+        <w:tc>
+          <w:tcPr>
+            <w:tcW w:w="1345" w:type="dxa"/>
+          </w:tcPr>
+          <w:p>
+            <w:pPr>
+              <w:spacing w:after="40" w:line="276" w:lineRule="auto"/>
+            </w:pPr>
+            <w:r>
+              <w:rPr>
+                <w:color w:val="000000"/>
+                <w:sz w:val="21"/>
+              </w:rPr>
+              <w:t>+1.93</w:t>
+            </w:r>
+          </w:p>
+        </w:tc>
+        <w:tc>
+          <w:tcPr>
+            <w:tcW w:w="1345" w:type="dxa"/>
+          </w:tcPr>
+          <w:p>
+            <w:pPr>
+              <w:spacing w:after="40" w:line="276" w:lineRule="auto"/>
+            </w:pPr>
+            <w:r>
+              <w:rPr>
+                <w:color w:val="000000"/>
+                <w:sz w:val="21"/>
+              </w:rPr>
+              <w:t>+0.18</w:t>
+            </w:r>
+            <w:r>
+              <w:rPr>
+                <w:color w:val="000000"/>
+                <w:sz w:val="21"/>
+              </w:rPr>
+              <w:t>（</w:t>
+            </w:r>
+            <w:r>
+              <w:rPr>
+                <w:color w:val="000000"/>
+                <w:sz w:val="21"/>
+              </w:rPr>
+              <w:t>p=0.24</w:t>
+            </w:r>
+            <w:r>
+              <w:rPr>
+                <w:color w:val="000000"/>
+                <w:sz w:val="21"/>
+              </w:rPr>
+              <w:t>）</w:t>
+            </w:r>
+          </w:p>
+        </w:tc>
+      </w:tr>
+    </w:tbl>
+    <w:p>
+      <w:pPr>
+        <w:spacing w:after="0"/>
+      </w:pPr>
+    </w:p>
+    <w:p>
+      <w:r>
+        <w:rPr>
+          <w:color w:val="000000"/>
+        </w:rPr>
+        <w:t>明星的绝对预测误差更大，且四个格子都显著；符号误差没有显著差异，说明不是更乐观，而是偏差更大。一个不能忽略的解释是覆盖股票本身更难、预测更激进，属于未控制的选择差异，因此不能直接把这项读成</w:t>
+      </w:r>
+      <w:r>
+        <w:rPr>
+          <w:color w:val="000000"/>
+        </w:rPr>
+        <w:t>"</w:t>
+      </w:r>
+      <w:r>
+        <w:rPr>
+          <w:color w:val="000000"/>
+        </w:rPr>
+        <w:t>能力更差</w:t>
+      </w:r>
+      <w:r>
+        <w:rPr>
+          <w:color w:val="000000"/>
+        </w:rPr>
+        <w:t>"</w:t>
+      </w:r>
+      <w:r>
+        <w:rPr>
+          <w:color w:val="000000"/>
+        </w:rPr>
+        <w:t>。但它至少说明：盈余预测这一维度上，没有证据支持明星更准。</w:t>
       </w:r>
     </w:p>
     <w:p>
@@ -14192,7 +15343,7 @@
         <w:pStyle w:val="1"/>
         <w:spacing w:before="280" w:after="120"/>
       </w:pPr>
-      <w:bookmarkStart w:id="34" w:name="_Toc243217435"/>
+      <w:bookmarkStart w:id="35" w:name="_Toc243218800"/>
       <w:r>
         <w:rPr>
           <w:rFonts w:ascii="Times New Roman" w:eastAsia="黑体" w:hAnsi="Times New Roman"/>
@@ -14209,7 +15360,7 @@
         </w:rPr>
         <w:t>与乙的边界和交接状态</w:t>
       </w:r>
-      <w:bookmarkEnd w:id="34"/>
+      <w:bookmarkEnd w:id="35"/>
     </w:p>
     <w:p>
       <w:r>
@@ -14250,7 +15401,6 @@
           <w:color w:val="000000"/>
           <w:sz w:val="22"/>
         </w:rPr>
-        <w:lastRenderedPageBreak/>
         <w:t>ref_newfortune_missing_tenure.csv</w:t>
       </w:r>
       <w:r>
@@ -14517,6 +15667,7 @@
         <w:rPr>
           <w:color w:val="000000"/>
         </w:rPr>
+        <w:lastRenderedPageBreak/>
         <w:t>非交易日对齐我们这边独立查过：事件落在周末的有</w:t>
       </w:r>
       <w:r>
@@ -14573,7 +15724,7 @@
         <w:pStyle w:val="1"/>
         <w:spacing w:before="280" w:after="120"/>
       </w:pPr>
-      <w:bookmarkStart w:id="35" w:name="_Toc243217436"/>
+      <w:bookmarkStart w:id="36" w:name="_Toc243218801"/>
       <w:r>
         <w:rPr>
           <w:rFonts w:ascii="Times New Roman" w:eastAsia="黑体" w:hAnsi="Times New Roman"/>
@@ -14590,7 +15741,7 @@
         </w:rPr>
         <w:t>待办与阻塞</w:t>
       </w:r>
-      <w:bookmarkEnd w:id="35"/>
+      <w:bookmarkEnd w:id="36"/>
     </w:p>
     <w:p>
       <w:pPr>
@@ -14861,7 +16012,7 @@
         <w:pStyle w:val="1"/>
         <w:spacing w:before="280" w:after="120"/>
       </w:pPr>
-      <w:bookmarkStart w:id="36" w:name="_Toc243217437"/>
+      <w:bookmarkStart w:id="37" w:name="_Toc243218802"/>
       <w:r>
         <w:rPr>
           <w:rFonts w:ascii="Times New Roman" w:eastAsia="黑体" w:hAnsi="Times New Roman"/>
@@ -14878,7 +16029,7 @@
         </w:rPr>
         <w:t>文件导航</w:t>
       </w:r>
-      <w:bookmarkEnd w:id="36"/>
+      <w:bookmarkEnd w:id="37"/>
     </w:p>
     <w:p>
       <w:pPr>
@@ -15213,7 +16364,6 @@
         <w:rPr>
           <w:color w:val="000000"/>
         </w:rPr>
-        <w:lastRenderedPageBreak/>
         <w:t>文档构建方式：</w:t>
       </w:r>
       <w:r>
@@ -15618,31 +16768,31 @@
       </w:rPr>
     </w:lvl>
   </w:abstractNum>
-  <w:num w:numId="1" w16cid:durableId="751855725">
+  <w:num w:numId="1" w16cid:durableId="1254895889">
     <w:abstractNumId w:val="8"/>
   </w:num>
-  <w:num w:numId="2" w16cid:durableId="375858772">
+  <w:num w:numId="2" w16cid:durableId="1602183797">
     <w:abstractNumId w:val="6"/>
   </w:num>
-  <w:num w:numId="3" w16cid:durableId="2107383357">
+  <w:num w:numId="3" w16cid:durableId="692148150">
     <w:abstractNumId w:val="5"/>
   </w:num>
-  <w:num w:numId="4" w16cid:durableId="259606930">
+  <w:num w:numId="4" w16cid:durableId="708603792">
     <w:abstractNumId w:val="4"/>
   </w:num>
-  <w:num w:numId="5" w16cid:durableId="1222715610">
+  <w:num w:numId="5" w16cid:durableId="2108306224">
     <w:abstractNumId w:val="7"/>
   </w:num>
-  <w:num w:numId="6" w16cid:durableId="1719163633">
+  <w:num w:numId="6" w16cid:durableId="643660007">
     <w:abstractNumId w:val="3"/>
   </w:num>
-  <w:num w:numId="7" w16cid:durableId="370494884">
+  <w:num w:numId="7" w16cid:durableId="1960604302">
     <w:abstractNumId w:val="2"/>
   </w:num>
-  <w:num w:numId="8" w16cid:durableId="233592384">
+  <w:num w:numId="8" w16cid:durableId="16809305">
     <w:abstractNumId w:val="1"/>
   </w:num>
-  <w:num w:numId="9" w16cid:durableId="1008213954">
+  <w:num w:numId="9" w16cid:durableId="1062289768">
     <w:abstractNumId w:val="0"/>
   </w:num>
 </w:numbering>
@@ -27041,7 +28191,7 @@
     <w:autoRedefine/>
     <w:uiPriority w:val="39"/>
     <w:unhideWhenUsed/>
-    <w:rsid w:val="001A0225"/>
+    <w:rsid w:val="003D105F"/>
   </w:style>
   <w:style w:type="paragraph" w:styleId="TOC2">
     <w:name w:val="toc 2"/>
@@ -27050,7 +28200,7 @@
     <w:autoRedefine/>
     <w:uiPriority w:val="39"/>
     <w:unhideWhenUsed/>
-    <w:rsid w:val="001A0225"/>
+    <w:rsid w:val="003D105F"/>
     <w:pPr>
       <w:ind w:leftChars="200" w:left="420"/>
     </w:pPr>
@@ -27060,7 +28210,7 @@
     <w:basedOn w:val="a2"/>
     <w:uiPriority w:val="99"/>
     <w:unhideWhenUsed/>
-    <w:rsid w:val="001A0225"/>
+    <w:rsid w:val="003D105F"/>
     <w:rPr>
       <w:color w:val="0000FF" w:themeColor="hyperlink"/>
       <w:u w:val="single"/>

</xml_diff>

<commit_message>
Simplify the one-page status in the memo and README
Co-Authored-By: Claude Code <noreply@anthropic.com>
</commit_message>
<xml_diff>
--- a/文档/项目进度与技术备忘_20261018.docx
+++ b/文档/项目进度与技术备忘_20261018.docx
@@ -118,7 +118,7 @@
         </w:rPr>
         <w:fldChar w:fldCharType="separate"/>
       </w:r>
-      <w:hyperlink w:anchor="_Toc243218765" w:history="1">
+      <w:hyperlink w:anchor="_Toc243221337" w:history="1">
         <w:r>
           <w:rPr>
             <w:rStyle w:val="aff9"/>
@@ -180,7 +180,7 @@
             <w:noProof/>
             <w:webHidden/>
           </w:rPr>
-          <w:instrText>PAGEREF _Toc243218765 \h</w:instrText>
+          <w:instrText>PAGEREF _Toc243221337 \h</w:instrText>
         </w:r>
         <w:r>
           <w:rPr>
@@ -238,7 +238,7 @@
           <w14:ligatures w14:val="standardContextual"/>
         </w:rPr>
       </w:pPr>
-      <w:hyperlink w:anchor="_Toc243218766" w:history="1">
+      <w:hyperlink w:anchor="_Toc243221338" w:history="1">
         <w:r>
           <w:rPr>
             <w:rStyle w:val="aff9"/>
@@ -284,7 +284,7 @@
             <w:noProof/>
             <w:webHidden/>
           </w:rPr>
-          <w:instrText>PAGEREF _Toc243218766 \h</w:instrText>
+          <w:instrText>PAGEREF _Toc243221338 \h</w:instrText>
         </w:r>
         <w:r>
           <w:rPr>
@@ -343,7 +343,7 @@
           <w14:ligatures w14:val="standardContextual"/>
         </w:rPr>
       </w:pPr>
-      <w:hyperlink w:anchor="_Toc243218767" w:history="1">
+      <w:hyperlink w:anchor="_Toc243221339" w:history="1">
         <w:r>
           <w:rPr>
             <w:rStyle w:val="aff9"/>
@@ -389,7 +389,7 @@
             <w:noProof/>
             <w:webHidden/>
           </w:rPr>
-          <w:instrText>PAGEREF _Toc243218767 \h</w:instrText>
+          <w:instrText>PAGEREF _Toc243221339 \h</w:instrText>
         </w:r>
         <w:r>
           <w:rPr>
@@ -448,7 +448,7 @@
           <w14:ligatures w14:val="standardContextual"/>
         </w:rPr>
       </w:pPr>
-      <w:hyperlink w:anchor="_Toc243218768" w:history="1">
+      <w:hyperlink w:anchor="_Toc243221340" w:history="1">
         <w:r>
           <w:rPr>
             <w:rStyle w:val="aff9"/>
@@ -494,7 +494,7 @@
             <w:noProof/>
             <w:webHidden/>
           </w:rPr>
-          <w:instrText>PAGEREF _Toc243218768 \h</w:instrText>
+          <w:instrText>PAGEREF _Toc243221340 \h</w:instrText>
         </w:r>
         <w:r>
           <w:rPr>
@@ -553,7 +553,7 @@
           <w14:ligatures w14:val="standardContextual"/>
         </w:rPr>
       </w:pPr>
-      <w:hyperlink w:anchor="_Toc243218769" w:history="1">
+      <w:hyperlink w:anchor="_Toc243221341" w:history="1">
         <w:r>
           <w:rPr>
             <w:rStyle w:val="aff9"/>
@@ -599,7 +599,7 @@
             <w:noProof/>
             <w:webHidden/>
           </w:rPr>
-          <w:instrText>PAGEREF _Toc243218769 \h</w:instrText>
+          <w:instrText>PAGEREF _Toc243221341 \h</w:instrText>
         </w:r>
         <w:r>
           <w:rPr>
@@ -658,7 +658,7 @@
           <w14:ligatures w14:val="standardContextual"/>
         </w:rPr>
       </w:pPr>
-      <w:hyperlink w:anchor="_Toc243218770" w:history="1">
+      <w:hyperlink w:anchor="_Toc243221342" w:history="1">
         <w:r>
           <w:rPr>
             <w:rStyle w:val="aff9"/>
@@ -704,7 +704,7 @@
             <w:noProof/>
             <w:webHidden/>
           </w:rPr>
-          <w:instrText>PAGEREF _Toc243218770 \h</w:instrText>
+          <w:instrText>PAGEREF _Toc243221342 \h</w:instrText>
         </w:r>
         <w:r>
           <w:rPr>
@@ -734,7 +734,7 @@
             <w:noProof/>
             <w:webHidden/>
           </w:rPr>
-          <w:t>4</w:t>
+          <w:t>3</w:t>
         </w:r>
         <w:r>
           <w:rPr>
@@ -763,7 +763,7 @@
           <w14:ligatures w14:val="standardContextual"/>
         </w:rPr>
       </w:pPr>
-      <w:hyperlink w:anchor="_Toc243218771" w:history="1">
+      <w:hyperlink w:anchor="_Toc243221343" w:history="1">
         <w:r>
           <w:rPr>
             <w:rStyle w:val="aff9"/>
@@ -809,7 +809,7 @@
             <w:noProof/>
             <w:webHidden/>
           </w:rPr>
-          <w:instrText>PAGEREF _Toc243218771 \h</w:instrText>
+          <w:instrText>PAGEREF _Toc243221343 \h</w:instrText>
         </w:r>
         <w:r>
           <w:rPr>
@@ -868,7 +868,7 @@
           <w14:ligatures w14:val="standardContextual"/>
         </w:rPr>
       </w:pPr>
-      <w:hyperlink w:anchor="_Toc243218772" w:history="1">
+      <w:hyperlink w:anchor="_Toc243221344" w:history="1">
         <w:r>
           <w:rPr>
             <w:rStyle w:val="aff9"/>
@@ -914,7 +914,7 @@
             <w:noProof/>
             <w:webHidden/>
           </w:rPr>
-          <w:instrText>PAGEREF _Toc243218772 \h</w:instrText>
+          <w:instrText>PAGEREF _Toc243221344 \h</w:instrText>
         </w:r>
         <w:r>
           <w:rPr>
@@ -973,7 +973,7 @@
           <w14:ligatures w14:val="standardContextual"/>
         </w:rPr>
       </w:pPr>
-      <w:hyperlink w:anchor="_Toc243218773" w:history="1">
+      <w:hyperlink w:anchor="_Toc243221345" w:history="1">
         <w:r>
           <w:rPr>
             <w:rStyle w:val="aff9"/>
@@ -1019,7 +1019,7 @@
             <w:noProof/>
             <w:webHidden/>
           </w:rPr>
-          <w:instrText>PAGEREF _Toc243218773 \h</w:instrText>
+          <w:instrText>PAGEREF _Toc243221345 \h</w:instrText>
         </w:r>
         <w:r>
           <w:rPr>
@@ -1077,7 +1077,7 @@
           <w14:ligatures w14:val="standardContextual"/>
         </w:rPr>
       </w:pPr>
-      <w:hyperlink w:anchor="_Toc243218774" w:history="1">
+      <w:hyperlink w:anchor="_Toc243221346" w:history="1">
         <w:r>
           <w:rPr>
             <w:rStyle w:val="aff9"/>
@@ -1123,7 +1123,7 @@
             <w:noProof/>
             <w:webHidden/>
           </w:rPr>
-          <w:instrText>PAGEREF _Toc243218774 \h</w:instrText>
+          <w:instrText>PAGEREF _Toc243221346 \h</w:instrText>
         </w:r>
         <w:r>
           <w:rPr>
@@ -1181,7 +1181,7 @@
           <w14:ligatures w14:val="standardContextual"/>
         </w:rPr>
       </w:pPr>
-      <w:hyperlink w:anchor="_Toc243218775" w:history="1">
+      <w:hyperlink w:anchor="_Toc243221347" w:history="1">
         <w:r>
           <w:rPr>
             <w:rStyle w:val="aff9"/>
@@ -1227,7 +1227,7 @@
             <w:noProof/>
             <w:webHidden/>
           </w:rPr>
-          <w:instrText>PAGEREF _Toc243218775 \h</w:instrText>
+          <w:instrText>PAGEREF _Toc243221347 \h</w:instrText>
         </w:r>
         <w:r>
           <w:rPr>
@@ -1285,7 +1285,7 @@
           <w14:ligatures w14:val="standardContextual"/>
         </w:rPr>
       </w:pPr>
-      <w:hyperlink w:anchor="_Toc243218776" w:history="1">
+      <w:hyperlink w:anchor="_Toc243221348" w:history="1">
         <w:r>
           <w:rPr>
             <w:rStyle w:val="aff9"/>
@@ -1331,7 +1331,7 @@
             <w:noProof/>
             <w:webHidden/>
           </w:rPr>
-          <w:instrText>PAGEREF _Toc243218776 \h</w:instrText>
+          <w:instrText>PAGEREF _Toc243221348 \h</w:instrText>
         </w:r>
         <w:r>
           <w:rPr>
@@ -1389,7 +1389,7 @@
           <w14:ligatures w14:val="standardContextual"/>
         </w:rPr>
       </w:pPr>
-      <w:hyperlink w:anchor="_Toc243218777" w:history="1">
+      <w:hyperlink w:anchor="_Toc243221349" w:history="1">
         <w:r>
           <w:rPr>
             <w:rStyle w:val="aff9"/>
@@ -1435,7 +1435,7 @@
             <w:noProof/>
             <w:webHidden/>
           </w:rPr>
-          <w:instrText>PAGEREF _Toc243218777 \h</w:instrText>
+          <w:instrText>PAGEREF _Toc243221349 \h</w:instrText>
         </w:r>
         <w:r>
           <w:rPr>
@@ -1493,7 +1493,7 @@
           <w14:ligatures w14:val="standardContextual"/>
         </w:rPr>
       </w:pPr>
-      <w:hyperlink w:anchor="_Toc243218778" w:history="1">
+      <w:hyperlink w:anchor="_Toc243221350" w:history="1">
         <w:r>
           <w:rPr>
             <w:rStyle w:val="aff9"/>
@@ -1539,7 +1539,7 @@
             <w:noProof/>
             <w:webHidden/>
           </w:rPr>
-          <w:instrText>PAGEREF _Toc243218778 \h</w:instrText>
+          <w:instrText>PAGEREF _Toc243221350 \h</w:instrText>
         </w:r>
         <w:r>
           <w:rPr>
@@ -1598,7 +1598,7 @@
           <w14:ligatures w14:val="standardContextual"/>
         </w:rPr>
       </w:pPr>
-      <w:hyperlink w:anchor="_Toc243218779" w:history="1">
+      <w:hyperlink w:anchor="_Toc243221351" w:history="1">
         <w:r>
           <w:rPr>
             <w:rStyle w:val="aff9"/>
@@ -1644,7 +1644,7 @@
             <w:noProof/>
             <w:webHidden/>
           </w:rPr>
-          <w:instrText>PAGEREF _Toc243218779 \h</w:instrText>
+          <w:instrText>PAGEREF _Toc243221351 \h</w:instrText>
         </w:r>
         <w:r>
           <w:rPr>
@@ -1703,7 +1703,7 @@
           <w14:ligatures w14:val="standardContextual"/>
         </w:rPr>
       </w:pPr>
-      <w:hyperlink w:anchor="_Toc243218780" w:history="1">
+      <w:hyperlink w:anchor="_Toc243221352" w:history="1">
         <w:r>
           <w:rPr>
             <w:rStyle w:val="aff9"/>
@@ -1749,7 +1749,7 @@
             <w:noProof/>
             <w:webHidden/>
           </w:rPr>
-          <w:instrText>PAGEREF _Toc243218780 \h</w:instrText>
+          <w:instrText>PAGEREF _Toc243221352 \h</w:instrText>
         </w:r>
         <w:r>
           <w:rPr>
@@ -1808,7 +1808,7 @@
           <w14:ligatures w14:val="standardContextual"/>
         </w:rPr>
       </w:pPr>
-      <w:hyperlink w:anchor="_Toc243218781" w:history="1">
+      <w:hyperlink w:anchor="_Toc243221353" w:history="1">
         <w:r>
           <w:rPr>
             <w:rStyle w:val="aff9"/>
@@ -1854,7 +1854,7 @@
             <w:noProof/>
             <w:webHidden/>
           </w:rPr>
-          <w:instrText>PAGEREF _Toc243218781 \h</w:instrText>
+          <w:instrText>PAGEREF _Toc243221353 \h</w:instrText>
         </w:r>
         <w:r>
           <w:rPr>
@@ -1884,7 +1884,7 @@
             <w:noProof/>
             <w:webHidden/>
           </w:rPr>
-          <w:t>7</w:t>
+          <w:t>6</w:t>
         </w:r>
         <w:r>
           <w:rPr>
@@ -1912,7 +1912,7 @@
           <w14:ligatures w14:val="standardContextual"/>
         </w:rPr>
       </w:pPr>
-      <w:hyperlink w:anchor="_Toc243218782" w:history="1">
+      <w:hyperlink w:anchor="_Toc243221354" w:history="1">
         <w:r>
           <w:rPr>
             <w:rStyle w:val="aff9"/>
@@ -1958,7 +1958,7 @@
             <w:noProof/>
             <w:webHidden/>
           </w:rPr>
-          <w:instrText>PAGEREF _Toc243218782 \h</w:instrText>
+          <w:instrText>PAGEREF _Toc243221354 \h</w:instrText>
         </w:r>
         <w:r>
           <w:rPr>
@@ -2017,7 +2017,7 @@
           <w14:ligatures w14:val="standardContextual"/>
         </w:rPr>
       </w:pPr>
-      <w:hyperlink w:anchor="_Toc243218783" w:history="1">
+      <w:hyperlink w:anchor="_Toc243221355" w:history="1">
         <w:r>
           <w:rPr>
             <w:rStyle w:val="aff9"/>
@@ -2063,7 +2063,7 @@
             <w:noProof/>
             <w:webHidden/>
           </w:rPr>
-          <w:instrText>PAGEREF _Toc243218783 \h</w:instrText>
+          <w:instrText>PAGEREF _Toc243221355 \h</w:instrText>
         </w:r>
         <w:r>
           <w:rPr>
@@ -2122,7 +2122,7 @@
           <w14:ligatures w14:val="standardContextual"/>
         </w:rPr>
       </w:pPr>
-      <w:hyperlink w:anchor="_Toc243218784" w:history="1">
+      <w:hyperlink w:anchor="_Toc243221356" w:history="1">
         <w:r>
           <w:rPr>
             <w:rStyle w:val="aff9"/>
@@ -2168,7 +2168,7 @@
             <w:noProof/>
             <w:webHidden/>
           </w:rPr>
-          <w:instrText>PAGEREF _Toc243218784 \h</w:instrText>
+          <w:instrText>PAGEREF _Toc243221356 \h</w:instrText>
         </w:r>
         <w:r>
           <w:rPr>
@@ -2227,7 +2227,7 @@
           <w14:ligatures w14:val="standardContextual"/>
         </w:rPr>
       </w:pPr>
-      <w:hyperlink w:anchor="_Toc243218785" w:history="1">
+      <w:hyperlink w:anchor="_Toc243221357" w:history="1">
         <w:r>
           <w:rPr>
             <w:rStyle w:val="aff9"/>
@@ -2273,7 +2273,7 @@
             <w:noProof/>
             <w:webHidden/>
           </w:rPr>
-          <w:instrText>PAGEREF _Toc243218785 \h</w:instrText>
+          <w:instrText>PAGEREF _Toc243221357 \h</w:instrText>
         </w:r>
         <w:r>
           <w:rPr>
@@ -2332,7 +2332,7 @@
           <w14:ligatures w14:val="standardContextual"/>
         </w:rPr>
       </w:pPr>
-      <w:hyperlink w:anchor="_Toc243218786" w:history="1">
+      <w:hyperlink w:anchor="_Toc243221358" w:history="1">
         <w:r>
           <w:rPr>
             <w:rStyle w:val="aff9"/>
@@ -2378,7 +2378,7 @@
             <w:noProof/>
             <w:webHidden/>
           </w:rPr>
-          <w:instrText>PAGEREF _Toc243218786 \h</w:instrText>
+          <w:instrText>PAGEREF _Toc243221358 \h</w:instrText>
         </w:r>
         <w:r>
           <w:rPr>
@@ -2437,7 +2437,7 @@
           <w14:ligatures w14:val="standardContextual"/>
         </w:rPr>
       </w:pPr>
-      <w:hyperlink w:anchor="_Toc243218787" w:history="1">
+      <w:hyperlink w:anchor="_Toc243221359" w:history="1">
         <w:r>
           <w:rPr>
             <w:rStyle w:val="aff9"/>
@@ -2483,7 +2483,7 @@
             <w:noProof/>
             <w:webHidden/>
           </w:rPr>
-          <w:instrText>PAGEREF _Toc243218787 \h</w:instrText>
+          <w:instrText>PAGEREF _Toc243221359 \h</w:instrText>
         </w:r>
         <w:r>
           <w:rPr>
@@ -2542,7 +2542,7 @@
           <w14:ligatures w14:val="standardContextual"/>
         </w:rPr>
       </w:pPr>
-      <w:hyperlink w:anchor="_Toc243218788" w:history="1">
+      <w:hyperlink w:anchor="_Toc243221360" w:history="1">
         <w:r>
           <w:rPr>
             <w:rStyle w:val="aff9"/>
@@ -2604,7 +2604,7 @@
             <w:noProof/>
             <w:webHidden/>
           </w:rPr>
-          <w:instrText>PAGEREF _Toc243218788 \h</w:instrText>
+          <w:instrText>PAGEREF _Toc243221360 \h</w:instrText>
         </w:r>
         <w:r>
           <w:rPr>
@@ -2663,7 +2663,7 @@
           <w14:ligatures w14:val="standardContextual"/>
         </w:rPr>
       </w:pPr>
-      <w:hyperlink w:anchor="_Toc243218789" w:history="1">
+      <w:hyperlink w:anchor="_Toc243221361" w:history="1">
         <w:r>
           <w:rPr>
             <w:rStyle w:val="aff9"/>
@@ -2709,7 +2709,7 @@
             <w:noProof/>
             <w:webHidden/>
           </w:rPr>
-          <w:instrText>PAGEREF _Toc243218789 \h</w:instrText>
+          <w:instrText>PAGEREF _Toc243221361 \h</w:instrText>
         </w:r>
         <w:r>
           <w:rPr>
@@ -2768,7 +2768,7 @@
           <w14:ligatures w14:val="standardContextual"/>
         </w:rPr>
       </w:pPr>
-      <w:hyperlink w:anchor="_Toc243218790" w:history="1">
+      <w:hyperlink w:anchor="_Toc243221362" w:history="1">
         <w:r>
           <w:rPr>
             <w:rStyle w:val="aff9"/>
@@ -2814,7 +2814,7 @@
             <w:noProof/>
             <w:webHidden/>
           </w:rPr>
-          <w:instrText>PAGEREF _Toc243218790 \h</w:instrText>
+          <w:instrText>PAGEREF _Toc243221362 \h</w:instrText>
         </w:r>
         <w:r>
           <w:rPr>
@@ -2844,7 +2844,7 @@
             <w:noProof/>
             <w:webHidden/>
           </w:rPr>
-          <w:t>9</w:t>
+          <w:t>8</w:t>
         </w:r>
         <w:r>
           <w:rPr>
@@ -2873,7 +2873,7 @@
           <w14:ligatures w14:val="standardContextual"/>
         </w:rPr>
       </w:pPr>
-      <w:hyperlink w:anchor="_Toc243218791" w:history="1">
+      <w:hyperlink w:anchor="_Toc243221363" w:history="1">
         <w:r>
           <w:rPr>
             <w:rStyle w:val="aff9"/>
@@ -2919,7 +2919,7 @@
             <w:noProof/>
             <w:webHidden/>
           </w:rPr>
-          <w:instrText>PAGEREF _Toc243218791 \h</w:instrText>
+          <w:instrText>PAGEREF _Toc243221363 \h</w:instrText>
         </w:r>
         <w:r>
           <w:rPr>
@@ -2978,7 +2978,7 @@
           <w14:ligatures w14:val="standardContextual"/>
         </w:rPr>
       </w:pPr>
-      <w:hyperlink w:anchor="_Toc243218792" w:history="1">
+      <w:hyperlink w:anchor="_Toc243221364" w:history="1">
         <w:r>
           <w:rPr>
             <w:rStyle w:val="aff9"/>
@@ -3024,7 +3024,7 @@
             <w:noProof/>
             <w:webHidden/>
           </w:rPr>
-          <w:instrText>PAGEREF _Toc243218792 \h</w:instrText>
+          <w:instrText>PAGEREF _Toc243221364 \h</w:instrText>
         </w:r>
         <w:r>
           <w:rPr>
@@ -3083,7 +3083,7 @@
           <w14:ligatures w14:val="standardContextual"/>
         </w:rPr>
       </w:pPr>
-      <w:hyperlink w:anchor="_Toc243218793" w:history="1">
+      <w:hyperlink w:anchor="_Toc243221365" w:history="1">
         <w:r>
           <w:rPr>
             <w:rStyle w:val="aff9"/>
@@ -3145,7 +3145,7 @@
             <w:noProof/>
             <w:webHidden/>
           </w:rPr>
-          <w:instrText>PAGEREF _Toc243218793 \h</w:instrText>
+          <w:instrText>PAGEREF _Toc243221365 \h</w:instrText>
         </w:r>
         <w:r>
           <w:rPr>
@@ -3204,7 +3204,7 @@
           <w14:ligatures w14:val="standardContextual"/>
         </w:rPr>
       </w:pPr>
-      <w:hyperlink w:anchor="_Toc243218794" w:history="1">
+      <w:hyperlink w:anchor="_Toc243221366" w:history="1">
         <w:r>
           <w:rPr>
             <w:rStyle w:val="aff9"/>
@@ -3250,7 +3250,7 @@
             <w:noProof/>
             <w:webHidden/>
           </w:rPr>
-          <w:instrText>PAGEREF _Toc243218794 \h</w:instrText>
+          <w:instrText>PAGEREF _Toc243221366 \h</w:instrText>
         </w:r>
         <w:r>
           <w:rPr>
@@ -3309,7 +3309,7 @@
           <w14:ligatures w14:val="standardContextual"/>
         </w:rPr>
       </w:pPr>
-      <w:hyperlink w:anchor="_Toc243218795" w:history="1">
+      <w:hyperlink w:anchor="_Toc243221367" w:history="1">
         <w:r>
           <w:rPr>
             <w:rStyle w:val="aff9"/>
@@ -3355,7 +3355,7 @@
             <w:noProof/>
             <w:webHidden/>
           </w:rPr>
-          <w:instrText>PAGEREF _Toc243218795 \h</w:instrText>
+          <w:instrText>PAGEREF _Toc243221367 \h</w:instrText>
         </w:r>
         <w:r>
           <w:rPr>
@@ -3413,7 +3413,7 @@
           <w14:ligatures w14:val="standardContextual"/>
         </w:rPr>
       </w:pPr>
-      <w:hyperlink w:anchor="_Toc243218796" w:history="1">
+      <w:hyperlink w:anchor="_Toc243221368" w:history="1">
         <w:r>
           <w:rPr>
             <w:rStyle w:val="aff9"/>
@@ -3467,7 +3467,7 @@
             <w:noProof/>
             <w:webHidden/>
           </w:rPr>
-          <w:instrText>PAGEREF _Toc243218796 \h</w:instrText>
+          <w:instrText>PAGEREF _Toc243221368 \h</w:instrText>
         </w:r>
         <w:r>
           <w:rPr>
@@ -3497,7 +3497,7 @@
             <w:noProof/>
             <w:webHidden/>
           </w:rPr>
-          <w:t>10</w:t>
+          <w:t>9</w:t>
         </w:r>
         <w:r>
           <w:rPr>
@@ -3526,7 +3526,7 @@
           <w14:ligatures w14:val="standardContextual"/>
         </w:rPr>
       </w:pPr>
-      <w:hyperlink w:anchor="_Toc243218797" w:history="1">
+      <w:hyperlink w:anchor="_Toc243221369" w:history="1">
         <w:r>
           <w:rPr>
             <w:rStyle w:val="aff9"/>
@@ -3588,7 +3588,7 @@
             <w:noProof/>
             <w:webHidden/>
           </w:rPr>
-          <w:instrText>PAGEREF _Toc243218797 \h</w:instrText>
+          <w:instrText>PAGEREF _Toc243221369 \h</w:instrText>
         </w:r>
         <w:r>
           <w:rPr>
@@ -3647,7 +3647,7 @@
           <w14:ligatures w14:val="standardContextual"/>
         </w:rPr>
       </w:pPr>
-      <w:hyperlink w:anchor="_Toc243218798" w:history="1">
+      <w:hyperlink w:anchor="_Toc243221370" w:history="1">
         <w:r>
           <w:rPr>
             <w:rStyle w:val="aff9"/>
@@ -3709,7 +3709,7 @@
             <w:noProof/>
             <w:webHidden/>
           </w:rPr>
-          <w:instrText>PAGEREF _Toc243218798 \h</w:instrText>
+          <w:instrText>PAGEREF _Toc243221370 \h</w:instrText>
         </w:r>
         <w:r>
           <w:rPr>
@@ -3768,7 +3768,7 @@
           <w14:ligatures w14:val="standardContextual"/>
         </w:rPr>
       </w:pPr>
-      <w:hyperlink w:anchor="_Toc243218799" w:history="1">
+      <w:hyperlink w:anchor="_Toc243221371" w:history="1">
         <w:r>
           <w:rPr>
             <w:rStyle w:val="aff9"/>
@@ -3830,7 +3830,7 @@
             <w:noProof/>
             <w:webHidden/>
           </w:rPr>
-          <w:instrText>PAGEREF _Toc243218799 \h</w:instrText>
+          <w:instrText>PAGEREF _Toc243221371 \h</w:instrText>
         </w:r>
         <w:r>
           <w:rPr>
@@ -3860,7 +3860,7 @@
             <w:noProof/>
             <w:webHidden/>
           </w:rPr>
-          <w:t>12</w:t>
+          <w:t>11</w:t>
         </w:r>
         <w:r>
           <w:rPr>
@@ -3888,7 +3888,7 @@
           <w14:ligatures w14:val="standardContextual"/>
         </w:rPr>
       </w:pPr>
-      <w:hyperlink w:anchor="_Toc243218800" w:history="1">
+      <w:hyperlink w:anchor="_Toc243221372" w:history="1">
         <w:r>
           <w:rPr>
             <w:rStyle w:val="aff9"/>
@@ -3934,7 +3934,7 @@
             <w:noProof/>
             <w:webHidden/>
           </w:rPr>
-          <w:instrText>PAGEREF _Toc243218800 \h</w:instrText>
+          <w:instrText>PAGEREF _Toc243221372 \h</w:instrText>
         </w:r>
         <w:r>
           <w:rPr>
@@ -3992,7 +3992,7 @@
           <w14:ligatures w14:val="standardContextual"/>
         </w:rPr>
       </w:pPr>
-      <w:hyperlink w:anchor="_Toc243218801" w:history="1">
+      <w:hyperlink w:anchor="_Toc243221373" w:history="1">
         <w:r>
           <w:rPr>
             <w:rStyle w:val="aff9"/>
@@ -4038,7 +4038,7 @@
             <w:noProof/>
             <w:webHidden/>
           </w:rPr>
-          <w:instrText>PAGEREF _Toc243218801 \h</w:instrText>
+          <w:instrText>PAGEREF _Toc243221373 \h</w:instrText>
         </w:r>
         <w:r>
           <w:rPr>
@@ -4068,7 +4068,7 @@
             <w:noProof/>
             <w:webHidden/>
           </w:rPr>
-          <w:t>13</w:t>
+          <w:t>12</w:t>
         </w:r>
         <w:r>
           <w:rPr>
@@ -4096,7 +4096,7 @@
           <w14:ligatures w14:val="standardContextual"/>
         </w:rPr>
       </w:pPr>
-      <w:hyperlink w:anchor="_Toc243218802" w:history="1">
+      <w:hyperlink w:anchor="_Toc243221374" w:history="1">
         <w:r>
           <w:rPr>
             <w:rStyle w:val="aff9"/>
@@ -4142,7 +4142,7 @@
             <w:noProof/>
             <w:webHidden/>
           </w:rPr>
-          <w:instrText>PAGEREF _Toc243218802 \h</w:instrText>
+          <w:instrText>PAGEREF _Toc243221374 \h</w:instrText>
         </w:r>
         <w:r>
           <w:rPr>
@@ -4197,7 +4197,7 @@
         <w:pStyle w:val="1"/>
         <w:spacing w:before="280" w:after="120"/>
       </w:pPr>
-      <w:bookmarkStart w:id="0" w:name="_Toc243218765"/>
+      <w:bookmarkStart w:id="0" w:name="_Toc243221337"/>
       <w:r>
         <w:rPr>
           <w:rFonts w:ascii="Times New Roman" w:eastAsia="黑体" w:hAnsi="Times New Roman"/>
@@ -4231,6 +4231,22 @@
         <w:t>，首轮）</w:t>
       </w:r>
       <w:bookmarkEnd w:id="0"/>
+    </w:p>
+    <w:p>
+      <w:r>
+        <w:rPr>
+          <w:color w:val="000000"/>
+        </w:rPr>
+        <w:t>研究问题：市场跟随明星分析师的推荐，是因为他们更准，还是因为投资者盲从名气？</w:t>
+      </w:r>
+    </w:p>
+    <w:p>
+      <w:r>
+        <w:rPr>
+          <w:color w:val="000000"/>
+        </w:rPr>
+        <w:t>三个检验与目前的答案：</w:t>
+      </w:r>
     </w:p>
     <w:p>
       <w:pPr>
@@ -4247,25 +4263,13 @@
         <w:rPr>
           <w:color w:val="000000"/>
         </w:rPr>
-        <w:t>公告日：明星上调的</w:t>
-      </w:r>
-      <w:r>
-        <w:rPr>
-          <w:color w:val="000000"/>
-        </w:rPr>
-        <w:t xml:space="preserve"> CAR </w:t>
-      </w:r>
-      <w:r>
-        <w:rPr>
-          <w:color w:val="000000"/>
-        </w:rPr>
-        <w:t>与异常成交量显著更大（</w:t>
-      </w:r>
-      <w:r>
-        <w:rPr>
-          <w:color w:val="000000"/>
-        </w:rPr>
-        <w:t>[-1,+1] +0.38pp</w:t>
+        <w:t>公告日反应：明星上调显著更大（</w:t>
+      </w:r>
+      <w:r>
+        <w:rPr>
+          <w:color w:val="000000"/>
+        </w:rPr>
+        <w:t>CAR[-1,+1] +0.38pp</w:t>
       </w:r>
       <w:r>
         <w:rPr>
@@ -4283,7 +4287,7 @@
         <w:rPr>
           <w:color w:val="000000"/>
         </w:rPr>
-        <w:t>；成交量</w:t>
+        <w:t>；异常成交量</w:t>
       </w:r>
       <w:r>
         <w:rPr>
@@ -4307,7 +4311,7 @@
         <w:rPr>
           <w:color w:val="000000"/>
         </w:rPr>
-        <w:t>），同股同日聚类后同向。明星下调没有差异。</w:t>
+        <w:t>），下调没有差异。</w:t>
       </w:r>
     </w:p>
     <w:p>
@@ -4325,19 +4329,7 @@
         <w:rPr>
           <w:color w:val="000000"/>
         </w:rPr>
-        <w:t>公告日之后：明星下调的标的在</w:t>
-      </w:r>
-      <w:r>
-        <w:rPr>
-          <w:color w:val="000000"/>
-        </w:rPr>
-        <w:t xml:space="preserve"> 60 </w:t>
-      </w:r>
-      <w:r>
-        <w:rPr>
-          <w:color w:val="000000"/>
-        </w:rPr>
-        <w:t>个交易日内相对市场多跌</w:t>
+        <w:t>公告日之后：明星下调先多跌</w:t>
       </w:r>
       <w:r>
         <w:rPr>
@@ -4355,25 +4347,37 @@
         <w:rPr>
           <w:color w:val="000000"/>
         </w:rPr>
+        <w:t xml:space="preserve">60 </w:t>
+      </w:r>
+      <w:r>
+        <w:rPr>
+          <w:color w:val="000000"/>
+        </w:rPr>
+        <w:t>日，</w:t>
+      </w:r>
+      <w:r>
+        <w:rPr>
+          <w:color w:val="000000"/>
+        </w:rPr>
         <w:t>p=0.002</w:t>
       </w:r>
       <w:r>
         <w:rPr>
           <w:color w:val="000000"/>
         </w:rPr>
-        <w:t>），到</w:t>
-      </w:r>
-      <w:r>
-        <w:rPr>
-          <w:color w:val="000000"/>
-        </w:rPr>
-        <w:t xml:space="preserve"> 250 </w:t>
-      </w:r>
-      <w:r>
-        <w:rPr>
-          <w:color w:val="000000"/>
-        </w:rPr>
-        <w:t>日符号翻正；明星上调没有显著漂移。形态是先过度反应、后修复。</w:t>
+        <w:t>），</w:t>
+      </w:r>
+      <w:r>
+        <w:rPr>
+          <w:color w:val="000000"/>
+        </w:rPr>
+        <w:t xml:space="preserve">250 </w:t>
+      </w:r>
+      <w:r>
+        <w:rPr>
+          <w:color w:val="000000"/>
+        </w:rPr>
+        <w:t>日反转；明星上调没有显著漂移。</w:t>
       </w:r>
     </w:p>
     <w:p>
@@ -4391,7 +4395,7 @@
         <w:rPr>
           <w:color w:val="000000"/>
         </w:rPr>
-        <w:t>事后准确度（持有收益）：明星在短期略准（下调</w:t>
+        <w:t>事后准确度：持有收益短期略优（下调</w:t>
       </w:r>
       <w:r>
         <w:rPr>
@@ -4403,13 +4407,49 @@
         <w:rPr>
           <w:color w:val="000000"/>
         </w:rPr>
-        <w:t>个月差</w:t>
-      </w:r>
-      <w:r>
-        <w:rPr>
-          <w:color w:val="000000"/>
-        </w:rPr>
-        <w:t xml:space="preserve"> +1.77pp</w:t>
+        <w:t>个月、上调</w:t>
+      </w:r>
+      <w:r>
+        <w:rPr>
+          <w:color w:val="000000"/>
+        </w:rPr>
+        <w:t xml:space="preserve"> 6 </w:t>
+      </w:r>
+      <w:r>
+        <w:rPr>
+          <w:color w:val="000000"/>
+        </w:rPr>
+        <w:t>个月），</w:t>
+      </w:r>
+      <w:r>
+        <w:rPr>
+          <w:color w:val="000000"/>
+        </w:rPr>
+        <w:t xml:space="preserve">12 </w:t>
+      </w:r>
+      <w:r>
+        <w:rPr>
+          <w:color w:val="000000"/>
+        </w:rPr>
+        <w:t>个月消失；但盈余预测的绝对误差反而更大（当年上调组</w:t>
+      </w:r>
+      <w:r>
+        <w:rPr>
+          <w:color w:val="000000"/>
+        </w:rPr>
+        <w:t xml:space="preserve"> 2.18 </w:t>
+      </w:r>
+      <w:r>
+        <w:rPr>
+          <w:color w:val="000000"/>
+        </w:rPr>
+        <w:t>对</w:t>
+      </w:r>
+      <w:r>
+        <w:rPr>
+          <w:color w:val="000000"/>
+        </w:rPr>
+        <w:t xml:space="preserve"> 1.89</w:t>
       </w:r>
       <w:r>
         <w:rPr>
@@ -4427,157 +4467,15 @@
         <w:rPr>
           <w:color w:val="000000"/>
         </w:rPr>
-        <w:t>；上调</w:t>
-      </w:r>
-      <w:r>
-        <w:rPr>
-          <w:color w:val="000000"/>
-        </w:rPr>
-        <w:t xml:space="preserve"> 6 </w:t>
-      </w:r>
-      <w:r>
-        <w:rPr>
-          <w:color w:val="000000"/>
-        </w:rPr>
-        <w:t>个月差</w:t>
-      </w:r>
-      <w:r>
-        <w:rPr>
-          <w:color w:val="000000"/>
-        </w:rPr>
-        <w:t xml:space="preserve"> +1.60pp</w:t>
-      </w:r>
-      <w:r>
-        <w:rPr>
-          <w:color w:val="000000"/>
-        </w:rPr>
-        <w:t>，</w:t>
-      </w:r>
-      <w:r>
-        <w:rPr>
-          <w:color w:val="000000"/>
-        </w:rPr>
-        <w:t>p=0.037</w:t>
-      </w:r>
-      <w:r>
-        <w:rPr>
-          <w:color w:val="000000"/>
-        </w:rPr>
-        <w:t>），</w:t>
-      </w:r>
-      <w:r>
-        <w:rPr>
-          <w:color w:val="000000"/>
-        </w:rPr>
-        <w:t xml:space="preserve">12 </w:t>
-      </w:r>
-      <w:r>
-        <w:rPr>
-          <w:color w:val="000000"/>
-        </w:rPr>
-        <w:t>个月优势消失甚至反转。</w:t>
+        <w:t>）。</w:t>
       </w:r>
     </w:p>
     <w:p>
-      <w:pPr>
-        <w:spacing w:after="80"/>
-        <w:ind w:left="425" w:hanging="425"/>
-      </w:pPr>
-      <w:r>
-        <w:rPr>
-          <w:color w:val="000000"/>
-        </w:rPr>
-        <w:t xml:space="preserve">4. </w:t>
-      </w:r>
-      <w:r>
-        <w:rPr>
-          <w:color w:val="000000"/>
-        </w:rPr>
-        <w:t>事后准确度（盈余预测误差）：明星的绝对预测误差反而更大。当年</w:t>
-      </w:r>
-      <w:r>
-        <w:rPr>
-          <w:color w:val="000000"/>
-        </w:rPr>
-        <w:t xml:space="preserve"> EPS</w:t>
-      </w:r>
-      <w:r>
-        <w:rPr>
-          <w:color w:val="000000"/>
-        </w:rPr>
-        <w:t>，上调组</w:t>
-      </w:r>
-      <w:r>
-        <w:rPr>
-          <w:color w:val="000000"/>
-        </w:rPr>
-        <w:t xml:space="preserve"> 2.18 </w:t>
-      </w:r>
-      <w:r>
-        <w:rPr>
-          <w:color w:val="000000"/>
-        </w:rPr>
-        <w:t>对</w:t>
-      </w:r>
-      <w:r>
-        <w:rPr>
-          <w:color w:val="000000"/>
-        </w:rPr>
-        <w:t xml:space="preserve"> 1.89</w:t>
-      </w:r>
-      <w:r>
-        <w:rPr>
-          <w:color w:val="000000"/>
-        </w:rPr>
-        <w:t>（</w:t>
-      </w:r>
-      <w:r>
-        <w:rPr>
-          <w:color w:val="000000"/>
-        </w:rPr>
-        <w:t>p=0.001</w:t>
-      </w:r>
-      <w:r>
-        <w:rPr>
-          <w:color w:val="000000"/>
-        </w:rPr>
-        <w:t>），下调组</w:t>
-      </w:r>
-      <w:r>
-        <w:rPr>
-          <w:color w:val="000000"/>
-        </w:rPr>
-        <w:t xml:space="preserve"> 3.07 </w:t>
-      </w:r>
-      <w:r>
-        <w:rPr>
-          <w:color w:val="000000"/>
-        </w:rPr>
-        <w:t>对</w:t>
-      </w:r>
-      <w:r>
-        <w:rPr>
-          <w:color w:val="000000"/>
-        </w:rPr>
-        <w:t xml:space="preserve"> 2.61</w:t>
-      </w:r>
-      <w:r>
-        <w:rPr>
-          <w:color w:val="000000"/>
-        </w:rPr>
-        <w:t>（</w:t>
-      </w:r>
-      <w:r>
-        <w:rPr>
-          <w:color w:val="000000"/>
-        </w:rPr>
-        <w:t>p=0.002</w:t>
-      </w:r>
-      <w:r>
-        <w:rPr>
-          <w:color w:val="000000"/>
-        </w:rPr>
-        <w:t>）；次年误差更大。符号误差（乐观程度）无显著差异。</w:t>
+      <w:r>
+        <w:rPr>
+          <w:color w:val="000000"/>
+        </w:rPr>
+        <w:t>一句话：明星能带动市场，但没有证据表明他们更准。影响力假说得到支持，信息优势即使存在也很弱。</w:t>
       </w:r>
     </w:p>
     <w:p>
@@ -4586,7 +4484,7 @@
           <w:color w:val="000000"/>
         </w:rPr>
         <w:lastRenderedPageBreak/>
-        <w:t>一句话：市场影响力明确存在；准确度证据混合，持有收益短期略优，但盈余预测并不更准。整体更接近影响力假说，但不能说明星完全没有信息优势。以上为首轮单变量结果，尚未做聚类标准误与涨跌停、停牌稳健性。</w:t>
+        <w:t>还没做：聚类标准误、涨跌停与停牌稳健性、三张主图。以上全部是首轮单变量结果。</w:t>
       </w:r>
     </w:p>
     <w:p>
@@ -4594,7 +4492,7 @@
         <w:pStyle w:val="1"/>
         <w:spacing w:before="280" w:after="120"/>
       </w:pPr>
-      <w:bookmarkStart w:id="1" w:name="_Toc243218766"/>
+      <w:bookmarkStart w:id="1" w:name="_Toc243221338"/>
       <w:r>
         <w:rPr>
           <w:rFonts w:ascii="Times New Roman" w:eastAsia="黑体" w:hAnsi="Times New Roman"/>
@@ -4618,7 +4516,7 @@
         <w:pStyle w:val="21"/>
         <w:spacing w:after="120"/>
       </w:pPr>
-      <w:bookmarkStart w:id="2" w:name="_Toc243218767"/>
+      <w:bookmarkStart w:id="2" w:name="_Toc243221339"/>
       <w:r>
         <w:rPr>
           <w:rFonts w:ascii="Times New Roman" w:eastAsia="黑体" w:hAnsi="Times New Roman"/>
@@ -4724,7 +4622,7 @@
         <w:pStyle w:val="21"/>
         <w:spacing w:after="120"/>
       </w:pPr>
-      <w:bookmarkStart w:id="3" w:name="_Toc243218768"/>
+      <w:bookmarkStart w:id="3" w:name="_Toc243221340"/>
       <w:r>
         <w:rPr>
           <w:rFonts w:ascii="Times New Roman" w:eastAsia="黑体" w:hAnsi="Times New Roman"/>
@@ -5133,7 +5031,7 @@
         <w:pStyle w:val="21"/>
         <w:spacing w:after="120"/>
       </w:pPr>
-      <w:bookmarkStart w:id="4" w:name="_Toc243218769"/>
+      <w:bookmarkStart w:id="4" w:name="_Toc243221341"/>
       <w:r>
         <w:rPr>
           <w:rFonts w:ascii="Times New Roman" w:eastAsia="黑体" w:hAnsi="Times New Roman"/>
@@ -5243,13 +5141,12 @@
         <w:pStyle w:val="21"/>
         <w:spacing w:after="120"/>
       </w:pPr>
-      <w:bookmarkStart w:id="5" w:name="_Toc243218770"/>
+      <w:bookmarkStart w:id="5" w:name="_Toc243221342"/>
       <w:r>
         <w:rPr>
           <w:rFonts w:ascii="Times New Roman" w:eastAsia="黑体" w:hAnsi="Times New Roman"/>
           <w:color w:val="000000"/>
         </w:rPr>
-        <w:lastRenderedPageBreak/>
         <w:t xml:space="preserve">1.4 </w:t>
       </w:r>
       <w:r>
@@ -5282,6 +5179,7 @@
         <w:rPr>
           <w:color w:val="000000"/>
         </w:rPr>
+        <w:lastRenderedPageBreak/>
         <w:t>事件后</w:t>
       </w:r>
       <w:r>
@@ -5326,7 +5224,7 @@
         <w:pStyle w:val="21"/>
         <w:spacing w:after="120"/>
       </w:pPr>
-      <w:bookmarkStart w:id="6" w:name="_Toc243218771"/>
+      <w:bookmarkStart w:id="6" w:name="_Toc243221343"/>
       <w:r>
         <w:rPr>
           <w:rFonts w:ascii="Times New Roman" w:eastAsia="黑体" w:hAnsi="Times New Roman"/>
@@ -5398,7 +5296,7 @@
         <w:pStyle w:val="21"/>
         <w:spacing w:after="120"/>
       </w:pPr>
-      <w:bookmarkStart w:id="7" w:name="_Toc243218772"/>
+      <w:bookmarkStart w:id="7" w:name="_Toc243221344"/>
       <w:r>
         <w:rPr>
           <w:rFonts w:ascii="Times New Roman" w:eastAsia="黑体" w:hAnsi="Times New Roman"/>
@@ -5494,7 +5392,7 @@
         <w:pStyle w:val="21"/>
         <w:spacing w:after="120"/>
       </w:pPr>
-      <w:bookmarkStart w:id="8" w:name="_Toc243218773"/>
+      <w:bookmarkStart w:id="8" w:name="_Toc243221345"/>
       <w:r>
         <w:rPr>
           <w:rFonts w:ascii="Times New Roman" w:eastAsia="黑体" w:hAnsi="Times New Roman"/>
@@ -5548,7 +5446,7 @@
         <w:pStyle w:val="1"/>
         <w:spacing w:before="280" w:after="120"/>
       </w:pPr>
-      <w:bookmarkStart w:id="9" w:name="_Toc243218774"/>
+      <w:bookmarkStart w:id="9" w:name="_Toc243221346"/>
       <w:r>
         <w:rPr>
           <w:rFonts w:ascii="Times New Roman" w:eastAsia="黑体" w:hAnsi="Times New Roman"/>
@@ -5702,7 +5600,7 @@
         <w:pStyle w:val="1"/>
         <w:spacing w:before="280" w:after="120"/>
       </w:pPr>
-      <w:bookmarkStart w:id="10" w:name="_Toc243218775"/>
+      <w:bookmarkStart w:id="10" w:name="_Toc243221347"/>
       <w:r>
         <w:rPr>
           <w:rFonts w:ascii="Times New Roman" w:eastAsia="黑体" w:hAnsi="Times New Roman"/>
@@ -5849,7 +5747,6 @@
                 <w:color w:val="000000"/>
                 <w:sz w:val="21"/>
               </w:rPr>
-              <w:lastRenderedPageBreak/>
               <w:t>是否新财富上榜</w:t>
             </w:r>
           </w:p>
@@ -6129,7 +6026,7 @@
         <w:pStyle w:val="1"/>
         <w:spacing w:before="280" w:after="120"/>
       </w:pPr>
-      <w:bookmarkStart w:id="11" w:name="_Toc243218776"/>
+      <w:bookmarkStart w:id="11" w:name="_Toc243221348"/>
       <w:r>
         <w:rPr>
           <w:rFonts w:ascii="Times New Roman" w:eastAsia="黑体" w:hAnsi="Times New Roman"/>
@@ -7353,7 +7250,7 @@
         <w:pStyle w:val="1"/>
         <w:spacing w:before="280" w:after="120"/>
       </w:pPr>
-      <w:bookmarkStart w:id="12" w:name="_Toc243218777"/>
+      <w:bookmarkStart w:id="12" w:name="_Toc243221349"/>
       <w:r>
         <w:rPr>
           <w:rFonts w:ascii="Times New Roman" w:eastAsia="黑体" w:hAnsi="Times New Roman"/>
@@ -7658,7 +7555,6 @@
                 <w:color w:val="000000"/>
                 <w:sz w:val="21"/>
               </w:rPr>
-              <w:lastRenderedPageBreak/>
               <w:t>剔除上市未满</w:t>
             </w:r>
             <w:r>
@@ -7887,6 +7783,7 @@
         <w:rPr>
           <w:color w:val="000000"/>
         </w:rPr>
+        <w:lastRenderedPageBreak/>
         <w:t>关键数字：</w:t>
       </w:r>
     </w:p>
@@ -8433,7 +8330,7 @@
         <w:pStyle w:val="1"/>
         <w:spacing w:before="280" w:after="120"/>
       </w:pPr>
-      <w:bookmarkStart w:id="13" w:name="_Toc243218778"/>
+      <w:bookmarkStart w:id="13" w:name="_Toc243221350"/>
       <w:r>
         <w:rPr>
           <w:rFonts w:ascii="Times New Roman" w:eastAsia="黑体" w:hAnsi="Times New Roman"/>
@@ -8457,7 +8354,7 @@
         <w:pStyle w:val="21"/>
         <w:spacing w:after="120"/>
       </w:pPr>
-      <w:bookmarkStart w:id="14" w:name="_Toc243218779"/>
+      <w:bookmarkStart w:id="14" w:name="_Toc243221351"/>
       <w:r>
         <w:rPr>
           <w:rFonts w:ascii="Times New Roman" w:eastAsia="黑体" w:hAnsi="Times New Roman"/>
@@ -8665,7 +8562,7 @@
         <w:pStyle w:val="21"/>
         <w:spacing w:after="120"/>
       </w:pPr>
-      <w:bookmarkStart w:id="15" w:name="_Toc243218780"/>
+      <w:bookmarkStart w:id="15" w:name="_Toc243221352"/>
       <w:r>
         <w:rPr>
           <w:rFonts w:ascii="Times New Roman" w:eastAsia="黑体" w:hAnsi="Times New Roman"/>
@@ -8751,13 +8648,12 @@
         <w:pStyle w:val="21"/>
         <w:spacing w:after="120"/>
       </w:pPr>
-      <w:bookmarkStart w:id="16" w:name="_Toc243218781"/>
+      <w:bookmarkStart w:id="16" w:name="_Toc243221353"/>
       <w:r>
         <w:rPr>
           <w:rFonts w:ascii="Times New Roman" w:eastAsia="黑体" w:hAnsi="Times New Roman"/>
           <w:color w:val="000000"/>
         </w:rPr>
-        <w:lastRenderedPageBreak/>
         <w:t xml:space="preserve">6.3 </w:t>
       </w:r>
       <w:r>
@@ -8854,13 +8750,14 @@
         <w:pStyle w:val="1"/>
         <w:spacing w:before="280" w:after="120"/>
       </w:pPr>
-      <w:bookmarkStart w:id="17" w:name="_Toc243218782"/>
+      <w:bookmarkStart w:id="17" w:name="_Toc243221354"/>
       <w:r>
         <w:rPr>
           <w:rFonts w:ascii="Times New Roman" w:eastAsia="黑体" w:hAnsi="Times New Roman"/>
           <w:color w:val="000000"/>
           <w:sz w:val="30"/>
         </w:rPr>
+        <w:lastRenderedPageBreak/>
         <w:t xml:space="preserve">7. </w:t>
       </w:r>
       <w:r>
@@ -8886,7 +8783,7 @@
         <w:pStyle w:val="21"/>
         <w:spacing w:after="120"/>
       </w:pPr>
-      <w:bookmarkStart w:id="18" w:name="_Toc243218783"/>
+      <w:bookmarkStart w:id="18" w:name="_Toc243221355"/>
       <w:r>
         <w:rPr>
           <w:rFonts w:ascii="Times New Roman" w:eastAsia="黑体" w:hAnsi="Times New Roman"/>
@@ -9152,7 +9049,7 @@
         <w:pStyle w:val="21"/>
         <w:spacing w:after="120"/>
       </w:pPr>
-      <w:bookmarkStart w:id="19" w:name="_Toc243218784"/>
+      <w:bookmarkStart w:id="19" w:name="_Toc243221356"/>
       <w:r>
         <w:rPr>
           <w:rFonts w:ascii="Times New Roman" w:eastAsia="黑体" w:hAnsi="Times New Roman"/>
@@ -9268,7 +9165,7 @@
         <w:pStyle w:val="21"/>
         <w:spacing w:after="120"/>
       </w:pPr>
-      <w:bookmarkStart w:id="20" w:name="_Toc243218785"/>
+      <w:bookmarkStart w:id="20" w:name="_Toc243221357"/>
       <w:r>
         <w:rPr>
           <w:rFonts w:ascii="Times New Roman" w:eastAsia="黑体" w:hAnsi="Times New Roman"/>
@@ -9494,7 +9391,6 @@
         <w:rPr>
           <w:color w:val="000000"/>
         </w:rPr>
-        <w:lastRenderedPageBreak/>
         <w:t>还有三类名字坑：</w:t>
       </w:r>
     </w:p>
@@ -9627,6 +9523,7 @@
         <w:rPr>
           <w:color w:val="000000"/>
         </w:rPr>
+        <w:lastRenderedPageBreak/>
         <w:t>中金公司在评级明细里以它为研究机构的记录是</w:t>
       </w:r>
       <w:r>
@@ -9659,7 +9556,7 @@
         <w:pStyle w:val="21"/>
         <w:spacing w:after="120"/>
       </w:pPr>
-      <w:bookmarkStart w:id="21" w:name="_Toc243218786"/>
+      <w:bookmarkStart w:id="21" w:name="_Toc243221358"/>
       <w:r>
         <w:rPr>
           <w:rFonts w:ascii="Times New Roman" w:eastAsia="黑体" w:hAnsi="Times New Roman"/>
@@ -9781,7 +9678,7 @@
         <w:pStyle w:val="21"/>
         <w:spacing w:after="120"/>
       </w:pPr>
-      <w:bookmarkStart w:id="22" w:name="_Toc243218787"/>
+      <w:bookmarkStart w:id="22" w:name="_Toc243221359"/>
       <w:r>
         <w:rPr>
           <w:rFonts w:ascii="Times New Roman" w:eastAsia="黑体" w:hAnsi="Times New Roman"/>
@@ -9919,7 +9816,7 @@
         <w:pStyle w:val="21"/>
         <w:spacing w:after="120"/>
       </w:pPr>
-      <w:bookmarkStart w:id="23" w:name="_Toc243218788"/>
+      <w:bookmarkStart w:id="23" w:name="_Toc243221360"/>
       <w:r>
         <w:rPr>
           <w:rFonts w:ascii="Times New Roman" w:eastAsia="黑体" w:hAnsi="Times New Roman"/>
@@ -10155,7 +10052,7 @@
         <w:pStyle w:val="21"/>
         <w:spacing w:after="120"/>
       </w:pPr>
-      <w:bookmarkStart w:id="24" w:name="_Toc243218789"/>
+      <w:bookmarkStart w:id="24" w:name="_Toc243221361"/>
       <w:r>
         <w:rPr>
           <w:rFonts w:ascii="Times New Roman" w:eastAsia="黑体" w:hAnsi="Times New Roman"/>
@@ -10271,13 +10168,12 @@
         <w:pStyle w:val="21"/>
         <w:spacing w:after="120"/>
       </w:pPr>
-      <w:bookmarkStart w:id="25" w:name="_Toc243218790"/>
+      <w:bookmarkStart w:id="25" w:name="_Toc243221362"/>
       <w:r>
         <w:rPr>
           <w:rFonts w:ascii="Times New Roman" w:eastAsia="黑体" w:hAnsi="Times New Roman"/>
           <w:color w:val="000000"/>
         </w:rPr>
-        <w:lastRenderedPageBreak/>
         <w:t xml:space="preserve">7.8 2018 </w:t>
       </w:r>
       <w:r>
@@ -10570,6 +10466,7 @@
         <w:rPr>
           <w:color w:val="000000"/>
         </w:rPr>
+        <w:lastRenderedPageBreak/>
         <w:t>榜单。沿用后</w:t>
       </w:r>
       <w:r>
@@ -10602,7 +10499,7 @@
         <w:pStyle w:val="21"/>
         <w:spacing w:after="120"/>
       </w:pPr>
-      <w:bookmarkStart w:id="26" w:name="_Toc243218791"/>
+      <w:bookmarkStart w:id="26" w:name="_Toc243221363"/>
       <w:r>
         <w:rPr>
           <w:rFonts w:ascii="Times New Roman" w:eastAsia="黑体" w:hAnsi="Times New Roman"/>
@@ -10704,7 +10601,7 @@
         <w:pStyle w:val="21"/>
         <w:spacing w:after="120"/>
       </w:pPr>
-      <w:bookmarkStart w:id="27" w:name="_Toc243218792"/>
+      <w:bookmarkStart w:id="27" w:name="_Toc243221364"/>
       <w:r>
         <w:rPr>
           <w:rFonts w:ascii="Times New Roman" w:eastAsia="黑体" w:hAnsi="Times New Roman"/>
@@ -10842,7 +10739,7 @@
         <w:pStyle w:val="21"/>
         <w:spacing w:after="120"/>
       </w:pPr>
-      <w:bookmarkStart w:id="28" w:name="_Toc243218793"/>
+      <w:bookmarkStart w:id="28" w:name="_Toc243221365"/>
       <w:r>
         <w:rPr>
           <w:rFonts w:ascii="Times New Roman" w:eastAsia="黑体" w:hAnsi="Times New Roman"/>
@@ -10910,7 +10807,7 @@
         <w:pStyle w:val="21"/>
         <w:spacing w:after="120"/>
       </w:pPr>
-      <w:bookmarkStart w:id="29" w:name="_Toc243218794"/>
+      <w:bookmarkStart w:id="29" w:name="_Toc243221366"/>
       <w:r>
         <w:rPr>
           <w:rFonts w:ascii="Times New Roman" w:eastAsia="黑体" w:hAnsi="Times New Roman"/>
@@ -10958,7 +10855,7 @@
         <w:pStyle w:val="21"/>
         <w:spacing w:after="120"/>
       </w:pPr>
-      <w:bookmarkStart w:id="30" w:name="_Toc243218795"/>
+      <w:bookmarkStart w:id="30" w:name="_Toc243221367"/>
       <w:r>
         <w:rPr>
           <w:rFonts w:ascii="Times New Roman" w:eastAsia="黑体" w:hAnsi="Times New Roman"/>
@@ -11122,14 +11019,13 @@
         <w:pStyle w:val="1"/>
         <w:spacing w:before="280" w:after="120"/>
       </w:pPr>
-      <w:bookmarkStart w:id="31" w:name="_Toc243218796"/>
+      <w:bookmarkStart w:id="31" w:name="_Toc243221368"/>
       <w:r>
         <w:rPr>
           <w:rFonts w:ascii="Times New Roman" w:eastAsia="黑体" w:hAnsi="Times New Roman"/>
           <w:color w:val="000000"/>
           <w:sz w:val="30"/>
         </w:rPr>
-        <w:lastRenderedPageBreak/>
         <w:t xml:space="preserve">8. </w:t>
       </w:r>
       <w:r>
@@ -11394,6 +11290,7 @@
                 <w:color w:val="000000"/>
                 <w:sz w:val="21"/>
               </w:rPr>
+              <w:lastRenderedPageBreak/>
               <w:t>停牌、缺失、节假日不能用同一种删除方法</w:t>
             </w:r>
           </w:p>
@@ -11921,7 +11818,7 @@
         <w:pStyle w:val="21"/>
         <w:spacing w:after="120"/>
       </w:pPr>
-      <w:bookmarkStart w:id="32" w:name="_Toc243218797"/>
+      <w:bookmarkStart w:id="32" w:name="_Toc243221369"/>
       <w:r>
         <w:rPr>
           <w:rFonts w:ascii="Times New Roman" w:eastAsia="黑体" w:hAnsi="Times New Roman"/>
@@ -12186,7 +12083,6 @@
                 <w:color w:val="000000"/>
                 <w:sz w:val="21"/>
               </w:rPr>
-              <w:lastRenderedPageBreak/>
               <w:t>CAR[-1,+1]</w:t>
             </w:r>
           </w:p>
@@ -12782,6 +12678,7 @@
         <w:rPr>
           <w:color w:val="000000"/>
         </w:rPr>
+        <w:lastRenderedPageBreak/>
         <w:t>同股同日先取均值的聚类稳健版结论一致：调高</w:t>
       </w:r>
       <w:r>
@@ -12930,7 +12827,7 @@
         <w:pStyle w:val="21"/>
         <w:spacing w:after="120"/>
       </w:pPr>
-      <w:bookmarkStart w:id="33" w:name="_Toc243218798"/>
+      <w:bookmarkStart w:id="33" w:name="_Toc243221370"/>
       <w:r>
         <w:rPr>
           <w:rFonts w:ascii="Times New Roman" w:eastAsia="黑体" w:hAnsi="Times New Roman"/>
@@ -14335,7 +14232,6 @@
         <w:rPr>
           <w:color w:val="000000"/>
         </w:rPr>
-        <w:lastRenderedPageBreak/>
         <w:t>合起来的故事：明星身份带来更大的公告日冲击，并且在短期（下调</w:t>
       </w:r>
       <w:r>
@@ -14416,7 +14312,7 @@
         <w:pStyle w:val="21"/>
         <w:spacing w:after="120"/>
       </w:pPr>
-      <w:bookmarkStart w:id="34" w:name="_Toc243218799"/>
+      <w:bookmarkStart w:id="34" w:name="_Toc243221371"/>
       <w:r>
         <w:rPr>
           <w:rFonts w:ascii="Times New Roman" w:eastAsia="黑体" w:hAnsi="Times New Roman"/>
@@ -14636,6 +14532,7 @@
                 <w:color w:val="000000"/>
                 <w:sz w:val="21"/>
               </w:rPr>
+              <w:lastRenderedPageBreak/>
               <w:t>指标</w:t>
             </w:r>
           </w:p>
@@ -15343,7 +15240,7 @@
         <w:pStyle w:val="1"/>
         <w:spacing w:before="280" w:after="120"/>
       </w:pPr>
-      <w:bookmarkStart w:id="35" w:name="_Toc243218800"/>
+      <w:bookmarkStart w:id="35" w:name="_Toc243221372"/>
       <w:r>
         <w:rPr>
           <w:rFonts w:ascii="Times New Roman" w:eastAsia="黑体" w:hAnsi="Times New Roman"/>
@@ -15667,7 +15564,6 @@
         <w:rPr>
           <w:color w:val="000000"/>
         </w:rPr>
-        <w:lastRenderedPageBreak/>
         <w:t>非交易日对齐我们这边独立查过：事件落在周末的有</w:t>
       </w:r>
       <w:r>
@@ -15724,7 +15620,7 @@
         <w:pStyle w:val="1"/>
         <w:spacing w:before="280" w:after="120"/>
       </w:pPr>
-      <w:bookmarkStart w:id="36" w:name="_Toc243218801"/>
+      <w:bookmarkStart w:id="36" w:name="_Toc243221373"/>
       <w:r>
         <w:rPr>
           <w:rFonts w:ascii="Times New Roman" w:eastAsia="黑体" w:hAnsi="Times New Roman"/>
@@ -15830,6 +15726,7 @@
         <w:rPr>
           <w:color w:val="000000"/>
         </w:rPr>
+        <w:lastRenderedPageBreak/>
         <w:t xml:space="preserve">4. </w:t>
       </w:r>
       <w:r>
@@ -16012,7 +15909,7 @@
         <w:pStyle w:val="1"/>
         <w:spacing w:before="280" w:after="120"/>
       </w:pPr>
-      <w:bookmarkStart w:id="37" w:name="_Toc243218802"/>
+      <w:bookmarkStart w:id="37" w:name="_Toc243221374"/>
       <w:r>
         <w:rPr>
           <w:rFonts w:ascii="Times New Roman" w:eastAsia="黑体" w:hAnsi="Times New Roman"/>
@@ -16768,31 +16665,31 @@
       </w:rPr>
     </w:lvl>
   </w:abstractNum>
-  <w:num w:numId="1" w16cid:durableId="1254895889">
+  <w:num w:numId="1" w16cid:durableId="247422106">
     <w:abstractNumId w:val="8"/>
   </w:num>
-  <w:num w:numId="2" w16cid:durableId="1602183797">
+  <w:num w:numId="2" w16cid:durableId="603927922">
     <w:abstractNumId w:val="6"/>
   </w:num>
-  <w:num w:numId="3" w16cid:durableId="692148150">
+  <w:num w:numId="3" w16cid:durableId="1820074317">
     <w:abstractNumId w:val="5"/>
   </w:num>
-  <w:num w:numId="4" w16cid:durableId="708603792">
+  <w:num w:numId="4" w16cid:durableId="838349288">
     <w:abstractNumId w:val="4"/>
   </w:num>
-  <w:num w:numId="5" w16cid:durableId="2108306224">
+  <w:num w:numId="5" w16cid:durableId="297226895">
     <w:abstractNumId w:val="7"/>
   </w:num>
-  <w:num w:numId="6" w16cid:durableId="643660007">
+  <w:num w:numId="6" w16cid:durableId="159345669">
     <w:abstractNumId w:val="3"/>
   </w:num>
-  <w:num w:numId="7" w16cid:durableId="1960604302">
+  <w:num w:numId="7" w16cid:durableId="832599967">
     <w:abstractNumId w:val="2"/>
   </w:num>
-  <w:num w:numId="8" w16cid:durableId="16809305">
+  <w:num w:numId="8" w16cid:durableId="1986398048">
     <w:abstractNumId w:val="1"/>
   </w:num>
-  <w:num w:numId="9" w16cid:durableId="1062289768">
+  <w:num w:numId="9" w16cid:durableId="1045183036">
     <w:abstractNumId w:val="0"/>
   </w:num>
 </w:numbering>
@@ -28191,7 +28088,7 @@
     <w:autoRedefine/>
     <w:uiPriority w:val="39"/>
     <w:unhideWhenUsed/>
-    <w:rsid w:val="003D105F"/>
+    <w:rsid w:val="00EB25B9"/>
   </w:style>
   <w:style w:type="paragraph" w:styleId="TOC2">
     <w:name w:val="toc 2"/>
@@ -28200,7 +28097,7 @@
     <w:autoRedefine/>
     <w:uiPriority w:val="39"/>
     <w:unhideWhenUsed/>
-    <w:rsid w:val="003D105F"/>
+    <w:rsid w:val="00EB25B9"/>
     <w:pPr>
       <w:ind w:leftChars="200" w:left="420"/>
     </w:pPr>
@@ -28210,7 +28107,7 @@
     <w:basedOn w:val="a2"/>
     <w:uiPriority w:val="99"/>
     <w:unhideWhenUsed/>
-    <w:rsid w:val="003D105F"/>
+    <w:rsid w:val="00EB25B9"/>
     <w:rPr>
       <w:color w:val="0000FF" w:themeColor="hyperlink"/>
       <w:u w:val="single"/>

</xml_diff>

<commit_message>
Add the open items for the market side to the memo
Co-Authored-By: Claude Code <noreply@anthropic.com>
</commit_message>
<xml_diff>
--- a/文档/项目进度与技术备忘_20261018.docx
+++ b/文档/项目进度与技术备忘_20261018.docx
@@ -118,7 +118,7 @@
         </w:rPr>
         <w:fldChar w:fldCharType="separate"/>
       </w:r>
-      <w:hyperlink w:anchor="_Toc243221337" w:history="1">
+      <w:hyperlink w:anchor="_Toc243222262" w:history="1">
         <w:r>
           <w:rPr>
             <w:rStyle w:val="aff9"/>
@@ -180,7 +180,7 @@
             <w:noProof/>
             <w:webHidden/>
           </w:rPr>
-          <w:instrText>PAGEREF _Toc243221337 \h</w:instrText>
+          <w:instrText>PAGEREF _Toc243222262 \h</w:instrText>
         </w:r>
         <w:r>
           <w:rPr>
@@ -238,7 +238,7 @@
           <w14:ligatures w14:val="standardContextual"/>
         </w:rPr>
       </w:pPr>
-      <w:hyperlink w:anchor="_Toc243221338" w:history="1">
+      <w:hyperlink w:anchor="_Toc243222263" w:history="1">
         <w:r>
           <w:rPr>
             <w:rStyle w:val="aff9"/>
@@ -284,7 +284,7 @@
             <w:noProof/>
             <w:webHidden/>
           </w:rPr>
-          <w:instrText>PAGEREF _Toc243221338 \h</w:instrText>
+          <w:instrText>PAGEREF _Toc243222263 \h</w:instrText>
         </w:r>
         <w:r>
           <w:rPr>
@@ -343,7 +343,7 @@
           <w14:ligatures w14:val="standardContextual"/>
         </w:rPr>
       </w:pPr>
-      <w:hyperlink w:anchor="_Toc243221339" w:history="1">
+      <w:hyperlink w:anchor="_Toc243222264" w:history="1">
         <w:r>
           <w:rPr>
             <w:rStyle w:val="aff9"/>
@@ -389,7 +389,7 @@
             <w:noProof/>
             <w:webHidden/>
           </w:rPr>
-          <w:instrText>PAGEREF _Toc243221339 \h</w:instrText>
+          <w:instrText>PAGEREF _Toc243222264 \h</w:instrText>
         </w:r>
         <w:r>
           <w:rPr>
@@ -448,7 +448,7 @@
           <w14:ligatures w14:val="standardContextual"/>
         </w:rPr>
       </w:pPr>
-      <w:hyperlink w:anchor="_Toc243221340" w:history="1">
+      <w:hyperlink w:anchor="_Toc243222265" w:history="1">
         <w:r>
           <w:rPr>
             <w:rStyle w:val="aff9"/>
@@ -494,7 +494,7 @@
             <w:noProof/>
             <w:webHidden/>
           </w:rPr>
-          <w:instrText>PAGEREF _Toc243221340 \h</w:instrText>
+          <w:instrText>PAGEREF _Toc243222265 \h</w:instrText>
         </w:r>
         <w:r>
           <w:rPr>
@@ -553,7 +553,7 @@
           <w14:ligatures w14:val="standardContextual"/>
         </w:rPr>
       </w:pPr>
-      <w:hyperlink w:anchor="_Toc243221341" w:history="1">
+      <w:hyperlink w:anchor="_Toc243222266" w:history="1">
         <w:r>
           <w:rPr>
             <w:rStyle w:val="aff9"/>
@@ -599,7 +599,7 @@
             <w:noProof/>
             <w:webHidden/>
           </w:rPr>
-          <w:instrText>PAGEREF _Toc243221341 \h</w:instrText>
+          <w:instrText>PAGEREF _Toc243222266 \h</w:instrText>
         </w:r>
         <w:r>
           <w:rPr>
@@ -658,7 +658,7 @@
           <w14:ligatures w14:val="standardContextual"/>
         </w:rPr>
       </w:pPr>
-      <w:hyperlink w:anchor="_Toc243221342" w:history="1">
+      <w:hyperlink w:anchor="_Toc243222267" w:history="1">
         <w:r>
           <w:rPr>
             <w:rStyle w:val="aff9"/>
@@ -704,7 +704,7 @@
             <w:noProof/>
             <w:webHidden/>
           </w:rPr>
-          <w:instrText>PAGEREF _Toc243221342 \h</w:instrText>
+          <w:instrText>PAGEREF _Toc243222267 \h</w:instrText>
         </w:r>
         <w:r>
           <w:rPr>
@@ -734,7 +734,7 @@
             <w:noProof/>
             <w:webHidden/>
           </w:rPr>
-          <w:t>3</w:t>
+          <w:t>4</w:t>
         </w:r>
         <w:r>
           <w:rPr>
@@ -763,7 +763,7 @@
           <w14:ligatures w14:val="standardContextual"/>
         </w:rPr>
       </w:pPr>
-      <w:hyperlink w:anchor="_Toc243221343" w:history="1">
+      <w:hyperlink w:anchor="_Toc243222268" w:history="1">
         <w:r>
           <w:rPr>
             <w:rStyle w:val="aff9"/>
@@ -809,7 +809,7 @@
             <w:noProof/>
             <w:webHidden/>
           </w:rPr>
-          <w:instrText>PAGEREF _Toc243221343 \h</w:instrText>
+          <w:instrText>PAGEREF _Toc243222268 \h</w:instrText>
         </w:r>
         <w:r>
           <w:rPr>
@@ -868,7 +868,7 @@
           <w14:ligatures w14:val="standardContextual"/>
         </w:rPr>
       </w:pPr>
-      <w:hyperlink w:anchor="_Toc243221344" w:history="1">
+      <w:hyperlink w:anchor="_Toc243222269" w:history="1">
         <w:r>
           <w:rPr>
             <w:rStyle w:val="aff9"/>
@@ -914,7 +914,7 @@
             <w:noProof/>
             <w:webHidden/>
           </w:rPr>
-          <w:instrText>PAGEREF _Toc243221344 \h</w:instrText>
+          <w:instrText>PAGEREF _Toc243222269 \h</w:instrText>
         </w:r>
         <w:r>
           <w:rPr>
@@ -973,7 +973,7 @@
           <w14:ligatures w14:val="standardContextual"/>
         </w:rPr>
       </w:pPr>
-      <w:hyperlink w:anchor="_Toc243221345" w:history="1">
+      <w:hyperlink w:anchor="_Toc243222270" w:history="1">
         <w:r>
           <w:rPr>
             <w:rStyle w:val="aff9"/>
@@ -1019,7 +1019,7 @@
             <w:noProof/>
             <w:webHidden/>
           </w:rPr>
-          <w:instrText>PAGEREF _Toc243221345 \h</w:instrText>
+          <w:instrText>PAGEREF _Toc243222270 \h</w:instrText>
         </w:r>
         <w:r>
           <w:rPr>
@@ -1077,7 +1077,7 @@
           <w14:ligatures w14:val="standardContextual"/>
         </w:rPr>
       </w:pPr>
-      <w:hyperlink w:anchor="_Toc243221346" w:history="1">
+      <w:hyperlink w:anchor="_Toc243222271" w:history="1">
         <w:r>
           <w:rPr>
             <w:rStyle w:val="aff9"/>
@@ -1123,7 +1123,7 @@
             <w:noProof/>
             <w:webHidden/>
           </w:rPr>
-          <w:instrText>PAGEREF _Toc243221346 \h</w:instrText>
+          <w:instrText>PAGEREF _Toc243222271 \h</w:instrText>
         </w:r>
         <w:r>
           <w:rPr>
@@ -1181,7 +1181,7 @@
           <w14:ligatures w14:val="standardContextual"/>
         </w:rPr>
       </w:pPr>
-      <w:hyperlink w:anchor="_Toc243221347" w:history="1">
+      <w:hyperlink w:anchor="_Toc243222272" w:history="1">
         <w:r>
           <w:rPr>
             <w:rStyle w:val="aff9"/>
@@ -1227,7 +1227,7 @@
             <w:noProof/>
             <w:webHidden/>
           </w:rPr>
-          <w:instrText>PAGEREF _Toc243221347 \h</w:instrText>
+          <w:instrText>PAGEREF _Toc243222272 \h</w:instrText>
         </w:r>
         <w:r>
           <w:rPr>
@@ -1285,7 +1285,7 @@
           <w14:ligatures w14:val="standardContextual"/>
         </w:rPr>
       </w:pPr>
-      <w:hyperlink w:anchor="_Toc243221348" w:history="1">
+      <w:hyperlink w:anchor="_Toc243222273" w:history="1">
         <w:r>
           <w:rPr>
             <w:rStyle w:val="aff9"/>
@@ -1331,7 +1331,7 @@
             <w:noProof/>
             <w:webHidden/>
           </w:rPr>
-          <w:instrText>PAGEREF _Toc243221348 \h</w:instrText>
+          <w:instrText>PAGEREF _Toc243222273 \h</w:instrText>
         </w:r>
         <w:r>
           <w:rPr>
@@ -1389,7 +1389,7 @@
           <w14:ligatures w14:val="standardContextual"/>
         </w:rPr>
       </w:pPr>
-      <w:hyperlink w:anchor="_Toc243221349" w:history="1">
+      <w:hyperlink w:anchor="_Toc243222274" w:history="1">
         <w:r>
           <w:rPr>
             <w:rStyle w:val="aff9"/>
@@ -1435,7 +1435,7 @@
             <w:noProof/>
             <w:webHidden/>
           </w:rPr>
-          <w:instrText>PAGEREF _Toc243221349 \h</w:instrText>
+          <w:instrText>PAGEREF _Toc243222274 \h</w:instrText>
         </w:r>
         <w:r>
           <w:rPr>
@@ -1493,7 +1493,7 @@
           <w14:ligatures w14:val="standardContextual"/>
         </w:rPr>
       </w:pPr>
-      <w:hyperlink w:anchor="_Toc243221350" w:history="1">
+      <w:hyperlink w:anchor="_Toc243222275" w:history="1">
         <w:r>
           <w:rPr>
             <w:rStyle w:val="aff9"/>
@@ -1539,7 +1539,7 @@
             <w:noProof/>
             <w:webHidden/>
           </w:rPr>
-          <w:instrText>PAGEREF _Toc243221350 \h</w:instrText>
+          <w:instrText>PAGEREF _Toc243222275 \h</w:instrText>
         </w:r>
         <w:r>
           <w:rPr>
@@ -1598,7 +1598,7 @@
           <w14:ligatures w14:val="standardContextual"/>
         </w:rPr>
       </w:pPr>
-      <w:hyperlink w:anchor="_Toc243221351" w:history="1">
+      <w:hyperlink w:anchor="_Toc243222276" w:history="1">
         <w:r>
           <w:rPr>
             <w:rStyle w:val="aff9"/>
@@ -1644,7 +1644,7 @@
             <w:noProof/>
             <w:webHidden/>
           </w:rPr>
-          <w:instrText>PAGEREF _Toc243221351 \h</w:instrText>
+          <w:instrText>PAGEREF _Toc243222276 \h</w:instrText>
         </w:r>
         <w:r>
           <w:rPr>
@@ -1703,7 +1703,7 @@
           <w14:ligatures w14:val="standardContextual"/>
         </w:rPr>
       </w:pPr>
-      <w:hyperlink w:anchor="_Toc243221352" w:history="1">
+      <w:hyperlink w:anchor="_Toc243222277" w:history="1">
         <w:r>
           <w:rPr>
             <w:rStyle w:val="aff9"/>
@@ -1749,7 +1749,7 @@
             <w:noProof/>
             <w:webHidden/>
           </w:rPr>
-          <w:instrText>PAGEREF _Toc243221352 \h</w:instrText>
+          <w:instrText>PAGEREF _Toc243222277 \h</w:instrText>
         </w:r>
         <w:r>
           <w:rPr>
@@ -1808,7 +1808,7 @@
           <w14:ligatures w14:val="standardContextual"/>
         </w:rPr>
       </w:pPr>
-      <w:hyperlink w:anchor="_Toc243221353" w:history="1">
+      <w:hyperlink w:anchor="_Toc243222278" w:history="1">
         <w:r>
           <w:rPr>
             <w:rStyle w:val="aff9"/>
@@ -1854,7 +1854,7 @@
             <w:noProof/>
             <w:webHidden/>
           </w:rPr>
-          <w:instrText>PAGEREF _Toc243221353 \h</w:instrText>
+          <w:instrText>PAGEREF _Toc243222278 \h</w:instrText>
         </w:r>
         <w:r>
           <w:rPr>
@@ -1884,7 +1884,7 @@
             <w:noProof/>
             <w:webHidden/>
           </w:rPr>
-          <w:t>6</w:t>
+          <w:t>7</w:t>
         </w:r>
         <w:r>
           <w:rPr>
@@ -1912,7 +1912,7 @@
           <w14:ligatures w14:val="standardContextual"/>
         </w:rPr>
       </w:pPr>
-      <w:hyperlink w:anchor="_Toc243221354" w:history="1">
+      <w:hyperlink w:anchor="_Toc243222279" w:history="1">
         <w:r>
           <w:rPr>
             <w:rStyle w:val="aff9"/>
@@ -1958,7 +1958,7 @@
             <w:noProof/>
             <w:webHidden/>
           </w:rPr>
-          <w:instrText>PAGEREF _Toc243221354 \h</w:instrText>
+          <w:instrText>PAGEREF _Toc243222279 \h</w:instrText>
         </w:r>
         <w:r>
           <w:rPr>
@@ -2017,7 +2017,7 @@
           <w14:ligatures w14:val="standardContextual"/>
         </w:rPr>
       </w:pPr>
-      <w:hyperlink w:anchor="_Toc243221355" w:history="1">
+      <w:hyperlink w:anchor="_Toc243222280" w:history="1">
         <w:r>
           <w:rPr>
             <w:rStyle w:val="aff9"/>
@@ -2063,7 +2063,7 @@
             <w:noProof/>
             <w:webHidden/>
           </w:rPr>
-          <w:instrText>PAGEREF _Toc243221355 \h</w:instrText>
+          <w:instrText>PAGEREF _Toc243222280 \h</w:instrText>
         </w:r>
         <w:r>
           <w:rPr>
@@ -2122,7 +2122,7 @@
           <w14:ligatures w14:val="standardContextual"/>
         </w:rPr>
       </w:pPr>
-      <w:hyperlink w:anchor="_Toc243221356" w:history="1">
+      <w:hyperlink w:anchor="_Toc243222281" w:history="1">
         <w:r>
           <w:rPr>
             <w:rStyle w:val="aff9"/>
@@ -2168,7 +2168,7 @@
             <w:noProof/>
             <w:webHidden/>
           </w:rPr>
-          <w:instrText>PAGEREF _Toc243221356 \h</w:instrText>
+          <w:instrText>PAGEREF _Toc243222281 \h</w:instrText>
         </w:r>
         <w:r>
           <w:rPr>
@@ -2227,7 +2227,7 @@
           <w14:ligatures w14:val="standardContextual"/>
         </w:rPr>
       </w:pPr>
-      <w:hyperlink w:anchor="_Toc243221357" w:history="1">
+      <w:hyperlink w:anchor="_Toc243222282" w:history="1">
         <w:r>
           <w:rPr>
             <w:rStyle w:val="aff9"/>
@@ -2273,7 +2273,7 @@
             <w:noProof/>
             <w:webHidden/>
           </w:rPr>
-          <w:instrText>PAGEREF _Toc243221357 \h</w:instrText>
+          <w:instrText>PAGEREF _Toc243222282 \h</w:instrText>
         </w:r>
         <w:r>
           <w:rPr>
@@ -2332,7 +2332,7 @@
           <w14:ligatures w14:val="standardContextual"/>
         </w:rPr>
       </w:pPr>
-      <w:hyperlink w:anchor="_Toc243221358" w:history="1">
+      <w:hyperlink w:anchor="_Toc243222283" w:history="1">
         <w:r>
           <w:rPr>
             <w:rStyle w:val="aff9"/>
@@ -2378,7 +2378,7 @@
             <w:noProof/>
             <w:webHidden/>
           </w:rPr>
-          <w:instrText>PAGEREF _Toc243221358 \h</w:instrText>
+          <w:instrText>PAGEREF _Toc243222283 \h</w:instrText>
         </w:r>
         <w:r>
           <w:rPr>
@@ -2437,7 +2437,7 @@
           <w14:ligatures w14:val="standardContextual"/>
         </w:rPr>
       </w:pPr>
-      <w:hyperlink w:anchor="_Toc243221359" w:history="1">
+      <w:hyperlink w:anchor="_Toc243222284" w:history="1">
         <w:r>
           <w:rPr>
             <w:rStyle w:val="aff9"/>
@@ -2483,7 +2483,7 @@
             <w:noProof/>
             <w:webHidden/>
           </w:rPr>
-          <w:instrText>PAGEREF _Toc243221359 \h</w:instrText>
+          <w:instrText>PAGEREF _Toc243222284 \h</w:instrText>
         </w:r>
         <w:r>
           <w:rPr>
@@ -2542,7 +2542,7 @@
           <w14:ligatures w14:val="standardContextual"/>
         </w:rPr>
       </w:pPr>
-      <w:hyperlink w:anchor="_Toc243221360" w:history="1">
+      <w:hyperlink w:anchor="_Toc243222285" w:history="1">
         <w:r>
           <w:rPr>
             <w:rStyle w:val="aff9"/>
@@ -2604,7 +2604,7 @@
             <w:noProof/>
             <w:webHidden/>
           </w:rPr>
-          <w:instrText>PAGEREF _Toc243221360 \h</w:instrText>
+          <w:instrText>PAGEREF _Toc243222285 \h</w:instrText>
         </w:r>
         <w:r>
           <w:rPr>
@@ -2663,7 +2663,7 @@
           <w14:ligatures w14:val="standardContextual"/>
         </w:rPr>
       </w:pPr>
-      <w:hyperlink w:anchor="_Toc243221361" w:history="1">
+      <w:hyperlink w:anchor="_Toc243222286" w:history="1">
         <w:r>
           <w:rPr>
             <w:rStyle w:val="aff9"/>
@@ -2709,7 +2709,7 @@
             <w:noProof/>
             <w:webHidden/>
           </w:rPr>
-          <w:instrText>PAGEREF _Toc243221361 \h</w:instrText>
+          <w:instrText>PAGEREF _Toc243222286 \h</w:instrText>
         </w:r>
         <w:r>
           <w:rPr>
@@ -2768,7 +2768,7 @@
           <w14:ligatures w14:val="standardContextual"/>
         </w:rPr>
       </w:pPr>
-      <w:hyperlink w:anchor="_Toc243221362" w:history="1">
+      <w:hyperlink w:anchor="_Toc243222287" w:history="1">
         <w:r>
           <w:rPr>
             <w:rStyle w:val="aff9"/>
@@ -2814,7 +2814,7 @@
             <w:noProof/>
             <w:webHidden/>
           </w:rPr>
-          <w:instrText>PAGEREF _Toc243221362 \h</w:instrText>
+          <w:instrText>PAGEREF _Toc243222287 \h</w:instrText>
         </w:r>
         <w:r>
           <w:rPr>
@@ -2844,7 +2844,7 @@
             <w:noProof/>
             <w:webHidden/>
           </w:rPr>
-          <w:t>8</w:t>
+          <w:t>9</w:t>
         </w:r>
         <w:r>
           <w:rPr>
@@ -2873,7 +2873,7 @@
           <w14:ligatures w14:val="standardContextual"/>
         </w:rPr>
       </w:pPr>
-      <w:hyperlink w:anchor="_Toc243221363" w:history="1">
+      <w:hyperlink w:anchor="_Toc243222288" w:history="1">
         <w:r>
           <w:rPr>
             <w:rStyle w:val="aff9"/>
@@ -2919,7 +2919,7 @@
             <w:noProof/>
             <w:webHidden/>
           </w:rPr>
-          <w:instrText>PAGEREF _Toc243221363 \h</w:instrText>
+          <w:instrText>PAGEREF _Toc243222288 \h</w:instrText>
         </w:r>
         <w:r>
           <w:rPr>
@@ -2978,7 +2978,7 @@
           <w14:ligatures w14:val="standardContextual"/>
         </w:rPr>
       </w:pPr>
-      <w:hyperlink w:anchor="_Toc243221364" w:history="1">
+      <w:hyperlink w:anchor="_Toc243222289" w:history="1">
         <w:r>
           <w:rPr>
             <w:rStyle w:val="aff9"/>
@@ -3024,7 +3024,7 @@
             <w:noProof/>
             <w:webHidden/>
           </w:rPr>
-          <w:instrText>PAGEREF _Toc243221364 \h</w:instrText>
+          <w:instrText>PAGEREF _Toc243222289 \h</w:instrText>
         </w:r>
         <w:r>
           <w:rPr>
@@ -3083,7 +3083,7 @@
           <w14:ligatures w14:val="standardContextual"/>
         </w:rPr>
       </w:pPr>
-      <w:hyperlink w:anchor="_Toc243221365" w:history="1">
+      <w:hyperlink w:anchor="_Toc243222290" w:history="1">
         <w:r>
           <w:rPr>
             <w:rStyle w:val="aff9"/>
@@ -3145,7 +3145,7 @@
             <w:noProof/>
             <w:webHidden/>
           </w:rPr>
-          <w:instrText>PAGEREF _Toc243221365 \h</w:instrText>
+          <w:instrText>PAGEREF _Toc243222290 \h</w:instrText>
         </w:r>
         <w:r>
           <w:rPr>
@@ -3204,7 +3204,7 @@
           <w14:ligatures w14:val="standardContextual"/>
         </w:rPr>
       </w:pPr>
-      <w:hyperlink w:anchor="_Toc243221366" w:history="1">
+      <w:hyperlink w:anchor="_Toc243222291" w:history="1">
         <w:r>
           <w:rPr>
             <w:rStyle w:val="aff9"/>
@@ -3250,7 +3250,7 @@
             <w:noProof/>
             <w:webHidden/>
           </w:rPr>
-          <w:instrText>PAGEREF _Toc243221366 \h</w:instrText>
+          <w:instrText>PAGEREF _Toc243222291 \h</w:instrText>
         </w:r>
         <w:r>
           <w:rPr>
@@ -3309,7 +3309,7 @@
           <w14:ligatures w14:val="standardContextual"/>
         </w:rPr>
       </w:pPr>
-      <w:hyperlink w:anchor="_Toc243221367" w:history="1">
+      <w:hyperlink w:anchor="_Toc243222292" w:history="1">
         <w:r>
           <w:rPr>
             <w:rStyle w:val="aff9"/>
@@ -3355,7 +3355,7 @@
             <w:noProof/>
             <w:webHidden/>
           </w:rPr>
-          <w:instrText>PAGEREF _Toc243221367 \h</w:instrText>
+          <w:instrText>PAGEREF _Toc243222292 \h</w:instrText>
         </w:r>
         <w:r>
           <w:rPr>
@@ -3413,7 +3413,7 @@
           <w14:ligatures w14:val="standardContextual"/>
         </w:rPr>
       </w:pPr>
-      <w:hyperlink w:anchor="_Toc243221368" w:history="1">
+      <w:hyperlink w:anchor="_Toc243222293" w:history="1">
         <w:r>
           <w:rPr>
             <w:rStyle w:val="aff9"/>
@@ -3467,7 +3467,7 @@
             <w:noProof/>
             <w:webHidden/>
           </w:rPr>
-          <w:instrText>PAGEREF _Toc243221368 \h</w:instrText>
+          <w:instrText>PAGEREF _Toc243222293 \h</w:instrText>
         </w:r>
         <w:r>
           <w:rPr>
@@ -3497,7 +3497,7 @@
             <w:noProof/>
             <w:webHidden/>
           </w:rPr>
-          <w:t>9</w:t>
+          <w:t>10</w:t>
         </w:r>
         <w:r>
           <w:rPr>
@@ -3526,7 +3526,7 @@
           <w14:ligatures w14:val="standardContextual"/>
         </w:rPr>
       </w:pPr>
-      <w:hyperlink w:anchor="_Toc243221369" w:history="1">
+      <w:hyperlink w:anchor="_Toc243222294" w:history="1">
         <w:r>
           <w:rPr>
             <w:rStyle w:val="aff9"/>
@@ -3588,7 +3588,7 @@
             <w:noProof/>
             <w:webHidden/>
           </w:rPr>
-          <w:instrText>PAGEREF _Toc243221369 \h</w:instrText>
+          <w:instrText>PAGEREF _Toc243222294 \h</w:instrText>
         </w:r>
         <w:r>
           <w:rPr>
@@ -3647,7 +3647,7 @@
           <w14:ligatures w14:val="standardContextual"/>
         </w:rPr>
       </w:pPr>
-      <w:hyperlink w:anchor="_Toc243221370" w:history="1">
+      <w:hyperlink w:anchor="_Toc243222295" w:history="1">
         <w:r>
           <w:rPr>
             <w:rStyle w:val="aff9"/>
@@ -3709,7 +3709,7 @@
             <w:noProof/>
             <w:webHidden/>
           </w:rPr>
-          <w:instrText>PAGEREF _Toc243221370 \h</w:instrText>
+          <w:instrText>PAGEREF _Toc243222295 \h</w:instrText>
         </w:r>
         <w:r>
           <w:rPr>
@@ -3768,7 +3768,7 @@
           <w14:ligatures w14:val="standardContextual"/>
         </w:rPr>
       </w:pPr>
-      <w:hyperlink w:anchor="_Toc243221371" w:history="1">
+      <w:hyperlink w:anchor="_Toc243222296" w:history="1">
         <w:r>
           <w:rPr>
             <w:rStyle w:val="aff9"/>
@@ -3830,7 +3830,7 @@
             <w:noProof/>
             <w:webHidden/>
           </w:rPr>
-          <w:instrText>PAGEREF _Toc243221371 \h</w:instrText>
+          <w:instrText>PAGEREF _Toc243222296 \h</w:instrText>
         </w:r>
         <w:r>
           <w:rPr>
@@ -3860,7 +3860,7 @@
             <w:noProof/>
             <w:webHidden/>
           </w:rPr>
-          <w:t>11</w:t>
+          <w:t>12</w:t>
         </w:r>
         <w:r>
           <w:rPr>
@@ -3888,7 +3888,7 @@
           <w14:ligatures w14:val="standardContextual"/>
         </w:rPr>
       </w:pPr>
-      <w:hyperlink w:anchor="_Toc243221372" w:history="1">
+      <w:hyperlink w:anchor="_Toc243222297" w:history="1">
         <w:r>
           <w:rPr>
             <w:rStyle w:val="aff9"/>
@@ -3934,7 +3934,7 @@
             <w:noProof/>
             <w:webHidden/>
           </w:rPr>
-          <w:instrText>PAGEREF _Toc243221372 \h</w:instrText>
+          <w:instrText>PAGEREF _Toc243222297 \h</w:instrText>
         </w:r>
         <w:r>
           <w:rPr>
@@ -3965,6 +3965,127 @@
             <w:webHidden/>
           </w:rPr>
           <w:t>12</w:t>
+        </w:r>
+        <w:r>
+          <w:rPr>
+            <w:rFonts w:hint="eastAsia"/>
+            <w:noProof/>
+            <w:webHidden/>
+          </w:rPr>
+          <w:fldChar w:fldCharType="end"/>
+        </w:r>
+      </w:hyperlink>
+    </w:p>
+    <w:p>
+      <w:pPr>
+        <w:pStyle w:val="TOC2"/>
+        <w:tabs>
+          <w:tab w:val="right" w:leader="dot" w:pos="9402"/>
+        </w:tabs>
+        <w:ind w:left="480"/>
+        <w:rPr>
+          <w:rFonts w:asciiTheme="minorHAnsi" w:eastAsiaTheme="minorEastAsia" w:hAnsiTheme="minorHAnsi" w:hint="eastAsia"/>
+          <w:noProof/>
+          <w:kern w:val="2"/>
+          <w:sz w:val="22"/>
+          <w:szCs w:val="24"/>
+          <w:lang w:eastAsia="zh-CN"/>
+          <w14:ligatures w14:val="standardContextual"/>
+        </w:rPr>
+      </w:pPr>
+      <w:hyperlink w:anchor="_Toc243222298" w:history="1">
+        <w:r>
+          <w:rPr>
+            <w:rStyle w:val="aff9"/>
+            <w:rFonts w:eastAsia="黑体"/>
+            <w:noProof/>
+          </w:rPr>
+          <w:t xml:space="preserve">9.1 </w:t>
+        </w:r>
+        <w:r>
+          <w:rPr>
+            <w:rStyle w:val="aff9"/>
+            <w:rFonts w:eastAsia="黑体"/>
+            <w:noProof/>
+          </w:rPr>
+          <w:t>需要乙确认或交付的事项（</w:t>
+        </w:r>
+        <w:r>
+          <w:rPr>
+            <w:rStyle w:val="aff9"/>
+            <w:rFonts w:eastAsia="黑体"/>
+            <w:noProof/>
+          </w:rPr>
+          <w:t>2026-10-18</w:t>
+        </w:r>
+        <w:r>
+          <w:rPr>
+            <w:rStyle w:val="aff9"/>
+            <w:rFonts w:eastAsia="黑体"/>
+            <w:noProof/>
+          </w:rPr>
+          <w:t>）</w:t>
+        </w:r>
+        <w:r>
+          <w:rPr>
+            <w:rFonts w:hint="eastAsia"/>
+            <w:noProof/>
+            <w:webHidden/>
+          </w:rPr>
+          <w:tab/>
+        </w:r>
+        <w:r>
+          <w:rPr>
+            <w:rFonts w:hint="eastAsia"/>
+            <w:noProof/>
+            <w:webHidden/>
+          </w:rPr>
+          <w:fldChar w:fldCharType="begin"/>
+        </w:r>
+        <w:r>
+          <w:rPr>
+            <w:rFonts w:hint="eastAsia"/>
+            <w:noProof/>
+            <w:webHidden/>
+          </w:rPr>
+          <w:instrText xml:space="preserve"> </w:instrText>
+        </w:r>
+        <w:r>
+          <w:rPr>
+            <w:noProof/>
+            <w:webHidden/>
+          </w:rPr>
+          <w:instrText>PAGEREF _Toc243222298 \h</w:instrText>
+        </w:r>
+        <w:r>
+          <w:rPr>
+            <w:rFonts w:hint="eastAsia"/>
+            <w:noProof/>
+            <w:webHidden/>
+          </w:rPr>
+          <w:instrText xml:space="preserve"> </w:instrText>
+        </w:r>
+        <w:r>
+          <w:rPr>
+            <w:rFonts w:hint="eastAsia"/>
+            <w:noProof/>
+            <w:webHidden/>
+          </w:rPr>
+        </w:r>
+        <w:r>
+          <w:rPr>
+            <w:rFonts w:hint="eastAsia"/>
+            <w:noProof/>
+            <w:webHidden/>
+          </w:rPr>
+          <w:fldChar w:fldCharType="separate"/>
+        </w:r>
+        <w:r>
+          <w:rPr>
+            <w:noProof/>
+            <w:webHidden/>
+          </w:rPr>
+          <w:t>13</w:t>
         </w:r>
         <w:r>
           <w:rPr>
@@ -3992,7 +4113,7 @@
           <w14:ligatures w14:val="standardContextual"/>
         </w:rPr>
       </w:pPr>
-      <w:hyperlink w:anchor="_Toc243221373" w:history="1">
+      <w:hyperlink w:anchor="_Toc243222299" w:history="1">
         <w:r>
           <w:rPr>
             <w:rStyle w:val="aff9"/>
@@ -4038,7 +4159,7 @@
             <w:noProof/>
             <w:webHidden/>
           </w:rPr>
-          <w:instrText>PAGEREF _Toc243221373 \h</w:instrText>
+          <w:instrText>PAGEREF _Toc243222299 \h</w:instrText>
         </w:r>
         <w:r>
           <w:rPr>
@@ -4068,7 +4189,7 @@
             <w:noProof/>
             <w:webHidden/>
           </w:rPr>
-          <w:t>12</w:t>
+          <w:t>13</w:t>
         </w:r>
         <w:r>
           <w:rPr>
@@ -4096,7 +4217,7 @@
           <w14:ligatures w14:val="standardContextual"/>
         </w:rPr>
       </w:pPr>
-      <w:hyperlink w:anchor="_Toc243221374" w:history="1">
+      <w:hyperlink w:anchor="_Toc243222300" w:history="1">
         <w:r>
           <w:rPr>
             <w:rStyle w:val="aff9"/>
@@ -4142,7 +4263,7 @@
             <w:noProof/>
             <w:webHidden/>
           </w:rPr>
-          <w:instrText>PAGEREF _Toc243221374 \h</w:instrText>
+          <w:instrText>PAGEREF _Toc243222300 \h</w:instrText>
         </w:r>
         <w:r>
           <w:rPr>
@@ -4172,7 +4293,7 @@
             <w:noProof/>
             <w:webHidden/>
           </w:rPr>
-          <w:t>13</w:t>
+          <w:t>14</w:t>
         </w:r>
         <w:r>
           <w:rPr>
@@ -4197,7 +4318,7 @@
         <w:pStyle w:val="1"/>
         <w:spacing w:before="280" w:after="120"/>
       </w:pPr>
-      <w:bookmarkStart w:id="0" w:name="_Toc243221337"/>
+      <w:bookmarkStart w:id="0" w:name="_Toc243222262"/>
       <w:r>
         <w:rPr>
           <w:rFonts w:ascii="Times New Roman" w:eastAsia="黑体" w:hAnsi="Times New Roman"/>
@@ -4475,6 +4596,7 @@
         <w:rPr>
           <w:color w:val="000000"/>
         </w:rPr>
+        <w:lastRenderedPageBreak/>
         <w:t>一句话：明星能带动市场，但没有证据表明他们更准。影响力假说得到支持，信息优势即使存在也很弱。</w:t>
       </w:r>
     </w:p>
@@ -4483,7 +4605,6 @@
         <w:rPr>
           <w:color w:val="000000"/>
         </w:rPr>
-        <w:lastRenderedPageBreak/>
         <w:t>还没做：聚类标准误、涨跌停与停牌稳健性、三张主图。以上全部是首轮单变量结果。</w:t>
       </w:r>
     </w:p>
@@ -4492,7 +4613,7 @@
         <w:pStyle w:val="1"/>
         <w:spacing w:before="280" w:after="120"/>
       </w:pPr>
-      <w:bookmarkStart w:id="1" w:name="_Toc243221338"/>
+      <w:bookmarkStart w:id="1" w:name="_Toc243222263"/>
       <w:r>
         <w:rPr>
           <w:rFonts w:ascii="Times New Roman" w:eastAsia="黑体" w:hAnsi="Times New Roman"/>
@@ -4516,7 +4637,7 @@
         <w:pStyle w:val="21"/>
         <w:spacing w:after="120"/>
       </w:pPr>
-      <w:bookmarkStart w:id="2" w:name="_Toc243221339"/>
+      <w:bookmarkStart w:id="2" w:name="_Toc243222264"/>
       <w:r>
         <w:rPr>
           <w:rFonts w:ascii="Times New Roman" w:eastAsia="黑体" w:hAnsi="Times New Roman"/>
@@ -4622,7 +4743,7 @@
         <w:pStyle w:val="21"/>
         <w:spacing w:after="120"/>
       </w:pPr>
-      <w:bookmarkStart w:id="3" w:name="_Toc243221340"/>
+      <w:bookmarkStart w:id="3" w:name="_Toc243222265"/>
       <w:r>
         <w:rPr>
           <w:rFonts w:ascii="Times New Roman" w:eastAsia="黑体" w:hAnsi="Times New Roman"/>
@@ -5031,7 +5152,7 @@
         <w:pStyle w:val="21"/>
         <w:spacing w:after="120"/>
       </w:pPr>
-      <w:bookmarkStart w:id="4" w:name="_Toc243221341"/>
+      <w:bookmarkStart w:id="4" w:name="_Toc243222266"/>
       <w:r>
         <w:rPr>
           <w:rFonts w:ascii="Times New Roman" w:eastAsia="黑体" w:hAnsi="Times New Roman"/>
@@ -5141,12 +5262,13 @@
         <w:pStyle w:val="21"/>
         <w:spacing w:after="120"/>
       </w:pPr>
-      <w:bookmarkStart w:id="5" w:name="_Toc243221342"/>
+      <w:bookmarkStart w:id="5" w:name="_Toc243222267"/>
       <w:r>
         <w:rPr>
           <w:rFonts w:ascii="Times New Roman" w:eastAsia="黑体" w:hAnsi="Times New Roman"/>
           <w:color w:val="000000"/>
         </w:rPr>
+        <w:lastRenderedPageBreak/>
         <w:t xml:space="preserve">1.4 </w:t>
       </w:r>
       <w:r>
@@ -5179,7 +5301,6 @@
         <w:rPr>
           <w:color w:val="000000"/>
         </w:rPr>
-        <w:lastRenderedPageBreak/>
         <w:t>事件后</w:t>
       </w:r>
       <w:r>
@@ -5224,7 +5345,7 @@
         <w:pStyle w:val="21"/>
         <w:spacing w:after="120"/>
       </w:pPr>
-      <w:bookmarkStart w:id="6" w:name="_Toc243221343"/>
+      <w:bookmarkStart w:id="6" w:name="_Toc243222268"/>
       <w:r>
         <w:rPr>
           <w:rFonts w:ascii="Times New Roman" w:eastAsia="黑体" w:hAnsi="Times New Roman"/>
@@ -5296,7 +5417,7 @@
         <w:pStyle w:val="21"/>
         <w:spacing w:after="120"/>
       </w:pPr>
-      <w:bookmarkStart w:id="7" w:name="_Toc243221344"/>
+      <w:bookmarkStart w:id="7" w:name="_Toc243222269"/>
       <w:r>
         <w:rPr>
           <w:rFonts w:ascii="Times New Roman" w:eastAsia="黑体" w:hAnsi="Times New Roman"/>
@@ -5392,7 +5513,7 @@
         <w:pStyle w:val="21"/>
         <w:spacing w:after="120"/>
       </w:pPr>
-      <w:bookmarkStart w:id="8" w:name="_Toc243221345"/>
+      <w:bookmarkStart w:id="8" w:name="_Toc243222270"/>
       <w:r>
         <w:rPr>
           <w:rFonts w:ascii="Times New Roman" w:eastAsia="黑体" w:hAnsi="Times New Roman"/>
@@ -5446,7 +5567,7 @@
         <w:pStyle w:val="1"/>
         <w:spacing w:before="280" w:after="120"/>
       </w:pPr>
-      <w:bookmarkStart w:id="9" w:name="_Toc243221346"/>
+      <w:bookmarkStart w:id="9" w:name="_Toc243222271"/>
       <w:r>
         <w:rPr>
           <w:rFonts w:ascii="Times New Roman" w:eastAsia="黑体" w:hAnsi="Times New Roman"/>
@@ -5600,7 +5721,7 @@
         <w:pStyle w:val="1"/>
         <w:spacing w:before="280" w:after="120"/>
       </w:pPr>
-      <w:bookmarkStart w:id="10" w:name="_Toc243221347"/>
+      <w:bookmarkStart w:id="10" w:name="_Toc243222272"/>
       <w:r>
         <w:rPr>
           <w:rFonts w:ascii="Times New Roman" w:eastAsia="黑体" w:hAnsi="Times New Roman"/>
@@ -5747,6 +5868,7 @@
                 <w:color w:val="000000"/>
                 <w:sz w:val="21"/>
               </w:rPr>
+              <w:lastRenderedPageBreak/>
               <w:t>是否新财富上榜</w:t>
             </w:r>
           </w:p>
@@ -6026,7 +6148,7 @@
         <w:pStyle w:val="1"/>
         <w:spacing w:before="280" w:after="120"/>
       </w:pPr>
-      <w:bookmarkStart w:id="11" w:name="_Toc243221348"/>
+      <w:bookmarkStart w:id="11" w:name="_Toc243222273"/>
       <w:r>
         <w:rPr>
           <w:rFonts w:ascii="Times New Roman" w:eastAsia="黑体" w:hAnsi="Times New Roman"/>
@@ -7250,7 +7372,7 @@
         <w:pStyle w:val="1"/>
         <w:spacing w:before="280" w:after="120"/>
       </w:pPr>
-      <w:bookmarkStart w:id="12" w:name="_Toc243221349"/>
+      <w:bookmarkStart w:id="12" w:name="_Toc243222274"/>
       <w:r>
         <w:rPr>
           <w:rFonts w:ascii="Times New Roman" w:eastAsia="黑体" w:hAnsi="Times New Roman"/>
@@ -7555,6 +7677,7 @@
                 <w:color w:val="000000"/>
                 <w:sz w:val="21"/>
               </w:rPr>
+              <w:lastRenderedPageBreak/>
               <w:t>剔除上市未满</w:t>
             </w:r>
             <w:r>
@@ -7783,7 +7906,6 @@
         <w:rPr>
           <w:color w:val="000000"/>
         </w:rPr>
-        <w:lastRenderedPageBreak/>
         <w:t>关键数字：</w:t>
       </w:r>
     </w:p>
@@ -8330,7 +8452,7 @@
         <w:pStyle w:val="1"/>
         <w:spacing w:before="280" w:after="120"/>
       </w:pPr>
-      <w:bookmarkStart w:id="13" w:name="_Toc243221350"/>
+      <w:bookmarkStart w:id="13" w:name="_Toc243222275"/>
       <w:r>
         <w:rPr>
           <w:rFonts w:ascii="Times New Roman" w:eastAsia="黑体" w:hAnsi="Times New Roman"/>
@@ -8354,7 +8476,7 @@
         <w:pStyle w:val="21"/>
         <w:spacing w:after="120"/>
       </w:pPr>
-      <w:bookmarkStart w:id="14" w:name="_Toc243221351"/>
+      <w:bookmarkStart w:id="14" w:name="_Toc243222276"/>
       <w:r>
         <w:rPr>
           <w:rFonts w:ascii="Times New Roman" w:eastAsia="黑体" w:hAnsi="Times New Roman"/>
@@ -8562,7 +8684,7 @@
         <w:pStyle w:val="21"/>
         <w:spacing w:after="120"/>
       </w:pPr>
-      <w:bookmarkStart w:id="15" w:name="_Toc243221352"/>
+      <w:bookmarkStart w:id="15" w:name="_Toc243222277"/>
       <w:r>
         <w:rPr>
           <w:rFonts w:ascii="Times New Roman" w:eastAsia="黑体" w:hAnsi="Times New Roman"/>
@@ -8648,12 +8770,13 @@
         <w:pStyle w:val="21"/>
         <w:spacing w:after="120"/>
       </w:pPr>
-      <w:bookmarkStart w:id="16" w:name="_Toc243221353"/>
+      <w:bookmarkStart w:id="16" w:name="_Toc243222278"/>
       <w:r>
         <w:rPr>
           <w:rFonts w:ascii="Times New Roman" w:eastAsia="黑体" w:hAnsi="Times New Roman"/>
           <w:color w:val="000000"/>
         </w:rPr>
+        <w:lastRenderedPageBreak/>
         <w:t xml:space="preserve">6.3 </w:t>
       </w:r>
       <w:r>
@@ -8750,14 +8873,13 @@
         <w:pStyle w:val="1"/>
         <w:spacing w:before="280" w:after="120"/>
       </w:pPr>
-      <w:bookmarkStart w:id="17" w:name="_Toc243221354"/>
+      <w:bookmarkStart w:id="17" w:name="_Toc243222279"/>
       <w:r>
         <w:rPr>
           <w:rFonts w:ascii="Times New Roman" w:eastAsia="黑体" w:hAnsi="Times New Roman"/>
           <w:color w:val="000000"/>
           <w:sz w:val="30"/>
         </w:rPr>
-        <w:lastRenderedPageBreak/>
         <w:t xml:space="preserve">7. </w:t>
       </w:r>
       <w:r>
@@ -8783,7 +8905,7 @@
         <w:pStyle w:val="21"/>
         <w:spacing w:after="120"/>
       </w:pPr>
-      <w:bookmarkStart w:id="18" w:name="_Toc243221355"/>
+      <w:bookmarkStart w:id="18" w:name="_Toc243222280"/>
       <w:r>
         <w:rPr>
           <w:rFonts w:ascii="Times New Roman" w:eastAsia="黑体" w:hAnsi="Times New Roman"/>
@@ -9049,7 +9171,7 @@
         <w:pStyle w:val="21"/>
         <w:spacing w:after="120"/>
       </w:pPr>
-      <w:bookmarkStart w:id="19" w:name="_Toc243221356"/>
+      <w:bookmarkStart w:id="19" w:name="_Toc243222281"/>
       <w:r>
         <w:rPr>
           <w:rFonts w:ascii="Times New Roman" w:eastAsia="黑体" w:hAnsi="Times New Roman"/>
@@ -9165,7 +9287,7 @@
         <w:pStyle w:val="21"/>
         <w:spacing w:after="120"/>
       </w:pPr>
-      <w:bookmarkStart w:id="20" w:name="_Toc243221357"/>
+      <w:bookmarkStart w:id="20" w:name="_Toc243222282"/>
       <w:r>
         <w:rPr>
           <w:rFonts w:ascii="Times New Roman" w:eastAsia="黑体" w:hAnsi="Times New Roman"/>
@@ -9391,6 +9513,7 @@
         <w:rPr>
           <w:color w:val="000000"/>
         </w:rPr>
+        <w:lastRenderedPageBreak/>
         <w:t>还有三类名字坑：</w:t>
       </w:r>
     </w:p>
@@ -9523,7 +9646,6 @@
         <w:rPr>
           <w:color w:val="000000"/>
         </w:rPr>
-        <w:lastRenderedPageBreak/>
         <w:t>中金公司在评级明细里以它为研究机构的记录是</w:t>
       </w:r>
       <w:r>
@@ -9556,7 +9678,7 @@
         <w:pStyle w:val="21"/>
         <w:spacing w:after="120"/>
       </w:pPr>
-      <w:bookmarkStart w:id="21" w:name="_Toc243221358"/>
+      <w:bookmarkStart w:id="21" w:name="_Toc243222283"/>
       <w:r>
         <w:rPr>
           <w:rFonts w:ascii="Times New Roman" w:eastAsia="黑体" w:hAnsi="Times New Roman"/>
@@ -9678,7 +9800,7 @@
         <w:pStyle w:val="21"/>
         <w:spacing w:after="120"/>
       </w:pPr>
-      <w:bookmarkStart w:id="22" w:name="_Toc243221359"/>
+      <w:bookmarkStart w:id="22" w:name="_Toc243222284"/>
       <w:r>
         <w:rPr>
           <w:rFonts w:ascii="Times New Roman" w:eastAsia="黑体" w:hAnsi="Times New Roman"/>
@@ -9816,7 +9938,7 @@
         <w:pStyle w:val="21"/>
         <w:spacing w:after="120"/>
       </w:pPr>
-      <w:bookmarkStart w:id="23" w:name="_Toc243221360"/>
+      <w:bookmarkStart w:id="23" w:name="_Toc243222285"/>
       <w:r>
         <w:rPr>
           <w:rFonts w:ascii="Times New Roman" w:eastAsia="黑体" w:hAnsi="Times New Roman"/>
@@ -10052,7 +10174,7 @@
         <w:pStyle w:val="21"/>
         <w:spacing w:after="120"/>
       </w:pPr>
-      <w:bookmarkStart w:id="24" w:name="_Toc243221361"/>
+      <w:bookmarkStart w:id="24" w:name="_Toc243222286"/>
       <w:r>
         <w:rPr>
           <w:rFonts w:ascii="Times New Roman" w:eastAsia="黑体" w:hAnsi="Times New Roman"/>
@@ -10168,12 +10290,13 @@
         <w:pStyle w:val="21"/>
         <w:spacing w:after="120"/>
       </w:pPr>
-      <w:bookmarkStart w:id="25" w:name="_Toc243221362"/>
+      <w:bookmarkStart w:id="25" w:name="_Toc243222287"/>
       <w:r>
         <w:rPr>
           <w:rFonts w:ascii="Times New Roman" w:eastAsia="黑体" w:hAnsi="Times New Roman"/>
           <w:color w:val="000000"/>
         </w:rPr>
+        <w:lastRenderedPageBreak/>
         <w:t xml:space="preserve">7.8 2018 </w:t>
       </w:r>
       <w:r>
@@ -10466,7 +10589,6 @@
         <w:rPr>
           <w:color w:val="000000"/>
         </w:rPr>
-        <w:lastRenderedPageBreak/>
         <w:t>榜单。沿用后</w:t>
       </w:r>
       <w:r>
@@ -10499,7 +10621,7 @@
         <w:pStyle w:val="21"/>
         <w:spacing w:after="120"/>
       </w:pPr>
-      <w:bookmarkStart w:id="26" w:name="_Toc243221363"/>
+      <w:bookmarkStart w:id="26" w:name="_Toc243222288"/>
       <w:r>
         <w:rPr>
           <w:rFonts w:ascii="Times New Roman" w:eastAsia="黑体" w:hAnsi="Times New Roman"/>
@@ -10601,7 +10723,7 @@
         <w:pStyle w:val="21"/>
         <w:spacing w:after="120"/>
       </w:pPr>
-      <w:bookmarkStart w:id="27" w:name="_Toc243221364"/>
+      <w:bookmarkStart w:id="27" w:name="_Toc243222289"/>
       <w:r>
         <w:rPr>
           <w:rFonts w:ascii="Times New Roman" w:eastAsia="黑体" w:hAnsi="Times New Roman"/>
@@ -10739,7 +10861,7 @@
         <w:pStyle w:val="21"/>
         <w:spacing w:after="120"/>
       </w:pPr>
-      <w:bookmarkStart w:id="28" w:name="_Toc243221365"/>
+      <w:bookmarkStart w:id="28" w:name="_Toc243222290"/>
       <w:r>
         <w:rPr>
           <w:rFonts w:ascii="Times New Roman" w:eastAsia="黑体" w:hAnsi="Times New Roman"/>
@@ -10807,7 +10929,7 @@
         <w:pStyle w:val="21"/>
         <w:spacing w:after="120"/>
       </w:pPr>
-      <w:bookmarkStart w:id="29" w:name="_Toc243221366"/>
+      <w:bookmarkStart w:id="29" w:name="_Toc243222291"/>
       <w:r>
         <w:rPr>
           <w:rFonts w:ascii="Times New Roman" w:eastAsia="黑体" w:hAnsi="Times New Roman"/>
@@ -10855,7 +10977,7 @@
         <w:pStyle w:val="21"/>
         <w:spacing w:after="120"/>
       </w:pPr>
-      <w:bookmarkStart w:id="30" w:name="_Toc243221367"/>
+      <w:bookmarkStart w:id="30" w:name="_Toc243222292"/>
       <w:r>
         <w:rPr>
           <w:rFonts w:ascii="Times New Roman" w:eastAsia="黑体" w:hAnsi="Times New Roman"/>
@@ -11019,13 +11141,14 @@
         <w:pStyle w:val="1"/>
         <w:spacing w:before="280" w:after="120"/>
       </w:pPr>
-      <w:bookmarkStart w:id="31" w:name="_Toc243221368"/>
+      <w:bookmarkStart w:id="31" w:name="_Toc243222293"/>
       <w:r>
         <w:rPr>
           <w:rFonts w:ascii="Times New Roman" w:eastAsia="黑体" w:hAnsi="Times New Roman"/>
           <w:color w:val="000000"/>
           <w:sz w:val="30"/>
         </w:rPr>
+        <w:lastRenderedPageBreak/>
         <w:t xml:space="preserve">8. </w:t>
       </w:r>
       <w:r>
@@ -11290,7 +11413,6 @@
                 <w:color w:val="000000"/>
                 <w:sz w:val="21"/>
               </w:rPr>
-              <w:lastRenderedPageBreak/>
               <w:t>停牌、缺失、节假日不能用同一种删除方法</w:t>
             </w:r>
           </w:p>
@@ -11818,7 +11940,7 @@
         <w:pStyle w:val="21"/>
         <w:spacing w:after="120"/>
       </w:pPr>
-      <w:bookmarkStart w:id="32" w:name="_Toc243221369"/>
+      <w:bookmarkStart w:id="32" w:name="_Toc243222294"/>
       <w:r>
         <w:rPr>
           <w:rFonts w:ascii="Times New Roman" w:eastAsia="黑体" w:hAnsi="Times New Roman"/>
@@ -12083,6 +12205,7 @@
                 <w:color w:val="000000"/>
                 <w:sz w:val="21"/>
               </w:rPr>
+              <w:lastRenderedPageBreak/>
               <w:t>CAR[-1,+1]</w:t>
             </w:r>
           </w:p>
@@ -12678,7 +12801,6 @@
         <w:rPr>
           <w:color w:val="000000"/>
         </w:rPr>
-        <w:lastRenderedPageBreak/>
         <w:t>同股同日先取均值的聚类稳健版结论一致：调高</w:t>
       </w:r>
       <w:r>
@@ -12827,7 +12949,7 @@
         <w:pStyle w:val="21"/>
         <w:spacing w:after="120"/>
       </w:pPr>
-      <w:bookmarkStart w:id="33" w:name="_Toc243221370"/>
+      <w:bookmarkStart w:id="33" w:name="_Toc243222295"/>
       <w:r>
         <w:rPr>
           <w:rFonts w:ascii="Times New Roman" w:eastAsia="黑体" w:hAnsi="Times New Roman"/>
@@ -14232,6 +14354,7 @@
         <w:rPr>
           <w:color w:val="000000"/>
         </w:rPr>
+        <w:lastRenderedPageBreak/>
         <w:t>合起来的故事：明星身份带来更大的公告日冲击，并且在短期（下调</w:t>
       </w:r>
       <w:r>
@@ -14312,7 +14435,7 @@
         <w:pStyle w:val="21"/>
         <w:spacing w:after="120"/>
       </w:pPr>
-      <w:bookmarkStart w:id="34" w:name="_Toc243221371"/>
+      <w:bookmarkStart w:id="34" w:name="_Toc243222296"/>
       <w:r>
         <w:rPr>
           <w:rFonts w:ascii="Times New Roman" w:eastAsia="黑体" w:hAnsi="Times New Roman"/>
@@ -14532,7 +14655,6 @@
                 <w:color w:val="000000"/>
                 <w:sz w:val="21"/>
               </w:rPr>
-              <w:lastRenderedPageBreak/>
               <w:t>指标</w:t>
             </w:r>
           </w:p>
@@ -15240,7 +15362,7 @@
         <w:pStyle w:val="1"/>
         <w:spacing w:before="280" w:after="120"/>
       </w:pPr>
-      <w:bookmarkStart w:id="35" w:name="_Toc243221372"/>
+      <w:bookmarkStart w:id="35" w:name="_Toc243222297"/>
       <w:r>
         <w:rPr>
           <w:rFonts w:ascii="Times New Roman" w:eastAsia="黑体" w:hAnsi="Times New Roman"/>
@@ -15564,6 +15686,7 @@
         <w:rPr>
           <w:color w:val="000000"/>
         </w:rPr>
+        <w:lastRenderedPageBreak/>
         <w:t>非交易日对齐我们这边独立查过：事件落在周末的有</w:t>
       </w:r>
       <w:r>
@@ -15613,6 +15736,962 @@
           <w:color w:val="000000"/>
         </w:rPr>
         <w:t>）不矛盾，但还没按名单逐条核。</w:t>
+      </w:r>
+    </w:p>
+    <w:p>
+      <w:pPr>
+        <w:pStyle w:val="21"/>
+        <w:spacing w:after="120"/>
+      </w:pPr>
+      <w:bookmarkStart w:id="36" w:name="_Toc243222298"/>
+      <w:r>
+        <w:rPr>
+          <w:rFonts w:ascii="Times New Roman" w:eastAsia="黑体" w:hAnsi="Times New Roman"/>
+          <w:color w:val="000000"/>
+        </w:rPr>
+        <w:t xml:space="preserve">9.1 </w:t>
+      </w:r>
+      <w:r>
+        <w:rPr>
+          <w:rFonts w:ascii="Times New Roman" w:eastAsia="黑体" w:hAnsi="Times New Roman"/>
+          <w:color w:val="000000"/>
+        </w:rPr>
+        <w:t>需要乙确认或交付的事项（</w:t>
+      </w:r>
+      <w:r>
+        <w:rPr>
+          <w:rFonts w:ascii="Times New Roman" w:eastAsia="黑体" w:hAnsi="Times New Roman"/>
+          <w:color w:val="000000"/>
+        </w:rPr>
+        <w:t>2026-10-18</w:t>
+      </w:r>
+      <w:r>
+        <w:rPr>
+          <w:rFonts w:ascii="Times New Roman" w:eastAsia="黑体" w:hAnsi="Times New Roman"/>
+          <w:color w:val="000000"/>
+        </w:rPr>
+        <w:t>）</w:t>
+      </w:r>
+      <w:bookmarkEnd w:id="36"/>
+    </w:p>
+    <w:tbl>
+      <w:tblPr>
+        <w:tblStyle w:val="aff1"/>
+        <w:tblW w:w="0" w:type="auto"/>
+        <w:jc w:val="center"/>
+        <w:tblLook w:val="04A0" w:firstRow="1" w:lastRow="0" w:firstColumn="1" w:lastColumn="0" w:noHBand="0" w:noVBand="1"/>
+      </w:tblPr>
+      <w:tblGrid>
+        <w:gridCol w:w="2227"/>
+        <w:gridCol w:w="2237"/>
+        <w:gridCol w:w="2933"/>
+        <w:gridCol w:w="2231"/>
+      </w:tblGrid>
+      <w:tr>
+        <w:trPr>
+          <w:cantSplit/>
+          <w:tblHeader/>
+          <w:jc w:val="center"/>
+        </w:trPr>
+        <w:tc>
+          <w:tcPr>
+            <w:tcW w:w="2353" w:type="dxa"/>
+            <w:shd w:val="clear" w:color="auto" w:fill="F2F2F2"/>
+          </w:tcPr>
+          <w:p>
+            <w:pPr>
+              <w:spacing w:after="40" w:line="276" w:lineRule="auto"/>
+            </w:pPr>
+            <w:r>
+              <w:rPr>
+                <w:b/>
+                <w:color w:val="000000"/>
+                <w:sz w:val="21"/>
+              </w:rPr>
+              <w:t>优先级</w:t>
+            </w:r>
+          </w:p>
+        </w:tc>
+        <w:tc>
+          <w:tcPr>
+            <w:tcW w:w="2353" w:type="dxa"/>
+            <w:shd w:val="clear" w:color="auto" w:fill="F2F2F2"/>
+          </w:tcPr>
+          <w:p>
+            <w:pPr>
+              <w:spacing w:after="40" w:line="276" w:lineRule="auto"/>
+            </w:pPr>
+            <w:r>
+              <w:rPr>
+                <w:b/>
+                <w:color w:val="000000"/>
+                <w:sz w:val="21"/>
+              </w:rPr>
+              <w:t>事项</w:t>
+            </w:r>
+          </w:p>
+        </w:tc>
+        <w:tc>
+          <w:tcPr>
+            <w:tcW w:w="2353" w:type="dxa"/>
+            <w:shd w:val="clear" w:color="auto" w:fill="F2F2F2"/>
+          </w:tcPr>
+          <w:p>
+            <w:pPr>
+              <w:spacing w:after="40" w:line="276" w:lineRule="auto"/>
+            </w:pPr>
+            <w:r>
+              <w:rPr>
+                <w:b/>
+                <w:color w:val="000000"/>
+                <w:sz w:val="21"/>
+              </w:rPr>
+              <w:t>具体问题</w:t>
+            </w:r>
+          </w:p>
+        </w:tc>
+        <w:tc>
+          <w:tcPr>
+            <w:tcW w:w="2353" w:type="dxa"/>
+            <w:shd w:val="clear" w:color="auto" w:fill="F2F2F2"/>
+          </w:tcPr>
+          <w:p>
+            <w:pPr>
+              <w:spacing w:after="40" w:line="276" w:lineRule="auto"/>
+            </w:pPr>
+            <w:r>
+              <w:rPr>
+                <w:b/>
+                <w:color w:val="000000"/>
+                <w:sz w:val="21"/>
+              </w:rPr>
+              <w:t>截止</w:t>
+            </w:r>
+          </w:p>
+        </w:tc>
+      </w:tr>
+      <w:tr>
+        <w:trPr>
+          <w:cantSplit/>
+          <w:jc w:val="center"/>
+        </w:trPr>
+        <w:tc>
+          <w:tcPr>
+            <w:tcW w:w="2353" w:type="dxa"/>
+          </w:tcPr>
+          <w:p>
+            <w:pPr>
+              <w:spacing w:after="40" w:line="276" w:lineRule="auto"/>
+            </w:pPr>
+            <w:r>
+              <w:rPr>
+                <w:color w:val="000000"/>
+                <w:sz w:val="21"/>
+              </w:rPr>
+              <w:t>高</w:t>
+            </w:r>
+          </w:p>
+        </w:tc>
+        <w:tc>
+          <w:tcPr>
+            <w:tcW w:w="2353" w:type="dxa"/>
+          </w:tcPr>
+          <w:p>
+            <w:pPr>
+              <w:spacing w:after="40" w:line="276" w:lineRule="auto"/>
+            </w:pPr>
+            <w:r>
+              <w:rPr>
+                <w:color w:val="000000"/>
+                <w:sz w:val="21"/>
+              </w:rPr>
+              <w:t>停牌字段</w:t>
+            </w:r>
+          </w:p>
+        </w:tc>
+        <w:tc>
+          <w:tcPr>
+            <w:tcW w:w="2353" w:type="dxa"/>
+          </w:tcPr>
+          <w:p>
+            <w:pPr>
+              <w:spacing w:after="40" w:line="276" w:lineRule="auto"/>
+            </w:pPr>
+            <w:r>
+              <w:rPr>
+                <w:rFonts w:ascii="Consolas" w:hAnsi="Consolas"/>
+                <w:color w:val="000000"/>
+                <w:sz w:val="19"/>
+              </w:rPr>
+              <w:t>StateCode=1</w:t>
+            </w:r>
+            <w:r>
+              <w:rPr>
+                <w:color w:val="000000"/>
+                <w:sz w:val="21"/>
+              </w:rPr>
+              <w:t>、</w:t>
+            </w:r>
+            <w:r>
+              <w:rPr>
+                <w:rFonts w:ascii="Consolas" w:hAnsi="Consolas"/>
+                <w:color w:val="000000"/>
+                <w:sz w:val="19"/>
+              </w:rPr>
+              <w:t>Filling=1</w:t>
+            </w:r>
+            <w:r>
+              <w:rPr>
+                <w:color w:val="000000"/>
+                <w:sz w:val="21"/>
+              </w:rPr>
+              <w:t xml:space="preserve"> </w:t>
+            </w:r>
+            <w:r>
+              <w:rPr>
+                <w:color w:val="000000"/>
+                <w:sz w:val="21"/>
+              </w:rPr>
+              <w:t>是停牌还是节假日填充？两市是否同口径？面板里这两列各有</w:t>
+            </w:r>
+            <w:r>
+              <w:rPr>
+                <w:color w:val="000000"/>
+                <w:sz w:val="21"/>
+              </w:rPr>
+              <w:t xml:space="preserve"> 43,830 </w:t>
+            </w:r>
+            <w:r>
+              <w:rPr>
+                <w:color w:val="000000"/>
+                <w:sz w:val="21"/>
+              </w:rPr>
+              <w:t>行为</w:t>
+            </w:r>
+            <w:r>
+              <w:rPr>
+                <w:color w:val="000000"/>
+                <w:sz w:val="21"/>
+              </w:rPr>
+              <w:t xml:space="preserve"> 1</w:t>
+            </w:r>
+            <w:r>
+              <w:rPr>
+                <w:color w:val="000000"/>
+                <w:sz w:val="21"/>
+              </w:rPr>
+              <w:t>，成交量和涨跌幅为空</w:t>
+            </w:r>
+          </w:p>
+        </w:tc>
+        <w:tc>
+          <w:tcPr>
+            <w:tcW w:w="2353" w:type="dxa"/>
+          </w:tcPr>
+          <w:p>
+            <w:pPr>
+              <w:spacing w:after="40" w:line="276" w:lineRule="auto"/>
+            </w:pPr>
+            <w:r>
+              <w:rPr>
+                <w:color w:val="000000"/>
+                <w:sz w:val="21"/>
+              </w:rPr>
+              <w:t>10-20</w:t>
+            </w:r>
+          </w:p>
+        </w:tc>
+      </w:tr>
+      <w:tr>
+        <w:trPr>
+          <w:cantSplit/>
+          <w:jc w:val="center"/>
+        </w:trPr>
+        <w:tc>
+          <w:tcPr>
+            <w:tcW w:w="2353" w:type="dxa"/>
+          </w:tcPr>
+          <w:p>
+            <w:pPr>
+              <w:spacing w:after="40" w:line="276" w:lineRule="auto"/>
+            </w:pPr>
+            <w:r>
+              <w:rPr>
+                <w:color w:val="000000"/>
+                <w:sz w:val="21"/>
+              </w:rPr>
+              <w:t>高</w:t>
+            </w:r>
+          </w:p>
+        </w:tc>
+        <w:tc>
+          <w:tcPr>
+            <w:tcW w:w="2353" w:type="dxa"/>
+          </w:tcPr>
+          <w:p>
+            <w:pPr>
+              <w:spacing w:after="40" w:line="276" w:lineRule="auto"/>
+            </w:pPr>
+            <w:r>
+              <w:rPr>
+                <w:color w:val="000000"/>
+                <w:sz w:val="21"/>
+              </w:rPr>
+              <w:t>极端收益</w:t>
+            </w:r>
+          </w:p>
+        </w:tc>
+        <w:tc>
+          <w:tcPr>
+            <w:tcW w:w="2353" w:type="dxa"/>
+          </w:tcPr>
+          <w:p>
+            <w:pPr>
+              <w:spacing w:after="40" w:line="276" w:lineRule="auto"/>
+            </w:pPr>
+            <w:r>
+              <w:rPr>
+                <w:color w:val="000000"/>
+                <w:sz w:val="21"/>
+              </w:rPr>
+              <w:t>涨跌幅最大</w:t>
+            </w:r>
+            <w:r>
+              <w:rPr>
+                <w:color w:val="000000"/>
+                <w:sz w:val="21"/>
+              </w:rPr>
+              <w:t xml:space="preserve"> 1273.938%</w:t>
+            </w:r>
+            <w:r>
+              <w:rPr>
+                <w:color w:val="000000"/>
+                <w:sz w:val="21"/>
+              </w:rPr>
+              <w:t>，确认是上市首日、复权还是数据错误，并给出剔除规则</w:t>
+            </w:r>
+          </w:p>
+        </w:tc>
+        <w:tc>
+          <w:tcPr>
+            <w:tcW w:w="2353" w:type="dxa"/>
+          </w:tcPr>
+          <w:p>
+            <w:pPr>
+              <w:spacing w:after="40" w:line="276" w:lineRule="auto"/>
+            </w:pPr>
+            <w:r>
+              <w:rPr>
+                <w:color w:val="000000"/>
+                <w:sz w:val="21"/>
+              </w:rPr>
+              <w:t>10-20</w:t>
+            </w:r>
+          </w:p>
+        </w:tc>
+      </w:tr>
+      <w:tr>
+        <w:trPr>
+          <w:cantSplit/>
+          <w:jc w:val="center"/>
+        </w:trPr>
+        <w:tc>
+          <w:tcPr>
+            <w:tcW w:w="2353" w:type="dxa"/>
+          </w:tcPr>
+          <w:p>
+            <w:pPr>
+              <w:spacing w:after="40" w:line="276" w:lineRule="auto"/>
+            </w:pPr>
+            <w:r>
+              <w:rPr>
+                <w:color w:val="000000"/>
+                <w:sz w:val="21"/>
+              </w:rPr>
+              <w:t>高</w:t>
+            </w:r>
+          </w:p>
+        </w:tc>
+        <w:tc>
+          <w:tcPr>
+            <w:tcW w:w="2353" w:type="dxa"/>
+          </w:tcPr>
+          <w:p>
+            <w:pPr>
+              <w:spacing w:after="40" w:line="276" w:lineRule="auto"/>
+            </w:pPr>
+            <w:r>
+              <w:rPr>
+                <w:color w:val="000000"/>
+                <w:sz w:val="21"/>
+              </w:rPr>
+              <w:t>独立复跑</w:t>
+            </w:r>
+          </w:p>
+        </w:tc>
+        <w:tc>
+          <w:tcPr>
+            <w:tcW w:w="2353" w:type="dxa"/>
+          </w:tcPr>
+          <w:p>
+            <w:pPr>
+              <w:spacing w:after="40" w:line="276" w:lineRule="auto"/>
+            </w:pPr>
+            <w:r>
+              <w:rPr>
+                <w:color w:val="000000"/>
+                <w:sz w:val="21"/>
+              </w:rPr>
+              <w:t>从</w:t>
+            </w:r>
+            <w:r>
+              <w:rPr>
+                <w:color w:val="000000"/>
+                <w:sz w:val="21"/>
+              </w:rPr>
+              <w:t xml:space="preserve"> main </w:t>
+            </w:r>
+            <w:r>
+              <w:rPr>
+                <w:color w:val="000000"/>
+                <w:sz w:val="21"/>
+              </w:rPr>
+              <w:t>拉最新版本，跑</w:t>
+            </w:r>
+            <w:r>
+              <w:rPr>
+                <w:color w:val="000000"/>
+                <w:sz w:val="21"/>
+              </w:rPr>
+              <w:t xml:space="preserve"> </w:t>
+            </w:r>
+            <w:r>
+              <w:rPr>
+                <w:rFonts w:ascii="Consolas" w:hAnsi="Consolas"/>
+                <w:color w:val="000000"/>
+                <w:sz w:val="19"/>
+              </w:rPr>
+              <w:t>event_study_v2.py</w:t>
+            </w:r>
+            <w:r>
+              <w:rPr>
+                <w:color w:val="000000"/>
+                <w:sz w:val="21"/>
+              </w:rPr>
+              <w:t xml:space="preserve"> </w:t>
+            </w:r>
+            <w:r>
+              <w:rPr>
+                <w:color w:val="000000"/>
+                <w:sz w:val="21"/>
+              </w:rPr>
+              <w:t>与</w:t>
+            </w:r>
+            <w:r>
+              <w:rPr>
+                <w:color w:val="000000"/>
+                <w:sz w:val="21"/>
+              </w:rPr>
+              <w:t xml:space="preserve"> </w:t>
+            </w:r>
+            <w:r>
+              <w:rPr>
+                <w:rFonts w:ascii="Consolas" w:hAnsi="Consolas"/>
+                <w:color w:val="000000"/>
+                <w:sz w:val="19"/>
+              </w:rPr>
+              <w:t>accuracy_test.py</w:t>
+            </w:r>
+            <w:r>
+              <w:rPr>
+                <w:color w:val="000000"/>
+                <w:sz w:val="21"/>
+              </w:rPr>
+              <w:t>，对比</w:t>
+            </w:r>
+            <w:r>
+              <w:rPr>
+                <w:color w:val="000000"/>
+                <w:sz w:val="21"/>
+              </w:rPr>
+              <w:t xml:space="preserve"> </w:t>
+            </w:r>
+            <w:r>
+              <w:rPr>
+                <w:rFonts w:ascii="Consolas" w:hAnsi="Consolas"/>
+                <w:color w:val="000000"/>
+                <w:sz w:val="19"/>
+              </w:rPr>
+              <w:t>car_summary.csv</w:t>
+            </w:r>
+            <w:r>
+              <w:rPr>
+                <w:color w:val="000000"/>
+                <w:sz w:val="21"/>
+              </w:rPr>
+              <w:t>、</w:t>
+            </w:r>
+            <w:r>
+              <w:rPr>
+                <w:rFonts w:ascii="Consolas" w:hAnsi="Consolas"/>
+                <w:color w:val="000000"/>
+                <w:sz w:val="19"/>
+              </w:rPr>
+              <w:t>accuracy_summary.csv</w:t>
+            </w:r>
+            <w:r>
+              <w:rPr>
+                <w:color w:val="000000"/>
+                <w:sz w:val="21"/>
+              </w:rPr>
+              <w:t>、</w:t>
+            </w:r>
+            <w:r>
+              <w:rPr>
+                <w:rFonts w:ascii="Consolas" w:hAnsi="Consolas"/>
+                <w:color w:val="000000"/>
+                <w:sz w:val="19"/>
+              </w:rPr>
+              <w:t>forecast_error_summary.csv</w:t>
+            </w:r>
+          </w:p>
+        </w:tc>
+        <w:tc>
+          <w:tcPr>
+            <w:tcW w:w="2353" w:type="dxa"/>
+          </w:tcPr>
+          <w:p>
+            <w:pPr>
+              <w:spacing w:after="40" w:line="276" w:lineRule="auto"/>
+            </w:pPr>
+            <w:r>
+              <w:rPr>
+                <w:color w:val="000000"/>
+                <w:sz w:val="21"/>
+              </w:rPr>
+              <w:t>10-21</w:t>
+            </w:r>
+          </w:p>
+        </w:tc>
+      </w:tr>
+      <w:tr>
+        <w:trPr>
+          <w:cantSplit/>
+          <w:jc w:val="center"/>
+        </w:trPr>
+        <w:tc>
+          <w:tcPr>
+            <w:tcW w:w="2353" w:type="dxa"/>
+          </w:tcPr>
+          <w:p>
+            <w:pPr>
+              <w:spacing w:after="40" w:line="276" w:lineRule="auto"/>
+            </w:pPr>
+            <w:r>
+              <w:rPr>
+                <w:color w:val="000000"/>
+                <w:sz w:val="21"/>
+              </w:rPr>
+              <w:t>中</w:t>
+            </w:r>
+          </w:p>
+        </w:tc>
+        <w:tc>
+          <w:tcPr>
+            <w:tcW w:w="2353" w:type="dxa"/>
+          </w:tcPr>
+          <w:p>
+            <w:pPr>
+              <w:spacing w:after="40" w:line="276" w:lineRule="auto"/>
+            </w:pPr>
+            <w:r>
+              <w:rPr>
+                <w:color w:val="000000"/>
+                <w:sz w:val="21"/>
+              </w:rPr>
+              <w:t>数据来源段落</w:t>
+            </w:r>
+          </w:p>
+        </w:tc>
+        <w:tc>
+          <w:tcPr>
+            <w:tcW w:w="2353" w:type="dxa"/>
+          </w:tcPr>
+          <w:p>
+            <w:pPr>
+              <w:spacing w:after="40" w:line="276" w:lineRule="auto"/>
+            </w:pPr>
+            <w:r>
+              <w:rPr>
+                <w:color w:val="000000"/>
+                <w:sz w:val="21"/>
+              </w:rPr>
+              <w:t>行情来源、提取日期、字段、复权方式、筛选规则，一页纸</w:t>
+            </w:r>
+          </w:p>
+        </w:tc>
+        <w:tc>
+          <w:tcPr>
+            <w:tcW w:w="2353" w:type="dxa"/>
+          </w:tcPr>
+          <w:p>
+            <w:pPr>
+              <w:spacing w:after="40" w:line="276" w:lineRule="auto"/>
+            </w:pPr>
+            <w:r>
+              <w:rPr>
+                <w:color w:val="000000"/>
+                <w:sz w:val="21"/>
+              </w:rPr>
+              <w:t>10-22</w:t>
+            </w:r>
+          </w:p>
+        </w:tc>
+      </w:tr>
+      <w:tr>
+        <w:trPr>
+          <w:cantSplit/>
+          <w:jc w:val="center"/>
+        </w:trPr>
+        <w:tc>
+          <w:tcPr>
+            <w:tcW w:w="2353" w:type="dxa"/>
+          </w:tcPr>
+          <w:p>
+            <w:pPr>
+              <w:spacing w:after="40" w:line="276" w:lineRule="auto"/>
+            </w:pPr>
+            <w:r>
+              <w:rPr>
+                <w:color w:val="000000"/>
+                <w:sz w:val="21"/>
+              </w:rPr>
+              <w:t>中</w:t>
+            </w:r>
+          </w:p>
+        </w:tc>
+        <w:tc>
+          <w:tcPr>
+            <w:tcW w:w="2353" w:type="dxa"/>
+          </w:tcPr>
+          <w:p>
+            <w:pPr>
+              <w:spacing w:after="40" w:line="276" w:lineRule="auto"/>
+            </w:pPr>
+            <w:r>
+              <w:rPr>
+                <w:color w:val="000000"/>
+                <w:sz w:val="21"/>
+              </w:rPr>
+              <w:t>陈述后半场</w:t>
+            </w:r>
+          </w:p>
+        </w:tc>
+        <w:tc>
+          <w:tcPr>
+            <w:tcW w:w="2353" w:type="dxa"/>
+          </w:tcPr>
+          <w:p>
+            <w:pPr>
+              <w:spacing w:after="40" w:line="276" w:lineRule="auto"/>
+            </w:pPr>
+            <w:r>
+              <w:rPr>
+                <w:color w:val="000000"/>
+                <w:sz w:val="21"/>
+              </w:rPr>
+              <w:t>第</w:t>
+            </w:r>
+            <w:r>
+              <w:rPr>
+                <w:color w:val="000000"/>
+                <w:sz w:val="21"/>
+              </w:rPr>
+              <w:t xml:space="preserve"> 8 </w:t>
+            </w:r>
+            <w:r>
+              <w:rPr>
+                <w:color w:val="000000"/>
+                <w:sz w:val="21"/>
+              </w:rPr>
+              <w:t>至</w:t>
+            </w:r>
+            <w:r>
+              <w:rPr>
+                <w:color w:val="000000"/>
+                <w:sz w:val="21"/>
+              </w:rPr>
+              <w:t xml:space="preserve"> 14 </w:t>
+            </w:r>
+            <w:r>
+              <w:rPr>
+                <w:color w:val="000000"/>
+                <w:sz w:val="21"/>
+              </w:rPr>
+              <w:t>页：三组主结果、异质性、稳健性、结论、拓展</w:t>
+            </w:r>
+          </w:p>
+        </w:tc>
+        <w:tc>
+          <w:tcPr>
+            <w:tcW w:w="2353" w:type="dxa"/>
+          </w:tcPr>
+          <w:p>
+            <w:pPr>
+              <w:spacing w:after="40" w:line="276" w:lineRule="auto"/>
+            </w:pPr>
+            <w:r>
+              <w:rPr>
+                <w:color w:val="000000"/>
+                <w:sz w:val="21"/>
+              </w:rPr>
+              <w:t xml:space="preserve">10-24 </w:t>
+            </w:r>
+            <w:r>
+              <w:rPr>
+                <w:color w:val="000000"/>
+                <w:sz w:val="21"/>
+              </w:rPr>
+              <w:t>初稿</w:t>
+            </w:r>
+          </w:p>
+        </w:tc>
+      </w:tr>
+      <w:tr>
+        <w:trPr>
+          <w:cantSplit/>
+          <w:jc w:val="center"/>
+        </w:trPr>
+        <w:tc>
+          <w:tcPr>
+            <w:tcW w:w="2353" w:type="dxa"/>
+          </w:tcPr>
+          <w:p>
+            <w:pPr>
+              <w:spacing w:after="40" w:line="276" w:lineRule="auto"/>
+            </w:pPr>
+            <w:r>
+              <w:rPr>
+                <w:color w:val="000000"/>
+                <w:sz w:val="21"/>
+              </w:rPr>
+              <w:t>低</w:t>
+            </w:r>
+          </w:p>
+        </w:tc>
+        <w:tc>
+          <w:tcPr>
+            <w:tcW w:w="2353" w:type="dxa"/>
+          </w:tcPr>
+          <w:p>
+            <w:pPr>
+              <w:spacing w:after="40" w:line="276" w:lineRule="auto"/>
+            </w:pPr>
+            <w:r>
+              <w:rPr>
+                <w:color w:val="000000"/>
+                <w:sz w:val="21"/>
+              </w:rPr>
+              <w:t>退市公司实际</w:t>
+            </w:r>
+            <w:r>
+              <w:rPr>
+                <w:color w:val="000000"/>
+                <w:sz w:val="21"/>
+              </w:rPr>
+              <w:t xml:space="preserve"> EPS</w:t>
+            </w:r>
+          </w:p>
+        </w:tc>
+        <w:tc>
+          <w:tcPr>
+            <w:tcW w:w="2353" w:type="dxa"/>
+          </w:tcPr>
+          <w:p>
+            <w:pPr>
+              <w:spacing w:after="40" w:line="276" w:lineRule="auto"/>
+            </w:pPr>
+            <w:r>
+              <w:rPr>
+                <w:color w:val="000000"/>
+                <w:sz w:val="21"/>
+              </w:rPr>
+              <w:t>事件里只有</w:t>
+            </w:r>
+            <w:r>
+              <w:rPr>
+                <w:color w:val="000000"/>
+                <w:sz w:val="21"/>
+              </w:rPr>
+              <w:t xml:space="preserve"> 34 </w:t>
+            </w:r>
+            <w:r>
+              <w:rPr>
+                <w:color w:val="000000"/>
+                <w:sz w:val="21"/>
+              </w:rPr>
+              <w:t>只股票、</w:t>
+            </w:r>
+            <w:r>
+              <w:rPr>
+                <w:color w:val="000000"/>
+                <w:sz w:val="21"/>
+              </w:rPr>
+              <w:t xml:space="preserve">56 </w:t>
+            </w:r>
+            <w:r>
+              <w:rPr>
+                <w:color w:val="000000"/>
+                <w:sz w:val="21"/>
+              </w:rPr>
+              <w:t>条事件缺实际</w:t>
+            </w:r>
+            <w:r>
+              <w:rPr>
+                <w:color w:val="000000"/>
+                <w:sz w:val="21"/>
+              </w:rPr>
+              <w:t xml:space="preserve"> EPS</w:t>
+            </w:r>
+            <w:r>
+              <w:rPr>
+                <w:color w:val="000000"/>
+                <w:sz w:val="21"/>
+              </w:rPr>
+              <w:t>，能补就补，补不到就注明</w:t>
+            </w:r>
+          </w:p>
+        </w:tc>
+        <w:tc>
+          <w:tcPr>
+            <w:tcW w:w="2353" w:type="dxa"/>
+          </w:tcPr>
+          <w:p>
+            <w:pPr>
+              <w:spacing w:after="40" w:line="276" w:lineRule="auto"/>
+            </w:pPr>
+            <w:r>
+              <w:rPr>
+                <w:color w:val="000000"/>
+                <w:sz w:val="21"/>
+              </w:rPr>
+              <w:t>10-22</w:t>
+            </w:r>
+          </w:p>
+        </w:tc>
+      </w:tr>
+    </w:tbl>
+    <w:p>
+      <w:pPr>
+        <w:spacing w:after="0"/>
+      </w:pPr>
+    </w:p>
+    <w:p>
+      <w:r>
+        <w:rPr>
+          <w:color w:val="000000"/>
+        </w:rPr>
+        <w:t>不需要乙再做：补</w:t>
+      </w:r>
+      <w:r>
+        <w:rPr>
+          <w:color w:val="000000"/>
+        </w:rPr>
+        <w:t xml:space="preserve"> 2017 </w:t>
+      </w:r>
+      <w:r>
+        <w:rPr>
+          <w:color w:val="000000"/>
+        </w:rPr>
+        <w:t>年行情、拉盈余预测、两个旧附件（</w:t>
+      </w:r>
+      <w:r>
+        <w:rPr>
+          <w:rFonts w:ascii="Consolas" w:hAnsi="Consolas"/>
+          <w:color w:val="000000"/>
+          <w:sz w:val="22"/>
+        </w:rPr>
+        <w:t>event_study_</w:t>
+      </w:r>
+      <w:r>
+        <w:rPr>
+          <w:rFonts w:ascii="Consolas" w:hAnsi="Consolas"/>
+          <w:color w:val="000000"/>
+          <w:sz w:val="22"/>
+        </w:rPr>
+        <w:t>非交易日报告</w:t>
+      </w:r>
+      <w:r>
+        <w:rPr>
+          <w:rFonts w:ascii="Consolas" w:hAnsi="Consolas"/>
+          <w:color w:val="000000"/>
+          <w:sz w:val="22"/>
+        </w:rPr>
+        <w:t>_</w:t>
+      </w:r>
+      <w:r>
+        <w:rPr>
+          <w:rFonts w:ascii="Consolas" w:hAnsi="Consolas"/>
+          <w:color w:val="000000"/>
+          <w:sz w:val="22"/>
+        </w:rPr>
+        <w:t>需确认事件对齐</w:t>
+      </w:r>
+      <w:r>
+        <w:rPr>
+          <w:rFonts w:ascii="Consolas" w:hAnsi="Consolas"/>
+          <w:color w:val="000000"/>
+          <w:sz w:val="22"/>
+        </w:rPr>
+        <w:t>.csv</w:t>
+      </w:r>
+      <w:r>
+        <w:rPr>
+          <w:color w:val="000000"/>
+        </w:rPr>
+        <w:t xml:space="preserve"> </w:t>
+      </w:r>
+      <w:r>
+        <w:rPr>
+          <w:color w:val="000000"/>
+        </w:rPr>
+        <w:t>与</w:t>
+      </w:r>
+      <w:r>
+        <w:rPr>
+          <w:color w:val="000000"/>
+        </w:rPr>
+        <w:t xml:space="preserve"> </w:t>
+      </w:r>
+      <w:r>
+        <w:rPr>
+          <w:rFonts w:ascii="Consolas" w:hAnsi="Consolas"/>
+          <w:color w:val="000000"/>
+          <w:sz w:val="22"/>
+        </w:rPr>
+        <w:t>CSMAR_2017</w:t>
+      </w:r>
+      <w:r>
+        <w:rPr>
+          <w:rFonts w:ascii="Consolas" w:hAnsi="Consolas"/>
+          <w:color w:val="000000"/>
+          <w:sz w:val="22"/>
+        </w:rPr>
+        <w:t>补下载股票代码</w:t>
+      </w:r>
+      <w:r>
+        <w:rPr>
+          <w:rFonts w:ascii="Consolas" w:hAnsi="Consolas"/>
+          <w:color w:val="000000"/>
+          <w:sz w:val="22"/>
+        </w:rPr>
+        <w:t>.txt</w:t>
+      </w:r>
+      <w:r>
+        <w:rPr>
+          <w:color w:val="000000"/>
+        </w:rPr>
+        <w:t>）。</w:t>
       </w:r>
     </w:p>
     <w:p>
@@ -15620,7 +16699,7 @@
         <w:pStyle w:val="1"/>
         <w:spacing w:before="280" w:after="120"/>
       </w:pPr>
-      <w:bookmarkStart w:id="36" w:name="_Toc243221373"/>
+      <w:bookmarkStart w:id="37" w:name="_Toc243222299"/>
       <w:r>
         <w:rPr>
           <w:rFonts w:ascii="Times New Roman" w:eastAsia="黑体" w:hAnsi="Times New Roman"/>
@@ -15637,7 +16716,7 @@
         </w:rPr>
         <w:t>待办与阻塞</w:t>
       </w:r>
-      <w:bookmarkEnd w:id="36"/>
+      <w:bookmarkEnd w:id="37"/>
     </w:p>
     <w:p>
       <w:pPr>
@@ -15726,7 +16805,6 @@
         <w:rPr>
           <w:color w:val="000000"/>
         </w:rPr>
-        <w:lastRenderedPageBreak/>
         <w:t xml:space="preserve">4. </w:t>
       </w:r>
       <w:r>
@@ -15769,6 +16847,7 @@
         <w:rPr>
           <w:color w:val="000000"/>
         </w:rPr>
+        <w:lastRenderedPageBreak/>
         <w:t xml:space="preserve">5. </w:t>
       </w:r>
       <w:r>
@@ -15909,7 +16988,7 @@
         <w:pStyle w:val="1"/>
         <w:spacing w:before="280" w:after="120"/>
       </w:pPr>
-      <w:bookmarkStart w:id="37" w:name="_Toc243221374"/>
+      <w:bookmarkStart w:id="38" w:name="_Toc243222300"/>
       <w:r>
         <w:rPr>
           <w:rFonts w:ascii="Times New Roman" w:eastAsia="黑体" w:hAnsi="Times New Roman"/>
@@ -15926,7 +17005,7 @@
         </w:rPr>
         <w:t>文件导航</w:t>
       </w:r>
-      <w:bookmarkEnd w:id="37"/>
+      <w:bookmarkEnd w:id="38"/>
     </w:p>
     <w:p>
       <w:pPr>
@@ -16665,31 +17744,31 @@
       </w:rPr>
     </w:lvl>
   </w:abstractNum>
-  <w:num w:numId="1" w16cid:durableId="247422106">
+  <w:num w:numId="1" w16cid:durableId="1256866945">
     <w:abstractNumId w:val="8"/>
   </w:num>
-  <w:num w:numId="2" w16cid:durableId="603927922">
+  <w:num w:numId="2" w16cid:durableId="1313606413">
     <w:abstractNumId w:val="6"/>
   </w:num>
-  <w:num w:numId="3" w16cid:durableId="1820074317">
+  <w:num w:numId="3" w16cid:durableId="939336214">
     <w:abstractNumId w:val="5"/>
   </w:num>
-  <w:num w:numId="4" w16cid:durableId="838349288">
+  <w:num w:numId="4" w16cid:durableId="180054938">
     <w:abstractNumId w:val="4"/>
   </w:num>
-  <w:num w:numId="5" w16cid:durableId="297226895">
+  <w:num w:numId="5" w16cid:durableId="2100565651">
     <w:abstractNumId w:val="7"/>
   </w:num>
-  <w:num w:numId="6" w16cid:durableId="159345669">
+  <w:num w:numId="6" w16cid:durableId="782576844">
     <w:abstractNumId w:val="3"/>
   </w:num>
-  <w:num w:numId="7" w16cid:durableId="832599967">
+  <w:num w:numId="7" w16cid:durableId="549076944">
     <w:abstractNumId w:val="2"/>
   </w:num>
-  <w:num w:numId="8" w16cid:durableId="1986398048">
+  <w:num w:numId="8" w16cid:durableId="828332088">
     <w:abstractNumId w:val="1"/>
   </w:num>
-  <w:num w:numId="9" w16cid:durableId="1045183036">
+  <w:num w:numId="9" w16cid:durableId="1091387381">
     <w:abstractNumId w:val="0"/>
   </w:num>
 </w:numbering>
@@ -28088,7 +29167,7 @@
     <w:autoRedefine/>
     <w:uiPriority w:val="39"/>
     <w:unhideWhenUsed/>
-    <w:rsid w:val="00EB25B9"/>
+    <w:rsid w:val="006E7B26"/>
   </w:style>
   <w:style w:type="paragraph" w:styleId="TOC2">
     <w:name w:val="toc 2"/>
@@ -28097,7 +29176,7 @@
     <w:autoRedefine/>
     <w:uiPriority w:val="39"/>
     <w:unhideWhenUsed/>
-    <w:rsid w:val="00EB25B9"/>
+    <w:rsid w:val="006E7B26"/>
     <w:pPr>
       <w:ind w:leftChars="200" w:left="420"/>
     </w:pPr>
@@ -28107,7 +29186,7 @@
     <w:basedOn w:val="a2"/>
     <w:uiPriority w:val="99"/>
     <w:unhideWhenUsed/>
-    <w:rsid w:val="00EB25B9"/>
+    <w:rsid w:val="006E7B26"/>
     <w:rPr>
       <w:color w:val="0000FF" w:themeColor="hyperlink"/>
       <w:u w:val="single"/>

</xml_diff>

<commit_message>
Explain the dynamic construction of broker tiers
The memo now states the three steps: resolve renames into stable identities, count
rating records, and cut on cumulative share. It also records that display names follow
the year in force, and that subsidiaries stay separate for the tier but are excluded
from star matching.

Co-Authored-By: Claude Code <noreply@anthropic.com>
</commit_message>
<xml_diff>
--- a/文档/项目进度与技术备忘_20261018.docx
+++ b/文档/项目进度与技术备忘_20261018.docx
@@ -118,7 +118,7 @@
         </w:rPr>
         <w:fldChar w:fldCharType="separate"/>
       </w:r>
-      <w:hyperlink w:anchor="_Toc243224271" w:history="1">
+      <w:hyperlink w:anchor="_Toc243226836" w:history="1">
         <w:r>
           <w:rPr>
             <w:rStyle w:val="aff9"/>
@@ -180,7 +180,7 @@
             <w:noProof/>
             <w:webHidden/>
           </w:rPr>
-          <w:instrText>PAGEREF _Toc243224271 \h</w:instrText>
+          <w:instrText>PAGEREF _Toc243226836 \h</w:instrText>
         </w:r>
         <w:r>
           <w:rPr>
@@ -238,7 +238,7 @@
           <w14:ligatures w14:val="standardContextual"/>
         </w:rPr>
       </w:pPr>
-      <w:hyperlink w:anchor="_Toc243224272" w:history="1">
+      <w:hyperlink w:anchor="_Toc243226837" w:history="1">
         <w:r>
           <w:rPr>
             <w:rStyle w:val="aff9"/>
@@ -284,7 +284,7 @@
             <w:noProof/>
             <w:webHidden/>
           </w:rPr>
-          <w:instrText>PAGEREF _Toc243224272 \h</w:instrText>
+          <w:instrText>PAGEREF _Toc243226837 \h</w:instrText>
         </w:r>
         <w:r>
           <w:rPr>
@@ -343,7 +343,7 @@
           <w14:ligatures w14:val="standardContextual"/>
         </w:rPr>
       </w:pPr>
-      <w:hyperlink w:anchor="_Toc243224273" w:history="1">
+      <w:hyperlink w:anchor="_Toc243226838" w:history="1">
         <w:r>
           <w:rPr>
             <w:rStyle w:val="aff9"/>
@@ -389,7 +389,7 @@
             <w:noProof/>
             <w:webHidden/>
           </w:rPr>
-          <w:instrText>PAGEREF _Toc243224273 \h</w:instrText>
+          <w:instrText>PAGEREF _Toc243226838 \h</w:instrText>
         </w:r>
         <w:r>
           <w:rPr>
@@ -448,7 +448,7 @@
           <w14:ligatures w14:val="standardContextual"/>
         </w:rPr>
       </w:pPr>
-      <w:hyperlink w:anchor="_Toc243224274" w:history="1">
+      <w:hyperlink w:anchor="_Toc243226839" w:history="1">
         <w:r>
           <w:rPr>
             <w:rStyle w:val="aff9"/>
@@ -494,7 +494,7 @@
             <w:noProof/>
             <w:webHidden/>
           </w:rPr>
-          <w:instrText>PAGEREF _Toc243224274 \h</w:instrText>
+          <w:instrText>PAGEREF _Toc243226839 \h</w:instrText>
         </w:r>
         <w:r>
           <w:rPr>
@@ -553,7 +553,7 @@
           <w14:ligatures w14:val="standardContextual"/>
         </w:rPr>
       </w:pPr>
-      <w:hyperlink w:anchor="_Toc243224275" w:history="1">
+      <w:hyperlink w:anchor="_Toc243226840" w:history="1">
         <w:r>
           <w:rPr>
             <w:rStyle w:val="aff9"/>
@@ -599,7 +599,7 @@
             <w:noProof/>
             <w:webHidden/>
           </w:rPr>
-          <w:instrText>PAGEREF _Toc243224275 \h</w:instrText>
+          <w:instrText>PAGEREF _Toc243226840 \h</w:instrText>
         </w:r>
         <w:r>
           <w:rPr>
@@ -658,7 +658,7 @@
           <w14:ligatures w14:val="standardContextual"/>
         </w:rPr>
       </w:pPr>
-      <w:hyperlink w:anchor="_Toc243224276" w:history="1">
+      <w:hyperlink w:anchor="_Toc243226841" w:history="1">
         <w:r>
           <w:rPr>
             <w:rStyle w:val="aff9"/>
@@ -704,7 +704,7 @@
             <w:noProof/>
             <w:webHidden/>
           </w:rPr>
-          <w:instrText>PAGEREF _Toc243224276 \h</w:instrText>
+          <w:instrText>PAGEREF _Toc243226841 \h</w:instrText>
         </w:r>
         <w:r>
           <w:rPr>
@@ -763,7 +763,7 @@
           <w14:ligatures w14:val="standardContextual"/>
         </w:rPr>
       </w:pPr>
-      <w:hyperlink w:anchor="_Toc243224277" w:history="1">
+      <w:hyperlink w:anchor="_Toc243226842" w:history="1">
         <w:r>
           <w:rPr>
             <w:rStyle w:val="aff9"/>
@@ -809,7 +809,7 @@
             <w:noProof/>
             <w:webHidden/>
           </w:rPr>
-          <w:instrText>PAGEREF _Toc243224277 \h</w:instrText>
+          <w:instrText>PAGEREF _Toc243226842 \h</w:instrText>
         </w:r>
         <w:r>
           <w:rPr>
@@ -868,7 +868,7 @@
           <w14:ligatures w14:val="standardContextual"/>
         </w:rPr>
       </w:pPr>
-      <w:hyperlink w:anchor="_Toc243224278" w:history="1">
+      <w:hyperlink w:anchor="_Toc243226843" w:history="1">
         <w:r>
           <w:rPr>
             <w:rStyle w:val="aff9"/>
@@ -914,7 +914,7 @@
             <w:noProof/>
             <w:webHidden/>
           </w:rPr>
-          <w:instrText>PAGEREF _Toc243224278 \h</w:instrText>
+          <w:instrText>PAGEREF _Toc243226843 \h</w:instrText>
         </w:r>
         <w:r>
           <w:rPr>
@@ -973,7 +973,7 @@
           <w14:ligatures w14:val="standardContextual"/>
         </w:rPr>
       </w:pPr>
-      <w:hyperlink w:anchor="_Toc243224279" w:history="1">
+      <w:hyperlink w:anchor="_Toc243226844" w:history="1">
         <w:r>
           <w:rPr>
             <w:rStyle w:val="aff9"/>
@@ -1019,7 +1019,7 @@
             <w:noProof/>
             <w:webHidden/>
           </w:rPr>
-          <w:instrText>PAGEREF _Toc243224279 \h</w:instrText>
+          <w:instrText>PAGEREF _Toc243226844 \h</w:instrText>
         </w:r>
         <w:r>
           <w:rPr>
@@ -1077,7 +1077,7 @@
           <w14:ligatures w14:val="standardContextual"/>
         </w:rPr>
       </w:pPr>
-      <w:hyperlink w:anchor="_Toc243224280" w:history="1">
+      <w:hyperlink w:anchor="_Toc243226845" w:history="1">
         <w:r>
           <w:rPr>
             <w:rStyle w:val="aff9"/>
@@ -1123,7 +1123,7 @@
             <w:noProof/>
             <w:webHidden/>
           </w:rPr>
-          <w:instrText>PAGEREF _Toc243224280 \h</w:instrText>
+          <w:instrText>PAGEREF _Toc243226845 \h</w:instrText>
         </w:r>
         <w:r>
           <w:rPr>
@@ -1181,7 +1181,7 @@
           <w14:ligatures w14:val="standardContextual"/>
         </w:rPr>
       </w:pPr>
-      <w:hyperlink w:anchor="_Toc243224281" w:history="1">
+      <w:hyperlink w:anchor="_Toc243226846" w:history="1">
         <w:r>
           <w:rPr>
             <w:rStyle w:val="aff9"/>
@@ -1227,7 +1227,7 @@
             <w:noProof/>
             <w:webHidden/>
           </w:rPr>
-          <w:instrText>PAGEREF _Toc243224281 \h</w:instrText>
+          <w:instrText>PAGEREF _Toc243226846 \h</w:instrText>
         </w:r>
         <w:r>
           <w:rPr>
@@ -1285,7 +1285,7 @@
           <w14:ligatures w14:val="standardContextual"/>
         </w:rPr>
       </w:pPr>
-      <w:hyperlink w:anchor="_Toc243224282" w:history="1">
+      <w:hyperlink w:anchor="_Toc243226847" w:history="1">
         <w:r>
           <w:rPr>
             <w:rStyle w:val="aff9"/>
@@ -1331,7 +1331,7 @@
             <w:noProof/>
             <w:webHidden/>
           </w:rPr>
-          <w:instrText>PAGEREF _Toc243224282 \h</w:instrText>
+          <w:instrText>PAGEREF _Toc243226847 \h</w:instrText>
         </w:r>
         <w:r>
           <w:rPr>
@@ -1389,7 +1389,7 @@
           <w14:ligatures w14:val="standardContextual"/>
         </w:rPr>
       </w:pPr>
-      <w:hyperlink w:anchor="_Toc243224283" w:history="1">
+      <w:hyperlink w:anchor="_Toc243226848" w:history="1">
         <w:r>
           <w:rPr>
             <w:rStyle w:val="aff9"/>
@@ -1435,7 +1435,7 @@
             <w:noProof/>
             <w:webHidden/>
           </w:rPr>
-          <w:instrText>PAGEREF _Toc243224283 \h</w:instrText>
+          <w:instrText>PAGEREF _Toc243226848 \h</w:instrText>
         </w:r>
         <w:r>
           <w:rPr>
@@ -1493,7 +1493,7 @@
           <w14:ligatures w14:val="standardContextual"/>
         </w:rPr>
       </w:pPr>
-      <w:hyperlink w:anchor="_Toc243224284" w:history="1">
+      <w:hyperlink w:anchor="_Toc243226849" w:history="1">
         <w:r>
           <w:rPr>
             <w:rStyle w:val="aff9"/>
@@ -1539,7 +1539,7 @@
             <w:noProof/>
             <w:webHidden/>
           </w:rPr>
-          <w:instrText>PAGEREF _Toc243224284 \h</w:instrText>
+          <w:instrText>PAGEREF _Toc243226849 \h</w:instrText>
         </w:r>
         <w:r>
           <w:rPr>
@@ -1598,7 +1598,7 @@
           <w14:ligatures w14:val="standardContextual"/>
         </w:rPr>
       </w:pPr>
-      <w:hyperlink w:anchor="_Toc243224285" w:history="1">
+      <w:hyperlink w:anchor="_Toc243226850" w:history="1">
         <w:r>
           <w:rPr>
             <w:rStyle w:val="aff9"/>
@@ -1644,7 +1644,7 @@
             <w:noProof/>
             <w:webHidden/>
           </w:rPr>
-          <w:instrText>PAGEREF _Toc243224285 \h</w:instrText>
+          <w:instrText>PAGEREF _Toc243226850 \h</w:instrText>
         </w:r>
         <w:r>
           <w:rPr>
@@ -1703,7 +1703,7 @@
           <w14:ligatures w14:val="standardContextual"/>
         </w:rPr>
       </w:pPr>
-      <w:hyperlink w:anchor="_Toc243224286" w:history="1">
+      <w:hyperlink w:anchor="_Toc243226851" w:history="1">
         <w:r>
           <w:rPr>
             <w:rStyle w:val="aff9"/>
@@ -1749,7 +1749,7 @@
             <w:noProof/>
             <w:webHidden/>
           </w:rPr>
-          <w:instrText>PAGEREF _Toc243224286 \h</w:instrText>
+          <w:instrText>PAGEREF _Toc243226851 \h</w:instrText>
         </w:r>
         <w:r>
           <w:rPr>
@@ -1808,7 +1808,7 @@
           <w14:ligatures w14:val="standardContextual"/>
         </w:rPr>
       </w:pPr>
-      <w:hyperlink w:anchor="_Toc243224287" w:history="1">
+      <w:hyperlink w:anchor="_Toc243226852" w:history="1">
         <w:r>
           <w:rPr>
             <w:rStyle w:val="aff9"/>
@@ -1854,7 +1854,7 @@
             <w:noProof/>
             <w:webHidden/>
           </w:rPr>
-          <w:instrText>PAGEREF _Toc243224287 \h</w:instrText>
+          <w:instrText>PAGEREF _Toc243226852 \h</w:instrText>
         </w:r>
         <w:r>
           <w:rPr>
@@ -1912,7 +1912,7 @@
           <w14:ligatures w14:val="standardContextual"/>
         </w:rPr>
       </w:pPr>
-      <w:hyperlink w:anchor="_Toc243224288" w:history="1">
+      <w:hyperlink w:anchor="_Toc243226853" w:history="1">
         <w:r>
           <w:rPr>
             <w:rStyle w:val="aff9"/>
@@ -1958,7 +1958,7 @@
             <w:noProof/>
             <w:webHidden/>
           </w:rPr>
-          <w:instrText>PAGEREF _Toc243224288 \h</w:instrText>
+          <w:instrText>PAGEREF _Toc243226853 \h</w:instrText>
         </w:r>
         <w:r>
           <w:rPr>
@@ -1988,7 +1988,7 @@
             <w:noProof/>
             <w:webHidden/>
           </w:rPr>
-          <w:t>7</w:t>
+          <w:t>8</w:t>
         </w:r>
         <w:r>
           <w:rPr>
@@ -2017,7 +2017,7 @@
           <w14:ligatures w14:val="standardContextual"/>
         </w:rPr>
       </w:pPr>
-      <w:hyperlink w:anchor="_Toc243224289" w:history="1">
+      <w:hyperlink w:anchor="_Toc243226854" w:history="1">
         <w:r>
           <w:rPr>
             <w:rStyle w:val="aff9"/>
@@ -2063,7 +2063,7 @@
             <w:noProof/>
             <w:webHidden/>
           </w:rPr>
-          <w:instrText>PAGEREF _Toc243224289 \h</w:instrText>
+          <w:instrText>PAGEREF _Toc243226854 \h</w:instrText>
         </w:r>
         <w:r>
           <w:rPr>
@@ -2093,7 +2093,7 @@
             <w:noProof/>
             <w:webHidden/>
           </w:rPr>
-          <w:t>7</w:t>
+          <w:t>8</w:t>
         </w:r>
         <w:r>
           <w:rPr>
@@ -2122,7 +2122,7 @@
           <w14:ligatures w14:val="standardContextual"/>
         </w:rPr>
       </w:pPr>
-      <w:hyperlink w:anchor="_Toc243224290" w:history="1">
+      <w:hyperlink w:anchor="_Toc243226855" w:history="1">
         <w:r>
           <w:rPr>
             <w:rStyle w:val="aff9"/>
@@ -2168,7 +2168,7 @@
             <w:noProof/>
             <w:webHidden/>
           </w:rPr>
-          <w:instrText>PAGEREF _Toc243224290 \h</w:instrText>
+          <w:instrText>PAGEREF _Toc243226855 \h</w:instrText>
         </w:r>
         <w:r>
           <w:rPr>
@@ -2227,7 +2227,7 @@
           <w14:ligatures w14:val="standardContextual"/>
         </w:rPr>
       </w:pPr>
-      <w:hyperlink w:anchor="_Toc243224291" w:history="1">
+      <w:hyperlink w:anchor="_Toc243226856" w:history="1">
         <w:r>
           <w:rPr>
             <w:rStyle w:val="aff9"/>
@@ -2273,7 +2273,7 @@
             <w:noProof/>
             <w:webHidden/>
           </w:rPr>
-          <w:instrText>PAGEREF _Toc243224291 \h</w:instrText>
+          <w:instrText>PAGEREF _Toc243226856 \h</w:instrText>
         </w:r>
         <w:r>
           <w:rPr>
@@ -2332,7 +2332,7 @@
           <w14:ligatures w14:val="standardContextual"/>
         </w:rPr>
       </w:pPr>
-      <w:hyperlink w:anchor="_Toc243224292" w:history="1">
+      <w:hyperlink w:anchor="_Toc243226857" w:history="1">
         <w:r>
           <w:rPr>
             <w:rStyle w:val="aff9"/>
@@ -2378,7 +2378,7 @@
             <w:noProof/>
             <w:webHidden/>
           </w:rPr>
-          <w:instrText>PAGEREF _Toc243224292 \h</w:instrText>
+          <w:instrText>PAGEREF _Toc243226857 \h</w:instrText>
         </w:r>
         <w:r>
           <w:rPr>
@@ -2408,7 +2408,7 @@
             <w:noProof/>
             <w:webHidden/>
           </w:rPr>
-          <w:t>8</w:t>
+          <w:t>9</w:t>
         </w:r>
         <w:r>
           <w:rPr>
@@ -2437,7 +2437,7 @@
           <w14:ligatures w14:val="standardContextual"/>
         </w:rPr>
       </w:pPr>
-      <w:hyperlink w:anchor="_Toc243224293" w:history="1">
+      <w:hyperlink w:anchor="_Toc243226858" w:history="1">
         <w:r>
           <w:rPr>
             <w:rStyle w:val="aff9"/>
@@ -2483,7 +2483,7 @@
             <w:noProof/>
             <w:webHidden/>
           </w:rPr>
-          <w:instrText>PAGEREF _Toc243224293 \h</w:instrText>
+          <w:instrText>PAGEREF _Toc243226858 \h</w:instrText>
         </w:r>
         <w:r>
           <w:rPr>
@@ -2513,7 +2513,7 @@
             <w:noProof/>
             <w:webHidden/>
           </w:rPr>
-          <w:t>9</w:t>
+          <w:t>10</w:t>
         </w:r>
         <w:r>
           <w:rPr>
@@ -2542,7 +2542,7 @@
           <w14:ligatures w14:val="standardContextual"/>
         </w:rPr>
       </w:pPr>
-      <w:hyperlink w:anchor="_Toc243224294" w:history="1">
+      <w:hyperlink w:anchor="_Toc243226859" w:history="1">
         <w:r>
           <w:rPr>
             <w:rStyle w:val="aff9"/>
@@ -2604,7 +2604,7 @@
             <w:noProof/>
             <w:webHidden/>
           </w:rPr>
-          <w:instrText>PAGEREF _Toc243224294 \h</w:instrText>
+          <w:instrText>PAGEREF _Toc243226859 \h</w:instrText>
         </w:r>
         <w:r>
           <w:rPr>
@@ -2634,7 +2634,7 @@
             <w:noProof/>
             <w:webHidden/>
           </w:rPr>
-          <w:t>9</w:t>
+          <w:t>10</w:t>
         </w:r>
         <w:r>
           <w:rPr>
@@ -2663,7 +2663,7 @@
           <w14:ligatures w14:val="standardContextual"/>
         </w:rPr>
       </w:pPr>
-      <w:hyperlink w:anchor="_Toc243224295" w:history="1">
+      <w:hyperlink w:anchor="_Toc243226860" w:history="1">
         <w:r>
           <w:rPr>
             <w:rStyle w:val="aff9"/>
@@ -2709,7 +2709,7 @@
             <w:noProof/>
             <w:webHidden/>
           </w:rPr>
-          <w:instrText>PAGEREF _Toc243224295 \h</w:instrText>
+          <w:instrText>PAGEREF _Toc243226860 \h</w:instrText>
         </w:r>
         <w:r>
           <w:rPr>
@@ -2739,7 +2739,7 @@
             <w:noProof/>
             <w:webHidden/>
           </w:rPr>
-          <w:t>9</w:t>
+          <w:t>10</w:t>
         </w:r>
         <w:r>
           <w:rPr>
@@ -2768,7 +2768,7 @@
           <w14:ligatures w14:val="standardContextual"/>
         </w:rPr>
       </w:pPr>
-      <w:hyperlink w:anchor="_Toc243224296" w:history="1">
+      <w:hyperlink w:anchor="_Toc243226861" w:history="1">
         <w:r>
           <w:rPr>
             <w:rStyle w:val="aff9"/>
@@ -2814,7 +2814,7 @@
             <w:noProof/>
             <w:webHidden/>
           </w:rPr>
-          <w:instrText>PAGEREF _Toc243224296 \h</w:instrText>
+          <w:instrText>PAGEREF _Toc243226861 \h</w:instrText>
         </w:r>
         <w:r>
           <w:rPr>
@@ -2844,7 +2844,7 @@
             <w:noProof/>
             <w:webHidden/>
           </w:rPr>
-          <w:t>9</w:t>
+          <w:t>10</w:t>
         </w:r>
         <w:r>
           <w:rPr>
@@ -2873,7 +2873,7 @@
           <w14:ligatures w14:val="standardContextual"/>
         </w:rPr>
       </w:pPr>
-      <w:hyperlink w:anchor="_Toc243224297" w:history="1">
+      <w:hyperlink w:anchor="_Toc243226862" w:history="1">
         <w:r>
           <w:rPr>
             <w:rStyle w:val="aff9"/>
@@ -2919,7 +2919,7 @@
             <w:noProof/>
             <w:webHidden/>
           </w:rPr>
-          <w:instrText>PAGEREF _Toc243224297 \h</w:instrText>
+          <w:instrText>PAGEREF _Toc243226862 \h</w:instrText>
         </w:r>
         <w:r>
           <w:rPr>
@@ -2949,7 +2949,7 @@
             <w:noProof/>
             <w:webHidden/>
           </w:rPr>
-          <w:t>9</w:t>
+          <w:t>10</w:t>
         </w:r>
         <w:r>
           <w:rPr>
@@ -2978,7 +2978,7 @@
           <w14:ligatures w14:val="standardContextual"/>
         </w:rPr>
       </w:pPr>
-      <w:hyperlink w:anchor="_Toc243224298" w:history="1">
+      <w:hyperlink w:anchor="_Toc243226863" w:history="1">
         <w:r>
           <w:rPr>
             <w:rStyle w:val="aff9"/>
@@ -3024,7 +3024,7 @@
             <w:noProof/>
             <w:webHidden/>
           </w:rPr>
-          <w:instrText>PAGEREF _Toc243224298 \h</w:instrText>
+          <w:instrText>PAGEREF _Toc243226863 \h</w:instrText>
         </w:r>
         <w:r>
           <w:rPr>
@@ -3054,7 +3054,7 @@
             <w:noProof/>
             <w:webHidden/>
           </w:rPr>
-          <w:t>10</w:t>
+          <w:t>11</w:t>
         </w:r>
         <w:r>
           <w:rPr>
@@ -3083,7 +3083,7 @@
           <w14:ligatures w14:val="standardContextual"/>
         </w:rPr>
       </w:pPr>
-      <w:hyperlink w:anchor="_Toc243224299" w:history="1">
+      <w:hyperlink w:anchor="_Toc243226864" w:history="1">
         <w:r>
           <w:rPr>
             <w:rStyle w:val="aff9"/>
@@ -3145,7 +3145,7 @@
             <w:noProof/>
             <w:webHidden/>
           </w:rPr>
-          <w:instrText>PAGEREF _Toc243224299 \h</w:instrText>
+          <w:instrText>PAGEREF _Toc243226864 \h</w:instrText>
         </w:r>
         <w:r>
           <w:rPr>
@@ -3175,7 +3175,7 @@
             <w:noProof/>
             <w:webHidden/>
           </w:rPr>
-          <w:t>10</w:t>
+          <w:t>11</w:t>
         </w:r>
         <w:r>
           <w:rPr>
@@ -3204,7 +3204,7 @@
           <w14:ligatures w14:val="standardContextual"/>
         </w:rPr>
       </w:pPr>
-      <w:hyperlink w:anchor="_Toc243224300" w:history="1">
+      <w:hyperlink w:anchor="_Toc243226865" w:history="1">
         <w:r>
           <w:rPr>
             <w:rStyle w:val="aff9"/>
@@ -3250,7 +3250,7 @@
             <w:noProof/>
             <w:webHidden/>
           </w:rPr>
-          <w:instrText>PAGEREF _Toc243224300 \h</w:instrText>
+          <w:instrText>PAGEREF _Toc243226865 \h</w:instrText>
         </w:r>
         <w:r>
           <w:rPr>
@@ -3280,7 +3280,7 @@
             <w:noProof/>
             <w:webHidden/>
           </w:rPr>
-          <w:t>10</w:t>
+          <w:t>11</w:t>
         </w:r>
         <w:r>
           <w:rPr>
@@ -3309,7 +3309,7 @@
           <w14:ligatures w14:val="standardContextual"/>
         </w:rPr>
       </w:pPr>
-      <w:hyperlink w:anchor="_Toc243224301" w:history="1">
+      <w:hyperlink w:anchor="_Toc243226866" w:history="1">
         <w:r>
           <w:rPr>
             <w:rStyle w:val="aff9"/>
@@ -3355,7 +3355,7 @@
             <w:noProof/>
             <w:webHidden/>
           </w:rPr>
-          <w:instrText>PAGEREF _Toc243224301 \h</w:instrText>
+          <w:instrText>PAGEREF _Toc243226866 \h</w:instrText>
         </w:r>
         <w:r>
           <w:rPr>
@@ -3385,7 +3385,7 @@
             <w:noProof/>
             <w:webHidden/>
           </w:rPr>
-          <w:t>10</w:t>
+          <w:t>11</w:t>
         </w:r>
         <w:r>
           <w:rPr>
@@ -3413,7 +3413,7 @@
           <w14:ligatures w14:val="standardContextual"/>
         </w:rPr>
       </w:pPr>
-      <w:hyperlink w:anchor="_Toc243224302" w:history="1">
+      <w:hyperlink w:anchor="_Toc243226867" w:history="1">
         <w:r>
           <w:rPr>
             <w:rStyle w:val="aff9"/>
@@ -3467,7 +3467,7 @@
             <w:noProof/>
             <w:webHidden/>
           </w:rPr>
-          <w:instrText>PAGEREF _Toc243224302 \h</w:instrText>
+          <w:instrText>PAGEREF _Toc243226867 \h</w:instrText>
         </w:r>
         <w:r>
           <w:rPr>
@@ -3497,7 +3497,7 @@
             <w:noProof/>
             <w:webHidden/>
           </w:rPr>
-          <w:t>10</w:t>
+          <w:t>11</w:t>
         </w:r>
         <w:r>
           <w:rPr>
@@ -3526,7 +3526,7 @@
           <w14:ligatures w14:val="standardContextual"/>
         </w:rPr>
       </w:pPr>
-      <w:hyperlink w:anchor="_Toc243224303" w:history="1">
+      <w:hyperlink w:anchor="_Toc243226868" w:history="1">
         <w:r>
           <w:rPr>
             <w:rStyle w:val="aff9"/>
@@ -3588,7 +3588,7 @@
             <w:noProof/>
             <w:webHidden/>
           </w:rPr>
-          <w:instrText>PAGEREF _Toc243224303 \h</w:instrText>
+          <w:instrText>PAGEREF _Toc243226868 \h</w:instrText>
         </w:r>
         <w:r>
           <w:rPr>
@@ -3618,7 +3618,7 @@
             <w:noProof/>
             <w:webHidden/>
           </w:rPr>
-          <w:t>11</w:t>
+          <w:t>12</w:t>
         </w:r>
         <w:r>
           <w:rPr>
@@ -3647,7 +3647,7 @@
           <w14:ligatures w14:val="standardContextual"/>
         </w:rPr>
       </w:pPr>
-      <w:hyperlink w:anchor="_Toc243224304" w:history="1">
+      <w:hyperlink w:anchor="_Toc243226869" w:history="1">
         <w:r>
           <w:rPr>
             <w:rStyle w:val="aff9"/>
@@ -3709,7 +3709,7 @@
             <w:noProof/>
             <w:webHidden/>
           </w:rPr>
-          <w:instrText>PAGEREF _Toc243224304 \h</w:instrText>
+          <w:instrText>PAGEREF _Toc243226869 \h</w:instrText>
         </w:r>
         <w:r>
           <w:rPr>
@@ -3739,7 +3739,7 @@
             <w:noProof/>
             <w:webHidden/>
           </w:rPr>
-          <w:t>11</w:t>
+          <w:t>12</w:t>
         </w:r>
         <w:r>
           <w:rPr>
@@ -3768,7 +3768,7 @@
           <w14:ligatures w14:val="standardContextual"/>
         </w:rPr>
       </w:pPr>
-      <w:hyperlink w:anchor="_Toc243224305" w:history="1">
+      <w:hyperlink w:anchor="_Toc243226870" w:history="1">
         <w:r>
           <w:rPr>
             <w:rStyle w:val="aff9"/>
@@ -3830,7 +3830,7 @@
             <w:noProof/>
             <w:webHidden/>
           </w:rPr>
-          <w:instrText>PAGEREF _Toc243224305 \h</w:instrText>
+          <w:instrText>PAGEREF _Toc243226870 \h</w:instrText>
         </w:r>
         <w:r>
           <w:rPr>
@@ -3860,7 +3860,7 @@
             <w:noProof/>
             <w:webHidden/>
           </w:rPr>
-          <w:t>12</w:t>
+          <w:t>13</w:t>
         </w:r>
         <w:r>
           <w:rPr>
@@ -3889,7 +3889,7 @@
           <w14:ligatures w14:val="standardContextual"/>
         </w:rPr>
       </w:pPr>
-      <w:hyperlink w:anchor="_Toc243224306" w:history="1">
+      <w:hyperlink w:anchor="_Toc243226871" w:history="1">
         <w:r>
           <w:rPr>
             <w:rStyle w:val="aff9"/>
@@ -3967,7 +3967,7 @@
             <w:noProof/>
             <w:webHidden/>
           </w:rPr>
-          <w:instrText>PAGEREF _Toc243224306 \h</w:instrText>
+          <w:instrText>PAGEREF _Toc243226871 \h</w:instrText>
         </w:r>
         <w:r>
           <w:rPr>
@@ -3997,7 +3997,7 @@
             <w:noProof/>
             <w:webHidden/>
           </w:rPr>
-          <w:t>13</w:t>
+          <w:t>14</w:t>
         </w:r>
         <w:r>
           <w:rPr>
@@ -4025,7 +4025,7 @@
           <w14:ligatures w14:val="standardContextual"/>
         </w:rPr>
       </w:pPr>
-      <w:hyperlink w:anchor="_Toc243224307" w:history="1">
+      <w:hyperlink w:anchor="_Toc243226872" w:history="1">
         <w:r>
           <w:rPr>
             <w:rStyle w:val="aff9"/>
@@ -4071,7 +4071,7 @@
             <w:noProof/>
             <w:webHidden/>
           </w:rPr>
-          <w:instrText>PAGEREF _Toc243224307 \h</w:instrText>
+          <w:instrText>PAGEREF _Toc243226872 \h</w:instrText>
         </w:r>
         <w:r>
           <w:rPr>
@@ -4101,7 +4101,7 @@
             <w:noProof/>
             <w:webHidden/>
           </w:rPr>
-          <w:t>13</w:t>
+          <w:t>14</w:t>
         </w:r>
         <w:r>
           <w:rPr>
@@ -4130,7 +4130,7 @@
           <w14:ligatures w14:val="standardContextual"/>
         </w:rPr>
       </w:pPr>
-      <w:hyperlink w:anchor="_Toc243224308" w:history="1">
+      <w:hyperlink w:anchor="_Toc243226873" w:history="1">
         <w:r>
           <w:rPr>
             <w:rStyle w:val="aff9"/>
@@ -4192,7 +4192,7 @@
             <w:noProof/>
             <w:webHidden/>
           </w:rPr>
-          <w:instrText>PAGEREF _Toc243224308 \h</w:instrText>
+          <w:instrText>PAGEREF _Toc243226873 \h</w:instrText>
         </w:r>
         <w:r>
           <w:rPr>
@@ -4222,7 +4222,7 @@
             <w:noProof/>
             <w:webHidden/>
           </w:rPr>
-          <w:t>14</w:t>
+          <w:t>15</w:t>
         </w:r>
         <w:r>
           <w:rPr>
@@ -4250,7 +4250,7 @@
           <w14:ligatures w14:val="standardContextual"/>
         </w:rPr>
       </w:pPr>
-      <w:hyperlink w:anchor="_Toc243224309" w:history="1">
+      <w:hyperlink w:anchor="_Toc243226874" w:history="1">
         <w:r>
           <w:rPr>
             <w:rStyle w:val="aff9"/>
@@ -4296,7 +4296,7 @@
             <w:noProof/>
             <w:webHidden/>
           </w:rPr>
-          <w:instrText>PAGEREF _Toc243224309 \h</w:instrText>
+          <w:instrText>PAGEREF _Toc243226874 \h</w:instrText>
         </w:r>
         <w:r>
           <w:rPr>
@@ -4326,7 +4326,7 @@
             <w:noProof/>
             <w:webHidden/>
           </w:rPr>
-          <w:t>14</w:t>
+          <w:t>16</w:t>
         </w:r>
         <w:r>
           <w:rPr>
@@ -4354,7 +4354,7 @@
           <w14:ligatures w14:val="standardContextual"/>
         </w:rPr>
       </w:pPr>
-      <w:hyperlink w:anchor="_Toc243224310" w:history="1">
+      <w:hyperlink w:anchor="_Toc243226875" w:history="1">
         <w:r>
           <w:rPr>
             <w:rStyle w:val="aff9"/>
@@ -4400,7 +4400,7 @@
             <w:noProof/>
             <w:webHidden/>
           </w:rPr>
-          <w:instrText>PAGEREF _Toc243224310 \h</w:instrText>
+          <w:instrText>PAGEREF _Toc243226875 \h</w:instrText>
         </w:r>
         <w:r>
           <w:rPr>
@@ -4430,7 +4430,7 @@
             <w:noProof/>
             <w:webHidden/>
           </w:rPr>
-          <w:t>15</w:t>
+          <w:t>16</w:t>
         </w:r>
         <w:r>
           <w:rPr>
@@ -4455,7 +4455,7 @@
         <w:pStyle w:val="1"/>
         <w:spacing w:before="280" w:after="120"/>
       </w:pPr>
-      <w:bookmarkStart w:id="0" w:name="_Toc243224271"/>
+      <w:bookmarkStart w:id="0" w:name="_Toc243226836"/>
       <w:r>
         <w:rPr>
           <w:rFonts w:ascii="Times New Roman" w:eastAsia="黑体" w:hAnsi="Times New Roman"/>
@@ -4737,7 +4737,6 @@
         <w:rPr>
           <w:color w:val="000000"/>
         </w:rPr>
-        <w:lastRenderedPageBreak/>
         <w:t xml:space="preserve">4. </w:t>
       </w:r>
       <w:r>
@@ -4756,7 +4755,19 @@
         <w:rPr>
           <w:color w:val="000000"/>
         </w:rPr>
-        <w:t>与成交量上显著；上调的明星溢价集中在头部券商，但头部与中部的差异不显著；中小层级几乎没有明星，无法估计。</w:t>
+        <w:t>与成交量上显著；上调的明星溢价集中在头部，头部与中部的差异边际显著（</w:t>
+      </w:r>
+      <w:r>
+        <w:rPr>
+          <w:color w:val="000000"/>
+        </w:rPr>
+        <w:t>p=0.070</w:t>
+      </w:r>
+      <w:r>
+        <w:rPr>
+          <w:color w:val="000000"/>
+        </w:rPr>
+        <w:t>）；中小层级几乎没有明星，无法估计。</w:t>
       </w:r>
     </w:p>
     <w:p>
@@ -4780,7 +4791,7 @@
         <w:pStyle w:val="1"/>
         <w:spacing w:before="280" w:after="120"/>
       </w:pPr>
-      <w:bookmarkStart w:id="1" w:name="_Toc243224272"/>
+      <w:bookmarkStart w:id="1" w:name="_Toc243226837"/>
       <w:r>
         <w:rPr>
           <w:rFonts w:ascii="Times New Roman" w:eastAsia="黑体" w:hAnsi="Times New Roman"/>
@@ -4804,7 +4815,7 @@
         <w:pStyle w:val="21"/>
         <w:spacing w:after="120"/>
       </w:pPr>
-      <w:bookmarkStart w:id="2" w:name="_Toc243224273"/>
+      <w:bookmarkStart w:id="2" w:name="_Toc243226838"/>
       <w:r>
         <w:rPr>
           <w:rFonts w:ascii="Times New Roman" w:eastAsia="黑体" w:hAnsi="Times New Roman"/>
@@ -4910,7 +4921,7 @@
         <w:pStyle w:val="21"/>
         <w:spacing w:after="120"/>
       </w:pPr>
-      <w:bookmarkStart w:id="3" w:name="_Toc243224274"/>
+      <w:bookmarkStart w:id="3" w:name="_Toc243226839"/>
       <w:r>
         <w:rPr>
           <w:rFonts w:ascii="Times New Roman" w:eastAsia="黑体" w:hAnsi="Times New Roman"/>
@@ -5319,7 +5330,7 @@
         <w:pStyle w:val="21"/>
         <w:spacing w:after="120"/>
       </w:pPr>
-      <w:bookmarkStart w:id="4" w:name="_Toc243224275"/>
+      <w:bookmarkStart w:id="4" w:name="_Toc243226840"/>
       <w:r>
         <w:rPr>
           <w:rFonts w:ascii="Times New Roman" w:eastAsia="黑体" w:hAnsi="Times New Roman"/>
@@ -5421,7 +5432,6 @@
         <w:rPr>
           <w:color w:val="000000"/>
         </w:rPr>
-        <w:lastRenderedPageBreak/>
         <w:t>第三问最关键：两个假说对它给出相反的预测，描述统计无法区分，只能靠检验。</w:t>
       </w:r>
     </w:p>
@@ -5430,7 +5440,7 @@
         <w:pStyle w:val="21"/>
         <w:spacing w:after="120"/>
       </w:pPr>
-      <w:bookmarkStart w:id="5" w:name="_Toc243224276"/>
+      <w:bookmarkStart w:id="5" w:name="_Toc243226841"/>
       <w:r>
         <w:rPr>
           <w:rFonts w:ascii="Times New Roman" w:eastAsia="黑体" w:hAnsi="Times New Roman"/>
@@ -5512,7 +5522,7 @@
         <w:pStyle w:val="21"/>
         <w:spacing w:after="120"/>
       </w:pPr>
-      <w:bookmarkStart w:id="6" w:name="_Toc243224277"/>
+      <w:bookmarkStart w:id="6" w:name="_Toc243226842"/>
       <w:r>
         <w:rPr>
           <w:rFonts w:ascii="Times New Roman" w:eastAsia="黑体" w:hAnsi="Times New Roman"/>
@@ -5584,7 +5594,7 @@
         <w:pStyle w:val="21"/>
         <w:spacing w:after="120"/>
       </w:pPr>
-      <w:bookmarkStart w:id="7" w:name="_Toc243224278"/>
+      <w:bookmarkStart w:id="7" w:name="_Toc243226843"/>
       <w:r>
         <w:rPr>
           <w:rFonts w:ascii="Times New Roman" w:eastAsia="黑体" w:hAnsi="Times New Roman"/>
@@ -5680,7 +5690,7 @@
         <w:pStyle w:val="21"/>
         <w:spacing w:after="120"/>
       </w:pPr>
-      <w:bookmarkStart w:id="8" w:name="_Toc243224279"/>
+      <w:bookmarkStart w:id="8" w:name="_Toc243226844"/>
       <w:r>
         <w:rPr>
           <w:rFonts w:ascii="Times New Roman" w:eastAsia="黑体" w:hAnsi="Times New Roman"/>
@@ -5734,7 +5744,7 @@
         <w:pStyle w:val="1"/>
         <w:spacing w:before="280" w:after="120"/>
       </w:pPr>
-      <w:bookmarkStart w:id="9" w:name="_Toc243224280"/>
+      <w:bookmarkStart w:id="9" w:name="_Toc243226845"/>
       <w:r>
         <w:rPr>
           <w:rFonts w:ascii="Times New Roman" w:eastAsia="黑体" w:hAnsi="Times New Roman"/>
@@ -5888,7 +5898,7 @@
         <w:pStyle w:val="1"/>
         <w:spacing w:before="280" w:after="120"/>
       </w:pPr>
-      <w:bookmarkStart w:id="10" w:name="_Toc243224281"/>
+      <w:bookmarkStart w:id="10" w:name="_Toc243226846"/>
       <w:r>
         <w:rPr>
           <w:rFonts w:ascii="Times New Roman" w:eastAsia="黑体" w:hAnsi="Times New Roman"/>
@@ -5974,7 +5984,6 @@
                 <w:color w:val="000000"/>
                 <w:sz w:val="21"/>
               </w:rPr>
-              <w:lastRenderedPageBreak/>
               <w:t>口径</w:t>
             </w:r>
           </w:p>
@@ -6315,7 +6324,7 @@
         <w:pStyle w:val="1"/>
         <w:spacing w:before="280" w:after="120"/>
       </w:pPr>
-      <w:bookmarkStart w:id="11" w:name="_Toc243224282"/>
+      <w:bookmarkStart w:id="11" w:name="_Toc243226847"/>
       <w:r>
         <w:rPr>
           <w:rFonts w:ascii="Times New Roman" w:eastAsia="黑体" w:hAnsi="Times New Roman"/>
@@ -7539,7 +7548,7 @@
         <w:pStyle w:val="1"/>
         <w:spacing w:before="280" w:after="120"/>
       </w:pPr>
-      <w:bookmarkStart w:id="12" w:name="_Toc243224283"/>
+      <w:bookmarkStart w:id="12" w:name="_Toc243226848"/>
       <w:r>
         <w:rPr>
           <w:rFonts w:ascii="Times New Roman" w:eastAsia="黑体" w:hAnsi="Times New Roman"/>
@@ -7844,7 +7853,6 @@
                 <w:color w:val="000000"/>
                 <w:sz w:val="21"/>
               </w:rPr>
-              <w:lastRenderedPageBreak/>
               <w:t>剔除上市未满</w:t>
             </w:r>
             <w:r>
@@ -8105,7 +8113,7 @@
         <w:rPr>
           <w:color w:val="000000"/>
         </w:rPr>
-        <w:t xml:space="preserve"> 2,772 </w:t>
+        <w:t xml:space="preserve"> 2,774 </w:t>
       </w:r>
       <w:r>
         <w:rPr>
@@ -8149,7 +8157,7 @@
         <w:rPr>
           <w:color w:val="000000"/>
         </w:rPr>
-        <w:t xml:space="preserve"> 18,208 </w:t>
+        <w:t xml:space="preserve"> 18,206 </w:t>
       </w:r>
       <w:r>
         <w:rPr>
@@ -8221,7 +8229,7 @@
         <w:rPr>
           <w:color w:val="000000"/>
         </w:rPr>
-        <w:t>11.8%</w:t>
+        <w:t>11.9%</w:t>
       </w:r>
       <w:r>
         <w:rPr>
@@ -8233,7 +8241,7 @@
         <w:rPr>
           <w:color w:val="000000"/>
         </w:rPr>
-        <w:t>11.6%</w:t>
+        <w:t>11.7%</w:t>
       </w:r>
       <w:r>
         <w:rPr>
@@ -8461,7 +8469,7 @@
         <w:rPr>
           <w:color w:val="000000"/>
         </w:rPr>
-        <w:t xml:space="preserve"> 27 / </w:t>
+        <w:t xml:space="preserve"> 26 / </w:t>
       </w:r>
       <w:r>
         <w:rPr>
@@ -8473,13 +8481,25 @@
         <w:rPr>
           <w:color w:val="000000"/>
         </w:rPr>
-        <w:t xml:space="preserve"> 91 </w:t>
-      </w:r>
-      <w:r>
-        <w:rPr>
-          <w:color w:val="000000"/>
-        </w:rPr>
-        <w:t>家。</w:t>
+        <w:t xml:space="preserve"> 86 </w:t>
+      </w:r>
+      <w:r>
+        <w:rPr>
+          <w:color w:val="000000"/>
+        </w:rPr>
+        <w:t>家（共</w:t>
+      </w:r>
+      <w:r>
+        <w:rPr>
+          <w:color w:val="000000"/>
+        </w:rPr>
+        <w:t xml:space="preserve"> 125 </w:t>
+      </w:r>
+      <w:r>
+        <w:rPr>
+          <w:color w:val="000000"/>
+        </w:rPr>
+        <w:t>家）。</w:t>
       </w:r>
       <w:r>
         <w:rPr>
@@ -8497,7 +8517,7 @@
         <w:rPr>
           <w:color w:val="000000"/>
         </w:rPr>
-        <w:t xml:space="preserve"> 1,608 </w:t>
+        <w:t xml:space="preserve"> 1,613 </w:t>
       </w:r>
       <w:r>
         <w:rPr>
@@ -8509,7 +8529,7 @@
         <w:rPr>
           <w:color w:val="000000"/>
         </w:rPr>
-        <w:t xml:space="preserve"> 1,160</w:t>
+        <w:t xml:space="preserve"> 1,159</w:t>
       </w:r>
       <w:r>
         <w:rPr>
@@ -8521,7 +8541,7 @@
         <w:rPr>
           <w:color w:val="000000"/>
         </w:rPr>
-        <w:t xml:space="preserve"> 4</w:t>
+        <w:t xml:space="preserve"> 2</w:t>
       </w:r>
       <w:r>
         <w:rPr>
@@ -8619,7 +8639,7 @@
         <w:pStyle w:val="1"/>
         <w:spacing w:before="280" w:after="120"/>
       </w:pPr>
-      <w:bookmarkStart w:id="13" w:name="_Toc243224284"/>
+      <w:bookmarkStart w:id="13" w:name="_Toc243226849"/>
       <w:r>
         <w:rPr>
           <w:rFonts w:ascii="Times New Roman" w:eastAsia="黑体" w:hAnsi="Times New Roman"/>
@@ -8643,7 +8663,7 @@
         <w:pStyle w:val="21"/>
         <w:spacing w:after="120"/>
       </w:pPr>
-      <w:bookmarkStart w:id="14" w:name="_Toc243224285"/>
+      <w:bookmarkStart w:id="14" w:name="_Toc243226850"/>
       <w:r>
         <w:rPr>
           <w:rFonts w:ascii="Times New Roman" w:eastAsia="黑体" w:hAnsi="Times New Roman"/>
@@ -8851,7 +8871,7 @@
         <w:pStyle w:val="21"/>
         <w:spacing w:after="120"/>
       </w:pPr>
-      <w:bookmarkStart w:id="15" w:name="_Toc243224286"/>
+      <w:bookmarkStart w:id="15" w:name="_Toc243226851"/>
       <w:r>
         <w:rPr>
           <w:rFonts w:ascii="Times New Roman" w:eastAsia="黑体" w:hAnsi="Times New Roman"/>
@@ -8937,13 +8957,12 @@
         <w:pStyle w:val="21"/>
         <w:spacing w:after="120"/>
       </w:pPr>
-      <w:bookmarkStart w:id="16" w:name="_Toc243224287"/>
+      <w:bookmarkStart w:id="16" w:name="_Toc243226852"/>
       <w:r>
         <w:rPr>
           <w:rFonts w:ascii="Times New Roman" w:eastAsia="黑体" w:hAnsi="Times New Roman"/>
           <w:color w:val="000000"/>
         </w:rPr>
-        <w:lastRenderedPageBreak/>
         <w:t xml:space="preserve">6.3 </w:t>
       </w:r>
       <w:r>
@@ -9004,7 +9023,152 @@
         <w:rPr>
           <w:color w:val="000000"/>
         </w:rPr>
-        <w:t>年全部评级记录的条数。先把机构名规范化（</w:t>
+        <w:t>年全部评级记录的条数。具体分三步：</w:t>
+      </w:r>
+    </w:p>
+    <w:p>
+      <w:pPr>
+        <w:spacing w:after="80"/>
+        <w:ind w:left="425" w:hanging="425"/>
+      </w:pPr>
+      <w:r>
+        <w:rPr>
+          <w:color w:val="000000"/>
+        </w:rPr>
+        <w:t xml:space="preserve">1. </w:t>
+      </w:r>
+      <w:r>
+        <w:rPr>
+          <w:b/>
+          <w:color w:val="000000"/>
+        </w:rPr>
+        <w:t>先定身份。</w:t>
+      </w:r>
+      <w:r>
+        <w:rPr>
+          <w:color w:val="000000"/>
+        </w:rPr>
+        <w:t xml:space="preserve"> </w:t>
+      </w:r>
+      <w:r>
+        <w:rPr>
+          <w:color w:val="000000"/>
+        </w:rPr>
+        <w:t>按年份把改名与合并并到同一家：联讯</w:t>
+      </w:r>
+      <w:r>
+        <w:rPr>
+          <w:color w:val="000000"/>
+        </w:rPr>
+        <w:t>→</w:t>
+      </w:r>
+      <w:r>
+        <w:rPr>
+          <w:color w:val="000000"/>
+        </w:rPr>
+        <w:t>粤开、财富</w:t>
+      </w:r>
+      <w:r>
+        <w:rPr>
+          <w:color w:val="000000"/>
+        </w:rPr>
+        <w:t>→</w:t>
+      </w:r>
+      <w:r>
+        <w:rPr>
+          <w:color w:val="000000"/>
+        </w:rPr>
+        <w:t>财信、华菁</w:t>
+      </w:r>
+      <w:r>
+        <w:rPr>
+          <w:color w:val="000000"/>
+        </w:rPr>
+        <w:t>→</w:t>
+      </w:r>
+      <w:r>
+        <w:rPr>
+          <w:color w:val="000000"/>
+        </w:rPr>
+        <w:t>华兴、新时代</w:t>
+      </w:r>
+      <w:r>
+        <w:rPr>
+          <w:color w:val="000000"/>
+        </w:rPr>
+        <w:t>→</w:t>
+      </w:r>
+      <w:r>
+        <w:rPr>
+          <w:color w:val="000000"/>
+        </w:rPr>
+        <w:t>诚通、安信</w:t>
+      </w:r>
+      <w:r>
+        <w:rPr>
+          <w:color w:val="000000"/>
+        </w:rPr>
+        <w:t>→</w:t>
+      </w:r>
+      <w:r>
+        <w:rPr>
+          <w:color w:val="000000"/>
+        </w:rPr>
+        <w:t>国投、国联证券</w:t>
+      </w:r>
+      <w:r>
+        <w:rPr>
+          <w:color w:val="000000"/>
+        </w:rPr>
+        <w:t>→</w:t>
+      </w:r>
+      <w:r>
+        <w:rPr>
+          <w:color w:val="000000"/>
+        </w:rPr>
+        <w:t>国联民生、国泰君安</w:t>
+      </w:r>
+      <w:r>
+        <w:rPr>
+          <w:color w:val="000000"/>
+        </w:rPr>
+        <w:t>→</w:t>
+      </w:r>
+      <w:r>
+        <w:rPr>
+          <w:color w:val="000000"/>
+        </w:rPr>
+        <w:t>国泰海通。同一家券商的所有历史写法只算一个稳定身份，当前共</w:t>
+      </w:r>
+      <w:r>
+        <w:rPr>
+          <w:color w:val="000000"/>
+        </w:rPr>
+        <w:t xml:space="preserve"> 125 </w:t>
+      </w:r>
+      <w:r>
+        <w:rPr>
+          <w:color w:val="000000"/>
+        </w:rPr>
+        <w:t>个。事件表仍保留</w:t>
+      </w:r>
+      <w:r>
+        <w:rPr>
+          <w:color w:val="000000"/>
+        </w:rPr>
+        <w:t xml:space="preserve"> iFinD </w:t>
+      </w:r>
+      <w:r>
+        <w:rPr>
+          <w:color w:val="000000"/>
+        </w:rPr>
+        <w:t>原始名称；展示时用</w:t>
+      </w:r>
+      <w:r>
+        <w:rPr>
+          <w:color w:val="000000"/>
+        </w:rPr>
+        <w:t xml:space="preserve"> </w:t>
       </w:r>
       <w:r>
         <w:rPr>
@@ -9012,26 +9176,261 @@
           <w:color w:val="000000"/>
           <w:sz w:val="22"/>
         </w:rPr>
-        <w:t>broker_names.py</w:t>
-      </w:r>
-      <w:r>
-        <w:rPr>
-          <w:color w:val="000000"/>
-        </w:rPr>
-        <w:t>），排除子公司，再按记录数从高到低排序，按</w:t>
+        <w:t>broker_name_in_year</w:t>
+      </w:r>
+      <w:r>
+        <w:rPr>
+          <w:color w:val="000000"/>
+        </w:rPr>
+        <w:t xml:space="preserve"> </w:t>
+      </w:r>
+      <w:r>
+        <w:rPr>
+          <w:color w:val="000000"/>
+        </w:rPr>
+        <w:t>返回当年在用的名称，所以</w:t>
+      </w:r>
+      <w:r>
+        <w:rPr>
+          <w:color w:val="000000"/>
+        </w:rPr>
+        <w:t xml:space="preserve"> 2018 </w:t>
+      </w:r>
+      <w:r>
+        <w:rPr>
+          <w:color w:val="000000"/>
+        </w:rPr>
+        <w:t>年的国泰君安不会写成国泰海通。</w:t>
+      </w:r>
+    </w:p>
+    <w:p>
+      <w:pPr>
+        <w:spacing w:after="80"/>
+        <w:ind w:left="425" w:hanging="425"/>
+      </w:pPr>
+      <w:r>
+        <w:rPr>
+          <w:color w:val="000000"/>
+        </w:rPr>
+        <w:t xml:space="preserve">2. </w:t>
       </w:r>
       <w:r>
         <w:rPr>
           <w:b/>
           <w:color w:val="000000"/>
         </w:rPr>
-        <w:t>累计记录份额</w:t>
-      </w:r>
-      <w:r>
-        <w:rPr>
-          <w:color w:val="000000"/>
-        </w:rPr>
-        <w:t>切三档：</w:t>
+        <w:t>再算规模。</w:t>
+      </w:r>
+      <w:r>
+        <w:rPr>
+          <w:color w:val="000000"/>
+        </w:rPr>
+        <w:t xml:space="preserve"> </w:t>
+      </w:r>
+      <w:r>
+        <w:rPr>
+          <w:color w:val="000000"/>
+        </w:rPr>
+        <w:t>对每个稳定身份，统计</w:t>
+      </w:r>
+      <w:r>
+        <w:rPr>
+          <w:color w:val="000000"/>
+        </w:rPr>
+        <w:t xml:space="preserve"> 2018 </w:t>
+      </w:r>
+      <w:r>
+        <w:rPr>
+          <w:color w:val="000000"/>
+        </w:rPr>
+        <w:t>至</w:t>
+      </w:r>
+      <w:r>
+        <w:rPr>
+          <w:color w:val="000000"/>
+        </w:rPr>
+        <w:t xml:space="preserve"> 2024 </w:t>
+      </w:r>
+      <w:r>
+        <w:rPr>
+          <w:color w:val="000000"/>
+        </w:rPr>
+        <w:t>年的全部评级记录条数。子公司（海通国际、华泰金融</w:t>
+      </w:r>
+      <w:r>
+        <w:rPr>
+          <w:color w:val="000000"/>
+        </w:rPr>
+        <w:t>(HK)</w:t>
+      </w:r>
+      <w:r>
+        <w:rPr>
+          <w:color w:val="000000"/>
+        </w:rPr>
+        <w:t>、群益证券</w:t>
+      </w:r>
+      <w:r>
+        <w:rPr>
+          <w:color w:val="000000"/>
+        </w:rPr>
+        <w:t>(</w:t>
+      </w:r>
+      <w:r>
+        <w:rPr>
+          <w:color w:val="000000"/>
+        </w:rPr>
+        <w:t>香港</w:t>
+      </w:r>
+      <w:r>
+        <w:rPr>
+          <w:color w:val="000000"/>
+        </w:rPr>
+        <w:t>)</w:t>
+      </w:r>
+      <w:r>
+        <w:rPr>
+          <w:color w:val="000000"/>
+        </w:rPr>
+        <w:t>等）保留为独立身份；</w:t>
+      </w:r>
+      <w:r>
+        <w:rPr>
+          <w:color w:val="000000"/>
+        </w:rPr>
+        <w:t xml:space="preserve">star </w:t>
+      </w:r>
+      <w:r>
+        <w:rPr>
+          <w:color w:val="000000"/>
+        </w:rPr>
+        <w:t>匹配时才排除，因为上榜分析师挂在母公司。</w:t>
+      </w:r>
+    </w:p>
+    <w:p>
+      <w:pPr>
+        <w:spacing w:after="80"/>
+        <w:ind w:left="425" w:hanging="425"/>
+      </w:pPr>
+      <w:r>
+        <w:rPr>
+          <w:color w:val="000000"/>
+        </w:rPr>
+        <w:t xml:space="preserve">3. </w:t>
+      </w:r>
+      <w:r>
+        <w:rPr>
+          <w:b/>
+          <w:color w:val="000000"/>
+        </w:rPr>
+        <w:t>后按累计份额切。</w:t>
+      </w:r>
+      <w:r>
+        <w:rPr>
+          <w:color w:val="000000"/>
+        </w:rPr>
+        <w:t xml:space="preserve"> </w:t>
+      </w:r>
+      <w:r>
+        <w:rPr>
+          <w:color w:val="000000"/>
+        </w:rPr>
+        <w:t>按记录数从高到低排序，头部是含自身累计不超过</w:t>
+      </w:r>
+      <w:r>
+        <w:rPr>
+          <w:color w:val="000000"/>
+        </w:rPr>
+        <w:t xml:space="preserve"> 50% </w:t>
+      </w:r>
+      <w:r>
+        <w:rPr>
+          <w:color w:val="000000"/>
+        </w:rPr>
+        <w:t>的机构（</w:t>
+      </w:r>
+      <w:r>
+        <w:rPr>
+          <w:color w:val="000000"/>
+        </w:rPr>
+        <w:t xml:space="preserve">13 </w:t>
+      </w:r>
+      <w:r>
+        <w:rPr>
+          <w:color w:val="000000"/>
+        </w:rPr>
+        <w:t>家，</w:t>
+      </w:r>
+      <w:r>
+        <w:rPr>
+          <w:color w:val="000000"/>
+        </w:rPr>
+        <w:t>47.9%</w:t>
+      </w:r>
+      <w:r>
+        <w:rPr>
+          <w:color w:val="000000"/>
+        </w:rPr>
+        <w:t>）；中部继续累计到</w:t>
+      </w:r>
+      <w:r>
+        <w:rPr>
+          <w:color w:val="000000"/>
+        </w:rPr>
+        <w:t xml:space="preserve"> 90%</w:t>
+      </w:r>
+      <w:r>
+        <w:rPr>
+          <w:color w:val="000000"/>
+        </w:rPr>
+        <w:t>（</w:t>
+      </w:r>
+      <w:r>
+        <w:rPr>
+          <w:color w:val="000000"/>
+        </w:rPr>
+        <w:t xml:space="preserve">26 </w:t>
+      </w:r>
+      <w:r>
+        <w:rPr>
+          <w:color w:val="000000"/>
+        </w:rPr>
+        <w:t>家，</w:t>
+      </w:r>
+      <w:r>
+        <w:rPr>
+          <w:color w:val="000000"/>
+        </w:rPr>
+        <w:t>41.4%</w:t>
+      </w:r>
+      <w:r>
+        <w:rPr>
+          <w:color w:val="000000"/>
+        </w:rPr>
+        <w:t>）；其余为中小（</w:t>
+      </w:r>
+      <w:r>
+        <w:rPr>
+          <w:color w:val="000000"/>
+        </w:rPr>
+        <w:t xml:space="preserve">86 </w:t>
+      </w:r>
+      <w:r>
+        <w:rPr>
+          <w:color w:val="000000"/>
+        </w:rPr>
+        <w:t>家，</w:t>
+      </w:r>
+      <w:r>
+        <w:rPr>
+          <w:color w:val="000000"/>
+        </w:rPr>
+        <w:t>10.6%</w:t>
+      </w:r>
+      <w:r>
+        <w:rPr>
+          <w:color w:val="000000"/>
+        </w:rPr>
+        <w:t>）。</w:t>
       </w:r>
     </w:p>
     <w:tbl>
@@ -9226,7 +9625,7 @@
                 <w:color w:val="000000"/>
                 <w:sz w:val="21"/>
               </w:rPr>
-              <w:t>47.7%</w:t>
+              <w:t>47.9%</w:t>
             </w:r>
           </w:p>
         </w:tc>
@@ -9243,7 +9642,7 @@
                 <w:color w:val="000000"/>
                 <w:sz w:val="21"/>
               </w:rPr>
-              <w:t>8,381</w:t>
+              <w:t>8,366</w:t>
             </w:r>
           </w:p>
         </w:tc>
@@ -9307,7 +9706,7 @@
                 <w:color w:val="000000"/>
                 <w:sz w:val="21"/>
               </w:rPr>
-              <w:t>27</w:t>
+              <w:t>26</w:t>
             </w:r>
           </w:p>
         </w:tc>
@@ -9324,7 +9723,7 @@
                 <w:color w:val="000000"/>
                 <w:sz w:val="21"/>
               </w:rPr>
-              <w:t>42.1%</w:t>
+              <w:t>41.4%</w:t>
             </w:r>
           </w:p>
         </w:tc>
@@ -9341,7 +9740,7 @@
                 <w:color w:val="000000"/>
                 <w:sz w:val="21"/>
               </w:rPr>
-              <w:t>9,544</w:t>
+              <w:t>9,272</w:t>
             </w:r>
           </w:p>
         </w:tc>
@@ -9398,7 +9797,7 @@
                 <w:color w:val="000000"/>
                 <w:sz w:val="21"/>
               </w:rPr>
-              <w:t>91</w:t>
+              <w:t>86</w:t>
             </w:r>
           </w:p>
         </w:tc>
@@ -9415,7 +9814,7 @@
                 <w:color w:val="000000"/>
                 <w:sz w:val="21"/>
               </w:rPr>
-              <w:t>10.2%</w:t>
+              <w:t>10.6%</w:t>
             </w:r>
           </w:p>
         </w:tc>
@@ -9432,7 +9831,7 @@
                 <w:color w:val="000000"/>
                 <w:sz w:val="21"/>
               </w:rPr>
-              <w:t>3,055</w:t>
+              <w:t>3,342</w:t>
             </w:r>
           </w:p>
         </w:tc>
@@ -9522,7 +9921,7 @@
         <w:rPr>
           <w:color w:val="000000"/>
         </w:rPr>
-        <w:t xml:space="preserve"> 44 </w:t>
+        <w:t xml:space="preserve"> 42 </w:t>
       </w:r>
       <w:r>
         <w:rPr>
@@ -9546,7 +9945,7 @@
         <w:rPr>
           <w:color w:val="000000"/>
         </w:rPr>
-        <w:t xml:space="preserve"> 92.8%</w:t>
+        <w:t xml:space="preserve"> 91.8%</w:t>
       </w:r>
       <w:r>
         <w:rPr>
@@ -9558,7 +9957,7 @@
         <w:rPr>
           <w:color w:val="000000"/>
         </w:rPr>
-        <w:t xml:space="preserve"> 8%</w:t>
+        <w:t xml:space="preserve"> 9%</w:t>
       </w:r>
       <w:r>
         <w:rPr>
@@ -9570,7 +9969,7 @@
         <w:rPr>
           <w:color w:val="000000"/>
         </w:rPr>
-        <w:t xml:space="preserve"> 47.7%</w:t>
+        <w:t xml:space="preserve"> 47.9%</w:t>
       </w:r>
       <w:r>
         <w:rPr>
@@ -9582,7 +9981,7 @@
         <w:rPr>
           <w:color w:val="000000"/>
         </w:rPr>
-        <w:t xml:space="preserve"> 42.1%</w:t>
+        <w:t xml:space="preserve"> 41.4%</w:t>
       </w:r>
       <w:r>
         <w:rPr>
@@ -9594,7 +9993,7 @@
         <w:rPr>
           <w:color w:val="000000"/>
         </w:rPr>
-        <w:t xml:space="preserve"> 10.2%</w:t>
+        <w:t xml:space="preserve"> 10.6%</w:t>
       </w:r>
       <w:r>
         <w:rPr>
@@ -9632,7 +10031,7 @@
         <w:rPr>
           <w:color w:val="000000"/>
         </w:rPr>
-        <w:t>三个局限要写进附录：层级由同一份评级数据构造，包含事件本身，只能作描述性变量，不能作因果变量；层级固定在整个样本期，不反映合并与变化；</w:t>
+        <w:t>三个局限要写进附录：层级由同一份评级数据构造，包含事件本身，只能作描述性变量，不能作因果变量；主口径的层级固定在整个样本期，改名与合并虽已并成同一身份，但层级仍是全期一次划分，滚动层级另做稳健性；</w:t>
       </w:r>
       <w:r>
         <w:rPr>
@@ -9650,49 +10049,167 @@
         <w:rPr>
           <w:color w:val="000000"/>
         </w:rPr>
+        <w:t xml:space="preserve"> 2 </w:t>
+      </w:r>
+      <w:r>
+        <w:rPr>
+          <w:color w:val="000000"/>
+        </w:rPr>
+        <w:t>条明星上调、</w:t>
+      </w:r>
+      <w:r>
+        <w:rPr>
+          <w:color w:val="000000"/>
+        </w:rPr>
+        <w:t xml:space="preserve">0 </w:t>
+      </w:r>
+      <w:r>
+        <w:rPr>
+          <w:color w:val="000000"/>
+        </w:rPr>
+        <w:t>条明星下调），不能把层级解读为独立的因果作用。切点本身是人为选择，稳健性里应换</w:t>
+      </w:r>
+      <w:r>
+        <w:rPr>
+          <w:color w:val="000000"/>
+        </w:rPr>
+        <w:t xml:space="preserve"> 40/80 </w:t>
+      </w:r>
+      <w:r>
+        <w:rPr>
+          <w:color w:val="000000"/>
+        </w:rPr>
+        <w:t>或</w:t>
+      </w:r>
+      <w:r>
+        <w:rPr>
+          <w:color w:val="000000"/>
+        </w:rPr>
+        <w:t xml:space="preserve"> 60/90 </w:t>
+      </w:r>
+      <w:r>
+        <w:rPr>
+          <w:color w:val="000000"/>
+        </w:rPr>
+        <w:t>重估第</w:t>
+      </w:r>
+      <w:r>
+        <w:rPr>
+          <w:color w:val="000000"/>
+        </w:rPr>
         <w:t xml:space="preserve"> 4 </w:t>
       </w:r>
       <w:r>
         <w:rPr>
           <w:color w:val="000000"/>
         </w:rPr>
-        <w:t>条明星上调、</w:t>
-      </w:r>
-      <w:r>
-        <w:rPr>
-          <w:color w:val="000000"/>
-        </w:rPr>
-        <w:t xml:space="preserve">0 </w:t>
-      </w:r>
-      <w:r>
-        <w:rPr>
-          <w:color w:val="000000"/>
-        </w:rPr>
-        <w:t>条明星下调），不能把层级解读为独立的因果作用。切点本身是人为选择，稳健性里应换</w:t>
-      </w:r>
-      <w:r>
-        <w:rPr>
-          <w:color w:val="000000"/>
-        </w:rPr>
-        <w:t xml:space="preserve"> 40/80 </w:t>
-      </w:r>
-      <w:r>
-        <w:rPr>
-          <w:color w:val="000000"/>
-        </w:rPr>
-        <w:t>或</w:t>
-      </w:r>
-      <w:r>
-        <w:rPr>
-          <w:color w:val="000000"/>
-        </w:rPr>
-        <w:t xml:space="preserve"> 60/90 </w:t>
-      </w:r>
-      <w:r>
-        <w:rPr>
-          <w:color w:val="000000"/>
-        </w:rPr>
-        <w:t>重估第</w:t>
+        <w:t>问。</w:t>
+      </w:r>
+    </w:p>
+    <w:p>
+      <w:r>
+        <w:rPr>
+          <w:color w:val="000000"/>
+        </w:rPr>
+        <w:t>滚动层级稳健性：为消除前视偏误，另按事件年</w:t>
+      </w:r>
+      <w:r>
+        <w:rPr>
+          <w:color w:val="000000"/>
+        </w:rPr>
+        <w:t xml:space="preserve"> t </w:t>
+      </w:r>
+      <w:r>
+        <w:rPr>
+          <w:color w:val="000000"/>
+        </w:rPr>
+        <w:t>之前最多三年（</w:t>
+      </w:r>
+      <w:r>
+        <w:rPr>
+          <w:color w:val="000000"/>
+        </w:rPr>
+        <w:t xml:space="preserve">t-3 </w:t>
+      </w:r>
+      <w:r>
+        <w:rPr>
+          <w:color w:val="000000"/>
+        </w:rPr>
+        <w:t>至</w:t>
+      </w:r>
+      <w:r>
+        <w:rPr>
+          <w:color w:val="000000"/>
+        </w:rPr>
+        <w:t xml:space="preserve"> t-1</w:t>
+      </w:r>
+      <w:r>
+        <w:rPr>
+          <w:color w:val="000000"/>
+        </w:rPr>
+        <w:t>）的记录数重排层级，切点不变。</w:t>
+      </w:r>
+      <w:r>
+        <w:rPr>
+          <w:color w:val="000000"/>
+        </w:rPr>
+        <w:t xml:space="preserve">2018 </w:t>
+      </w:r>
+      <w:r>
+        <w:rPr>
+          <w:color w:val="000000"/>
+        </w:rPr>
+        <w:t>年没有更早数据，用当年记录并在</w:t>
+      </w:r>
+      <w:r>
+        <w:rPr>
+          <w:color w:val="000000"/>
+        </w:rPr>
+        <w:t xml:space="preserve"> </w:t>
+      </w:r>
+      <w:r>
+        <w:rPr>
+          <w:rFonts w:ascii="Consolas" w:hAnsi="Consolas"/>
+          <w:color w:val="000000"/>
+          <w:sz w:val="22"/>
+        </w:rPr>
+        <w:t>broker_tier_rolling.csv</w:t>
+      </w:r>
+      <w:r>
+        <w:rPr>
+          <w:color w:val="000000"/>
+        </w:rPr>
+        <w:t xml:space="preserve"> </w:t>
+      </w:r>
+      <w:r>
+        <w:rPr>
+          <w:color w:val="000000"/>
+        </w:rPr>
+        <w:t>标注。结果</w:t>
+      </w:r>
+      <w:r>
+        <w:rPr>
+          <w:color w:val="000000"/>
+        </w:rPr>
+        <w:t xml:space="preserve"> 23.1% </w:t>
+      </w:r>
+      <w:r>
+        <w:rPr>
+          <w:color w:val="000000"/>
+        </w:rPr>
+        <w:t>的事件换了层级，</w:t>
+      </w:r>
+      <w:r>
+        <w:rPr>
+          <w:color w:val="000000"/>
+        </w:rPr>
+        <w:t xml:space="preserve">62 </w:t>
+      </w:r>
+      <w:r>
+        <w:rPr>
+          <w:color w:val="000000"/>
+        </w:rPr>
+        <w:t>条事件因窗口内无记录无法归类。用滚动层级重估第</w:t>
       </w:r>
       <w:r>
         <w:rPr>
@@ -9704,7 +10221,223 @@
         <w:rPr>
           <w:color w:val="000000"/>
         </w:rPr>
-        <w:t>问。</w:t>
+        <w:t>问，上调与下调的不对称几乎不变（</w:t>
+      </w:r>
+      <w:r>
+        <w:rPr>
+          <w:color w:val="000000"/>
+        </w:rPr>
+        <w:t xml:space="preserve">[-1,+5] </w:t>
+      </w:r>
+      <w:r>
+        <w:rPr>
+          <w:color w:val="000000"/>
+        </w:rPr>
+        <w:t>交互项</w:t>
+      </w:r>
+      <w:r>
+        <w:rPr>
+          <w:color w:val="000000"/>
+        </w:rPr>
+        <w:t xml:space="preserve"> −0.70</w:t>
+      </w:r>
+      <w:r>
+        <w:rPr>
+          <w:color w:val="000000"/>
+        </w:rPr>
+        <w:t>，</w:t>
+      </w:r>
+      <w:r>
+        <w:rPr>
+          <w:color w:val="000000"/>
+        </w:rPr>
+        <w:t>p=0.024</w:t>
+      </w:r>
+      <w:r>
+        <w:rPr>
+          <w:color w:val="000000"/>
+        </w:rPr>
+        <w:t>；成交量</w:t>
+      </w:r>
+      <w:r>
+        <w:rPr>
+          <w:color w:val="000000"/>
+        </w:rPr>
+        <w:t xml:space="preserve"> −0.058</w:t>
+      </w:r>
+      <w:r>
+        <w:rPr>
+          <w:color w:val="000000"/>
+        </w:rPr>
+        <w:t>，</w:t>
+      </w:r>
+      <w:r>
+        <w:rPr>
+          <w:color w:val="000000"/>
+        </w:rPr>
+        <w:t>p=0.038</w:t>
+      </w:r>
+      <w:r>
+        <w:rPr>
+          <w:color w:val="000000"/>
+        </w:rPr>
+        <w:t>），但层级本身的显著性不稳定：头部上调的</w:t>
+      </w:r>
+      <w:r>
+        <w:rPr>
+          <w:color w:val="000000"/>
+        </w:rPr>
+        <w:t xml:space="preserve"> CAR </w:t>
+      </w:r>
+      <w:r>
+        <w:rPr>
+          <w:color w:val="000000"/>
+        </w:rPr>
+        <w:t>溢价从</w:t>
+      </w:r>
+      <w:r>
+        <w:rPr>
+          <w:color w:val="000000"/>
+        </w:rPr>
+        <w:t xml:space="preserve"> +0.55</w:t>
+      </w:r>
+      <w:r>
+        <w:rPr>
+          <w:color w:val="000000"/>
+        </w:rPr>
+        <w:t>（</w:t>
+      </w:r>
+      <w:r>
+        <w:rPr>
+          <w:color w:val="000000"/>
+        </w:rPr>
+        <w:t>p=0.016</w:t>
+      </w:r>
+      <w:r>
+        <w:rPr>
+          <w:color w:val="000000"/>
+        </w:rPr>
+        <w:t>）变为</w:t>
+      </w:r>
+      <w:r>
+        <w:rPr>
+          <w:color w:val="000000"/>
+        </w:rPr>
+        <w:t xml:space="preserve"> +0.49</w:t>
+      </w:r>
+      <w:r>
+        <w:rPr>
+          <w:color w:val="000000"/>
+        </w:rPr>
+        <w:t>（</w:t>
+      </w:r>
+      <w:r>
+        <w:rPr>
+          <w:color w:val="000000"/>
+        </w:rPr>
+        <w:t>p=0.044</w:t>
+      </w:r>
+      <w:r>
+        <w:rPr>
+          <w:color w:val="000000"/>
+        </w:rPr>
+        <w:t>），成交量溢价从</w:t>
+      </w:r>
+      <w:r>
+        <w:rPr>
+          <w:color w:val="000000"/>
+        </w:rPr>
+        <w:t xml:space="preserve"> +0.063</w:t>
+      </w:r>
+      <w:r>
+        <w:rPr>
+          <w:color w:val="000000"/>
+        </w:rPr>
+        <w:t>（</w:t>
+      </w:r>
+      <w:r>
+        <w:rPr>
+          <w:color w:val="000000"/>
+        </w:rPr>
+        <w:t>p=0.013</w:t>
+      </w:r>
+      <w:r>
+        <w:rPr>
+          <w:color w:val="000000"/>
+        </w:rPr>
+        <w:t>）变为</w:t>
+      </w:r>
+      <w:r>
+        <w:rPr>
+          <w:color w:val="000000"/>
+        </w:rPr>
+        <w:t xml:space="preserve"> +0.042</w:t>
+      </w:r>
+      <w:r>
+        <w:rPr>
+          <w:color w:val="000000"/>
+        </w:rPr>
+        <w:t>（</w:t>
+      </w:r>
+      <w:r>
+        <w:rPr>
+          <w:color w:val="000000"/>
+        </w:rPr>
+        <w:t>p=0.100</w:t>
+      </w:r>
+      <w:r>
+        <w:rPr>
+          <w:color w:val="000000"/>
+        </w:rPr>
+        <w:t>）；中部下调的</w:t>
+      </w:r>
+      <w:r>
+        <w:rPr>
+          <w:color w:val="000000"/>
+        </w:rPr>
+        <w:t xml:space="preserve"> +0.62</w:t>
+      </w:r>
+      <w:r>
+        <w:rPr>
+          <w:color w:val="000000"/>
+        </w:rPr>
+        <w:t>（</w:t>
+      </w:r>
+      <w:r>
+        <w:rPr>
+          <w:color w:val="000000"/>
+        </w:rPr>
+        <w:t>p=0.007</w:t>
+      </w:r>
+      <w:r>
+        <w:rPr>
+          <w:color w:val="000000"/>
+        </w:rPr>
+        <w:t>）变为</w:t>
+      </w:r>
+      <w:r>
+        <w:rPr>
+          <w:color w:val="000000"/>
+        </w:rPr>
+        <w:t xml:space="preserve"> +0.32</w:t>
+      </w:r>
+      <w:r>
+        <w:rPr>
+          <w:color w:val="000000"/>
+        </w:rPr>
+        <w:t>（</w:t>
+      </w:r>
+      <w:r>
+        <w:rPr>
+          <w:color w:val="000000"/>
+        </w:rPr>
+        <w:t>p=0.131</w:t>
+      </w:r>
+      <w:r>
+        <w:rPr>
+          <w:color w:val="000000"/>
+        </w:rPr>
+        <w:t>）。所以层级结果只能作为提示，不能作为稳定结论。</w:t>
       </w:r>
     </w:p>
     <w:p>
@@ -9712,7 +10445,7 @@
         <w:pStyle w:val="1"/>
         <w:spacing w:before="280" w:after="120"/>
       </w:pPr>
-      <w:bookmarkStart w:id="17" w:name="_Toc243224288"/>
+      <w:bookmarkStart w:id="17" w:name="_Toc243226853"/>
       <w:r>
         <w:rPr>
           <w:rFonts w:ascii="Times New Roman" w:eastAsia="黑体" w:hAnsi="Times New Roman"/>
@@ -9744,7 +10477,7 @@
         <w:pStyle w:val="21"/>
         <w:spacing w:after="120"/>
       </w:pPr>
-      <w:bookmarkStart w:id="18" w:name="_Toc243224289"/>
+      <w:bookmarkStart w:id="18" w:name="_Toc243226854"/>
       <w:r>
         <w:rPr>
           <w:rFonts w:ascii="Times New Roman" w:eastAsia="黑体" w:hAnsi="Times New Roman"/>
@@ -9870,7 +10603,6 @@
         <w:rPr>
           <w:color w:val="000000"/>
         </w:rPr>
-        <w:lastRenderedPageBreak/>
         <w:t>早年数据整年查询会因响应过大</w:t>
       </w:r>
       <w:r>
@@ -10011,7 +10743,7 @@
         <w:pStyle w:val="21"/>
         <w:spacing w:after="120"/>
       </w:pPr>
-      <w:bookmarkStart w:id="19" w:name="_Toc243224290"/>
+      <w:bookmarkStart w:id="19" w:name="_Toc243226855"/>
       <w:r>
         <w:rPr>
           <w:rFonts w:ascii="Times New Roman" w:eastAsia="黑体" w:hAnsi="Times New Roman"/>
@@ -10127,7 +10859,7 @@
         <w:pStyle w:val="21"/>
         <w:spacing w:after="120"/>
       </w:pPr>
-      <w:bookmarkStart w:id="20" w:name="_Toc243224291"/>
+      <w:bookmarkStart w:id="20" w:name="_Toc243226856"/>
       <w:r>
         <w:rPr>
           <w:rFonts w:ascii="Times New Roman" w:eastAsia="黑体" w:hAnsi="Times New Roman"/>
@@ -10285,7 +11017,7 @@
         <w:rPr>
           <w:color w:val="000000"/>
         </w:rPr>
-        <w:t>条明星研报被误判成非明星。归并后券商层级从</w:t>
+        <w:t>条明星研报被误判成非明星。归并中信建投后，券商层级从</w:t>
       </w:r>
       <w:r>
         <w:rPr>
@@ -10333,7 +11065,79 @@
         <w:rPr>
           <w:color w:val="000000"/>
         </w:rPr>
-        <w:t>）换了层级。事件表本身保留</w:t>
+        <w:t>）换了层级。此后又按年份并入安信</w:t>
+      </w:r>
+      <w:r>
+        <w:rPr>
+          <w:color w:val="000000"/>
+        </w:rPr>
+        <w:t>/</w:t>
+      </w:r>
+      <w:r>
+        <w:rPr>
+          <w:color w:val="000000"/>
+        </w:rPr>
+        <w:t>国投、国联</w:t>
+      </w:r>
+      <w:r>
+        <w:rPr>
+          <w:color w:val="000000"/>
+        </w:rPr>
+        <w:t>/</w:t>
+      </w:r>
+      <w:r>
+        <w:rPr>
+          <w:color w:val="000000"/>
+        </w:rPr>
+        <w:t>国联民生、华菁</w:t>
+      </w:r>
+      <w:r>
+        <w:rPr>
+          <w:color w:val="000000"/>
+        </w:rPr>
+        <w:t>/</w:t>
+      </w:r>
+      <w:r>
+        <w:rPr>
+          <w:color w:val="000000"/>
+        </w:rPr>
+        <w:t>华兴、新时代</w:t>
+      </w:r>
+      <w:r>
+        <w:rPr>
+          <w:color w:val="000000"/>
+        </w:rPr>
+        <w:t>/</w:t>
+      </w:r>
+      <w:r>
+        <w:rPr>
+          <w:color w:val="000000"/>
+        </w:rPr>
+        <w:t>诚通等改名对，当前为</w:t>
+      </w:r>
+      <w:r>
+        <w:rPr>
+          <w:color w:val="000000"/>
+        </w:rPr>
+        <w:t xml:space="preserve"> 13 / 26 / 86</w:t>
+      </w:r>
+      <w:r>
+        <w:rPr>
+          <w:color w:val="000000"/>
+        </w:rPr>
+        <w:t>（</w:t>
+      </w:r>
+      <w:r>
+        <w:rPr>
+          <w:color w:val="000000"/>
+        </w:rPr>
+        <w:t xml:space="preserve">125 </w:t>
+      </w:r>
+      <w:r>
+        <w:rPr>
+          <w:color w:val="000000"/>
+        </w:rPr>
+        <w:t>家）。事件表保留</w:t>
       </w:r>
       <w:r>
         <w:rPr>
@@ -10345,7 +11149,786 @@
         <w:rPr>
           <w:color w:val="000000"/>
         </w:rPr>
-        <w:t>原始机构名，规范化只在匹配时发生。</w:t>
+        <w:t>原始机构名；规范化只用于匹配与层级，展示用</w:t>
+      </w:r>
+      <w:r>
+        <w:rPr>
+          <w:color w:val="000000"/>
+        </w:rPr>
+        <w:t xml:space="preserve"> </w:t>
+      </w:r>
+      <w:r>
+        <w:rPr>
+          <w:rFonts w:ascii="Consolas" w:hAnsi="Consolas"/>
+          <w:color w:val="000000"/>
+          <w:sz w:val="22"/>
+        </w:rPr>
+        <w:t>broker_name_in_year</w:t>
+      </w:r>
+      <w:r>
+        <w:rPr>
+          <w:color w:val="000000"/>
+        </w:rPr>
+        <w:t xml:space="preserve"> </w:t>
+      </w:r>
+      <w:r>
+        <w:rPr>
+          <w:color w:val="000000"/>
+        </w:rPr>
+        <w:t>返回当年在用的名称。</w:t>
+      </w:r>
+    </w:p>
+    <w:p>
+      <w:r>
+        <w:rPr>
+          <w:color w:val="000000"/>
+        </w:rPr>
+        <w:t>按年份处理的改名与合并：</w:t>
+      </w:r>
+    </w:p>
+    <w:tbl>
+      <w:tblPr>
+        <w:tblStyle w:val="aff1"/>
+        <w:tblW w:w="0" w:type="auto"/>
+        <w:jc w:val="center"/>
+        <w:tblLook w:val="04A0" w:firstRow="1" w:lastRow="0" w:firstColumn="1" w:lastColumn="0" w:noHBand="0" w:noVBand="1"/>
+      </w:tblPr>
+      <w:tblGrid>
+        <w:gridCol w:w="2353"/>
+        <w:gridCol w:w="2353"/>
+        <w:gridCol w:w="2353"/>
+        <w:gridCol w:w="2353"/>
+      </w:tblGrid>
+      <w:tr>
+        <w:trPr>
+          <w:cantSplit/>
+          <w:tblHeader/>
+          <w:jc w:val="center"/>
+        </w:trPr>
+        <w:tc>
+          <w:tcPr>
+            <w:tcW w:w="2353" w:type="dxa"/>
+            <w:shd w:val="clear" w:color="auto" w:fill="F2F2F2"/>
+          </w:tcPr>
+          <w:p>
+            <w:pPr>
+              <w:spacing w:after="40" w:line="276" w:lineRule="auto"/>
+            </w:pPr>
+            <w:r>
+              <w:rPr>
+                <w:b/>
+                <w:color w:val="000000"/>
+                <w:sz w:val="21"/>
+              </w:rPr>
+              <w:t>旧名</w:t>
+            </w:r>
+          </w:p>
+        </w:tc>
+        <w:tc>
+          <w:tcPr>
+            <w:tcW w:w="2353" w:type="dxa"/>
+            <w:shd w:val="clear" w:color="auto" w:fill="F2F2F2"/>
+          </w:tcPr>
+          <w:p>
+            <w:pPr>
+              <w:spacing w:after="40" w:line="276" w:lineRule="auto"/>
+            </w:pPr>
+            <w:r>
+              <w:rPr>
+                <w:b/>
+                <w:color w:val="000000"/>
+                <w:sz w:val="21"/>
+              </w:rPr>
+              <w:t>新名</w:t>
+            </w:r>
+          </w:p>
+        </w:tc>
+        <w:tc>
+          <w:tcPr>
+            <w:tcW w:w="2353" w:type="dxa"/>
+            <w:shd w:val="clear" w:color="auto" w:fill="F2F2F2"/>
+          </w:tcPr>
+          <w:p>
+            <w:pPr>
+              <w:spacing w:after="40" w:line="276" w:lineRule="auto"/>
+            </w:pPr>
+            <w:r>
+              <w:rPr>
+                <w:b/>
+                <w:color w:val="000000"/>
+                <w:sz w:val="21"/>
+              </w:rPr>
+              <w:t>新名生效年</w:t>
+            </w:r>
+          </w:p>
+        </w:tc>
+        <w:tc>
+          <w:tcPr>
+            <w:tcW w:w="2353" w:type="dxa"/>
+            <w:shd w:val="clear" w:color="auto" w:fill="F2F2F2"/>
+          </w:tcPr>
+          <w:p>
+            <w:pPr>
+              <w:spacing w:after="40" w:line="276" w:lineRule="auto"/>
+            </w:pPr>
+            <w:r>
+              <w:rPr>
+                <w:b/>
+                <w:color w:val="000000"/>
+                <w:sz w:val="21"/>
+              </w:rPr>
+              <w:t>证据</w:t>
+            </w:r>
+          </w:p>
+        </w:tc>
+      </w:tr>
+      <w:tr>
+        <w:trPr>
+          <w:cantSplit/>
+          <w:jc w:val="center"/>
+        </w:trPr>
+        <w:tc>
+          <w:tcPr>
+            <w:tcW w:w="2353" w:type="dxa"/>
+          </w:tcPr>
+          <w:p>
+            <w:pPr>
+              <w:spacing w:after="40" w:line="276" w:lineRule="auto"/>
+            </w:pPr>
+            <w:r>
+              <w:rPr>
+                <w:color w:val="000000"/>
+                <w:sz w:val="21"/>
+              </w:rPr>
+              <w:t>联讯证券</w:t>
+            </w:r>
+          </w:p>
+        </w:tc>
+        <w:tc>
+          <w:tcPr>
+            <w:tcW w:w="2353" w:type="dxa"/>
+          </w:tcPr>
+          <w:p>
+            <w:pPr>
+              <w:spacing w:after="40" w:line="276" w:lineRule="auto"/>
+            </w:pPr>
+            <w:r>
+              <w:rPr>
+                <w:color w:val="000000"/>
+                <w:sz w:val="21"/>
+              </w:rPr>
+              <w:t>粤开证券</w:t>
+            </w:r>
+          </w:p>
+        </w:tc>
+        <w:tc>
+          <w:tcPr>
+            <w:tcW w:w="2353" w:type="dxa"/>
+          </w:tcPr>
+          <w:p>
+            <w:pPr>
+              <w:spacing w:after="40" w:line="276" w:lineRule="auto"/>
+            </w:pPr>
+            <w:r>
+              <w:rPr>
+                <w:color w:val="000000"/>
+                <w:sz w:val="21"/>
+              </w:rPr>
+              <w:t>2020</w:t>
+            </w:r>
+          </w:p>
+        </w:tc>
+        <w:tc>
+          <w:tcPr>
+            <w:tcW w:w="2353" w:type="dxa"/>
+          </w:tcPr>
+          <w:p>
+            <w:pPr>
+              <w:spacing w:after="40" w:line="276" w:lineRule="auto"/>
+            </w:pPr>
+            <w:r>
+              <w:rPr>
+                <w:color w:val="000000"/>
+                <w:sz w:val="21"/>
+              </w:rPr>
+              <w:t>同一机构，旧名留在历史记录</w:t>
+            </w:r>
+          </w:p>
+        </w:tc>
+      </w:tr>
+      <w:tr>
+        <w:trPr>
+          <w:cantSplit/>
+          <w:jc w:val="center"/>
+        </w:trPr>
+        <w:tc>
+          <w:tcPr>
+            <w:tcW w:w="2353" w:type="dxa"/>
+          </w:tcPr>
+          <w:p>
+            <w:pPr>
+              <w:spacing w:after="40" w:line="276" w:lineRule="auto"/>
+            </w:pPr>
+            <w:r>
+              <w:rPr>
+                <w:color w:val="000000"/>
+                <w:sz w:val="21"/>
+              </w:rPr>
+              <w:t>财富证券</w:t>
+            </w:r>
+          </w:p>
+        </w:tc>
+        <w:tc>
+          <w:tcPr>
+            <w:tcW w:w="2353" w:type="dxa"/>
+          </w:tcPr>
+          <w:p>
+            <w:pPr>
+              <w:spacing w:after="40" w:line="276" w:lineRule="auto"/>
+            </w:pPr>
+            <w:r>
+              <w:rPr>
+                <w:color w:val="000000"/>
+                <w:sz w:val="21"/>
+              </w:rPr>
+              <w:t>财信证券</w:t>
+            </w:r>
+          </w:p>
+        </w:tc>
+        <w:tc>
+          <w:tcPr>
+            <w:tcW w:w="2353" w:type="dxa"/>
+          </w:tcPr>
+          <w:p>
+            <w:pPr>
+              <w:spacing w:after="40" w:line="276" w:lineRule="auto"/>
+            </w:pPr>
+            <w:r>
+              <w:rPr>
+                <w:color w:val="000000"/>
+                <w:sz w:val="21"/>
+              </w:rPr>
+              <w:t>2020</w:t>
+            </w:r>
+          </w:p>
+        </w:tc>
+        <w:tc>
+          <w:tcPr>
+            <w:tcW w:w="2353" w:type="dxa"/>
+          </w:tcPr>
+          <w:p>
+            <w:pPr>
+              <w:spacing w:after="40" w:line="276" w:lineRule="auto"/>
+            </w:pPr>
+            <w:r>
+              <w:rPr>
+                <w:color w:val="000000"/>
+                <w:sz w:val="21"/>
+              </w:rPr>
+              <w:t>同上</w:t>
+            </w:r>
+          </w:p>
+        </w:tc>
+      </w:tr>
+      <w:tr>
+        <w:trPr>
+          <w:cantSplit/>
+          <w:jc w:val="center"/>
+        </w:trPr>
+        <w:tc>
+          <w:tcPr>
+            <w:tcW w:w="2353" w:type="dxa"/>
+          </w:tcPr>
+          <w:p>
+            <w:pPr>
+              <w:spacing w:after="40" w:line="276" w:lineRule="auto"/>
+            </w:pPr>
+            <w:r>
+              <w:rPr>
+                <w:color w:val="000000"/>
+                <w:sz w:val="21"/>
+              </w:rPr>
+              <w:t>华菁证券</w:t>
+            </w:r>
+          </w:p>
+        </w:tc>
+        <w:tc>
+          <w:tcPr>
+            <w:tcW w:w="2353" w:type="dxa"/>
+          </w:tcPr>
+          <w:p>
+            <w:pPr>
+              <w:spacing w:after="40" w:line="276" w:lineRule="auto"/>
+            </w:pPr>
+            <w:r>
+              <w:rPr>
+                <w:color w:val="000000"/>
+                <w:sz w:val="21"/>
+              </w:rPr>
+              <w:t>华兴证券</w:t>
+            </w:r>
+          </w:p>
+        </w:tc>
+        <w:tc>
+          <w:tcPr>
+            <w:tcW w:w="2353" w:type="dxa"/>
+          </w:tcPr>
+          <w:p>
+            <w:pPr>
+              <w:spacing w:after="40" w:line="276" w:lineRule="auto"/>
+            </w:pPr>
+            <w:r>
+              <w:rPr>
+                <w:color w:val="000000"/>
+                <w:sz w:val="21"/>
+              </w:rPr>
+              <w:t>2021</w:t>
+            </w:r>
+          </w:p>
+        </w:tc>
+        <w:tc>
+          <w:tcPr>
+            <w:tcW w:w="2353" w:type="dxa"/>
+          </w:tcPr>
+          <w:p>
+            <w:pPr>
+              <w:spacing w:after="40" w:line="276" w:lineRule="auto"/>
+            </w:pPr>
+            <w:r>
+              <w:rPr>
+                <w:color w:val="000000"/>
+                <w:sz w:val="21"/>
+              </w:rPr>
+              <w:t>分析师重合</w:t>
+            </w:r>
+            <w:r>
+              <w:rPr>
+                <w:color w:val="000000"/>
+                <w:sz w:val="21"/>
+              </w:rPr>
+              <w:t xml:space="preserve"> 3/4</w:t>
+            </w:r>
+          </w:p>
+        </w:tc>
+      </w:tr>
+      <w:tr>
+        <w:trPr>
+          <w:cantSplit/>
+          <w:jc w:val="center"/>
+        </w:trPr>
+        <w:tc>
+          <w:tcPr>
+            <w:tcW w:w="2353" w:type="dxa"/>
+          </w:tcPr>
+          <w:p>
+            <w:pPr>
+              <w:spacing w:after="40" w:line="276" w:lineRule="auto"/>
+            </w:pPr>
+            <w:r>
+              <w:rPr>
+                <w:color w:val="000000"/>
+                <w:sz w:val="21"/>
+              </w:rPr>
+              <w:t>新时代证券</w:t>
+            </w:r>
+          </w:p>
+        </w:tc>
+        <w:tc>
+          <w:tcPr>
+            <w:tcW w:w="2353" w:type="dxa"/>
+          </w:tcPr>
+          <w:p>
+            <w:pPr>
+              <w:spacing w:after="40" w:line="276" w:lineRule="auto"/>
+            </w:pPr>
+            <w:r>
+              <w:rPr>
+                <w:color w:val="000000"/>
+                <w:sz w:val="21"/>
+              </w:rPr>
+              <w:t>诚通证券</w:t>
+            </w:r>
+          </w:p>
+        </w:tc>
+        <w:tc>
+          <w:tcPr>
+            <w:tcW w:w="2353" w:type="dxa"/>
+          </w:tcPr>
+          <w:p>
+            <w:pPr>
+              <w:spacing w:after="40" w:line="276" w:lineRule="auto"/>
+            </w:pPr>
+            <w:r>
+              <w:rPr>
+                <w:color w:val="000000"/>
+                <w:sz w:val="21"/>
+              </w:rPr>
+              <w:t>2022</w:t>
+            </w:r>
+          </w:p>
+        </w:tc>
+        <w:tc>
+          <w:tcPr>
+            <w:tcW w:w="2353" w:type="dxa"/>
+          </w:tcPr>
+          <w:p>
+            <w:pPr>
+              <w:spacing w:after="40" w:line="276" w:lineRule="auto"/>
+            </w:pPr>
+            <w:r>
+              <w:rPr>
+                <w:color w:val="000000"/>
+                <w:sz w:val="21"/>
+              </w:rPr>
+              <w:t>更名，样本内记录很少</w:t>
+            </w:r>
+          </w:p>
+        </w:tc>
+      </w:tr>
+      <w:tr>
+        <w:trPr>
+          <w:cantSplit/>
+          <w:jc w:val="center"/>
+        </w:trPr>
+        <w:tc>
+          <w:tcPr>
+            <w:tcW w:w="2353" w:type="dxa"/>
+          </w:tcPr>
+          <w:p>
+            <w:pPr>
+              <w:spacing w:after="40" w:line="276" w:lineRule="auto"/>
+            </w:pPr>
+            <w:r>
+              <w:rPr>
+                <w:color w:val="000000"/>
+                <w:sz w:val="21"/>
+              </w:rPr>
+              <w:t>安信证券</w:t>
+            </w:r>
+          </w:p>
+        </w:tc>
+        <w:tc>
+          <w:tcPr>
+            <w:tcW w:w="2353" w:type="dxa"/>
+          </w:tcPr>
+          <w:p>
+            <w:pPr>
+              <w:spacing w:after="40" w:line="276" w:lineRule="auto"/>
+            </w:pPr>
+            <w:r>
+              <w:rPr>
+                <w:color w:val="000000"/>
+                <w:sz w:val="21"/>
+              </w:rPr>
+              <w:t>国投证券</w:t>
+            </w:r>
+          </w:p>
+        </w:tc>
+        <w:tc>
+          <w:tcPr>
+            <w:tcW w:w="2353" w:type="dxa"/>
+          </w:tcPr>
+          <w:p>
+            <w:pPr>
+              <w:spacing w:after="40" w:line="276" w:lineRule="auto"/>
+            </w:pPr>
+            <w:r>
+              <w:rPr>
+                <w:color w:val="000000"/>
+                <w:sz w:val="21"/>
+              </w:rPr>
+              <w:t>2024</w:t>
+            </w:r>
+          </w:p>
+        </w:tc>
+        <w:tc>
+          <w:tcPr>
+            <w:tcW w:w="2353" w:type="dxa"/>
+          </w:tcPr>
+          <w:p>
+            <w:pPr>
+              <w:spacing w:after="40" w:line="276" w:lineRule="auto"/>
+            </w:pPr>
+            <w:r>
+              <w:rPr>
+                <w:color w:val="000000"/>
+                <w:sz w:val="21"/>
+              </w:rPr>
+              <w:t>分析师重合</w:t>
+            </w:r>
+            <w:r>
+              <w:rPr>
+                <w:color w:val="000000"/>
+                <w:sz w:val="21"/>
+              </w:rPr>
+              <w:t xml:space="preserve"> 26/32</w:t>
+            </w:r>
+          </w:p>
+        </w:tc>
+      </w:tr>
+      <w:tr>
+        <w:trPr>
+          <w:cantSplit/>
+          <w:jc w:val="center"/>
+        </w:trPr>
+        <w:tc>
+          <w:tcPr>
+            <w:tcW w:w="2353" w:type="dxa"/>
+          </w:tcPr>
+          <w:p>
+            <w:pPr>
+              <w:spacing w:after="40" w:line="276" w:lineRule="auto"/>
+            </w:pPr>
+            <w:r>
+              <w:rPr>
+                <w:color w:val="000000"/>
+                <w:sz w:val="21"/>
+              </w:rPr>
+              <w:t>国联证券</w:t>
+            </w:r>
+          </w:p>
+        </w:tc>
+        <w:tc>
+          <w:tcPr>
+            <w:tcW w:w="2353" w:type="dxa"/>
+          </w:tcPr>
+          <w:p>
+            <w:pPr>
+              <w:spacing w:after="40" w:line="276" w:lineRule="auto"/>
+            </w:pPr>
+            <w:r>
+              <w:rPr>
+                <w:color w:val="000000"/>
+                <w:sz w:val="21"/>
+              </w:rPr>
+              <w:t>国联民生</w:t>
+            </w:r>
+          </w:p>
+        </w:tc>
+        <w:tc>
+          <w:tcPr>
+            <w:tcW w:w="2353" w:type="dxa"/>
+          </w:tcPr>
+          <w:p>
+            <w:pPr>
+              <w:spacing w:after="40" w:line="276" w:lineRule="auto"/>
+            </w:pPr>
+            <w:r>
+              <w:rPr>
+                <w:color w:val="000000"/>
+                <w:sz w:val="21"/>
+              </w:rPr>
+              <w:t>2025</w:t>
+            </w:r>
+          </w:p>
+        </w:tc>
+        <w:tc>
+          <w:tcPr>
+            <w:tcW w:w="2353" w:type="dxa"/>
+          </w:tcPr>
+          <w:p>
+            <w:pPr>
+              <w:spacing w:after="40" w:line="276" w:lineRule="auto"/>
+            </w:pPr>
+            <w:r>
+              <w:rPr>
+                <w:color w:val="000000"/>
+                <w:sz w:val="21"/>
+              </w:rPr>
+              <w:t>合并；</w:t>
+            </w:r>
+            <w:r>
+              <w:rPr>
+                <w:color w:val="000000"/>
+                <w:sz w:val="21"/>
+              </w:rPr>
+              <w:t xml:space="preserve">iFinD </w:t>
+            </w:r>
+            <w:r>
+              <w:rPr>
+                <w:color w:val="000000"/>
+                <w:sz w:val="21"/>
+              </w:rPr>
+              <w:t>在</w:t>
+            </w:r>
+            <w:r>
+              <w:rPr>
+                <w:color w:val="000000"/>
+                <w:sz w:val="21"/>
+              </w:rPr>
+              <w:t xml:space="preserve"> 2022-2024 </w:t>
+            </w:r>
+            <w:r>
+              <w:rPr>
+                <w:color w:val="000000"/>
+                <w:sz w:val="21"/>
+              </w:rPr>
+              <w:t>提前用了新名</w:t>
+            </w:r>
+          </w:p>
+        </w:tc>
+      </w:tr>
+      <w:tr>
+        <w:trPr>
+          <w:cantSplit/>
+          <w:jc w:val="center"/>
+        </w:trPr>
+        <w:tc>
+          <w:tcPr>
+            <w:tcW w:w="2353" w:type="dxa"/>
+          </w:tcPr>
+          <w:p>
+            <w:pPr>
+              <w:spacing w:after="40" w:line="276" w:lineRule="auto"/>
+            </w:pPr>
+            <w:r>
+              <w:rPr>
+                <w:color w:val="000000"/>
+                <w:sz w:val="21"/>
+              </w:rPr>
+              <w:t>国泰君安</w:t>
+            </w:r>
+          </w:p>
+        </w:tc>
+        <w:tc>
+          <w:tcPr>
+            <w:tcW w:w="2353" w:type="dxa"/>
+          </w:tcPr>
+          <w:p>
+            <w:pPr>
+              <w:spacing w:after="40" w:line="276" w:lineRule="auto"/>
+            </w:pPr>
+            <w:r>
+              <w:rPr>
+                <w:color w:val="000000"/>
+                <w:sz w:val="21"/>
+              </w:rPr>
+              <w:t>国泰海通</w:t>
+            </w:r>
+          </w:p>
+        </w:tc>
+        <w:tc>
+          <w:tcPr>
+            <w:tcW w:w="2353" w:type="dxa"/>
+          </w:tcPr>
+          <w:p>
+            <w:pPr>
+              <w:spacing w:after="40" w:line="276" w:lineRule="auto"/>
+            </w:pPr>
+            <w:r>
+              <w:rPr>
+                <w:color w:val="000000"/>
+                <w:sz w:val="21"/>
+              </w:rPr>
+              <w:t>2025</w:t>
+            </w:r>
+          </w:p>
+        </w:tc>
+        <w:tc>
+          <w:tcPr>
+            <w:tcW w:w="2353" w:type="dxa"/>
+          </w:tcPr>
+          <w:p>
+            <w:pPr>
+              <w:spacing w:after="40" w:line="276" w:lineRule="auto"/>
+            </w:pPr>
+            <w:r>
+              <w:rPr>
+                <w:color w:val="000000"/>
+                <w:sz w:val="21"/>
+              </w:rPr>
+              <w:t xml:space="preserve">iFinD </w:t>
+            </w:r>
+            <w:r>
+              <w:rPr>
+                <w:color w:val="000000"/>
+                <w:sz w:val="21"/>
+              </w:rPr>
+              <w:t>在</w:t>
+            </w:r>
+            <w:r>
+              <w:rPr>
+                <w:color w:val="000000"/>
+                <w:sz w:val="21"/>
+              </w:rPr>
+              <w:t xml:space="preserve"> 2020-2024 </w:t>
+            </w:r>
+            <w:r>
+              <w:rPr>
+                <w:color w:val="000000"/>
+                <w:sz w:val="21"/>
+              </w:rPr>
+              <w:t>提前用了新名；</w:t>
+            </w:r>
+            <w:r>
+              <w:rPr>
+                <w:color w:val="000000"/>
+                <w:sz w:val="21"/>
+              </w:rPr>
+              <w:t xml:space="preserve">274 </w:t>
+            </w:r>
+            <w:r>
+              <w:rPr>
+                <w:color w:val="000000"/>
+                <w:sz w:val="21"/>
+              </w:rPr>
+              <w:t>行分析师全与国泰君安重合、与海通零重合</w:t>
+            </w:r>
+          </w:p>
+        </w:tc>
+      </w:tr>
+    </w:tbl>
+    <w:p>
+      <w:pPr>
+        <w:spacing w:after="0"/>
+      </w:pPr>
+    </w:p>
+    <w:p>
+      <w:r>
+        <w:rPr>
+          <w:color w:val="000000"/>
+        </w:rPr>
+        <w:t>稳定身份用</w:t>
+      </w:r>
+      <w:r>
+        <w:rPr>
+          <w:color w:val="000000"/>
+        </w:rPr>
+        <w:t xml:space="preserve"> </w:t>
+      </w:r>
+      <w:r>
+        <w:rPr>
+          <w:rFonts w:ascii="Consolas" w:hAnsi="Consolas"/>
+          <w:color w:val="000000"/>
+          <w:sz w:val="22"/>
+        </w:rPr>
+        <w:t>canonical_broker</w:t>
+      </w:r>
+      <w:r>
+        <w:rPr>
+          <w:color w:val="000000"/>
+        </w:rPr>
+        <w:t>，跨年汇总；展示用</w:t>
+      </w:r>
+      <w:r>
+        <w:rPr>
+          <w:color w:val="000000"/>
+        </w:rPr>
+        <w:t xml:space="preserve"> </w:t>
+      </w:r>
+      <w:r>
+        <w:rPr>
+          <w:rFonts w:ascii="Consolas" w:hAnsi="Consolas"/>
+          <w:color w:val="000000"/>
+          <w:sz w:val="22"/>
+        </w:rPr>
+        <w:t>broker_name_in_year</w:t>
+      </w:r>
+      <w:r>
+        <w:rPr>
+          <w:color w:val="000000"/>
+        </w:rPr>
+        <w:t>，按年份返回当时名称。</w:t>
       </w:r>
     </w:p>
     <w:p>
@@ -10517,7 +12100,7 @@
         <w:pStyle w:val="21"/>
         <w:spacing w:after="120"/>
       </w:pPr>
-      <w:bookmarkStart w:id="21" w:name="_Toc243224292"/>
+      <w:bookmarkStart w:id="21" w:name="_Toc243226857"/>
       <w:r>
         <w:rPr>
           <w:rFonts w:ascii="Times New Roman" w:eastAsia="黑体" w:hAnsi="Times New Roman"/>
@@ -10639,13 +12222,12 @@
         <w:pStyle w:val="21"/>
         <w:spacing w:after="120"/>
       </w:pPr>
-      <w:bookmarkStart w:id="22" w:name="_Toc243224293"/>
+      <w:bookmarkStart w:id="22" w:name="_Toc243226858"/>
       <w:r>
         <w:rPr>
           <w:rFonts w:ascii="Times New Roman" w:eastAsia="黑体" w:hAnsi="Times New Roman"/>
           <w:color w:val="000000"/>
         </w:rPr>
-        <w:lastRenderedPageBreak/>
         <w:t xml:space="preserve">7.5 </w:t>
       </w:r>
       <w:r>
@@ -10778,7 +12360,7 @@
         <w:pStyle w:val="21"/>
         <w:spacing w:after="120"/>
       </w:pPr>
-      <w:bookmarkStart w:id="23" w:name="_Toc243224294"/>
+      <w:bookmarkStart w:id="23" w:name="_Toc243226859"/>
       <w:r>
         <w:rPr>
           <w:rFonts w:ascii="Times New Roman" w:eastAsia="黑体" w:hAnsi="Times New Roman"/>
@@ -11014,7 +12596,7 @@
         <w:pStyle w:val="21"/>
         <w:spacing w:after="120"/>
       </w:pPr>
-      <w:bookmarkStart w:id="24" w:name="_Toc243224295"/>
+      <w:bookmarkStart w:id="24" w:name="_Toc243226860"/>
       <w:r>
         <w:rPr>
           <w:rFonts w:ascii="Times New Roman" w:eastAsia="黑体" w:hAnsi="Times New Roman"/>
@@ -11130,7 +12712,7 @@
         <w:pStyle w:val="21"/>
         <w:spacing w:after="120"/>
       </w:pPr>
-      <w:bookmarkStart w:id="25" w:name="_Toc243224296"/>
+      <w:bookmarkStart w:id="25" w:name="_Toc243226861"/>
       <w:r>
         <w:rPr>
           <w:rFonts w:ascii="Times New Roman" w:eastAsia="黑体" w:hAnsi="Times New Roman"/>
@@ -11460,7 +13042,7 @@
         <w:pStyle w:val="21"/>
         <w:spacing w:after="120"/>
       </w:pPr>
-      <w:bookmarkStart w:id="26" w:name="_Toc243224297"/>
+      <w:bookmarkStart w:id="26" w:name="_Toc243226862"/>
       <w:r>
         <w:rPr>
           <w:rFonts w:ascii="Times New Roman" w:eastAsia="黑体" w:hAnsi="Times New Roman"/>
@@ -11562,13 +13144,12 @@
         <w:pStyle w:val="21"/>
         <w:spacing w:after="120"/>
       </w:pPr>
-      <w:bookmarkStart w:id="27" w:name="_Toc243224298"/>
+      <w:bookmarkStart w:id="27" w:name="_Toc243226863"/>
       <w:r>
         <w:rPr>
           <w:rFonts w:ascii="Times New Roman" w:eastAsia="黑体" w:hAnsi="Times New Roman"/>
           <w:color w:val="000000"/>
         </w:rPr>
-        <w:lastRenderedPageBreak/>
         <w:t xml:space="preserve">7.10 ST </w:t>
       </w:r>
       <w:r>
@@ -11701,7 +13282,7 @@
         <w:pStyle w:val="21"/>
         <w:spacing w:after="120"/>
       </w:pPr>
-      <w:bookmarkStart w:id="28" w:name="_Toc243224299"/>
+      <w:bookmarkStart w:id="28" w:name="_Toc243226864"/>
       <w:r>
         <w:rPr>
           <w:rFonts w:ascii="Times New Roman" w:eastAsia="黑体" w:hAnsi="Times New Roman"/>
@@ -11769,7 +13350,7 @@
         <w:pStyle w:val="21"/>
         <w:spacing w:after="120"/>
       </w:pPr>
-      <w:bookmarkStart w:id="29" w:name="_Toc243224300"/>
+      <w:bookmarkStart w:id="29" w:name="_Toc243226865"/>
       <w:r>
         <w:rPr>
           <w:rFonts w:ascii="Times New Roman" w:eastAsia="黑体" w:hAnsi="Times New Roman"/>
@@ -11817,7 +13398,7 @@
         <w:pStyle w:val="21"/>
         <w:spacing w:after="120"/>
       </w:pPr>
-      <w:bookmarkStart w:id="30" w:name="_Toc243224301"/>
+      <w:bookmarkStart w:id="30" w:name="_Toc243226866"/>
       <w:r>
         <w:rPr>
           <w:rFonts w:ascii="Times New Roman" w:eastAsia="黑体" w:hAnsi="Times New Roman"/>
@@ -11981,7 +13562,7 @@
         <w:pStyle w:val="1"/>
         <w:spacing w:before="280" w:after="120"/>
       </w:pPr>
-      <w:bookmarkStart w:id="31" w:name="_Toc243224302"/>
+      <w:bookmarkStart w:id="31" w:name="_Toc243226867"/>
       <w:r>
         <w:rPr>
           <w:rFonts w:ascii="Times New Roman" w:eastAsia="黑体" w:hAnsi="Times New Roman"/>
@@ -12511,7 +14092,6 @@
         <w:rPr>
           <w:color w:val="000000"/>
         </w:rPr>
-        <w:lastRenderedPageBreak/>
         <w:t>口径细节：</w:t>
       </w:r>
     </w:p>
@@ -12780,7 +14360,7 @@
         <w:pStyle w:val="21"/>
         <w:spacing w:after="120"/>
       </w:pPr>
-      <w:bookmarkStart w:id="32" w:name="_Toc243224303"/>
+      <w:bookmarkStart w:id="32" w:name="_Toc243226868"/>
       <w:r>
         <w:rPr>
           <w:rFonts w:ascii="Times New Roman" w:eastAsia="黑体" w:hAnsi="Times New Roman"/>
@@ -13153,7 +14733,7 @@
                 <w:color w:val="000000"/>
                 <w:sz w:val="21"/>
               </w:rPr>
-              <w:t>+0.56pp</w:t>
+              <w:t>+0.55pp</w:t>
             </w:r>
           </w:p>
         </w:tc>
@@ -13170,7 +14750,7 @@
                 <w:color w:val="000000"/>
                 <w:sz w:val="21"/>
               </w:rPr>
-              <w:t>2.34</w:t>
+              <w:t>2.33</w:t>
             </w:r>
           </w:p>
         </w:tc>
@@ -13258,7 +14838,7 @@
                 <w:color w:val="000000"/>
                 <w:sz w:val="21"/>
               </w:rPr>
-              <w:t>+1.00pp</w:t>
+              <w:t>+0.99pp</w:t>
             </w:r>
           </w:p>
         </w:tc>
@@ -13275,7 +14855,7 @@
                 <w:color w:val="000000"/>
                 <w:sz w:val="21"/>
               </w:rPr>
-              <w:t>3.59</w:t>
+              <w:t>3.57</w:t>
             </w:r>
           </w:p>
         </w:tc>
@@ -13363,7 +14943,7 @@
                 <w:color w:val="000000"/>
                 <w:sz w:val="21"/>
               </w:rPr>
-              <w:t>+1.46pp</w:t>
+              <w:t>+1.47pp</w:t>
             </w:r>
           </w:p>
         </w:tc>
@@ -13380,7 +14960,7 @@
                 <w:color w:val="000000"/>
                 <w:sz w:val="21"/>
               </w:rPr>
-              <w:t>1.99</w:t>
+              <w:t>2.01</w:t>
             </w:r>
           </w:p>
         </w:tc>
@@ -13468,7 +15048,7 @@
                 <w:color w:val="000000"/>
                 <w:sz w:val="21"/>
               </w:rPr>
-              <w:t>+0.90pp</w:t>
+              <w:t>+0.88pp</w:t>
             </w:r>
           </w:p>
         </w:tc>
@@ -13485,7 +15065,7 @@
                 <w:color w:val="000000"/>
                 <w:sz w:val="21"/>
               </w:rPr>
-              <w:t>0.85</w:t>
+              <w:t>0.83</w:t>
             </w:r>
           </w:p>
         </w:tc>
@@ -13646,7 +15226,7 @@
         <w:rPr>
           <w:color w:val="000000"/>
         </w:rPr>
-        <w:t xml:space="preserve"> [-1,+1] +0.44</w:t>
+        <w:t xml:space="preserve"> [-1,+1] +0.43</w:t>
       </w:r>
       <w:r>
         <w:rPr>
@@ -13658,7 +15238,7 @@
         <w:rPr>
           <w:color w:val="000000"/>
         </w:rPr>
-        <w:t>t=2.53</w:t>
+        <w:t>t=2.52</w:t>
       </w:r>
       <w:r>
         <w:rPr>
@@ -13682,7 +15262,7 @@
         <w:rPr>
           <w:color w:val="000000"/>
         </w:rPr>
-        <w:t>t=2.61</w:t>
+        <w:t>t=2.60</w:t>
       </w:r>
       <w:r>
         <w:rPr>
@@ -13706,7 +15286,7 @@
         <w:rPr>
           <w:color w:val="000000"/>
         </w:rPr>
-        <w:t>t=3.85</w:t>
+        <w:t>t=3.83</w:t>
       </w:r>
       <w:r>
         <w:rPr>
@@ -13718,7 +15298,7 @@
         <w:rPr>
           <w:color w:val="000000"/>
         </w:rPr>
-        <w:t>[0,+120] +1.53</w:t>
+        <w:t>[0,+120] +1.54</w:t>
       </w:r>
       <w:r>
         <w:rPr>
@@ -13730,7 +15310,7 @@
         <w:rPr>
           <w:color w:val="000000"/>
         </w:rPr>
-        <w:t>t=2.09</w:t>
+        <w:t>t=2.10</w:t>
       </w:r>
       <w:r>
         <w:rPr>
@@ -13788,7 +15368,7 @@
         <w:pStyle w:val="21"/>
         <w:spacing w:after="120"/>
       </w:pPr>
-      <w:bookmarkStart w:id="33" w:name="_Toc243224304"/>
+      <w:bookmarkStart w:id="33" w:name="_Toc243226869"/>
       <w:r>
         <w:rPr>
           <w:rFonts w:ascii="Times New Roman" w:eastAsia="黑体" w:hAnsi="Times New Roman"/>
@@ -13945,7 +15525,6 @@
                 <w:color w:val="000000"/>
                 <w:sz w:val="21"/>
               </w:rPr>
-              <w:lastRenderedPageBreak/>
               <w:t xml:space="preserve">+2 </w:t>
             </w:r>
             <w:r>
@@ -13984,7 +15563,7 @@
                 <w:color w:val="000000"/>
                 <w:sz w:val="21"/>
               </w:rPr>
-              <w:t>0.03</w:t>
+              <w:t>0.02</w:t>
             </w:r>
             <w:r>
               <w:rPr>
@@ -13998,7 +15577,7 @@
                 <w:color w:val="000000"/>
                 <w:sz w:val="21"/>
               </w:rPr>
-              <w:t>p=0.96</w:t>
+              <w:t>p=0.98</w:t>
             </w:r>
             <w:r>
               <w:rPr>
@@ -14109,7 +15688,7 @@
                 <w:color w:val="000000"/>
                 <w:sz w:val="21"/>
               </w:rPr>
-              <w:t>+1.07</w:t>
+              <w:t>+1.08</w:t>
             </w:r>
             <w:r>
               <w:rPr>
@@ -14229,7 +15808,7 @@
                 <w:color w:val="000000"/>
                 <w:sz w:val="21"/>
               </w:rPr>
-              <w:t>+0.47</w:t>
+              <w:t>+0.45</w:t>
             </w:r>
             <w:r>
               <w:rPr>
@@ -14243,7 +15822,7 @@
                 <w:color w:val="000000"/>
                 <w:sz w:val="21"/>
               </w:rPr>
-              <w:t>p=0.65</w:t>
+              <w:t>p=0.67</w:t>
             </w:r>
             <w:r>
               <w:rPr>
@@ -14561,7 +16140,7 @@
                 <w:color w:val="000000"/>
                 <w:sz w:val="21"/>
               </w:rPr>
-              <w:t>+3.54</w:t>
+              <w:t>+3.55</w:t>
             </w:r>
           </w:p>
         </w:tc>
@@ -14595,7 +16174,7 @@
                 <w:color w:val="000000"/>
                 <w:sz w:val="21"/>
               </w:rPr>
-              <w:t>+0.46</w:t>
+              <w:t>+0.47</w:t>
             </w:r>
             <w:r>
               <w:rPr>
@@ -14609,7 +16188,7 @@
                 <w:color w:val="000000"/>
                 <w:sz w:val="21"/>
               </w:rPr>
-              <w:t>p=0.42</w:t>
+              <w:t>p=0.41</w:t>
             </w:r>
             <w:r>
               <w:rPr>
@@ -14746,7 +16325,7 @@
                 <w:color w:val="000000"/>
                 <w:sz w:val="21"/>
               </w:rPr>
-              <w:t>+6.52</w:t>
+              <w:t>+6.53</w:t>
             </w:r>
           </w:p>
         </w:tc>
@@ -14781,7 +16360,7 @@
                 <w:color w:val="000000"/>
                 <w:sz w:val="21"/>
               </w:rPr>
-              <w:t>+1.60</w:t>
+              <w:t>+1.61</w:t>
             </w:r>
             <w:r>
               <w:rPr>
@@ -14797,7 +16376,7 @@
                 <w:color w:val="000000"/>
                 <w:sz w:val="21"/>
               </w:rPr>
-              <w:t>p=0.037</w:t>
+              <w:t>p=0.035</w:t>
             </w:r>
             <w:r>
               <w:rPr>
@@ -14938,7 +16517,7 @@
                 <w:color w:val="000000"/>
                 <w:sz w:val="21"/>
               </w:rPr>
-              <w:t>+9.26</w:t>
+              <w:t>+9.24</w:t>
             </w:r>
           </w:p>
         </w:tc>
@@ -14955,7 +16534,7 @@
                 <w:color w:val="000000"/>
                 <w:sz w:val="21"/>
               </w:rPr>
-              <w:t>+8.34</w:t>
+              <w:t>+8.35</w:t>
             </w:r>
           </w:p>
         </w:tc>
@@ -14972,7 +16551,7 @@
                 <w:color w:val="000000"/>
                 <w:sz w:val="21"/>
               </w:rPr>
-              <w:t>+0.92</w:t>
+              <w:t>+0.89</w:t>
             </w:r>
             <w:r>
               <w:rPr>
@@ -14986,7 +16565,7 @@
                 <w:color w:val="000000"/>
                 <w:sz w:val="21"/>
               </w:rPr>
-              <w:t>p=0.39</w:t>
+              <w:t>p=0.40</w:t>
             </w:r>
             <w:r>
               <w:rPr>
@@ -15120,7 +16699,7 @@
         <w:rPr>
           <w:color w:val="000000"/>
         </w:rPr>
-        <w:t xml:space="preserve"> 56.0% </w:t>
+        <w:t xml:space="preserve"> 56.1% </w:t>
       </w:r>
       <w:r>
         <w:rPr>
@@ -15274,7 +16853,7 @@
         <w:pStyle w:val="21"/>
         <w:spacing w:after="120"/>
       </w:pPr>
-      <w:bookmarkStart w:id="34" w:name="_Toc243224305"/>
+      <w:bookmarkStart w:id="34" w:name="_Toc243226870"/>
       <w:r>
         <w:rPr>
           <w:rFonts w:ascii="Times New Roman" w:eastAsia="黑体" w:hAnsi="Times New Roman"/>
@@ -15316,7 +16895,7 @@
         <w:rPr>
           <w:color w:val="000000"/>
         </w:rPr>
-        <w:t xml:space="preserve"> 20,236 </w:t>
+        <w:t xml:space="preserve"> 20,246 </w:t>
       </w:r>
       <w:r>
         <w:rPr>
@@ -15352,7 +16931,7 @@
         <w:rPr>
           <w:color w:val="000000"/>
         </w:rPr>
-        <w:t xml:space="preserve"> 20,055 </w:t>
+        <w:t xml:space="preserve"> 20,065 </w:t>
       </w:r>
       <w:r>
         <w:rPr>
@@ -15364,7 +16943,7 @@
         <w:rPr>
           <w:color w:val="000000"/>
         </w:rPr>
-        <w:t xml:space="preserve"> 17,020 </w:t>
+        <w:t xml:space="preserve"> 17,024 </w:t>
       </w:r>
       <w:r>
         <w:rPr>
@@ -15886,7 +17465,7 @@
                 <w:color w:val="000000"/>
                 <w:sz w:val="21"/>
               </w:rPr>
-              <w:t>+0.41</w:t>
+              <w:t>+0.40</w:t>
             </w:r>
             <w:r>
               <w:rPr>
@@ -15902,7 +17481,7 @@
                 <w:color w:val="000000"/>
                 <w:sz w:val="21"/>
               </w:rPr>
-              <w:t>p=0.013</w:t>
+              <w:t>p=0.014</w:t>
             </w:r>
             <w:r>
               <w:rPr>
@@ -16074,7 +17653,7 @@
                 <w:color w:val="000000"/>
                 <w:sz w:val="21"/>
               </w:rPr>
-              <w:t>p=0.11</w:t>
+              <w:t>p=0.12</w:t>
             </w:r>
             <w:r>
               <w:rPr>
@@ -16169,14 +17748,7 @@
         <w:rPr>
           <w:color w:val="000000"/>
         </w:rPr>
-        <w:t>明星的绝对预测误差更大，且四个格子都显著；符号误差没有显著差异，说明不是更乐观，而是偏差更大。一个不能忽略的解释是覆盖股票本身更难、预测更激进，属于未控制的选</w:t>
-      </w:r>
-      <w:r>
-        <w:rPr>
-          <w:color w:val="000000"/>
-        </w:rPr>
-        <w:lastRenderedPageBreak/>
-        <w:t>择差异，因此不能直接把这项读成</w:t>
+        <w:t>明星的绝对预测误差更大，且四个格子都显著；符号误差没有显著差异，说明不是更乐观，而是偏差更大。一个不能忽略的解释是覆盖股票本身更难、预测更激进，属于未控制的选择差异，因此不能直接把这项读成</w:t>
       </w:r>
       <w:r>
         <w:rPr>
@@ -16208,7 +17780,7 @@
         <w:pStyle w:val="21"/>
         <w:spacing w:after="120"/>
       </w:pPr>
-      <w:bookmarkStart w:id="35" w:name="_Toc243224306"/>
+      <w:bookmarkStart w:id="35" w:name="_Toc243226871"/>
       <w:r>
         <w:rPr>
           <w:rFonts w:ascii="Times New Roman" w:eastAsia="黑体" w:hAnsi="Times New Roman"/>
@@ -16517,7 +18089,7 @@
                 <w:color w:val="000000"/>
                 <w:sz w:val="21"/>
               </w:rPr>
-              <w:t>0.30</w:t>
+              <w:t>0.29</w:t>
             </w:r>
             <w:r>
               <w:rPr>
@@ -16531,7 +18103,7 @@
                 <w:color w:val="000000"/>
                 <w:sz w:val="21"/>
               </w:rPr>
-              <w:t>p=0.190</w:t>
+              <w:t>p=0.191</w:t>
             </w:r>
             <w:r>
               <w:rPr>
@@ -16918,7 +18490,7 @@
                 <w:color w:val="000000"/>
                 <w:sz w:val="21"/>
               </w:rPr>
-              <w:t>+1.12</w:t>
+              <w:t>+1.14</w:t>
             </w:r>
             <w:r>
               <w:rPr>
@@ -16932,7 +18504,7 @@
                 <w:color w:val="000000"/>
                 <w:sz w:val="21"/>
               </w:rPr>
-              <w:t>p=0.103</w:t>
+              <w:t>p=0.098</w:t>
             </w:r>
             <w:r>
               <w:rPr>
@@ -16963,7 +18535,7 @@
                 <w:color w:val="000000"/>
                 <w:sz w:val="21"/>
               </w:rPr>
-              <w:t>1.59</w:t>
+              <w:t>1.60</w:t>
             </w:r>
             <w:r>
               <w:rPr>
@@ -16977,7 +18549,7 @@
                 <w:color w:val="000000"/>
                 <w:sz w:val="21"/>
               </w:rPr>
-              <w:t>p=0.091</w:t>
+              <w:t>p=0.088</w:t>
             </w:r>
             <w:r>
               <w:rPr>
@@ -17063,7 +18635,7 @@
         <w:rPr>
           <w:color w:val="000000"/>
         </w:rPr>
-        <w:t xml:space="preserve"> 4 </w:t>
+        <w:t xml:space="preserve"> 2 </w:t>
       </w:r>
       <w:r>
         <w:rPr>
@@ -17268,7 +18840,7 @@
                 <w:color w:val="000000"/>
                 <w:sz w:val="21"/>
               </w:rPr>
-              <w:t>+0.43</w:t>
+              <w:t>+0.55</w:t>
             </w:r>
             <w:r>
               <w:rPr>
@@ -17282,7 +18854,7 @@
                 <w:color w:val="000000"/>
                 <w:sz w:val="21"/>
               </w:rPr>
-              <w:t>p=0.061</w:t>
+              <w:t>p=0.016</w:t>
             </w:r>
             <w:r>
               <w:rPr>
@@ -17313,7 +18885,7 @@
                 <w:color w:val="000000"/>
                 <w:sz w:val="21"/>
               </w:rPr>
-              <w:t>0.29</w:t>
+              <w:t>0.63</w:t>
             </w:r>
             <w:r>
               <w:rPr>
@@ -17327,7 +18899,7 @@
                 <w:color w:val="000000"/>
                 <w:sz w:val="21"/>
               </w:rPr>
-              <w:t>p=0.417</w:t>
+              <w:t>p=0.070</w:t>
             </w:r>
             <w:r>
               <w:rPr>
@@ -17351,7 +18923,14 @@
                 <w:color w:val="000000"/>
                 <w:sz w:val="21"/>
               </w:rPr>
-              <w:t>+0.14</w:t>
+              <w:t>−</w:t>
+            </w:r>
+            <w:r>
+              <w:rPr>
+                <w:color w:val="000000"/>
+                <w:sz w:val="21"/>
+              </w:rPr>
+              <w:t>0.08</w:t>
             </w:r>
             <w:r>
               <w:rPr>
@@ -17365,7 +18944,7 @@
                 <w:color w:val="000000"/>
                 <w:sz w:val="21"/>
               </w:rPr>
-              <w:t>p=0.623</w:t>
+              <w:t>p=0.764</w:t>
             </w:r>
             <w:r>
               <w:rPr>
@@ -17429,7 +19008,7 @@
                 <w:color w:val="000000"/>
                 <w:sz w:val="21"/>
               </w:rPr>
-              <w:t>+0.067</w:t>
+              <w:t>+0.063</w:t>
             </w:r>
             <w:r>
               <w:rPr>
@@ -17443,7 +19022,7 @@
                 <w:color w:val="000000"/>
                 <w:sz w:val="21"/>
               </w:rPr>
-              <w:t>p=0.008</w:t>
+              <w:t>p=0.013</w:t>
             </w:r>
             <w:r>
               <w:rPr>
@@ -17474,7 +19053,7 @@
                 <w:color w:val="000000"/>
                 <w:sz w:val="21"/>
               </w:rPr>
-              <w:t>0.054</w:t>
+              <w:t>0.043</w:t>
             </w:r>
             <w:r>
               <w:rPr>
@@ -17488,7 +19067,7 @@
                 <w:color w:val="000000"/>
                 <w:sz w:val="21"/>
               </w:rPr>
-              <w:t>p=0.147</w:t>
+              <w:t>p=0.249</w:t>
             </w:r>
             <w:r>
               <w:rPr>
@@ -17512,7 +19091,7 @@
                 <w:color w:val="000000"/>
                 <w:sz w:val="21"/>
               </w:rPr>
-              <w:t>+0.013</w:t>
+              <w:t>+0.021</w:t>
             </w:r>
             <w:r>
               <w:rPr>
@@ -17526,7 +19105,7 @@
                 <w:color w:val="000000"/>
                 <w:sz w:val="21"/>
               </w:rPr>
-              <w:t>p=0.644</w:t>
+              <w:t>p=0.465</w:t>
             </w:r>
             <w:r>
               <w:rPr>
@@ -17597,7 +19176,7 @@
                 <w:color w:val="000000"/>
                 <w:sz w:val="21"/>
               </w:rPr>
-              <w:t>0.08</w:t>
+              <w:t>0.14</w:t>
             </w:r>
             <w:r>
               <w:rPr>
@@ -17611,7 +19190,7 @@
                 <w:color w:val="000000"/>
                 <w:sz w:val="21"/>
               </w:rPr>
-              <w:t>p=0.726</w:t>
+              <w:t>p=0.534</w:t>
             </w:r>
             <w:r>
               <w:rPr>
@@ -17635,7 +19214,7 @@
                 <w:color w:val="000000"/>
                 <w:sz w:val="21"/>
               </w:rPr>
-              <w:t>+0.61</w:t>
+              <w:t>+0.77</w:t>
             </w:r>
             <w:r>
               <w:rPr>
@@ -17649,7 +19228,7 @@
                 <w:color w:val="000000"/>
                 <w:sz w:val="21"/>
               </w:rPr>
-              <w:t>p=0.064</w:t>
+              <w:t>p=0.017</w:t>
             </w:r>
             <w:r>
               <w:rPr>
@@ -17673,7 +19252,7 @@
                 <w:color w:val="000000"/>
                 <w:sz w:val="21"/>
               </w:rPr>
-              <w:t>+0.53</w:t>
+              <w:t>+0.62</w:t>
             </w:r>
             <w:r>
               <w:rPr>
@@ -17687,7 +19266,7 @@
                 <w:color w:val="000000"/>
                 <w:sz w:val="21"/>
               </w:rPr>
-              <w:t>p=0.024</w:t>
+              <w:t>p=0.007</w:t>
             </w:r>
             <w:r>
               <w:rPr>
@@ -17710,7 +19289,43 @@
         <w:rPr>
           <w:color w:val="000000"/>
         </w:rPr>
-        <w:t>读法：上调的明星溢价集中在头部券商，但头部与中部的差异在统计上不显著；下调侧的层级结果符号相反，且只在边际显著。</w:t>
+        <w:t>读法：上调的明星溢价集中在头部券商，头部与中部的差异边际显著（</w:t>
+      </w:r>
+      <w:r>
+        <w:rPr>
+          <w:color w:val="000000"/>
+        </w:rPr>
+        <w:t>p=0.070</w:t>
+      </w:r>
+      <w:r>
+        <w:rPr>
+          <w:color w:val="000000"/>
+        </w:rPr>
+        <w:t>），中部总效应为负且不显著。下调侧，中部券商的明星事件相对回报更高（</w:t>
+      </w:r>
+      <w:r>
+        <w:rPr>
+          <w:color w:val="000000"/>
+        </w:rPr>
+        <w:t>+0.62</w:t>
+      </w:r>
+      <w:r>
+        <w:rPr>
+          <w:color w:val="000000"/>
+        </w:rPr>
+        <w:t>，</w:t>
+      </w:r>
+      <w:r>
+        <w:rPr>
+          <w:color w:val="000000"/>
+        </w:rPr>
+        <w:t>p=0.007</w:t>
+      </w:r>
+      <w:r>
+        <w:rPr>
+          <w:color w:val="000000"/>
+        </w:rPr>
+        <w:t>），头部没有差异；符号与上调侧相反，解释要谨慎。</w:t>
       </w:r>
       <w:r>
         <w:rPr>
@@ -17723,6 +19338,50 @@
           <w:color w:val="000000"/>
         </w:rPr>
         <w:t>与层级高度共线，不能把层级当成独立因果变量。中小层级无法估计，写进局限。</w:t>
+      </w:r>
+    </w:p>
+    <w:p>
+      <w:r>
+        <w:rPr>
+          <w:color w:val="000000"/>
+        </w:rPr>
+        <w:t>滚动层级稳健性：用</w:t>
+      </w:r>
+      <w:r>
+        <w:rPr>
+          <w:color w:val="000000"/>
+        </w:rPr>
+        <w:t xml:space="preserve"> t-3 </w:t>
+      </w:r>
+      <w:r>
+        <w:rPr>
+          <w:color w:val="000000"/>
+        </w:rPr>
+        <w:t>至</w:t>
+      </w:r>
+      <w:r>
+        <w:rPr>
+          <w:color w:val="000000"/>
+        </w:rPr>
+        <w:t xml:space="preserve"> t-1 </w:t>
+      </w:r>
+      <w:r>
+        <w:rPr>
+          <w:color w:val="000000"/>
+        </w:rPr>
+        <w:t>的事前记录重排层级后，不对称结论不变，但层级项的显著性不稳定，详见</w:t>
+      </w:r>
+      <w:r>
+        <w:rPr>
+          <w:color w:val="000000"/>
+        </w:rPr>
+        <w:t xml:space="preserve"> 6.3</w:t>
+      </w:r>
+      <w:r>
+        <w:rPr>
+          <w:color w:val="000000"/>
+        </w:rPr>
+        <w:t>。这一项说明层级结果对测量方式敏感，报告中应放在稳健性或讨论，而不是主结果。</w:t>
       </w:r>
     </w:p>
     <w:p>
@@ -17730,7 +19389,7 @@
         <w:pStyle w:val="1"/>
         <w:spacing w:before="280" w:after="120"/>
       </w:pPr>
-      <w:bookmarkStart w:id="36" w:name="_Toc243224307"/>
+      <w:bookmarkStart w:id="36" w:name="_Toc243226872"/>
       <w:r>
         <w:rPr>
           <w:rFonts w:ascii="Times New Roman" w:eastAsia="黑体" w:hAnsi="Times New Roman"/>
@@ -17972,7 +19631,6 @@
           <w:color w:val="000000"/>
           <w:sz w:val="22"/>
         </w:rPr>
-        <w:lastRenderedPageBreak/>
         <w:t>event_study_</w:t>
       </w:r>
       <w:r>
@@ -18111,7 +19769,7 @@
         <w:pStyle w:val="21"/>
         <w:spacing w:after="120"/>
       </w:pPr>
-      <w:bookmarkStart w:id="37" w:name="_Toc243224308"/>
+      <w:bookmarkStart w:id="37" w:name="_Toc243226873"/>
       <w:r>
         <w:rPr>
           <w:rFonts w:ascii="Times New Roman" w:eastAsia="黑体" w:hAnsi="Times New Roman"/>
@@ -19067,7 +20725,7 @@
         <w:pStyle w:val="1"/>
         <w:spacing w:before="280" w:after="120"/>
       </w:pPr>
-      <w:bookmarkStart w:id="38" w:name="_Toc243224309"/>
+      <w:bookmarkStart w:id="38" w:name="_Toc243226874"/>
       <w:r>
         <w:rPr>
           <w:rFonts w:ascii="Times New Roman" w:eastAsia="黑体" w:hAnsi="Times New Roman"/>
@@ -19173,7 +20831,6 @@
         <w:rPr>
           <w:color w:val="000000"/>
         </w:rPr>
-        <w:lastRenderedPageBreak/>
         <w:t xml:space="preserve">4. </w:t>
       </w:r>
       <w:r>
@@ -19356,7 +21013,7 @@
         <w:pStyle w:val="1"/>
         <w:spacing w:before="280" w:after="120"/>
       </w:pPr>
-      <w:bookmarkStart w:id="39" w:name="_Toc243224310"/>
+      <w:bookmarkStart w:id="39" w:name="_Toc243226875"/>
       <w:r>
         <w:rPr>
           <w:rFonts w:ascii="Times New Roman" w:eastAsia="黑体" w:hAnsi="Times New Roman"/>
@@ -20112,31 +21769,31 @@
       </w:rPr>
     </w:lvl>
   </w:abstractNum>
-  <w:num w:numId="1" w16cid:durableId="529346267">
+  <w:num w:numId="1" w16cid:durableId="219638505">
     <w:abstractNumId w:val="8"/>
   </w:num>
-  <w:num w:numId="2" w16cid:durableId="692002375">
+  <w:num w:numId="2" w16cid:durableId="382096913">
     <w:abstractNumId w:val="6"/>
   </w:num>
-  <w:num w:numId="3" w16cid:durableId="2037267029">
+  <w:num w:numId="3" w16cid:durableId="651447160">
     <w:abstractNumId w:val="5"/>
   </w:num>
-  <w:num w:numId="4" w16cid:durableId="1563170887">
+  <w:num w:numId="4" w16cid:durableId="1035229352">
     <w:abstractNumId w:val="4"/>
   </w:num>
-  <w:num w:numId="5" w16cid:durableId="759840196">
+  <w:num w:numId="5" w16cid:durableId="1267998730">
     <w:abstractNumId w:val="7"/>
   </w:num>
-  <w:num w:numId="6" w16cid:durableId="538511809">
+  <w:num w:numId="6" w16cid:durableId="2121483951">
     <w:abstractNumId w:val="3"/>
   </w:num>
-  <w:num w:numId="7" w16cid:durableId="827399036">
+  <w:num w:numId="7" w16cid:durableId="299766558">
     <w:abstractNumId w:val="2"/>
   </w:num>
-  <w:num w:numId="8" w16cid:durableId="1470635309">
+  <w:num w:numId="8" w16cid:durableId="250237410">
     <w:abstractNumId w:val="1"/>
   </w:num>
-  <w:num w:numId="9" w16cid:durableId="1095247953">
+  <w:num w:numId="9" w16cid:durableId="1107315364">
     <w:abstractNumId w:val="0"/>
   </w:num>
 </w:numbering>
@@ -31535,7 +33192,7 @@
     <w:autoRedefine/>
     <w:uiPriority w:val="39"/>
     <w:unhideWhenUsed/>
-    <w:rsid w:val="00962284"/>
+    <w:rsid w:val="00473B39"/>
   </w:style>
   <w:style w:type="paragraph" w:styleId="TOC2">
     <w:name w:val="toc 2"/>
@@ -31544,7 +33201,7 @@
     <w:autoRedefine/>
     <w:uiPriority w:val="39"/>
     <w:unhideWhenUsed/>
-    <w:rsid w:val="00962284"/>
+    <w:rsid w:val="00473B39"/>
     <w:pPr>
       <w:ind w:leftChars="200" w:left="420"/>
     </w:pPr>
@@ -31554,7 +33211,7 @@
     <w:basedOn w:val="a2"/>
     <w:uiPriority w:val="99"/>
     <w:unhideWhenUsed/>
-    <w:rsid w:val="00962284"/>
+    <w:rsid w:val="00473B39"/>
     <w:rPr>
       <w:color w:val="0000FF" w:themeColor="hyperlink"/>
       <w:u w:val="single"/>

</xml_diff>

<commit_message>
Use sample-period broker identities and explain suspension handling
Stable identities now keep the name in force at the start of the sample, so a 2018
Guotai Junan record is never written as Guotai Haitong; later names are display-only.
The memo also explains suspension days in plain language: keep the slot, record a
missing return, and require 80% valid observations before reporting a CAR.

Co-Authored-By: Claude Code <noreply@anthropic.com>
</commit_message>
<xml_diff>
--- a/文档/项目进度与技术备忘_20261018.docx
+++ b/文档/项目进度与技术备忘_20261018.docx
@@ -118,7 +118,7 @@
         </w:rPr>
         <w:fldChar w:fldCharType="separate"/>
       </w:r>
-      <w:hyperlink w:anchor="_Toc243226836" w:history="1">
+      <w:hyperlink w:anchor="_Toc243227542" w:history="1">
         <w:r>
           <w:rPr>
             <w:rStyle w:val="aff9"/>
@@ -180,7 +180,7 @@
             <w:noProof/>
             <w:webHidden/>
           </w:rPr>
-          <w:instrText>PAGEREF _Toc243226836 \h</w:instrText>
+          <w:instrText>PAGEREF _Toc243227542 \h</w:instrText>
         </w:r>
         <w:r>
           <w:rPr>
@@ -238,7 +238,7 @@
           <w14:ligatures w14:val="standardContextual"/>
         </w:rPr>
       </w:pPr>
-      <w:hyperlink w:anchor="_Toc243226837" w:history="1">
+      <w:hyperlink w:anchor="_Toc243227543" w:history="1">
         <w:r>
           <w:rPr>
             <w:rStyle w:val="aff9"/>
@@ -284,7 +284,7 @@
             <w:noProof/>
             <w:webHidden/>
           </w:rPr>
-          <w:instrText>PAGEREF _Toc243226837 \h</w:instrText>
+          <w:instrText>PAGEREF _Toc243227543 \h</w:instrText>
         </w:r>
         <w:r>
           <w:rPr>
@@ -343,7 +343,7 @@
           <w14:ligatures w14:val="standardContextual"/>
         </w:rPr>
       </w:pPr>
-      <w:hyperlink w:anchor="_Toc243226838" w:history="1">
+      <w:hyperlink w:anchor="_Toc243227544" w:history="1">
         <w:r>
           <w:rPr>
             <w:rStyle w:val="aff9"/>
@@ -389,7 +389,7 @@
             <w:noProof/>
             <w:webHidden/>
           </w:rPr>
-          <w:instrText>PAGEREF _Toc243226838 \h</w:instrText>
+          <w:instrText>PAGEREF _Toc243227544 \h</w:instrText>
         </w:r>
         <w:r>
           <w:rPr>
@@ -448,7 +448,7 @@
           <w14:ligatures w14:val="standardContextual"/>
         </w:rPr>
       </w:pPr>
-      <w:hyperlink w:anchor="_Toc243226839" w:history="1">
+      <w:hyperlink w:anchor="_Toc243227545" w:history="1">
         <w:r>
           <w:rPr>
             <w:rStyle w:val="aff9"/>
@@ -494,7 +494,7 @@
             <w:noProof/>
             <w:webHidden/>
           </w:rPr>
-          <w:instrText>PAGEREF _Toc243226839 \h</w:instrText>
+          <w:instrText>PAGEREF _Toc243227545 \h</w:instrText>
         </w:r>
         <w:r>
           <w:rPr>
@@ -553,7 +553,7 @@
           <w14:ligatures w14:val="standardContextual"/>
         </w:rPr>
       </w:pPr>
-      <w:hyperlink w:anchor="_Toc243226840" w:history="1">
+      <w:hyperlink w:anchor="_Toc243227546" w:history="1">
         <w:r>
           <w:rPr>
             <w:rStyle w:val="aff9"/>
@@ -599,7 +599,7 @@
             <w:noProof/>
             <w:webHidden/>
           </w:rPr>
-          <w:instrText>PAGEREF _Toc243226840 \h</w:instrText>
+          <w:instrText>PAGEREF _Toc243227546 \h</w:instrText>
         </w:r>
         <w:r>
           <w:rPr>
@@ -658,7 +658,7 @@
           <w14:ligatures w14:val="standardContextual"/>
         </w:rPr>
       </w:pPr>
-      <w:hyperlink w:anchor="_Toc243226841" w:history="1">
+      <w:hyperlink w:anchor="_Toc243227547" w:history="1">
         <w:r>
           <w:rPr>
             <w:rStyle w:val="aff9"/>
@@ -704,7 +704,7 @@
             <w:noProof/>
             <w:webHidden/>
           </w:rPr>
-          <w:instrText>PAGEREF _Toc243226841 \h</w:instrText>
+          <w:instrText>PAGEREF _Toc243227547 \h</w:instrText>
         </w:r>
         <w:r>
           <w:rPr>
@@ -763,7 +763,7 @@
           <w14:ligatures w14:val="standardContextual"/>
         </w:rPr>
       </w:pPr>
-      <w:hyperlink w:anchor="_Toc243226842" w:history="1">
+      <w:hyperlink w:anchor="_Toc243227548" w:history="1">
         <w:r>
           <w:rPr>
             <w:rStyle w:val="aff9"/>
@@ -809,7 +809,7 @@
             <w:noProof/>
             <w:webHidden/>
           </w:rPr>
-          <w:instrText>PAGEREF _Toc243226842 \h</w:instrText>
+          <w:instrText>PAGEREF _Toc243227548 \h</w:instrText>
         </w:r>
         <w:r>
           <w:rPr>
@@ -868,7 +868,7 @@
           <w14:ligatures w14:val="standardContextual"/>
         </w:rPr>
       </w:pPr>
-      <w:hyperlink w:anchor="_Toc243226843" w:history="1">
+      <w:hyperlink w:anchor="_Toc243227549" w:history="1">
         <w:r>
           <w:rPr>
             <w:rStyle w:val="aff9"/>
@@ -914,7 +914,7 @@
             <w:noProof/>
             <w:webHidden/>
           </w:rPr>
-          <w:instrText>PAGEREF _Toc243226843 \h</w:instrText>
+          <w:instrText>PAGEREF _Toc243227549 \h</w:instrText>
         </w:r>
         <w:r>
           <w:rPr>
@@ -973,7 +973,7 @@
           <w14:ligatures w14:val="standardContextual"/>
         </w:rPr>
       </w:pPr>
-      <w:hyperlink w:anchor="_Toc243226844" w:history="1">
+      <w:hyperlink w:anchor="_Toc243227550" w:history="1">
         <w:r>
           <w:rPr>
             <w:rStyle w:val="aff9"/>
@@ -1019,7 +1019,7 @@
             <w:noProof/>
             <w:webHidden/>
           </w:rPr>
-          <w:instrText>PAGEREF _Toc243226844 \h</w:instrText>
+          <w:instrText>PAGEREF _Toc243227550 \h</w:instrText>
         </w:r>
         <w:r>
           <w:rPr>
@@ -1077,7 +1077,7 @@
           <w14:ligatures w14:val="standardContextual"/>
         </w:rPr>
       </w:pPr>
-      <w:hyperlink w:anchor="_Toc243226845" w:history="1">
+      <w:hyperlink w:anchor="_Toc243227551" w:history="1">
         <w:r>
           <w:rPr>
             <w:rStyle w:val="aff9"/>
@@ -1123,7 +1123,7 @@
             <w:noProof/>
             <w:webHidden/>
           </w:rPr>
-          <w:instrText>PAGEREF _Toc243226845 \h</w:instrText>
+          <w:instrText>PAGEREF _Toc243227551 \h</w:instrText>
         </w:r>
         <w:r>
           <w:rPr>
@@ -1181,7 +1181,7 @@
           <w14:ligatures w14:val="standardContextual"/>
         </w:rPr>
       </w:pPr>
-      <w:hyperlink w:anchor="_Toc243226846" w:history="1">
+      <w:hyperlink w:anchor="_Toc243227552" w:history="1">
         <w:r>
           <w:rPr>
             <w:rStyle w:val="aff9"/>
@@ -1227,7 +1227,7 @@
             <w:noProof/>
             <w:webHidden/>
           </w:rPr>
-          <w:instrText>PAGEREF _Toc243226846 \h</w:instrText>
+          <w:instrText>PAGEREF _Toc243227552 \h</w:instrText>
         </w:r>
         <w:r>
           <w:rPr>
@@ -1285,7 +1285,7 @@
           <w14:ligatures w14:val="standardContextual"/>
         </w:rPr>
       </w:pPr>
-      <w:hyperlink w:anchor="_Toc243226847" w:history="1">
+      <w:hyperlink w:anchor="_Toc243227553" w:history="1">
         <w:r>
           <w:rPr>
             <w:rStyle w:val="aff9"/>
@@ -1331,7 +1331,7 @@
             <w:noProof/>
             <w:webHidden/>
           </w:rPr>
-          <w:instrText>PAGEREF _Toc243226847 \h</w:instrText>
+          <w:instrText>PAGEREF _Toc243227553 \h</w:instrText>
         </w:r>
         <w:r>
           <w:rPr>
@@ -1389,7 +1389,7 @@
           <w14:ligatures w14:val="standardContextual"/>
         </w:rPr>
       </w:pPr>
-      <w:hyperlink w:anchor="_Toc243226848" w:history="1">
+      <w:hyperlink w:anchor="_Toc243227554" w:history="1">
         <w:r>
           <w:rPr>
             <w:rStyle w:val="aff9"/>
@@ -1435,7 +1435,7 @@
             <w:noProof/>
             <w:webHidden/>
           </w:rPr>
-          <w:instrText>PAGEREF _Toc243226848 \h</w:instrText>
+          <w:instrText>PAGEREF _Toc243227554 \h</w:instrText>
         </w:r>
         <w:r>
           <w:rPr>
@@ -1493,7 +1493,7 @@
           <w14:ligatures w14:val="standardContextual"/>
         </w:rPr>
       </w:pPr>
-      <w:hyperlink w:anchor="_Toc243226849" w:history="1">
+      <w:hyperlink w:anchor="_Toc243227555" w:history="1">
         <w:r>
           <w:rPr>
             <w:rStyle w:val="aff9"/>
@@ -1539,7 +1539,7 @@
             <w:noProof/>
             <w:webHidden/>
           </w:rPr>
-          <w:instrText>PAGEREF _Toc243226849 \h</w:instrText>
+          <w:instrText>PAGEREF _Toc243227555 \h</w:instrText>
         </w:r>
         <w:r>
           <w:rPr>
@@ -1598,7 +1598,7 @@
           <w14:ligatures w14:val="standardContextual"/>
         </w:rPr>
       </w:pPr>
-      <w:hyperlink w:anchor="_Toc243226850" w:history="1">
+      <w:hyperlink w:anchor="_Toc243227556" w:history="1">
         <w:r>
           <w:rPr>
             <w:rStyle w:val="aff9"/>
@@ -1644,7 +1644,7 @@
             <w:noProof/>
             <w:webHidden/>
           </w:rPr>
-          <w:instrText>PAGEREF _Toc243226850 \h</w:instrText>
+          <w:instrText>PAGEREF _Toc243227556 \h</w:instrText>
         </w:r>
         <w:r>
           <w:rPr>
@@ -1703,7 +1703,7 @@
           <w14:ligatures w14:val="standardContextual"/>
         </w:rPr>
       </w:pPr>
-      <w:hyperlink w:anchor="_Toc243226851" w:history="1">
+      <w:hyperlink w:anchor="_Toc243227557" w:history="1">
         <w:r>
           <w:rPr>
             <w:rStyle w:val="aff9"/>
@@ -1749,7 +1749,7 @@
             <w:noProof/>
             <w:webHidden/>
           </w:rPr>
-          <w:instrText>PAGEREF _Toc243226851 \h</w:instrText>
+          <w:instrText>PAGEREF _Toc243227557 \h</w:instrText>
         </w:r>
         <w:r>
           <w:rPr>
@@ -1808,7 +1808,7 @@
           <w14:ligatures w14:val="standardContextual"/>
         </w:rPr>
       </w:pPr>
-      <w:hyperlink w:anchor="_Toc243226852" w:history="1">
+      <w:hyperlink w:anchor="_Toc243227558" w:history="1">
         <w:r>
           <w:rPr>
             <w:rStyle w:val="aff9"/>
@@ -1854,7 +1854,7 @@
             <w:noProof/>
             <w:webHidden/>
           </w:rPr>
-          <w:instrText>PAGEREF _Toc243226852 \h</w:instrText>
+          <w:instrText>PAGEREF _Toc243227558 \h</w:instrText>
         </w:r>
         <w:r>
           <w:rPr>
@@ -1912,7 +1912,7 @@
           <w14:ligatures w14:val="standardContextual"/>
         </w:rPr>
       </w:pPr>
-      <w:hyperlink w:anchor="_Toc243226853" w:history="1">
+      <w:hyperlink w:anchor="_Toc243227559" w:history="1">
         <w:r>
           <w:rPr>
             <w:rStyle w:val="aff9"/>
@@ -1958,7 +1958,7 @@
             <w:noProof/>
             <w:webHidden/>
           </w:rPr>
-          <w:instrText>PAGEREF _Toc243226853 \h</w:instrText>
+          <w:instrText>PAGEREF _Toc243227559 \h</w:instrText>
         </w:r>
         <w:r>
           <w:rPr>
@@ -2017,7 +2017,7 @@
           <w14:ligatures w14:val="standardContextual"/>
         </w:rPr>
       </w:pPr>
-      <w:hyperlink w:anchor="_Toc243226854" w:history="1">
+      <w:hyperlink w:anchor="_Toc243227560" w:history="1">
         <w:r>
           <w:rPr>
             <w:rStyle w:val="aff9"/>
@@ -2063,7 +2063,7 @@
             <w:noProof/>
             <w:webHidden/>
           </w:rPr>
-          <w:instrText>PAGEREF _Toc243226854 \h</w:instrText>
+          <w:instrText>PAGEREF _Toc243227560 \h</w:instrText>
         </w:r>
         <w:r>
           <w:rPr>
@@ -2122,7 +2122,7 @@
           <w14:ligatures w14:val="standardContextual"/>
         </w:rPr>
       </w:pPr>
-      <w:hyperlink w:anchor="_Toc243226855" w:history="1">
+      <w:hyperlink w:anchor="_Toc243227561" w:history="1">
         <w:r>
           <w:rPr>
             <w:rStyle w:val="aff9"/>
@@ -2168,7 +2168,7 @@
             <w:noProof/>
             <w:webHidden/>
           </w:rPr>
-          <w:instrText>PAGEREF _Toc243226855 \h</w:instrText>
+          <w:instrText>PAGEREF _Toc243227561 \h</w:instrText>
         </w:r>
         <w:r>
           <w:rPr>
@@ -2227,7 +2227,7 @@
           <w14:ligatures w14:val="standardContextual"/>
         </w:rPr>
       </w:pPr>
-      <w:hyperlink w:anchor="_Toc243226856" w:history="1">
+      <w:hyperlink w:anchor="_Toc243227562" w:history="1">
         <w:r>
           <w:rPr>
             <w:rStyle w:val="aff9"/>
@@ -2273,7 +2273,7 @@
             <w:noProof/>
             <w:webHidden/>
           </w:rPr>
-          <w:instrText>PAGEREF _Toc243226856 \h</w:instrText>
+          <w:instrText>PAGEREF _Toc243227562 \h</w:instrText>
         </w:r>
         <w:r>
           <w:rPr>
@@ -2332,7 +2332,7 @@
           <w14:ligatures w14:val="standardContextual"/>
         </w:rPr>
       </w:pPr>
-      <w:hyperlink w:anchor="_Toc243226857" w:history="1">
+      <w:hyperlink w:anchor="_Toc243227563" w:history="1">
         <w:r>
           <w:rPr>
             <w:rStyle w:val="aff9"/>
@@ -2378,7 +2378,7 @@
             <w:noProof/>
             <w:webHidden/>
           </w:rPr>
-          <w:instrText>PAGEREF _Toc243226857 \h</w:instrText>
+          <w:instrText>PAGEREF _Toc243227563 \h</w:instrText>
         </w:r>
         <w:r>
           <w:rPr>
@@ -2437,7 +2437,7 @@
           <w14:ligatures w14:val="standardContextual"/>
         </w:rPr>
       </w:pPr>
-      <w:hyperlink w:anchor="_Toc243226858" w:history="1">
+      <w:hyperlink w:anchor="_Toc243227564" w:history="1">
         <w:r>
           <w:rPr>
             <w:rStyle w:val="aff9"/>
@@ -2483,7 +2483,7 @@
             <w:noProof/>
             <w:webHidden/>
           </w:rPr>
-          <w:instrText>PAGEREF _Toc243226858 \h</w:instrText>
+          <w:instrText>PAGEREF _Toc243227564 \h</w:instrText>
         </w:r>
         <w:r>
           <w:rPr>
@@ -2542,7 +2542,7 @@
           <w14:ligatures w14:val="standardContextual"/>
         </w:rPr>
       </w:pPr>
-      <w:hyperlink w:anchor="_Toc243226859" w:history="1">
+      <w:hyperlink w:anchor="_Toc243227565" w:history="1">
         <w:r>
           <w:rPr>
             <w:rStyle w:val="aff9"/>
@@ -2604,7 +2604,7 @@
             <w:noProof/>
             <w:webHidden/>
           </w:rPr>
-          <w:instrText>PAGEREF _Toc243226859 \h</w:instrText>
+          <w:instrText>PAGEREF _Toc243227565 \h</w:instrText>
         </w:r>
         <w:r>
           <w:rPr>
@@ -2663,7 +2663,7 @@
           <w14:ligatures w14:val="standardContextual"/>
         </w:rPr>
       </w:pPr>
-      <w:hyperlink w:anchor="_Toc243226860" w:history="1">
+      <w:hyperlink w:anchor="_Toc243227566" w:history="1">
         <w:r>
           <w:rPr>
             <w:rStyle w:val="aff9"/>
@@ -2709,7 +2709,7 @@
             <w:noProof/>
             <w:webHidden/>
           </w:rPr>
-          <w:instrText>PAGEREF _Toc243226860 \h</w:instrText>
+          <w:instrText>PAGEREF _Toc243227566 \h</w:instrText>
         </w:r>
         <w:r>
           <w:rPr>
@@ -2768,7 +2768,7 @@
           <w14:ligatures w14:val="standardContextual"/>
         </w:rPr>
       </w:pPr>
-      <w:hyperlink w:anchor="_Toc243226861" w:history="1">
+      <w:hyperlink w:anchor="_Toc243227567" w:history="1">
         <w:r>
           <w:rPr>
             <w:rStyle w:val="aff9"/>
@@ -2814,7 +2814,7 @@
             <w:noProof/>
             <w:webHidden/>
           </w:rPr>
-          <w:instrText>PAGEREF _Toc243226861 \h</w:instrText>
+          <w:instrText>PAGEREF _Toc243227567 \h</w:instrText>
         </w:r>
         <w:r>
           <w:rPr>
@@ -2873,7 +2873,7 @@
           <w14:ligatures w14:val="standardContextual"/>
         </w:rPr>
       </w:pPr>
-      <w:hyperlink w:anchor="_Toc243226862" w:history="1">
+      <w:hyperlink w:anchor="_Toc243227568" w:history="1">
         <w:r>
           <w:rPr>
             <w:rStyle w:val="aff9"/>
@@ -2919,7 +2919,7 @@
             <w:noProof/>
             <w:webHidden/>
           </w:rPr>
-          <w:instrText>PAGEREF _Toc243226862 \h</w:instrText>
+          <w:instrText>PAGEREF _Toc243227568 \h</w:instrText>
         </w:r>
         <w:r>
           <w:rPr>
@@ -2949,7 +2949,7 @@
             <w:noProof/>
             <w:webHidden/>
           </w:rPr>
-          <w:t>10</w:t>
+          <w:t>11</w:t>
         </w:r>
         <w:r>
           <w:rPr>
@@ -2978,7 +2978,7 @@
           <w14:ligatures w14:val="standardContextual"/>
         </w:rPr>
       </w:pPr>
-      <w:hyperlink w:anchor="_Toc243226863" w:history="1">
+      <w:hyperlink w:anchor="_Toc243227569" w:history="1">
         <w:r>
           <w:rPr>
             <w:rStyle w:val="aff9"/>
@@ -3024,7 +3024,7 @@
             <w:noProof/>
             <w:webHidden/>
           </w:rPr>
-          <w:instrText>PAGEREF _Toc243226863 \h</w:instrText>
+          <w:instrText>PAGEREF _Toc243227569 \h</w:instrText>
         </w:r>
         <w:r>
           <w:rPr>
@@ -3083,7 +3083,7 @@
           <w14:ligatures w14:val="standardContextual"/>
         </w:rPr>
       </w:pPr>
-      <w:hyperlink w:anchor="_Toc243226864" w:history="1">
+      <w:hyperlink w:anchor="_Toc243227570" w:history="1">
         <w:r>
           <w:rPr>
             <w:rStyle w:val="aff9"/>
@@ -3145,7 +3145,7 @@
             <w:noProof/>
             <w:webHidden/>
           </w:rPr>
-          <w:instrText>PAGEREF _Toc243226864 \h</w:instrText>
+          <w:instrText>PAGEREF _Toc243227570 \h</w:instrText>
         </w:r>
         <w:r>
           <w:rPr>
@@ -3204,7 +3204,7 @@
           <w14:ligatures w14:val="standardContextual"/>
         </w:rPr>
       </w:pPr>
-      <w:hyperlink w:anchor="_Toc243226865" w:history="1">
+      <w:hyperlink w:anchor="_Toc243227571" w:history="1">
         <w:r>
           <w:rPr>
             <w:rStyle w:val="aff9"/>
@@ -3250,7 +3250,7 @@
             <w:noProof/>
             <w:webHidden/>
           </w:rPr>
-          <w:instrText>PAGEREF _Toc243226865 \h</w:instrText>
+          <w:instrText>PAGEREF _Toc243227571 \h</w:instrText>
         </w:r>
         <w:r>
           <w:rPr>
@@ -3309,7 +3309,7 @@
           <w14:ligatures w14:val="standardContextual"/>
         </w:rPr>
       </w:pPr>
-      <w:hyperlink w:anchor="_Toc243226866" w:history="1">
+      <w:hyperlink w:anchor="_Toc243227572" w:history="1">
         <w:r>
           <w:rPr>
             <w:rStyle w:val="aff9"/>
@@ -3355,7 +3355,7 @@
             <w:noProof/>
             <w:webHidden/>
           </w:rPr>
-          <w:instrText>PAGEREF _Toc243226866 \h</w:instrText>
+          <w:instrText>PAGEREF _Toc243227572 \h</w:instrText>
         </w:r>
         <w:r>
           <w:rPr>
@@ -3413,7 +3413,7 @@
           <w14:ligatures w14:val="standardContextual"/>
         </w:rPr>
       </w:pPr>
-      <w:hyperlink w:anchor="_Toc243226867" w:history="1">
+      <w:hyperlink w:anchor="_Toc243227573" w:history="1">
         <w:r>
           <w:rPr>
             <w:rStyle w:val="aff9"/>
@@ -3467,7 +3467,7 @@
             <w:noProof/>
             <w:webHidden/>
           </w:rPr>
-          <w:instrText>PAGEREF _Toc243226867 \h</w:instrText>
+          <w:instrText>PAGEREF _Toc243227573 \h</w:instrText>
         </w:r>
         <w:r>
           <w:rPr>
@@ -3526,7 +3526,7 @@
           <w14:ligatures w14:val="standardContextual"/>
         </w:rPr>
       </w:pPr>
-      <w:hyperlink w:anchor="_Toc243226868" w:history="1">
+      <w:hyperlink w:anchor="_Toc243227574" w:history="1">
         <w:r>
           <w:rPr>
             <w:rStyle w:val="aff9"/>
@@ -3588,7 +3588,7 @@
             <w:noProof/>
             <w:webHidden/>
           </w:rPr>
-          <w:instrText>PAGEREF _Toc243226868 \h</w:instrText>
+          <w:instrText>PAGEREF _Toc243227574 \h</w:instrText>
         </w:r>
         <w:r>
           <w:rPr>
@@ -3647,7 +3647,7 @@
           <w14:ligatures w14:val="standardContextual"/>
         </w:rPr>
       </w:pPr>
-      <w:hyperlink w:anchor="_Toc243226869" w:history="1">
+      <w:hyperlink w:anchor="_Toc243227575" w:history="1">
         <w:r>
           <w:rPr>
             <w:rStyle w:val="aff9"/>
@@ -3709,7 +3709,7 @@
             <w:noProof/>
             <w:webHidden/>
           </w:rPr>
-          <w:instrText>PAGEREF _Toc243226869 \h</w:instrText>
+          <w:instrText>PAGEREF _Toc243227575 \h</w:instrText>
         </w:r>
         <w:r>
           <w:rPr>
@@ -3739,7 +3739,7 @@
             <w:noProof/>
             <w:webHidden/>
           </w:rPr>
-          <w:t>12</w:t>
+          <w:t>13</w:t>
         </w:r>
         <w:r>
           <w:rPr>
@@ -3768,7 +3768,7 @@
           <w14:ligatures w14:val="standardContextual"/>
         </w:rPr>
       </w:pPr>
-      <w:hyperlink w:anchor="_Toc243226870" w:history="1">
+      <w:hyperlink w:anchor="_Toc243227576" w:history="1">
         <w:r>
           <w:rPr>
             <w:rStyle w:val="aff9"/>
@@ -3830,7 +3830,7 @@
             <w:noProof/>
             <w:webHidden/>
           </w:rPr>
-          <w:instrText>PAGEREF _Toc243226870 \h</w:instrText>
+          <w:instrText>PAGEREF _Toc243227576 \h</w:instrText>
         </w:r>
         <w:r>
           <w:rPr>
@@ -3860,7 +3860,7 @@
             <w:noProof/>
             <w:webHidden/>
           </w:rPr>
-          <w:t>13</w:t>
+          <w:t>14</w:t>
         </w:r>
         <w:r>
           <w:rPr>
@@ -3889,7 +3889,7 @@
           <w14:ligatures w14:val="standardContextual"/>
         </w:rPr>
       </w:pPr>
-      <w:hyperlink w:anchor="_Toc243226871" w:history="1">
+      <w:hyperlink w:anchor="_Toc243227577" w:history="1">
         <w:r>
           <w:rPr>
             <w:rStyle w:val="aff9"/>
@@ -3967,7 +3967,7 @@
             <w:noProof/>
             <w:webHidden/>
           </w:rPr>
-          <w:instrText>PAGEREF _Toc243226871 \h</w:instrText>
+          <w:instrText>PAGEREF _Toc243227577 \h</w:instrText>
         </w:r>
         <w:r>
           <w:rPr>
@@ -4025,7 +4025,7 @@
           <w14:ligatures w14:val="standardContextual"/>
         </w:rPr>
       </w:pPr>
-      <w:hyperlink w:anchor="_Toc243226872" w:history="1">
+      <w:hyperlink w:anchor="_Toc243227578" w:history="1">
         <w:r>
           <w:rPr>
             <w:rStyle w:val="aff9"/>
@@ -4071,7 +4071,7 @@
             <w:noProof/>
             <w:webHidden/>
           </w:rPr>
-          <w:instrText>PAGEREF _Toc243226872 \h</w:instrText>
+          <w:instrText>PAGEREF _Toc243227578 \h</w:instrText>
         </w:r>
         <w:r>
           <w:rPr>
@@ -4101,7 +4101,7 @@
             <w:noProof/>
             <w:webHidden/>
           </w:rPr>
-          <w:t>14</w:t>
+          <w:t>15</w:t>
         </w:r>
         <w:r>
           <w:rPr>
@@ -4130,7 +4130,7 @@
           <w14:ligatures w14:val="standardContextual"/>
         </w:rPr>
       </w:pPr>
-      <w:hyperlink w:anchor="_Toc243226873" w:history="1">
+      <w:hyperlink w:anchor="_Toc243227579" w:history="1">
         <w:r>
           <w:rPr>
             <w:rStyle w:val="aff9"/>
@@ -4192,7 +4192,7 @@
             <w:noProof/>
             <w:webHidden/>
           </w:rPr>
-          <w:instrText>PAGEREF _Toc243226873 \h</w:instrText>
+          <w:instrText>PAGEREF _Toc243227579 \h</w:instrText>
         </w:r>
         <w:r>
           <w:rPr>
@@ -4250,7 +4250,7 @@
           <w14:ligatures w14:val="standardContextual"/>
         </w:rPr>
       </w:pPr>
-      <w:hyperlink w:anchor="_Toc243226874" w:history="1">
+      <w:hyperlink w:anchor="_Toc243227580" w:history="1">
         <w:r>
           <w:rPr>
             <w:rStyle w:val="aff9"/>
@@ -4296,7 +4296,7 @@
             <w:noProof/>
             <w:webHidden/>
           </w:rPr>
-          <w:instrText>PAGEREF _Toc243226874 \h</w:instrText>
+          <w:instrText>PAGEREF _Toc243227580 \h</w:instrText>
         </w:r>
         <w:r>
           <w:rPr>
@@ -4354,7 +4354,7 @@
           <w14:ligatures w14:val="standardContextual"/>
         </w:rPr>
       </w:pPr>
-      <w:hyperlink w:anchor="_Toc243226875" w:history="1">
+      <w:hyperlink w:anchor="_Toc243227581" w:history="1">
         <w:r>
           <w:rPr>
             <w:rStyle w:val="aff9"/>
@@ -4400,7 +4400,7 @@
             <w:noProof/>
             <w:webHidden/>
           </w:rPr>
-          <w:instrText>PAGEREF _Toc243226875 \h</w:instrText>
+          <w:instrText>PAGEREF _Toc243227581 \h</w:instrText>
         </w:r>
         <w:r>
           <w:rPr>
@@ -4430,7 +4430,7 @@
             <w:noProof/>
             <w:webHidden/>
           </w:rPr>
-          <w:t>16</w:t>
+          <w:t>17</w:t>
         </w:r>
         <w:r>
           <w:rPr>
@@ -4455,7 +4455,7 @@
         <w:pStyle w:val="1"/>
         <w:spacing w:before="280" w:after="120"/>
       </w:pPr>
-      <w:bookmarkStart w:id="0" w:name="_Toc243226836"/>
+      <w:bookmarkStart w:id="0" w:name="_Toc243227542"/>
       <w:r>
         <w:rPr>
           <w:rFonts w:ascii="Times New Roman" w:eastAsia="黑体" w:hAnsi="Times New Roman"/>
@@ -4791,7 +4791,7 @@
         <w:pStyle w:val="1"/>
         <w:spacing w:before="280" w:after="120"/>
       </w:pPr>
-      <w:bookmarkStart w:id="1" w:name="_Toc243226837"/>
+      <w:bookmarkStart w:id="1" w:name="_Toc243227543"/>
       <w:r>
         <w:rPr>
           <w:rFonts w:ascii="Times New Roman" w:eastAsia="黑体" w:hAnsi="Times New Roman"/>
@@ -4815,7 +4815,7 @@
         <w:pStyle w:val="21"/>
         <w:spacing w:after="120"/>
       </w:pPr>
-      <w:bookmarkStart w:id="2" w:name="_Toc243226838"/>
+      <w:bookmarkStart w:id="2" w:name="_Toc243227544"/>
       <w:r>
         <w:rPr>
           <w:rFonts w:ascii="Times New Roman" w:eastAsia="黑体" w:hAnsi="Times New Roman"/>
@@ -4921,7 +4921,7 @@
         <w:pStyle w:val="21"/>
         <w:spacing w:after="120"/>
       </w:pPr>
-      <w:bookmarkStart w:id="3" w:name="_Toc243226839"/>
+      <w:bookmarkStart w:id="3" w:name="_Toc243227545"/>
       <w:r>
         <w:rPr>
           <w:rFonts w:ascii="Times New Roman" w:eastAsia="黑体" w:hAnsi="Times New Roman"/>
@@ -5330,7 +5330,7 @@
         <w:pStyle w:val="21"/>
         <w:spacing w:after="120"/>
       </w:pPr>
-      <w:bookmarkStart w:id="4" w:name="_Toc243226840"/>
+      <w:bookmarkStart w:id="4" w:name="_Toc243227546"/>
       <w:r>
         <w:rPr>
           <w:rFonts w:ascii="Times New Roman" w:eastAsia="黑体" w:hAnsi="Times New Roman"/>
@@ -5440,7 +5440,7 @@
         <w:pStyle w:val="21"/>
         <w:spacing w:after="120"/>
       </w:pPr>
-      <w:bookmarkStart w:id="5" w:name="_Toc243226841"/>
+      <w:bookmarkStart w:id="5" w:name="_Toc243227547"/>
       <w:r>
         <w:rPr>
           <w:rFonts w:ascii="Times New Roman" w:eastAsia="黑体" w:hAnsi="Times New Roman"/>
@@ -5522,7 +5522,7 @@
         <w:pStyle w:val="21"/>
         <w:spacing w:after="120"/>
       </w:pPr>
-      <w:bookmarkStart w:id="6" w:name="_Toc243226842"/>
+      <w:bookmarkStart w:id="6" w:name="_Toc243227548"/>
       <w:r>
         <w:rPr>
           <w:rFonts w:ascii="Times New Roman" w:eastAsia="黑体" w:hAnsi="Times New Roman"/>
@@ -5594,7 +5594,7 @@
         <w:pStyle w:val="21"/>
         <w:spacing w:after="120"/>
       </w:pPr>
-      <w:bookmarkStart w:id="7" w:name="_Toc243226843"/>
+      <w:bookmarkStart w:id="7" w:name="_Toc243227549"/>
       <w:r>
         <w:rPr>
           <w:rFonts w:ascii="Times New Roman" w:eastAsia="黑体" w:hAnsi="Times New Roman"/>
@@ -5690,7 +5690,7 @@
         <w:pStyle w:val="21"/>
         <w:spacing w:after="120"/>
       </w:pPr>
-      <w:bookmarkStart w:id="8" w:name="_Toc243226844"/>
+      <w:bookmarkStart w:id="8" w:name="_Toc243227550"/>
       <w:r>
         <w:rPr>
           <w:rFonts w:ascii="Times New Roman" w:eastAsia="黑体" w:hAnsi="Times New Roman"/>
@@ -5744,7 +5744,7 @@
         <w:pStyle w:val="1"/>
         <w:spacing w:before="280" w:after="120"/>
       </w:pPr>
-      <w:bookmarkStart w:id="9" w:name="_Toc243226845"/>
+      <w:bookmarkStart w:id="9" w:name="_Toc243227551"/>
       <w:r>
         <w:rPr>
           <w:rFonts w:ascii="Times New Roman" w:eastAsia="黑体" w:hAnsi="Times New Roman"/>
@@ -5898,7 +5898,7 @@
         <w:pStyle w:val="1"/>
         <w:spacing w:before="280" w:after="120"/>
       </w:pPr>
-      <w:bookmarkStart w:id="10" w:name="_Toc243226846"/>
+      <w:bookmarkStart w:id="10" w:name="_Toc243227552"/>
       <w:r>
         <w:rPr>
           <w:rFonts w:ascii="Times New Roman" w:eastAsia="黑体" w:hAnsi="Times New Roman"/>
@@ -6324,7 +6324,7 @@
         <w:pStyle w:val="1"/>
         <w:spacing w:before="280" w:after="120"/>
       </w:pPr>
-      <w:bookmarkStart w:id="11" w:name="_Toc243226847"/>
+      <w:bookmarkStart w:id="11" w:name="_Toc243227553"/>
       <w:r>
         <w:rPr>
           <w:rFonts w:ascii="Times New Roman" w:eastAsia="黑体" w:hAnsi="Times New Roman"/>
@@ -7548,7 +7548,7 @@
         <w:pStyle w:val="1"/>
         <w:spacing w:before="280" w:after="120"/>
       </w:pPr>
-      <w:bookmarkStart w:id="12" w:name="_Toc243226848"/>
+      <w:bookmarkStart w:id="12" w:name="_Toc243227554"/>
       <w:r>
         <w:rPr>
           <w:rFonts w:ascii="Times New Roman" w:eastAsia="黑体" w:hAnsi="Times New Roman"/>
@@ -8481,7 +8481,7 @@
         <w:rPr>
           <w:color w:val="000000"/>
         </w:rPr>
-        <w:t xml:space="preserve"> 86 </w:t>
+        <w:t xml:space="preserve"> 85 </w:t>
       </w:r>
       <w:r>
         <w:rPr>
@@ -8493,7 +8493,7 @@
         <w:rPr>
           <w:color w:val="000000"/>
         </w:rPr>
-        <w:t xml:space="preserve"> 125 </w:t>
+        <w:t xml:space="preserve"> 124 </w:t>
       </w:r>
       <w:r>
         <w:rPr>
@@ -8639,7 +8639,7 @@
         <w:pStyle w:val="1"/>
         <w:spacing w:before="280" w:after="120"/>
       </w:pPr>
-      <w:bookmarkStart w:id="13" w:name="_Toc243226849"/>
+      <w:bookmarkStart w:id="13" w:name="_Toc243227555"/>
       <w:r>
         <w:rPr>
           <w:rFonts w:ascii="Times New Roman" w:eastAsia="黑体" w:hAnsi="Times New Roman"/>
@@ -8663,7 +8663,7 @@
         <w:pStyle w:val="21"/>
         <w:spacing w:after="120"/>
       </w:pPr>
-      <w:bookmarkStart w:id="14" w:name="_Toc243226850"/>
+      <w:bookmarkStart w:id="14" w:name="_Toc243227556"/>
       <w:r>
         <w:rPr>
           <w:rFonts w:ascii="Times New Roman" w:eastAsia="黑体" w:hAnsi="Times New Roman"/>
@@ -8871,7 +8871,7 @@
         <w:pStyle w:val="21"/>
         <w:spacing w:after="120"/>
       </w:pPr>
-      <w:bookmarkStart w:id="15" w:name="_Toc243226851"/>
+      <w:bookmarkStart w:id="15" w:name="_Toc243227557"/>
       <w:r>
         <w:rPr>
           <w:rFonts w:ascii="Times New Roman" w:eastAsia="黑体" w:hAnsi="Times New Roman"/>
@@ -8957,7 +8957,7 @@
         <w:pStyle w:val="21"/>
         <w:spacing w:after="120"/>
       </w:pPr>
-      <w:bookmarkStart w:id="16" w:name="_Toc243226852"/>
+      <w:bookmarkStart w:id="16" w:name="_Toc243227558"/>
       <w:r>
         <w:rPr>
           <w:rFonts w:ascii="Times New Roman" w:eastAsia="黑体" w:hAnsi="Times New Roman"/>
@@ -9054,103 +9054,116 @@
         <w:rPr>
           <w:color w:val="000000"/>
         </w:rPr>
-        <w:t>按年份把改名与合并并到同一家：联讯</w:t>
-      </w:r>
-      <w:r>
-        <w:rPr>
-          <w:color w:val="000000"/>
-        </w:rPr>
-        <w:t>→</w:t>
-      </w:r>
-      <w:r>
-        <w:rPr>
-          <w:color w:val="000000"/>
-        </w:rPr>
-        <w:t>粤开、财富</w:t>
-      </w:r>
-      <w:r>
-        <w:rPr>
-          <w:color w:val="000000"/>
-        </w:rPr>
-        <w:t>→</w:t>
-      </w:r>
-      <w:r>
-        <w:rPr>
-          <w:color w:val="000000"/>
-        </w:rPr>
-        <w:t>财信、华菁</w:t>
-      </w:r>
-      <w:r>
-        <w:rPr>
-          <w:color w:val="000000"/>
-        </w:rPr>
-        <w:t>→</w:t>
-      </w:r>
-      <w:r>
-        <w:rPr>
-          <w:color w:val="000000"/>
-        </w:rPr>
-        <w:t>华兴、新时代</w:t>
-      </w:r>
-      <w:r>
-        <w:rPr>
-          <w:color w:val="000000"/>
-        </w:rPr>
-        <w:t>→</w:t>
-      </w:r>
-      <w:r>
-        <w:rPr>
-          <w:color w:val="000000"/>
-        </w:rPr>
-        <w:t>诚通、安信</w:t>
-      </w:r>
-      <w:r>
-        <w:rPr>
-          <w:color w:val="000000"/>
-        </w:rPr>
-        <w:t>→</w:t>
-      </w:r>
-      <w:r>
-        <w:rPr>
-          <w:color w:val="000000"/>
-        </w:rPr>
-        <w:t>国投、国联证券</w:t>
-      </w:r>
-      <w:r>
-        <w:rPr>
-          <w:color w:val="000000"/>
-        </w:rPr>
-        <w:t>→</w:t>
-      </w:r>
-      <w:r>
-        <w:rPr>
-          <w:color w:val="000000"/>
-        </w:rPr>
-        <w:t>国联民生、国泰君安</w:t>
-      </w:r>
-      <w:r>
-        <w:rPr>
-          <w:color w:val="000000"/>
-        </w:rPr>
-        <w:t>→</w:t>
-      </w:r>
-      <w:r>
-        <w:rPr>
-          <w:color w:val="000000"/>
-        </w:rPr>
-        <w:t>国泰海通。同一家券商的所有历史写法只算一个稳定身份，当前共</w:t>
-      </w:r>
-      <w:r>
-        <w:rPr>
-          <w:color w:val="000000"/>
-        </w:rPr>
-        <w:t xml:space="preserve"> 125 </w:t>
-      </w:r>
-      <w:r>
-        <w:rPr>
-          <w:color w:val="000000"/>
-        </w:rPr>
-        <w:t>个。事件表仍保留</w:t>
+        <w:t>按年份把改名与合并并到同一家，稳定身份采用</w:t>
+      </w:r>
+      <w:r>
+        <w:rPr>
+          <w:b/>
+          <w:color w:val="000000"/>
+        </w:rPr>
+        <w:t>样本期内最先在用的名称</w:t>
+      </w:r>
+      <w:r>
+        <w:rPr>
+          <w:color w:val="000000"/>
+        </w:rPr>
+        <w:t>，不采用未来的新名：国泰君安（</w:t>
+      </w:r>
+      <w:r>
+        <w:rPr>
+          <w:color w:val="000000"/>
+        </w:rPr>
+        <w:t xml:space="preserve">2025 </w:t>
+      </w:r>
+      <w:r>
+        <w:rPr>
+          <w:color w:val="000000"/>
+        </w:rPr>
+        <w:t>年才合并为国泰海通）、安信证券（</w:t>
+      </w:r>
+      <w:r>
+        <w:rPr>
+          <w:color w:val="000000"/>
+        </w:rPr>
+        <w:t xml:space="preserve">2024 </w:t>
+      </w:r>
+      <w:r>
+        <w:rPr>
+          <w:color w:val="000000"/>
+        </w:rPr>
+        <w:t>年改名国投证券）、国联证券（</w:t>
+      </w:r>
+      <w:r>
+        <w:rPr>
+          <w:color w:val="000000"/>
+        </w:rPr>
+        <w:t xml:space="preserve">2025 </w:t>
+      </w:r>
+      <w:r>
+        <w:rPr>
+          <w:color w:val="000000"/>
+        </w:rPr>
+        <w:t>年合并为国联民生）、华菁证券（</w:t>
+      </w:r>
+      <w:r>
+        <w:rPr>
+          <w:color w:val="000000"/>
+        </w:rPr>
+        <w:t xml:space="preserve">2021 </w:t>
+      </w:r>
+      <w:r>
+        <w:rPr>
+          <w:color w:val="000000"/>
+        </w:rPr>
+        <w:t>年改名华兴证券）、新时代证券（</w:t>
+      </w:r>
+      <w:r>
+        <w:rPr>
+          <w:color w:val="000000"/>
+        </w:rPr>
+        <w:t xml:space="preserve">2022 </w:t>
+      </w:r>
+      <w:r>
+        <w:rPr>
+          <w:color w:val="000000"/>
+        </w:rPr>
+        <w:t>年更名诚通证券）、联讯证券（</w:t>
+      </w:r>
+      <w:r>
+        <w:rPr>
+          <w:color w:val="000000"/>
+        </w:rPr>
+        <w:t xml:space="preserve">2020 </w:t>
+      </w:r>
+      <w:r>
+        <w:rPr>
+          <w:color w:val="000000"/>
+        </w:rPr>
+        <w:t>年改名粤开证券）、财富证券（</w:t>
+      </w:r>
+      <w:r>
+        <w:rPr>
+          <w:color w:val="000000"/>
+        </w:rPr>
+        <w:t xml:space="preserve">2020 </w:t>
+      </w:r>
+      <w:r>
+        <w:rPr>
+          <w:color w:val="000000"/>
+        </w:rPr>
+        <w:t>年改名财信证券）。同一家券商的所有历史写法只算一个身份，当前共</w:t>
+      </w:r>
+      <w:r>
+        <w:rPr>
+          <w:color w:val="000000"/>
+        </w:rPr>
+        <w:t xml:space="preserve"> 124 </w:t>
+      </w:r>
+      <w:r>
+        <w:rPr>
+          <w:color w:val="000000"/>
+        </w:rPr>
+        <w:t>个。事件表保留</w:t>
       </w:r>
       <w:r>
         <w:rPr>
@@ -9188,7 +9201,7 @@
         <w:rPr>
           <w:color w:val="000000"/>
         </w:rPr>
-        <w:t>返回当年在用的名称，所以</w:t>
+        <w:t>返回当年名称，所以</w:t>
       </w:r>
       <w:r>
         <w:rPr>
@@ -9200,7 +9213,19 @@
         <w:rPr>
           <w:color w:val="000000"/>
         </w:rPr>
-        <w:t>年的国泰君安不会写成国泰海通。</w:t>
+        <w:t>年的国泰君安不会写成国泰海通，</w:t>
+      </w:r>
+      <w:r>
+        <w:rPr>
+          <w:color w:val="000000"/>
+        </w:rPr>
+        <w:t xml:space="preserve">2024 </w:t>
+      </w:r>
+      <w:r>
+        <w:rPr>
+          <w:color w:val="000000"/>
+        </w:rPr>
+        <w:t>年的安信会显示国投。</w:t>
       </w:r>
     </w:p>
     <w:p>
@@ -9364,7 +9389,7 @@
         <w:rPr>
           <w:color w:val="000000"/>
         </w:rPr>
-        <w:t>47.9%</w:t>
+        <w:t>48.0%</w:t>
       </w:r>
       <w:r>
         <w:rPr>
@@ -9412,7 +9437,7 @@
         <w:rPr>
           <w:color w:val="000000"/>
         </w:rPr>
-        <w:t xml:space="preserve">86 </w:t>
+        <w:t xml:space="preserve">85 </w:t>
       </w:r>
       <w:r>
         <w:rPr>
@@ -9625,7 +9650,7 @@
                 <w:color w:val="000000"/>
                 <w:sz w:val="21"/>
               </w:rPr>
-              <w:t>47.9%</w:t>
+              <w:t>48.0%</w:t>
             </w:r>
           </w:p>
         </w:tc>
@@ -9642,7 +9667,7 @@
                 <w:color w:val="000000"/>
                 <w:sz w:val="21"/>
               </w:rPr>
-              <w:t>8,366</w:t>
+              <w:t>8,368</w:t>
             </w:r>
           </w:p>
         </w:tc>
@@ -9797,7 +9822,7 @@
                 <w:color w:val="000000"/>
                 <w:sz w:val="21"/>
               </w:rPr>
-              <w:t>86</w:t>
+              <w:t>85</w:t>
             </w:r>
           </w:p>
         </w:tc>
@@ -9831,7 +9856,7 @@
                 <w:color w:val="000000"/>
                 <w:sz w:val="21"/>
               </w:rPr>
-              <w:t>3,342</w:t>
+              <w:t>3,340</w:t>
             </w:r>
           </w:p>
         </w:tc>
@@ -9969,7 +9994,7 @@
         <w:rPr>
           <w:color w:val="000000"/>
         </w:rPr>
-        <w:t xml:space="preserve"> 47.9%</w:t>
+        <w:t xml:space="preserve"> 48.0%</w:t>
       </w:r>
       <w:r>
         <w:rPr>
@@ -10445,7 +10470,7 @@
         <w:pStyle w:val="1"/>
         <w:spacing w:before="280" w:after="120"/>
       </w:pPr>
-      <w:bookmarkStart w:id="17" w:name="_Toc243226853"/>
+      <w:bookmarkStart w:id="17" w:name="_Toc243227559"/>
       <w:r>
         <w:rPr>
           <w:rFonts w:ascii="Times New Roman" w:eastAsia="黑体" w:hAnsi="Times New Roman"/>
@@ -10477,7 +10502,7 @@
         <w:pStyle w:val="21"/>
         <w:spacing w:after="120"/>
       </w:pPr>
-      <w:bookmarkStart w:id="18" w:name="_Toc243226854"/>
+      <w:bookmarkStart w:id="18" w:name="_Toc243227560"/>
       <w:r>
         <w:rPr>
           <w:rFonts w:ascii="Times New Roman" w:eastAsia="黑体" w:hAnsi="Times New Roman"/>
@@ -10743,7 +10768,7 @@
         <w:pStyle w:val="21"/>
         <w:spacing w:after="120"/>
       </w:pPr>
-      <w:bookmarkStart w:id="19" w:name="_Toc243226855"/>
+      <w:bookmarkStart w:id="19" w:name="_Toc243227561"/>
       <w:r>
         <w:rPr>
           <w:rFonts w:ascii="Times New Roman" w:eastAsia="黑体" w:hAnsi="Times New Roman"/>
@@ -10859,7 +10884,7 @@
         <w:pStyle w:val="21"/>
         <w:spacing w:after="120"/>
       </w:pPr>
-      <w:bookmarkStart w:id="20" w:name="_Toc243226856"/>
+      <w:bookmarkStart w:id="20" w:name="_Toc243227562"/>
       <w:r>
         <w:rPr>
           <w:rFonts w:ascii="Times New Roman" w:eastAsia="黑体" w:hAnsi="Times New Roman"/>
@@ -11119,7 +11144,7 @@
         <w:rPr>
           <w:color w:val="000000"/>
         </w:rPr>
-        <w:t xml:space="preserve"> 13 / 26 / 86</w:t>
+        <w:t xml:space="preserve"> 13 / 26 / 85</w:t>
       </w:r>
       <w:r>
         <w:rPr>
@@ -11131,7 +11156,7 @@
         <w:rPr>
           <w:color w:val="000000"/>
         </w:rPr>
-        <w:t xml:space="preserve">125 </w:t>
+        <w:t xml:space="preserve">124 </w:t>
       </w:r>
       <w:r>
         <w:rPr>
@@ -11888,7 +11913,7 @@
         <w:rPr>
           <w:color w:val="000000"/>
         </w:rPr>
-        <w:t>稳定身份用</w:t>
+        <w:t>稳定身份用旧名（样本期内最先在用的名称），由</w:t>
       </w:r>
       <w:r>
         <w:rPr>
@@ -11908,16 +11933,22 @@
         <w:rPr>
           <w:color w:val="000000"/>
         </w:rPr>
-        <w:t>，跨年汇总；展示用</w:t>
-      </w:r>
-      <w:r>
-        <w:rPr>
-          <w:color w:val="000000"/>
-        </w:rPr>
         <w:t xml:space="preserve"> </w:t>
       </w:r>
       <w:r>
         <w:rPr>
+          <w:color w:val="000000"/>
+        </w:rPr>
+        <w:t>跨年汇总；新名只用于生效年之后的展示，由</w:t>
+      </w:r>
+      <w:r>
+        <w:rPr>
+          <w:color w:val="000000"/>
+        </w:rPr>
+        <w:t xml:space="preserve"> </w:t>
+      </w:r>
+      <w:r>
+        <w:rPr>
           <w:rFonts w:ascii="Consolas" w:hAnsi="Consolas"/>
           <w:color w:val="000000"/>
           <w:sz w:val="22"/>
@@ -11928,7 +11959,13 @@
         <w:rPr>
           <w:color w:val="000000"/>
         </w:rPr>
-        <w:t>，按年份返回当时名称。</w:t>
+        <w:t xml:space="preserve"> </w:t>
+      </w:r>
+      <w:r>
+        <w:rPr>
+          <w:color w:val="000000"/>
+        </w:rPr>
+        <w:t>返回。</w:t>
       </w:r>
     </w:p>
     <w:p>
@@ -12100,7 +12137,7 @@
         <w:pStyle w:val="21"/>
         <w:spacing w:after="120"/>
       </w:pPr>
-      <w:bookmarkStart w:id="21" w:name="_Toc243226857"/>
+      <w:bookmarkStart w:id="21" w:name="_Toc243227563"/>
       <w:r>
         <w:rPr>
           <w:rFonts w:ascii="Times New Roman" w:eastAsia="黑体" w:hAnsi="Times New Roman"/>
@@ -12222,7 +12259,7 @@
         <w:pStyle w:val="21"/>
         <w:spacing w:after="120"/>
       </w:pPr>
-      <w:bookmarkStart w:id="22" w:name="_Toc243226858"/>
+      <w:bookmarkStart w:id="22" w:name="_Toc243227564"/>
       <w:r>
         <w:rPr>
           <w:rFonts w:ascii="Times New Roman" w:eastAsia="黑体" w:hAnsi="Times New Roman"/>
@@ -12360,7 +12397,7 @@
         <w:pStyle w:val="21"/>
         <w:spacing w:after="120"/>
       </w:pPr>
-      <w:bookmarkStart w:id="23" w:name="_Toc243226859"/>
+      <w:bookmarkStart w:id="23" w:name="_Toc243227565"/>
       <w:r>
         <w:rPr>
           <w:rFonts w:ascii="Times New Roman" w:eastAsia="黑体" w:hAnsi="Times New Roman"/>
@@ -12596,7 +12633,7 @@
         <w:pStyle w:val="21"/>
         <w:spacing w:after="120"/>
       </w:pPr>
-      <w:bookmarkStart w:id="24" w:name="_Toc243226860"/>
+      <w:bookmarkStart w:id="24" w:name="_Toc243227566"/>
       <w:r>
         <w:rPr>
           <w:rFonts w:ascii="Times New Roman" w:eastAsia="黑体" w:hAnsi="Times New Roman"/>
@@ -12712,7 +12749,7 @@
         <w:pStyle w:val="21"/>
         <w:spacing w:after="120"/>
       </w:pPr>
-      <w:bookmarkStart w:id="25" w:name="_Toc243226861"/>
+      <w:bookmarkStart w:id="25" w:name="_Toc243227567"/>
       <w:r>
         <w:rPr>
           <w:rFonts w:ascii="Times New Roman" w:eastAsia="黑体" w:hAnsi="Times New Roman"/>
@@ -13042,7 +13079,7 @@
         <w:pStyle w:val="21"/>
         <w:spacing w:after="120"/>
       </w:pPr>
-      <w:bookmarkStart w:id="26" w:name="_Toc243226862"/>
+      <w:bookmarkStart w:id="26" w:name="_Toc243227568"/>
       <w:r>
         <w:rPr>
           <w:rFonts w:ascii="Times New Roman" w:eastAsia="黑体" w:hAnsi="Times New Roman"/>
@@ -13144,7 +13181,7 @@
         <w:pStyle w:val="21"/>
         <w:spacing w:after="120"/>
       </w:pPr>
-      <w:bookmarkStart w:id="27" w:name="_Toc243226863"/>
+      <w:bookmarkStart w:id="27" w:name="_Toc243227569"/>
       <w:r>
         <w:rPr>
           <w:rFonts w:ascii="Times New Roman" w:eastAsia="黑体" w:hAnsi="Times New Roman"/>
@@ -13282,7 +13319,7 @@
         <w:pStyle w:val="21"/>
         <w:spacing w:after="120"/>
       </w:pPr>
-      <w:bookmarkStart w:id="28" w:name="_Toc243226864"/>
+      <w:bookmarkStart w:id="28" w:name="_Toc243227570"/>
       <w:r>
         <w:rPr>
           <w:rFonts w:ascii="Times New Roman" w:eastAsia="黑体" w:hAnsi="Times New Roman"/>
@@ -13350,7 +13387,7 @@
         <w:pStyle w:val="21"/>
         <w:spacing w:after="120"/>
       </w:pPr>
-      <w:bookmarkStart w:id="29" w:name="_Toc243226865"/>
+      <w:bookmarkStart w:id="29" w:name="_Toc243227571"/>
       <w:r>
         <w:rPr>
           <w:rFonts w:ascii="Times New Roman" w:eastAsia="黑体" w:hAnsi="Times New Roman"/>
@@ -13398,7 +13435,7 @@
         <w:pStyle w:val="21"/>
         <w:spacing w:after="120"/>
       </w:pPr>
-      <w:bookmarkStart w:id="30" w:name="_Toc243226866"/>
+      <w:bookmarkStart w:id="30" w:name="_Toc243227572"/>
       <w:r>
         <w:rPr>
           <w:rFonts w:ascii="Times New Roman" w:eastAsia="黑体" w:hAnsi="Times New Roman"/>
@@ -13562,7 +13599,7 @@
         <w:pStyle w:val="1"/>
         <w:spacing w:before="280" w:after="120"/>
       </w:pPr>
-      <w:bookmarkStart w:id="31" w:name="_Toc243226867"/>
+      <w:bookmarkStart w:id="31" w:name="_Toc243227573"/>
       <w:r>
         <w:rPr>
           <w:rFonts w:ascii="Times New Roman" w:eastAsia="黑体" w:hAnsi="Times New Roman"/>
@@ -14340,19 +14377,355 @@
         <w:rPr>
           <w:color w:val="000000"/>
         </w:rPr>
-        <w:t>停牌事件的决定：保留，不整体剔除。停牌是缺观测，不是事件无效，事件当天已经保证是交易日；整体剔除会引入选择偏差，停牌股恰是重组、并购、退市风险这类反应最极端的样本，删掉等于只留温和股票。主口径用「保留</w:t>
-      </w:r>
-      <w:r>
-        <w:rPr>
-          <w:color w:val="000000"/>
-        </w:rPr>
-        <w:t xml:space="preserve"> + 80% </w:t>
-      </w:r>
-      <w:r>
-        <w:rPr>
-          <w:color w:val="000000"/>
-        </w:rPr>
-        <w:t>门槛」。长窗口的停牌常是内生的（评级变动和停牌同时发生），所以稳健性里另做一版「窗口内出现停牌就整体剔除」对比，这需要乙在行情里保留停牌状态字段，等交付再补，不阻塞主口径。</w:t>
+        <w:t>停牌日怎么处理：不删行，记为空。</w:t>
+      </w:r>
+    </w:p>
+    <w:p>
+      <w:r>
+        <w:rPr>
+          <w:color w:val="000000"/>
+        </w:rPr>
+        <w:t>事件窗口按交易日历排，停牌日仍占一个交易日位置，但当天收益记为空，不当成</w:t>
+      </w:r>
+      <w:r>
+        <w:rPr>
+          <w:color w:val="000000"/>
+        </w:rPr>
+        <w:t xml:space="preserve"> 0</w:t>
+      </w:r>
+      <w:r>
+        <w:rPr>
+          <w:color w:val="000000"/>
+        </w:rPr>
+        <w:t>。一条事件要报</w:t>
+      </w:r>
+      <w:r>
+        <w:rPr>
+          <w:color w:val="000000"/>
+        </w:rPr>
+        <w:t xml:space="preserve"> CAR</w:t>
+      </w:r>
+      <w:r>
+        <w:rPr>
+          <w:color w:val="000000"/>
+        </w:rPr>
+        <w:t>，必须同时满足两件事：事件日当天有有效收益；窗口内至少</w:t>
+      </w:r>
+      <w:r>
+        <w:rPr>
+          <w:color w:val="000000"/>
+        </w:rPr>
+        <w:t xml:space="preserve"> 80% </w:t>
+      </w:r>
+      <w:r>
+        <w:rPr>
+          <w:color w:val="000000"/>
+        </w:rPr>
+        <w:t>的交易日有有效收益。达不到，就把这条事件的</w:t>
+      </w:r>
+      <w:r>
+        <w:rPr>
+          <w:color w:val="000000"/>
+        </w:rPr>
+        <w:t xml:space="preserve"> CAR </w:t>
+      </w:r>
+      <w:r>
+        <w:rPr>
+          <w:color w:val="000000"/>
+        </w:rPr>
+        <w:t>记为缺失，并写明原因，例如「有效观测不足</w:t>
+      </w:r>
+      <w:r>
+        <w:rPr>
+          <w:color w:val="000000"/>
+        </w:rPr>
+        <w:t xml:space="preserve"> 7/11</w:t>
+      </w:r>
+      <w:r>
+        <w:rPr>
+          <w:color w:val="000000"/>
+        </w:rPr>
+        <w:t>」。</w:t>
+      </w:r>
+    </w:p>
+    <w:p>
+      <w:r>
+        <w:rPr>
+          <w:color w:val="000000"/>
+        </w:rPr>
+        <w:t>举例：窗口</w:t>
+      </w:r>
+      <w:r>
+        <w:rPr>
+          <w:color w:val="000000"/>
+        </w:rPr>
+        <w:t xml:space="preserve"> [-1,+1] </w:t>
+      </w:r>
+      <w:r>
+        <w:rPr>
+          <w:color w:val="000000"/>
+        </w:rPr>
+        <w:t>有</w:t>
+      </w:r>
+      <w:r>
+        <w:rPr>
+          <w:color w:val="000000"/>
+        </w:rPr>
+        <w:t xml:space="preserve"> 3 </w:t>
+      </w:r>
+      <w:r>
+        <w:rPr>
+          <w:color w:val="000000"/>
+        </w:rPr>
+        <w:t>个交易日，其中</w:t>
+      </w:r>
+      <w:r>
+        <w:rPr>
+          <w:color w:val="000000"/>
+        </w:rPr>
+        <w:t xml:space="preserve"> +1 </w:t>
+      </w:r>
+      <w:r>
+        <w:rPr>
+          <w:color w:val="000000"/>
+        </w:rPr>
+        <w:t>停牌，有效</w:t>
+      </w:r>
+      <w:r>
+        <w:rPr>
+          <w:color w:val="000000"/>
+        </w:rPr>
+        <w:t xml:space="preserve"> 2/3=67%</w:t>
+      </w:r>
+      <w:r>
+        <w:rPr>
+          <w:color w:val="000000"/>
+        </w:rPr>
+        <w:t>，低于</w:t>
+      </w:r>
+      <w:r>
+        <w:rPr>
+          <w:color w:val="000000"/>
+        </w:rPr>
+        <w:t xml:space="preserve"> 80%</w:t>
+      </w:r>
+      <w:r>
+        <w:rPr>
+          <w:color w:val="000000"/>
+        </w:rPr>
+        <w:t>，</w:t>
+      </w:r>
+      <w:r>
+        <w:rPr>
+          <w:color w:val="000000"/>
+        </w:rPr>
+        <w:t xml:space="preserve">CAR </w:t>
+      </w:r>
+      <w:r>
+        <w:rPr>
+          <w:color w:val="000000"/>
+        </w:rPr>
+        <w:t>记缺失；窗口</w:t>
+      </w:r>
+      <w:r>
+        <w:rPr>
+          <w:color w:val="000000"/>
+        </w:rPr>
+        <w:t xml:space="preserve"> [-5,+5] </w:t>
+      </w:r>
+      <w:r>
+        <w:rPr>
+          <w:color w:val="000000"/>
+        </w:rPr>
+        <w:t>有</w:t>
+      </w:r>
+      <w:r>
+        <w:rPr>
+          <w:color w:val="000000"/>
+        </w:rPr>
+        <w:t xml:space="preserve"> 11 </w:t>
+      </w:r>
+      <w:r>
+        <w:rPr>
+          <w:color w:val="000000"/>
+        </w:rPr>
+        <w:t>个交易日，停牌</w:t>
+      </w:r>
+      <w:r>
+        <w:rPr>
+          <w:color w:val="000000"/>
+        </w:rPr>
+        <w:t xml:space="preserve"> 2 </w:t>
+      </w:r>
+      <w:r>
+        <w:rPr>
+          <w:color w:val="000000"/>
+        </w:rPr>
+        <w:t>天，有效</w:t>
+      </w:r>
+      <w:r>
+        <w:rPr>
+          <w:color w:val="000000"/>
+        </w:rPr>
+        <w:t xml:space="preserve"> 9/11=82%</w:t>
+      </w:r>
+      <w:r>
+        <w:rPr>
+          <w:color w:val="000000"/>
+        </w:rPr>
+        <w:t>，</w:t>
+      </w:r>
+      <w:r>
+        <w:rPr>
+          <w:color w:val="000000"/>
+        </w:rPr>
+        <w:t xml:space="preserve">CAR </w:t>
+      </w:r>
+      <w:r>
+        <w:rPr>
+          <w:color w:val="000000"/>
+        </w:rPr>
+        <w:t>用</w:t>
+      </w:r>
+      <w:r>
+        <w:rPr>
+          <w:color w:val="000000"/>
+        </w:rPr>
+        <w:t xml:space="preserve"> 9 </w:t>
+      </w:r>
+      <w:r>
+        <w:rPr>
+          <w:color w:val="000000"/>
+        </w:rPr>
+        <w:t>天算，同时记录有效数。</w:t>
+      </w:r>
+    </w:p>
+    <w:p>
+      <w:r>
+        <w:rPr>
+          <w:color w:val="000000"/>
+        </w:rPr>
+        <w:t>为什么不把停牌事件整条删掉：停牌往往和重组、并购、退市风险同时发生，正是反应最极端的样本；整体删掉等于只留温和股票，会引入选择偏差。主口径保留，另做一版「窗口内出现停牌就整条剔除」的稳健性对比，用行情里的</w:t>
+      </w:r>
+      <w:r>
+        <w:rPr>
+          <w:color w:val="000000"/>
+        </w:rPr>
+        <w:t xml:space="preserve"> </w:t>
+      </w:r>
+      <w:r>
+        <w:rPr>
+          <w:rFonts w:ascii="Consolas" w:hAnsi="Consolas"/>
+          <w:color w:val="000000"/>
+          <w:sz w:val="22"/>
+        </w:rPr>
+        <w:t>StateCode</w:t>
+      </w:r>
+      <w:r>
+        <w:rPr>
+          <w:color w:val="000000"/>
+        </w:rPr>
+        <w:t xml:space="preserve"> </w:t>
+      </w:r>
+      <w:r>
+        <w:rPr>
+          <w:color w:val="000000"/>
+        </w:rPr>
+        <w:t>与</w:t>
+      </w:r>
+      <w:r>
+        <w:rPr>
+          <w:color w:val="000000"/>
+        </w:rPr>
+        <w:t xml:space="preserve"> </w:t>
+      </w:r>
+      <w:r>
+        <w:rPr>
+          <w:rFonts w:ascii="Consolas" w:hAnsi="Consolas"/>
+          <w:color w:val="000000"/>
+          <w:sz w:val="22"/>
+        </w:rPr>
+        <w:t>Filling</w:t>
+      </w:r>
+      <w:r>
+        <w:rPr>
+          <w:color w:val="000000"/>
+        </w:rPr>
+        <w:t xml:space="preserve"> </w:t>
+      </w:r>
+      <w:r>
+        <w:rPr>
+          <w:color w:val="000000"/>
+        </w:rPr>
+        <w:t>识别停牌（两列各有</w:t>
+      </w:r>
+      <w:r>
+        <w:rPr>
+          <w:color w:val="000000"/>
+        </w:rPr>
+        <w:t xml:space="preserve"> 43,830 </w:t>
+      </w:r>
+      <w:r>
+        <w:rPr>
+          <w:color w:val="000000"/>
+        </w:rPr>
+        <w:t>行为</w:t>
+      </w:r>
+      <w:r>
+        <w:rPr>
+          <w:color w:val="000000"/>
+        </w:rPr>
+        <w:t xml:space="preserve"> 1</w:t>
+      </w:r>
+      <w:r>
+        <w:rPr>
+          <w:color w:val="000000"/>
+        </w:rPr>
+        <w:t>，成交量和涨跌幅为空），看结论是否变化。</w:t>
+      </w:r>
+    </w:p>
+    <w:p>
+      <w:r>
+        <w:rPr>
+          <w:color w:val="000000"/>
+        </w:rPr>
+        <w:t>成交量同理：事件日当天的异常成交量，基准窗口</w:t>
+      </w:r>
+      <w:r>
+        <w:rPr>
+          <w:color w:val="000000"/>
+        </w:rPr>
+        <w:t xml:space="preserve"> [-120,-11] </w:t>
+      </w:r>
+      <w:r>
+        <w:rPr>
+          <w:color w:val="000000"/>
+        </w:rPr>
+        <w:t>至少要有</w:t>
+      </w:r>
+      <w:r>
+        <w:rPr>
+          <w:color w:val="000000"/>
+        </w:rPr>
+        <w:t xml:space="preserve"> 60 </w:t>
+      </w:r>
+      <w:r>
+        <w:rPr>
+          <w:color w:val="000000"/>
+        </w:rPr>
+        <w:t>个有效位置，不足则</w:t>
+      </w:r>
+      <w:r>
+        <w:rPr>
+          <w:color w:val="000000"/>
+        </w:rPr>
+        <w:t xml:space="preserve"> AV </w:t>
+      </w:r>
+      <w:r>
+        <w:rPr>
+          <w:color w:val="000000"/>
+        </w:rPr>
+        <w:t>记缺失。</w:t>
       </w:r>
     </w:p>
     <w:p>
@@ -14360,7 +14733,7 @@
         <w:pStyle w:val="21"/>
         <w:spacing w:after="120"/>
       </w:pPr>
-      <w:bookmarkStart w:id="32" w:name="_Toc243226868"/>
+      <w:bookmarkStart w:id="32" w:name="_Toc243227574"/>
       <w:r>
         <w:rPr>
           <w:rFonts w:ascii="Times New Roman" w:eastAsia="黑体" w:hAnsi="Times New Roman"/>
@@ -15368,7 +15741,7 @@
         <w:pStyle w:val="21"/>
         <w:spacing w:after="120"/>
       </w:pPr>
-      <w:bookmarkStart w:id="33" w:name="_Toc243226869"/>
+      <w:bookmarkStart w:id="33" w:name="_Toc243227575"/>
       <w:r>
         <w:rPr>
           <w:rFonts w:ascii="Times New Roman" w:eastAsia="黑体" w:hAnsi="Times New Roman"/>
@@ -16853,7 +17226,7 @@
         <w:pStyle w:val="21"/>
         <w:spacing w:after="120"/>
       </w:pPr>
-      <w:bookmarkStart w:id="34" w:name="_Toc243226870"/>
+      <w:bookmarkStart w:id="34" w:name="_Toc243227576"/>
       <w:r>
         <w:rPr>
           <w:rFonts w:ascii="Times New Roman" w:eastAsia="黑体" w:hAnsi="Times New Roman"/>
@@ -16895,7 +17268,7 @@
         <w:rPr>
           <w:color w:val="000000"/>
         </w:rPr>
-        <w:t xml:space="preserve"> 20,246 </w:t>
+        <w:t xml:space="preserve"> 20,248 </w:t>
       </w:r>
       <w:r>
         <w:rPr>
@@ -16931,7 +17304,7 @@
         <w:rPr>
           <w:color w:val="000000"/>
         </w:rPr>
-        <w:t xml:space="preserve"> 20,065 </w:t>
+        <w:t xml:space="preserve"> 20,067 </w:t>
       </w:r>
       <w:r>
         <w:rPr>
@@ -17780,7 +18153,7 @@
         <w:pStyle w:val="21"/>
         <w:spacing w:after="120"/>
       </w:pPr>
-      <w:bookmarkStart w:id="35" w:name="_Toc243226871"/>
+      <w:bookmarkStart w:id="35" w:name="_Toc243227577"/>
       <w:r>
         <w:rPr>
           <w:rFonts w:ascii="Times New Roman" w:eastAsia="黑体" w:hAnsi="Times New Roman"/>
@@ -19190,7 +19563,7 @@
                 <w:color w:val="000000"/>
                 <w:sz w:val="21"/>
               </w:rPr>
-              <w:t>p=0.534</w:t>
+              <w:t>p=0.538</w:t>
             </w:r>
             <w:r>
               <w:rPr>
@@ -19389,7 +19762,7 @@
         <w:pStyle w:val="1"/>
         <w:spacing w:before="280" w:after="120"/>
       </w:pPr>
-      <w:bookmarkStart w:id="36" w:name="_Toc243226872"/>
+      <w:bookmarkStart w:id="36" w:name="_Toc243227578"/>
       <w:r>
         <w:rPr>
           <w:rFonts w:ascii="Times New Roman" w:eastAsia="黑体" w:hAnsi="Times New Roman"/>
@@ -19769,7 +20142,7 @@
         <w:pStyle w:val="21"/>
         <w:spacing w:after="120"/>
       </w:pPr>
-      <w:bookmarkStart w:id="37" w:name="_Toc243226873"/>
+      <w:bookmarkStart w:id="37" w:name="_Toc243227579"/>
       <w:r>
         <w:rPr>
           <w:rFonts w:ascii="Times New Roman" w:eastAsia="黑体" w:hAnsi="Times New Roman"/>
@@ -20725,7 +21098,7 @@
         <w:pStyle w:val="1"/>
         <w:spacing w:before="280" w:after="120"/>
       </w:pPr>
-      <w:bookmarkStart w:id="38" w:name="_Toc243226874"/>
+      <w:bookmarkStart w:id="38" w:name="_Toc243227580"/>
       <w:r>
         <w:rPr>
           <w:rFonts w:ascii="Times New Roman" w:eastAsia="黑体" w:hAnsi="Times New Roman"/>
@@ -21013,7 +21386,7 @@
         <w:pStyle w:val="1"/>
         <w:spacing w:before="280" w:after="120"/>
       </w:pPr>
-      <w:bookmarkStart w:id="39" w:name="_Toc243226875"/>
+      <w:bookmarkStart w:id="39" w:name="_Toc243227581"/>
       <w:r>
         <w:rPr>
           <w:rFonts w:ascii="Times New Roman" w:eastAsia="黑体" w:hAnsi="Times New Roman"/>
@@ -21769,31 +22142,31 @@
       </w:rPr>
     </w:lvl>
   </w:abstractNum>
-  <w:num w:numId="1" w16cid:durableId="219638505">
+  <w:num w:numId="1" w16cid:durableId="1523930057">
     <w:abstractNumId w:val="8"/>
   </w:num>
-  <w:num w:numId="2" w16cid:durableId="382096913">
+  <w:num w:numId="2" w16cid:durableId="1352142230">
     <w:abstractNumId w:val="6"/>
   </w:num>
-  <w:num w:numId="3" w16cid:durableId="651447160">
+  <w:num w:numId="3" w16cid:durableId="485442007">
     <w:abstractNumId w:val="5"/>
   </w:num>
-  <w:num w:numId="4" w16cid:durableId="1035229352">
+  <w:num w:numId="4" w16cid:durableId="1236622686">
     <w:abstractNumId w:val="4"/>
   </w:num>
-  <w:num w:numId="5" w16cid:durableId="1267998730">
+  <w:num w:numId="5" w16cid:durableId="911698052">
     <w:abstractNumId w:val="7"/>
   </w:num>
-  <w:num w:numId="6" w16cid:durableId="2121483951">
+  <w:num w:numId="6" w16cid:durableId="1150974603">
     <w:abstractNumId w:val="3"/>
   </w:num>
-  <w:num w:numId="7" w16cid:durableId="299766558">
+  <w:num w:numId="7" w16cid:durableId="503057749">
     <w:abstractNumId w:val="2"/>
   </w:num>
-  <w:num w:numId="8" w16cid:durableId="250237410">
+  <w:num w:numId="8" w16cid:durableId="1184828565">
     <w:abstractNumId w:val="1"/>
   </w:num>
-  <w:num w:numId="9" w16cid:durableId="1107315364">
+  <w:num w:numId="9" w16cid:durableId="376928521">
     <w:abstractNumId w:val="0"/>
   </w:num>
 </w:numbering>
@@ -33192,7 +33565,7 @@
     <w:autoRedefine/>
     <w:uiPriority w:val="39"/>
     <w:unhideWhenUsed/>
-    <w:rsid w:val="00473B39"/>
+    <w:rsid w:val="00CF1616"/>
   </w:style>
   <w:style w:type="paragraph" w:styleId="TOC2">
     <w:name w:val="toc 2"/>
@@ -33201,7 +33574,7 @@
     <w:autoRedefine/>
     <w:uiPriority w:val="39"/>
     <w:unhideWhenUsed/>
-    <w:rsid w:val="00473B39"/>
+    <w:rsid w:val="00CF1616"/>
     <w:pPr>
       <w:ind w:leftChars="200" w:left="420"/>
     </w:pPr>
@@ -33211,7 +33584,7 @@
     <w:basedOn w:val="a2"/>
     <w:uiPriority w:val="99"/>
     <w:unhideWhenUsed/>
-    <w:rsid w:val="00473B39"/>
+    <w:rsid w:val="00CF1616"/>
     <w:rPr>
       <w:color w:val="0000FF" w:themeColor="hyperlink"/>
       <w:u w:val="single"/>

</xml_diff>

<commit_message>
Add the suspension robustness check and finalize the memo
Dropping events with a suspension day in the window leaves the upgrade premium
significant and the downgrade premium insignificant. The memo records the
direction-split table; the README and ignore rules cover the new script and CSV.

Co-Authored-By: Claude Code <noreply@anthropic.com>
</commit_message>
<xml_diff>
--- a/文档/项目进度与技术备忘_20261018.docx
+++ b/文档/项目进度与技术备忘_20261018.docx
@@ -118,7 +118,7 @@
         </w:rPr>
         <w:fldChar w:fldCharType="separate"/>
       </w:r>
-      <w:hyperlink w:anchor="_Toc243227542" w:history="1">
+      <w:hyperlink w:anchor="_Toc243227776" w:history="1">
         <w:r>
           <w:rPr>
             <w:rStyle w:val="aff9"/>
@@ -180,7 +180,7 @@
             <w:noProof/>
             <w:webHidden/>
           </w:rPr>
-          <w:instrText>PAGEREF _Toc243227542 \h</w:instrText>
+          <w:instrText>PAGEREF _Toc243227776 \h</w:instrText>
         </w:r>
         <w:r>
           <w:rPr>
@@ -238,7 +238,7 @@
           <w14:ligatures w14:val="standardContextual"/>
         </w:rPr>
       </w:pPr>
-      <w:hyperlink w:anchor="_Toc243227543" w:history="1">
+      <w:hyperlink w:anchor="_Toc243227777" w:history="1">
         <w:r>
           <w:rPr>
             <w:rStyle w:val="aff9"/>
@@ -284,7 +284,7 @@
             <w:noProof/>
             <w:webHidden/>
           </w:rPr>
-          <w:instrText>PAGEREF _Toc243227543 \h</w:instrText>
+          <w:instrText>PAGEREF _Toc243227777 \h</w:instrText>
         </w:r>
         <w:r>
           <w:rPr>
@@ -343,7 +343,7 @@
           <w14:ligatures w14:val="standardContextual"/>
         </w:rPr>
       </w:pPr>
-      <w:hyperlink w:anchor="_Toc243227544" w:history="1">
+      <w:hyperlink w:anchor="_Toc243227778" w:history="1">
         <w:r>
           <w:rPr>
             <w:rStyle w:val="aff9"/>
@@ -389,7 +389,7 @@
             <w:noProof/>
             <w:webHidden/>
           </w:rPr>
-          <w:instrText>PAGEREF _Toc243227544 \h</w:instrText>
+          <w:instrText>PAGEREF _Toc243227778 \h</w:instrText>
         </w:r>
         <w:r>
           <w:rPr>
@@ -448,7 +448,7 @@
           <w14:ligatures w14:val="standardContextual"/>
         </w:rPr>
       </w:pPr>
-      <w:hyperlink w:anchor="_Toc243227545" w:history="1">
+      <w:hyperlink w:anchor="_Toc243227779" w:history="1">
         <w:r>
           <w:rPr>
             <w:rStyle w:val="aff9"/>
@@ -494,7 +494,7 @@
             <w:noProof/>
             <w:webHidden/>
           </w:rPr>
-          <w:instrText>PAGEREF _Toc243227545 \h</w:instrText>
+          <w:instrText>PAGEREF _Toc243227779 \h</w:instrText>
         </w:r>
         <w:r>
           <w:rPr>
@@ -553,7 +553,7 @@
           <w14:ligatures w14:val="standardContextual"/>
         </w:rPr>
       </w:pPr>
-      <w:hyperlink w:anchor="_Toc243227546" w:history="1">
+      <w:hyperlink w:anchor="_Toc243227780" w:history="1">
         <w:r>
           <w:rPr>
             <w:rStyle w:val="aff9"/>
@@ -599,7 +599,7 @@
             <w:noProof/>
             <w:webHidden/>
           </w:rPr>
-          <w:instrText>PAGEREF _Toc243227546 \h</w:instrText>
+          <w:instrText>PAGEREF _Toc243227780 \h</w:instrText>
         </w:r>
         <w:r>
           <w:rPr>
@@ -658,7 +658,7 @@
           <w14:ligatures w14:val="standardContextual"/>
         </w:rPr>
       </w:pPr>
-      <w:hyperlink w:anchor="_Toc243227547" w:history="1">
+      <w:hyperlink w:anchor="_Toc243227781" w:history="1">
         <w:r>
           <w:rPr>
             <w:rStyle w:val="aff9"/>
@@ -704,7 +704,7 @@
             <w:noProof/>
             <w:webHidden/>
           </w:rPr>
-          <w:instrText>PAGEREF _Toc243227547 \h</w:instrText>
+          <w:instrText>PAGEREF _Toc243227781 \h</w:instrText>
         </w:r>
         <w:r>
           <w:rPr>
@@ -763,7 +763,7 @@
           <w14:ligatures w14:val="standardContextual"/>
         </w:rPr>
       </w:pPr>
-      <w:hyperlink w:anchor="_Toc243227548" w:history="1">
+      <w:hyperlink w:anchor="_Toc243227782" w:history="1">
         <w:r>
           <w:rPr>
             <w:rStyle w:val="aff9"/>
@@ -809,7 +809,7 @@
             <w:noProof/>
             <w:webHidden/>
           </w:rPr>
-          <w:instrText>PAGEREF _Toc243227548 \h</w:instrText>
+          <w:instrText>PAGEREF _Toc243227782 \h</w:instrText>
         </w:r>
         <w:r>
           <w:rPr>
@@ -868,7 +868,7 @@
           <w14:ligatures w14:val="standardContextual"/>
         </w:rPr>
       </w:pPr>
-      <w:hyperlink w:anchor="_Toc243227549" w:history="1">
+      <w:hyperlink w:anchor="_Toc243227783" w:history="1">
         <w:r>
           <w:rPr>
             <w:rStyle w:val="aff9"/>
@@ -914,7 +914,7 @@
             <w:noProof/>
             <w:webHidden/>
           </w:rPr>
-          <w:instrText>PAGEREF _Toc243227549 \h</w:instrText>
+          <w:instrText>PAGEREF _Toc243227783 \h</w:instrText>
         </w:r>
         <w:r>
           <w:rPr>
@@ -973,7 +973,7 @@
           <w14:ligatures w14:val="standardContextual"/>
         </w:rPr>
       </w:pPr>
-      <w:hyperlink w:anchor="_Toc243227550" w:history="1">
+      <w:hyperlink w:anchor="_Toc243227784" w:history="1">
         <w:r>
           <w:rPr>
             <w:rStyle w:val="aff9"/>
@@ -1019,7 +1019,7 @@
             <w:noProof/>
             <w:webHidden/>
           </w:rPr>
-          <w:instrText>PAGEREF _Toc243227550 \h</w:instrText>
+          <w:instrText>PAGEREF _Toc243227784 \h</w:instrText>
         </w:r>
         <w:r>
           <w:rPr>
@@ -1077,7 +1077,7 @@
           <w14:ligatures w14:val="standardContextual"/>
         </w:rPr>
       </w:pPr>
-      <w:hyperlink w:anchor="_Toc243227551" w:history="1">
+      <w:hyperlink w:anchor="_Toc243227785" w:history="1">
         <w:r>
           <w:rPr>
             <w:rStyle w:val="aff9"/>
@@ -1123,7 +1123,7 @@
             <w:noProof/>
             <w:webHidden/>
           </w:rPr>
-          <w:instrText>PAGEREF _Toc243227551 \h</w:instrText>
+          <w:instrText>PAGEREF _Toc243227785 \h</w:instrText>
         </w:r>
         <w:r>
           <w:rPr>
@@ -1181,7 +1181,7 @@
           <w14:ligatures w14:val="standardContextual"/>
         </w:rPr>
       </w:pPr>
-      <w:hyperlink w:anchor="_Toc243227552" w:history="1">
+      <w:hyperlink w:anchor="_Toc243227786" w:history="1">
         <w:r>
           <w:rPr>
             <w:rStyle w:val="aff9"/>
@@ -1227,7 +1227,7 @@
             <w:noProof/>
             <w:webHidden/>
           </w:rPr>
-          <w:instrText>PAGEREF _Toc243227552 \h</w:instrText>
+          <w:instrText>PAGEREF _Toc243227786 \h</w:instrText>
         </w:r>
         <w:r>
           <w:rPr>
@@ -1257,7 +1257,7 @@
             <w:noProof/>
             <w:webHidden/>
           </w:rPr>
-          <w:t>4</w:t>
+          <w:t>5</w:t>
         </w:r>
         <w:r>
           <w:rPr>
@@ -1285,7 +1285,7 @@
           <w14:ligatures w14:val="standardContextual"/>
         </w:rPr>
       </w:pPr>
-      <w:hyperlink w:anchor="_Toc243227553" w:history="1">
+      <w:hyperlink w:anchor="_Toc243227787" w:history="1">
         <w:r>
           <w:rPr>
             <w:rStyle w:val="aff9"/>
@@ -1331,7 +1331,7 @@
             <w:noProof/>
             <w:webHidden/>
           </w:rPr>
-          <w:instrText>PAGEREF _Toc243227553 \h</w:instrText>
+          <w:instrText>PAGEREF _Toc243227787 \h</w:instrText>
         </w:r>
         <w:r>
           <w:rPr>
@@ -1389,7 +1389,7 @@
           <w14:ligatures w14:val="standardContextual"/>
         </w:rPr>
       </w:pPr>
-      <w:hyperlink w:anchor="_Toc243227554" w:history="1">
+      <w:hyperlink w:anchor="_Toc243227788" w:history="1">
         <w:r>
           <w:rPr>
             <w:rStyle w:val="aff9"/>
@@ -1435,7 +1435,7 @@
             <w:noProof/>
             <w:webHidden/>
           </w:rPr>
-          <w:instrText>PAGEREF _Toc243227554 \h</w:instrText>
+          <w:instrText>PAGEREF _Toc243227788 \h</w:instrText>
         </w:r>
         <w:r>
           <w:rPr>
@@ -1493,7 +1493,7 @@
           <w14:ligatures w14:val="standardContextual"/>
         </w:rPr>
       </w:pPr>
-      <w:hyperlink w:anchor="_Toc243227555" w:history="1">
+      <w:hyperlink w:anchor="_Toc243227789" w:history="1">
         <w:r>
           <w:rPr>
             <w:rStyle w:val="aff9"/>
@@ -1539,7 +1539,7 @@
             <w:noProof/>
             <w:webHidden/>
           </w:rPr>
-          <w:instrText>PAGEREF _Toc243227555 \h</w:instrText>
+          <w:instrText>PAGEREF _Toc243227789 \h</w:instrText>
         </w:r>
         <w:r>
           <w:rPr>
@@ -1598,7 +1598,7 @@
           <w14:ligatures w14:val="standardContextual"/>
         </w:rPr>
       </w:pPr>
-      <w:hyperlink w:anchor="_Toc243227556" w:history="1">
+      <w:hyperlink w:anchor="_Toc243227790" w:history="1">
         <w:r>
           <w:rPr>
             <w:rStyle w:val="aff9"/>
@@ -1644,7 +1644,7 @@
             <w:noProof/>
             <w:webHidden/>
           </w:rPr>
-          <w:instrText>PAGEREF _Toc243227556 \h</w:instrText>
+          <w:instrText>PAGEREF _Toc243227790 \h</w:instrText>
         </w:r>
         <w:r>
           <w:rPr>
@@ -1703,7 +1703,7 @@
           <w14:ligatures w14:val="standardContextual"/>
         </w:rPr>
       </w:pPr>
-      <w:hyperlink w:anchor="_Toc243227557" w:history="1">
+      <w:hyperlink w:anchor="_Toc243227791" w:history="1">
         <w:r>
           <w:rPr>
             <w:rStyle w:val="aff9"/>
@@ -1749,7 +1749,7 @@
             <w:noProof/>
             <w:webHidden/>
           </w:rPr>
-          <w:instrText>PAGEREF _Toc243227557 \h</w:instrText>
+          <w:instrText>PAGEREF _Toc243227791 \h</w:instrText>
         </w:r>
         <w:r>
           <w:rPr>
@@ -1808,7 +1808,7 @@
           <w14:ligatures w14:val="standardContextual"/>
         </w:rPr>
       </w:pPr>
-      <w:hyperlink w:anchor="_Toc243227558" w:history="1">
+      <w:hyperlink w:anchor="_Toc243227792" w:history="1">
         <w:r>
           <w:rPr>
             <w:rStyle w:val="aff9"/>
@@ -1854,7 +1854,7 @@
             <w:noProof/>
             <w:webHidden/>
           </w:rPr>
-          <w:instrText>PAGEREF _Toc243227558 \h</w:instrText>
+          <w:instrText>PAGEREF _Toc243227792 \h</w:instrText>
         </w:r>
         <w:r>
           <w:rPr>
@@ -1912,7 +1912,7 @@
           <w14:ligatures w14:val="standardContextual"/>
         </w:rPr>
       </w:pPr>
-      <w:hyperlink w:anchor="_Toc243227559" w:history="1">
+      <w:hyperlink w:anchor="_Toc243227793" w:history="1">
         <w:r>
           <w:rPr>
             <w:rStyle w:val="aff9"/>
@@ -1958,7 +1958,7 @@
             <w:noProof/>
             <w:webHidden/>
           </w:rPr>
-          <w:instrText>PAGEREF _Toc243227559 \h</w:instrText>
+          <w:instrText>PAGEREF _Toc243227793 \h</w:instrText>
         </w:r>
         <w:r>
           <w:rPr>
@@ -2017,7 +2017,7 @@
           <w14:ligatures w14:val="standardContextual"/>
         </w:rPr>
       </w:pPr>
-      <w:hyperlink w:anchor="_Toc243227560" w:history="1">
+      <w:hyperlink w:anchor="_Toc243227794" w:history="1">
         <w:r>
           <w:rPr>
             <w:rStyle w:val="aff9"/>
@@ -2063,7 +2063,7 @@
             <w:noProof/>
             <w:webHidden/>
           </w:rPr>
-          <w:instrText>PAGEREF _Toc243227560 \h</w:instrText>
+          <w:instrText>PAGEREF _Toc243227794 \h</w:instrText>
         </w:r>
         <w:r>
           <w:rPr>
@@ -2122,7 +2122,7 @@
           <w14:ligatures w14:val="standardContextual"/>
         </w:rPr>
       </w:pPr>
-      <w:hyperlink w:anchor="_Toc243227561" w:history="1">
+      <w:hyperlink w:anchor="_Toc243227795" w:history="1">
         <w:r>
           <w:rPr>
             <w:rStyle w:val="aff9"/>
@@ -2168,7 +2168,7 @@
             <w:noProof/>
             <w:webHidden/>
           </w:rPr>
-          <w:instrText>PAGEREF _Toc243227561 \h</w:instrText>
+          <w:instrText>PAGEREF _Toc243227795 \h</w:instrText>
         </w:r>
         <w:r>
           <w:rPr>
@@ -2227,7 +2227,7 @@
           <w14:ligatures w14:val="standardContextual"/>
         </w:rPr>
       </w:pPr>
-      <w:hyperlink w:anchor="_Toc243227562" w:history="1">
+      <w:hyperlink w:anchor="_Toc243227796" w:history="1">
         <w:r>
           <w:rPr>
             <w:rStyle w:val="aff9"/>
@@ -2273,7 +2273,7 @@
             <w:noProof/>
             <w:webHidden/>
           </w:rPr>
-          <w:instrText>PAGEREF _Toc243227562 \h</w:instrText>
+          <w:instrText>PAGEREF _Toc243227796 \h</w:instrText>
         </w:r>
         <w:r>
           <w:rPr>
@@ -2303,7 +2303,7 @@
             <w:noProof/>
             <w:webHidden/>
           </w:rPr>
-          <w:t>8</w:t>
+          <w:t>9</w:t>
         </w:r>
         <w:r>
           <w:rPr>
@@ -2332,7 +2332,7 @@
           <w14:ligatures w14:val="standardContextual"/>
         </w:rPr>
       </w:pPr>
-      <w:hyperlink w:anchor="_Toc243227563" w:history="1">
+      <w:hyperlink w:anchor="_Toc243227797" w:history="1">
         <w:r>
           <w:rPr>
             <w:rStyle w:val="aff9"/>
@@ -2378,7 +2378,7 @@
             <w:noProof/>
             <w:webHidden/>
           </w:rPr>
-          <w:instrText>PAGEREF _Toc243227563 \h</w:instrText>
+          <w:instrText>PAGEREF _Toc243227797 \h</w:instrText>
         </w:r>
         <w:r>
           <w:rPr>
@@ -2408,7 +2408,7 @@
             <w:noProof/>
             <w:webHidden/>
           </w:rPr>
-          <w:t>9</w:t>
+          <w:t>10</w:t>
         </w:r>
         <w:r>
           <w:rPr>
@@ -2437,7 +2437,7 @@
           <w14:ligatures w14:val="standardContextual"/>
         </w:rPr>
       </w:pPr>
-      <w:hyperlink w:anchor="_Toc243227564" w:history="1">
+      <w:hyperlink w:anchor="_Toc243227798" w:history="1">
         <w:r>
           <w:rPr>
             <w:rStyle w:val="aff9"/>
@@ -2483,7 +2483,7 @@
             <w:noProof/>
             <w:webHidden/>
           </w:rPr>
-          <w:instrText>PAGEREF _Toc243227564 \h</w:instrText>
+          <w:instrText>PAGEREF _Toc243227798 \h</w:instrText>
         </w:r>
         <w:r>
           <w:rPr>
@@ -2542,7 +2542,7 @@
           <w14:ligatures w14:val="standardContextual"/>
         </w:rPr>
       </w:pPr>
-      <w:hyperlink w:anchor="_Toc243227565" w:history="1">
+      <w:hyperlink w:anchor="_Toc243227799" w:history="1">
         <w:r>
           <w:rPr>
             <w:rStyle w:val="aff9"/>
@@ -2604,7 +2604,7 @@
             <w:noProof/>
             <w:webHidden/>
           </w:rPr>
-          <w:instrText>PAGEREF _Toc243227565 \h</w:instrText>
+          <w:instrText>PAGEREF _Toc243227799 \h</w:instrText>
         </w:r>
         <w:r>
           <w:rPr>
@@ -2663,7 +2663,7 @@
           <w14:ligatures w14:val="standardContextual"/>
         </w:rPr>
       </w:pPr>
-      <w:hyperlink w:anchor="_Toc243227566" w:history="1">
+      <w:hyperlink w:anchor="_Toc243227800" w:history="1">
         <w:r>
           <w:rPr>
             <w:rStyle w:val="aff9"/>
@@ -2709,7 +2709,7 @@
             <w:noProof/>
             <w:webHidden/>
           </w:rPr>
-          <w:instrText>PAGEREF _Toc243227566 \h</w:instrText>
+          <w:instrText>PAGEREF _Toc243227800 \h</w:instrText>
         </w:r>
         <w:r>
           <w:rPr>
@@ -2768,7 +2768,7 @@
           <w14:ligatures w14:val="standardContextual"/>
         </w:rPr>
       </w:pPr>
-      <w:hyperlink w:anchor="_Toc243227567" w:history="1">
+      <w:hyperlink w:anchor="_Toc243227801" w:history="1">
         <w:r>
           <w:rPr>
             <w:rStyle w:val="aff9"/>
@@ -2814,7 +2814,7 @@
             <w:noProof/>
             <w:webHidden/>
           </w:rPr>
-          <w:instrText>PAGEREF _Toc243227567 \h</w:instrText>
+          <w:instrText>PAGEREF _Toc243227801 \h</w:instrText>
         </w:r>
         <w:r>
           <w:rPr>
@@ -2873,7 +2873,7 @@
           <w14:ligatures w14:val="standardContextual"/>
         </w:rPr>
       </w:pPr>
-      <w:hyperlink w:anchor="_Toc243227568" w:history="1">
+      <w:hyperlink w:anchor="_Toc243227802" w:history="1">
         <w:r>
           <w:rPr>
             <w:rStyle w:val="aff9"/>
@@ -2919,7 +2919,7 @@
             <w:noProof/>
             <w:webHidden/>
           </w:rPr>
-          <w:instrText>PAGEREF _Toc243227568 \h</w:instrText>
+          <w:instrText>PAGEREF _Toc243227802 \h</w:instrText>
         </w:r>
         <w:r>
           <w:rPr>
@@ -2978,7 +2978,7 @@
           <w14:ligatures w14:val="standardContextual"/>
         </w:rPr>
       </w:pPr>
-      <w:hyperlink w:anchor="_Toc243227569" w:history="1">
+      <w:hyperlink w:anchor="_Toc243227803" w:history="1">
         <w:r>
           <w:rPr>
             <w:rStyle w:val="aff9"/>
@@ -3024,7 +3024,7 @@
             <w:noProof/>
             <w:webHidden/>
           </w:rPr>
-          <w:instrText>PAGEREF _Toc243227569 \h</w:instrText>
+          <w:instrText>PAGEREF _Toc243227803 \h</w:instrText>
         </w:r>
         <w:r>
           <w:rPr>
@@ -3083,7 +3083,7 @@
           <w14:ligatures w14:val="standardContextual"/>
         </w:rPr>
       </w:pPr>
-      <w:hyperlink w:anchor="_Toc243227570" w:history="1">
+      <w:hyperlink w:anchor="_Toc243227804" w:history="1">
         <w:r>
           <w:rPr>
             <w:rStyle w:val="aff9"/>
@@ -3145,7 +3145,7 @@
             <w:noProof/>
             <w:webHidden/>
           </w:rPr>
-          <w:instrText>PAGEREF _Toc243227570 \h</w:instrText>
+          <w:instrText>PAGEREF _Toc243227804 \h</w:instrText>
         </w:r>
         <w:r>
           <w:rPr>
@@ -3204,7 +3204,7 @@
           <w14:ligatures w14:val="standardContextual"/>
         </w:rPr>
       </w:pPr>
-      <w:hyperlink w:anchor="_Toc243227571" w:history="1">
+      <w:hyperlink w:anchor="_Toc243227805" w:history="1">
         <w:r>
           <w:rPr>
             <w:rStyle w:val="aff9"/>
@@ -3250,7 +3250,7 @@
             <w:noProof/>
             <w:webHidden/>
           </w:rPr>
-          <w:instrText>PAGEREF _Toc243227571 \h</w:instrText>
+          <w:instrText>PAGEREF _Toc243227805 \h</w:instrText>
         </w:r>
         <w:r>
           <w:rPr>
@@ -3309,7 +3309,7 @@
           <w14:ligatures w14:val="standardContextual"/>
         </w:rPr>
       </w:pPr>
-      <w:hyperlink w:anchor="_Toc243227572" w:history="1">
+      <w:hyperlink w:anchor="_Toc243227806" w:history="1">
         <w:r>
           <w:rPr>
             <w:rStyle w:val="aff9"/>
@@ -3355,7 +3355,7 @@
             <w:noProof/>
             <w:webHidden/>
           </w:rPr>
-          <w:instrText>PAGEREF _Toc243227572 \h</w:instrText>
+          <w:instrText>PAGEREF _Toc243227806 \h</w:instrText>
         </w:r>
         <w:r>
           <w:rPr>
@@ -3413,7 +3413,7 @@
           <w14:ligatures w14:val="standardContextual"/>
         </w:rPr>
       </w:pPr>
-      <w:hyperlink w:anchor="_Toc243227573" w:history="1">
+      <w:hyperlink w:anchor="_Toc243227807" w:history="1">
         <w:r>
           <w:rPr>
             <w:rStyle w:val="aff9"/>
@@ -3467,7 +3467,7 @@
             <w:noProof/>
             <w:webHidden/>
           </w:rPr>
-          <w:instrText>PAGEREF _Toc243227573 \h</w:instrText>
+          <w:instrText>PAGEREF _Toc243227807 \h</w:instrText>
         </w:r>
         <w:r>
           <w:rPr>
@@ -3526,7 +3526,7 @@
           <w14:ligatures w14:val="standardContextual"/>
         </w:rPr>
       </w:pPr>
-      <w:hyperlink w:anchor="_Toc243227574" w:history="1">
+      <w:hyperlink w:anchor="_Toc243227808" w:history="1">
         <w:r>
           <w:rPr>
             <w:rStyle w:val="aff9"/>
@@ -3588,7 +3588,7 @@
             <w:noProof/>
             <w:webHidden/>
           </w:rPr>
-          <w:instrText>PAGEREF _Toc243227574 \h</w:instrText>
+          <w:instrText>PAGEREF _Toc243227808 \h</w:instrText>
         </w:r>
         <w:r>
           <w:rPr>
@@ -3647,7 +3647,7 @@
           <w14:ligatures w14:val="standardContextual"/>
         </w:rPr>
       </w:pPr>
-      <w:hyperlink w:anchor="_Toc243227575" w:history="1">
+      <w:hyperlink w:anchor="_Toc243227809" w:history="1">
         <w:r>
           <w:rPr>
             <w:rStyle w:val="aff9"/>
@@ -3709,7 +3709,7 @@
             <w:noProof/>
             <w:webHidden/>
           </w:rPr>
-          <w:instrText>PAGEREF _Toc243227575 \h</w:instrText>
+          <w:instrText>PAGEREF _Toc243227809 \h</w:instrText>
         </w:r>
         <w:r>
           <w:rPr>
@@ -3768,7 +3768,7 @@
           <w14:ligatures w14:val="standardContextual"/>
         </w:rPr>
       </w:pPr>
-      <w:hyperlink w:anchor="_Toc243227576" w:history="1">
+      <w:hyperlink w:anchor="_Toc243227810" w:history="1">
         <w:r>
           <w:rPr>
             <w:rStyle w:val="aff9"/>
@@ -3830,7 +3830,7 @@
             <w:noProof/>
             <w:webHidden/>
           </w:rPr>
-          <w:instrText>PAGEREF _Toc243227576 \h</w:instrText>
+          <w:instrText>PAGEREF _Toc243227810 \h</w:instrText>
         </w:r>
         <w:r>
           <w:rPr>
@@ -3889,7 +3889,7 @@
           <w14:ligatures w14:val="standardContextual"/>
         </w:rPr>
       </w:pPr>
-      <w:hyperlink w:anchor="_Toc243227577" w:history="1">
+      <w:hyperlink w:anchor="_Toc243227811" w:history="1">
         <w:r>
           <w:rPr>
             <w:rStyle w:val="aff9"/>
@@ -3967,7 +3967,7 @@
             <w:noProof/>
             <w:webHidden/>
           </w:rPr>
-          <w:instrText>PAGEREF _Toc243227577 \h</w:instrText>
+          <w:instrText>PAGEREF _Toc243227811 \h</w:instrText>
         </w:r>
         <w:r>
           <w:rPr>
@@ -3998,110 +3998,6 @@
             <w:webHidden/>
           </w:rPr>
           <w:t>14</w:t>
-        </w:r>
-        <w:r>
-          <w:rPr>
-            <w:rFonts w:hint="eastAsia"/>
-            <w:noProof/>
-            <w:webHidden/>
-          </w:rPr>
-          <w:fldChar w:fldCharType="end"/>
-        </w:r>
-      </w:hyperlink>
-    </w:p>
-    <w:p>
-      <w:pPr>
-        <w:pStyle w:val="TOC1"/>
-        <w:tabs>
-          <w:tab w:val="right" w:leader="dot" w:pos="9402"/>
-        </w:tabs>
-        <w:rPr>
-          <w:rFonts w:asciiTheme="minorHAnsi" w:eastAsiaTheme="minorEastAsia" w:hAnsiTheme="minorHAnsi" w:hint="eastAsia"/>
-          <w:noProof/>
-          <w:kern w:val="2"/>
-          <w:sz w:val="22"/>
-          <w:szCs w:val="24"/>
-          <w:lang w:eastAsia="zh-CN"/>
-          <w14:ligatures w14:val="standardContextual"/>
-        </w:rPr>
-      </w:pPr>
-      <w:hyperlink w:anchor="_Toc243227578" w:history="1">
-        <w:r>
-          <w:rPr>
-            <w:rStyle w:val="aff9"/>
-            <w:rFonts w:eastAsia="黑体"/>
-            <w:noProof/>
-          </w:rPr>
-          <w:t xml:space="preserve">9. </w:t>
-        </w:r>
-        <w:r>
-          <w:rPr>
-            <w:rStyle w:val="aff9"/>
-            <w:rFonts w:eastAsia="黑体"/>
-            <w:noProof/>
-          </w:rPr>
-          <w:t>与乙的边界和交接状态</w:t>
-        </w:r>
-        <w:r>
-          <w:rPr>
-            <w:rFonts w:hint="eastAsia"/>
-            <w:noProof/>
-            <w:webHidden/>
-          </w:rPr>
-          <w:tab/>
-        </w:r>
-        <w:r>
-          <w:rPr>
-            <w:rFonts w:hint="eastAsia"/>
-            <w:noProof/>
-            <w:webHidden/>
-          </w:rPr>
-          <w:fldChar w:fldCharType="begin"/>
-        </w:r>
-        <w:r>
-          <w:rPr>
-            <w:rFonts w:hint="eastAsia"/>
-            <w:noProof/>
-            <w:webHidden/>
-          </w:rPr>
-          <w:instrText xml:space="preserve"> </w:instrText>
-        </w:r>
-        <w:r>
-          <w:rPr>
-            <w:noProof/>
-            <w:webHidden/>
-          </w:rPr>
-          <w:instrText>PAGEREF _Toc243227578 \h</w:instrText>
-        </w:r>
-        <w:r>
-          <w:rPr>
-            <w:rFonts w:hint="eastAsia"/>
-            <w:noProof/>
-            <w:webHidden/>
-          </w:rPr>
-          <w:instrText xml:space="preserve"> </w:instrText>
-        </w:r>
-        <w:r>
-          <w:rPr>
-            <w:rFonts w:hint="eastAsia"/>
-            <w:noProof/>
-            <w:webHidden/>
-          </w:rPr>
-        </w:r>
-        <w:r>
-          <w:rPr>
-            <w:rFonts w:hint="eastAsia"/>
-            <w:noProof/>
-            <w:webHidden/>
-          </w:rPr>
-          <w:fldChar w:fldCharType="separate"/>
-        </w:r>
-        <w:r>
-          <w:rPr>
-            <w:noProof/>
-            <w:webHidden/>
-          </w:rPr>
-          <w:t>15</w:t>
         </w:r>
         <w:r>
           <w:rPr>
@@ -4130,14 +4026,14 @@
           <w14:ligatures w14:val="standardContextual"/>
         </w:rPr>
       </w:pPr>
-      <w:hyperlink w:anchor="_Toc243227579" w:history="1">
+      <w:hyperlink w:anchor="_Toc243227812" w:history="1">
         <w:r>
           <w:rPr>
             <w:rStyle w:val="aff9"/>
             <w:rFonts w:eastAsia="黑体"/>
             <w:noProof/>
           </w:rPr>
-          <w:t xml:space="preserve">9.1 </w:t>
+          <w:t xml:space="preserve">8.5 </w:t>
         </w:r>
         <w:r>
           <w:rPr>
@@ -4145,7 +4041,7 @@
             <w:rFonts w:eastAsia="黑体"/>
             <w:noProof/>
           </w:rPr>
-          <w:t>需要乙确认或交付的事项（</w:t>
+          <w:t>停牌稳健性（</w:t>
         </w:r>
         <w:r>
           <w:rPr>
@@ -4192,7 +4088,7 @@
             <w:noProof/>
             <w:webHidden/>
           </w:rPr>
-          <w:instrText>PAGEREF _Toc243227579 \h</w:instrText>
+          <w:instrText>PAGEREF _Toc243227812 \h</w:instrText>
         </w:r>
         <w:r>
           <w:rPr>
@@ -4250,14 +4146,14 @@
           <w14:ligatures w14:val="standardContextual"/>
         </w:rPr>
       </w:pPr>
-      <w:hyperlink w:anchor="_Toc243227580" w:history="1">
+      <w:hyperlink w:anchor="_Toc243227813" w:history="1">
         <w:r>
           <w:rPr>
             <w:rStyle w:val="aff9"/>
             <w:rFonts w:eastAsia="黑体"/>
             <w:noProof/>
           </w:rPr>
-          <w:t xml:space="preserve">10. </w:t>
+          <w:t xml:space="preserve">9. </w:t>
         </w:r>
         <w:r>
           <w:rPr>
@@ -4265,7 +4161,7 @@
             <w:rFonts w:eastAsia="黑体"/>
             <w:noProof/>
           </w:rPr>
-          <w:t>待办与阻塞</w:t>
+          <w:t>与乙的边界和交接状态</w:t>
         </w:r>
         <w:r>
           <w:rPr>
@@ -4296,7 +4192,128 @@
             <w:noProof/>
             <w:webHidden/>
           </w:rPr>
-          <w:instrText>PAGEREF _Toc243227580 \h</w:instrText>
+          <w:instrText>PAGEREF _Toc243227813 \h</w:instrText>
+        </w:r>
+        <w:r>
+          <w:rPr>
+            <w:rFonts w:hint="eastAsia"/>
+            <w:noProof/>
+            <w:webHidden/>
+          </w:rPr>
+          <w:instrText xml:space="preserve"> </w:instrText>
+        </w:r>
+        <w:r>
+          <w:rPr>
+            <w:rFonts w:hint="eastAsia"/>
+            <w:noProof/>
+            <w:webHidden/>
+          </w:rPr>
+        </w:r>
+        <w:r>
+          <w:rPr>
+            <w:rFonts w:hint="eastAsia"/>
+            <w:noProof/>
+            <w:webHidden/>
+          </w:rPr>
+          <w:fldChar w:fldCharType="separate"/>
+        </w:r>
+        <w:r>
+          <w:rPr>
+            <w:noProof/>
+            <w:webHidden/>
+          </w:rPr>
+          <w:t>15</w:t>
+        </w:r>
+        <w:r>
+          <w:rPr>
+            <w:rFonts w:hint="eastAsia"/>
+            <w:noProof/>
+            <w:webHidden/>
+          </w:rPr>
+          <w:fldChar w:fldCharType="end"/>
+        </w:r>
+      </w:hyperlink>
+    </w:p>
+    <w:p>
+      <w:pPr>
+        <w:pStyle w:val="TOC2"/>
+        <w:tabs>
+          <w:tab w:val="right" w:leader="dot" w:pos="9402"/>
+        </w:tabs>
+        <w:ind w:left="480"/>
+        <w:rPr>
+          <w:rFonts w:asciiTheme="minorHAnsi" w:eastAsiaTheme="minorEastAsia" w:hAnsiTheme="minorHAnsi" w:hint="eastAsia"/>
+          <w:noProof/>
+          <w:kern w:val="2"/>
+          <w:sz w:val="22"/>
+          <w:szCs w:val="24"/>
+          <w:lang w:eastAsia="zh-CN"/>
+          <w14:ligatures w14:val="standardContextual"/>
+        </w:rPr>
+      </w:pPr>
+      <w:hyperlink w:anchor="_Toc243227814" w:history="1">
+        <w:r>
+          <w:rPr>
+            <w:rStyle w:val="aff9"/>
+            <w:rFonts w:eastAsia="黑体"/>
+            <w:noProof/>
+          </w:rPr>
+          <w:t xml:space="preserve">9.1 </w:t>
+        </w:r>
+        <w:r>
+          <w:rPr>
+            <w:rStyle w:val="aff9"/>
+            <w:rFonts w:eastAsia="黑体"/>
+            <w:noProof/>
+          </w:rPr>
+          <w:t>需要乙确认或交付的事项（</w:t>
+        </w:r>
+        <w:r>
+          <w:rPr>
+            <w:rStyle w:val="aff9"/>
+            <w:rFonts w:eastAsia="黑体"/>
+            <w:noProof/>
+          </w:rPr>
+          <w:t>2026-10-18</w:t>
+        </w:r>
+        <w:r>
+          <w:rPr>
+            <w:rStyle w:val="aff9"/>
+            <w:rFonts w:eastAsia="黑体"/>
+            <w:noProof/>
+          </w:rPr>
+          <w:t>）</w:t>
+        </w:r>
+        <w:r>
+          <w:rPr>
+            <w:rFonts w:hint="eastAsia"/>
+            <w:noProof/>
+            <w:webHidden/>
+          </w:rPr>
+          <w:tab/>
+        </w:r>
+        <w:r>
+          <w:rPr>
+            <w:rFonts w:hint="eastAsia"/>
+            <w:noProof/>
+            <w:webHidden/>
+          </w:rPr>
+          <w:fldChar w:fldCharType="begin"/>
+        </w:r>
+        <w:r>
+          <w:rPr>
+            <w:rFonts w:hint="eastAsia"/>
+            <w:noProof/>
+            <w:webHidden/>
+          </w:rPr>
+          <w:instrText xml:space="preserve"> </w:instrText>
+        </w:r>
+        <w:r>
+          <w:rPr>
+            <w:noProof/>
+            <w:webHidden/>
+          </w:rPr>
+          <w:instrText>PAGEREF _Toc243227814 \h</w:instrText>
         </w:r>
         <w:r>
           <w:rPr>
@@ -4354,14 +4371,14 @@
           <w14:ligatures w14:val="standardContextual"/>
         </w:rPr>
       </w:pPr>
-      <w:hyperlink w:anchor="_Toc243227581" w:history="1">
+      <w:hyperlink w:anchor="_Toc243227815" w:history="1">
         <w:r>
           <w:rPr>
             <w:rStyle w:val="aff9"/>
             <w:rFonts w:eastAsia="黑体"/>
             <w:noProof/>
           </w:rPr>
-          <w:t xml:space="preserve">11. </w:t>
+          <w:t xml:space="preserve">10. </w:t>
         </w:r>
         <w:r>
           <w:rPr>
@@ -4369,6 +4386,110 @@
             <w:rFonts w:eastAsia="黑体"/>
             <w:noProof/>
           </w:rPr>
+          <w:t>待办与阻塞</w:t>
+        </w:r>
+        <w:r>
+          <w:rPr>
+            <w:rFonts w:hint="eastAsia"/>
+            <w:noProof/>
+            <w:webHidden/>
+          </w:rPr>
+          <w:tab/>
+        </w:r>
+        <w:r>
+          <w:rPr>
+            <w:rFonts w:hint="eastAsia"/>
+            <w:noProof/>
+            <w:webHidden/>
+          </w:rPr>
+          <w:fldChar w:fldCharType="begin"/>
+        </w:r>
+        <w:r>
+          <w:rPr>
+            <w:rFonts w:hint="eastAsia"/>
+            <w:noProof/>
+            <w:webHidden/>
+          </w:rPr>
+          <w:instrText xml:space="preserve"> </w:instrText>
+        </w:r>
+        <w:r>
+          <w:rPr>
+            <w:noProof/>
+            <w:webHidden/>
+          </w:rPr>
+          <w:instrText>PAGEREF _Toc243227815 \h</w:instrText>
+        </w:r>
+        <w:r>
+          <w:rPr>
+            <w:rFonts w:hint="eastAsia"/>
+            <w:noProof/>
+            <w:webHidden/>
+          </w:rPr>
+          <w:instrText xml:space="preserve"> </w:instrText>
+        </w:r>
+        <w:r>
+          <w:rPr>
+            <w:rFonts w:hint="eastAsia"/>
+            <w:noProof/>
+            <w:webHidden/>
+          </w:rPr>
+        </w:r>
+        <w:r>
+          <w:rPr>
+            <w:rFonts w:hint="eastAsia"/>
+            <w:noProof/>
+            <w:webHidden/>
+          </w:rPr>
+          <w:fldChar w:fldCharType="separate"/>
+        </w:r>
+        <w:r>
+          <w:rPr>
+            <w:noProof/>
+            <w:webHidden/>
+          </w:rPr>
+          <w:t>17</w:t>
+        </w:r>
+        <w:r>
+          <w:rPr>
+            <w:rFonts w:hint="eastAsia"/>
+            <w:noProof/>
+            <w:webHidden/>
+          </w:rPr>
+          <w:fldChar w:fldCharType="end"/>
+        </w:r>
+      </w:hyperlink>
+    </w:p>
+    <w:p>
+      <w:pPr>
+        <w:pStyle w:val="TOC1"/>
+        <w:tabs>
+          <w:tab w:val="right" w:leader="dot" w:pos="9402"/>
+        </w:tabs>
+        <w:rPr>
+          <w:rFonts w:asciiTheme="minorHAnsi" w:eastAsiaTheme="minorEastAsia" w:hAnsiTheme="minorHAnsi" w:hint="eastAsia"/>
+          <w:noProof/>
+          <w:kern w:val="2"/>
+          <w:sz w:val="22"/>
+          <w:szCs w:val="24"/>
+          <w:lang w:eastAsia="zh-CN"/>
+          <w14:ligatures w14:val="standardContextual"/>
+        </w:rPr>
+      </w:pPr>
+      <w:hyperlink w:anchor="_Toc243227816" w:history="1">
+        <w:r>
+          <w:rPr>
+            <w:rStyle w:val="aff9"/>
+            <w:rFonts w:eastAsia="黑体"/>
+            <w:noProof/>
+          </w:rPr>
+          <w:t xml:space="preserve">11. </w:t>
+        </w:r>
+        <w:r>
+          <w:rPr>
+            <w:rStyle w:val="aff9"/>
+            <w:rFonts w:eastAsia="黑体"/>
+            <w:noProof/>
+          </w:rPr>
           <w:t>文件导航</w:t>
         </w:r>
         <w:r>
@@ -4400,7 +4521,7 @@
             <w:noProof/>
             <w:webHidden/>
           </w:rPr>
-          <w:instrText>PAGEREF _Toc243227581 \h</w:instrText>
+          <w:instrText>PAGEREF _Toc243227816 \h</w:instrText>
         </w:r>
         <w:r>
           <w:rPr>
@@ -4455,7 +4576,7 @@
         <w:pStyle w:val="1"/>
         <w:spacing w:before="280" w:after="120"/>
       </w:pPr>
-      <w:bookmarkStart w:id="0" w:name="_Toc243227542"/>
+      <w:bookmarkStart w:id="0" w:name="_Toc243227776"/>
       <w:r>
         <w:rPr>
           <w:rFonts w:ascii="Times New Roman" w:eastAsia="黑体" w:hAnsi="Times New Roman"/>
@@ -4791,7 +4912,7 @@
         <w:pStyle w:val="1"/>
         <w:spacing w:before="280" w:after="120"/>
       </w:pPr>
-      <w:bookmarkStart w:id="1" w:name="_Toc243227543"/>
+      <w:bookmarkStart w:id="1" w:name="_Toc243227777"/>
       <w:r>
         <w:rPr>
           <w:rFonts w:ascii="Times New Roman" w:eastAsia="黑体" w:hAnsi="Times New Roman"/>
@@ -4815,7 +4936,7 @@
         <w:pStyle w:val="21"/>
         <w:spacing w:after="120"/>
       </w:pPr>
-      <w:bookmarkStart w:id="2" w:name="_Toc243227544"/>
+      <w:bookmarkStart w:id="2" w:name="_Toc243227778"/>
       <w:r>
         <w:rPr>
           <w:rFonts w:ascii="Times New Roman" w:eastAsia="黑体" w:hAnsi="Times New Roman"/>
@@ -4921,7 +5042,7 @@
         <w:pStyle w:val="21"/>
         <w:spacing w:after="120"/>
       </w:pPr>
-      <w:bookmarkStart w:id="3" w:name="_Toc243227545"/>
+      <w:bookmarkStart w:id="3" w:name="_Toc243227779"/>
       <w:r>
         <w:rPr>
           <w:rFonts w:ascii="Times New Roman" w:eastAsia="黑体" w:hAnsi="Times New Roman"/>
@@ -5330,7 +5451,7 @@
         <w:pStyle w:val="21"/>
         <w:spacing w:after="120"/>
       </w:pPr>
-      <w:bookmarkStart w:id="4" w:name="_Toc243227546"/>
+      <w:bookmarkStart w:id="4" w:name="_Toc243227780"/>
       <w:r>
         <w:rPr>
           <w:rFonts w:ascii="Times New Roman" w:eastAsia="黑体" w:hAnsi="Times New Roman"/>
@@ -5440,7 +5561,7 @@
         <w:pStyle w:val="21"/>
         <w:spacing w:after="120"/>
       </w:pPr>
-      <w:bookmarkStart w:id="5" w:name="_Toc243227547"/>
+      <w:bookmarkStart w:id="5" w:name="_Toc243227781"/>
       <w:r>
         <w:rPr>
           <w:rFonts w:ascii="Times New Roman" w:eastAsia="黑体" w:hAnsi="Times New Roman"/>
@@ -5522,7 +5643,7 @@
         <w:pStyle w:val="21"/>
         <w:spacing w:after="120"/>
       </w:pPr>
-      <w:bookmarkStart w:id="6" w:name="_Toc243227548"/>
+      <w:bookmarkStart w:id="6" w:name="_Toc243227782"/>
       <w:r>
         <w:rPr>
           <w:rFonts w:ascii="Times New Roman" w:eastAsia="黑体" w:hAnsi="Times New Roman"/>
@@ -5594,7 +5715,7 @@
         <w:pStyle w:val="21"/>
         <w:spacing w:after="120"/>
       </w:pPr>
-      <w:bookmarkStart w:id="7" w:name="_Toc243227549"/>
+      <w:bookmarkStart w:id="7" w:name="_Toc243227783"/>
       <w:r>
         <w:rPr>
           <w:rFonts w:ascii="Times New Roman" w:eastAsia="黑体" w:hAnsi="Times New Roman"/>
@@ -5690,7 +5811,7 @@
         <w:pStyle w:val="21"/>
         <w:spacing w:after="120"/>
       </w:pPr>
-      <w:bookmarkStart w:id="8" w:name="_Toc243227550"/>
+      <w:bookmarkStart w:id="8" w:name="_Toc243227784"/>
       <w:r>
         <w:rPr>
           <w:rFonts w:ascii="Times New Roman" w:eastAsia="黑体" w:hAnsi="Times New Roman"/>
@@ -5744,7 +5865,7 @@
         <w:pStyle w:val="1"/>
         <w:spacing w:before="280" w:after="120"/>
       </w:pPr>
-      <w:bookmarkStart w:id="9" w:name="_Toc243227551"/>
+      <w:bookmarkStart w:id="9" w:name="_Toc243227785"/>
       <w:r>
         <w:rPr>
           <w:rFonts w:ascii="Times New Roman" w:eastAsia="黑体" w:hAnsi="Times New Roman"/>
@@ -5898,7 +6019,7 @@
         <w:pStyle w:val="1"/>
         <w:spacing w:before="280" w:after="120"/>
       </w:pPr>
-      <w:bookmarkStart w:id="10" w:name="_Toc243227552"/>
+      <w:bookmarkStart w:id="10" w:name="_Toc243227786"/>
       <w:r>
         <w:rPr>
           <w:rFonts w:ascii="Times New Roman" w:eastAsia="黑体" w:hAnsi="Times New Roman"/>
@@ -6324,7 +6445,7 @@
         <w:pStyle w:val="1"/>
         <w:spacing w:before="280" w:after="120"/>
       </w:pPr>
-      <w:bookmarkStart w:id="11" w:name="_Toc243227553"/>
+      <w:bookmarkStart w:id="11" w:name="_Toc243227787"/>
       <w:r>
         <w:rPr>
           <w:rFonts w:ascii="Times New Roman" w:eastAsia="黑体" w:hAnsi="Times New Roman"/>
@@ -7548,7 +7669,7 @@
         <w:pStyle w:val="1"/>
         <w:spacing w:before="280" w:after="120"/>
       </w:pPr>
-      <w:bookmarkStart w:id="12" w:name="_Toc243227554"/>
+      <w:bookmarkStart w:id="12" w:name="_Toc243227788"/>
       <w:r>
         <w:rPr>
           <w:rFonts w:ascii="Times New Roman" w:eastAsia="黑体" w:hAnsi="Times New Roman"/>
@@ -8639,7 +8760,7 @@
         <w:pStyle w:val="1"/>
         <w:spacing w:before="280" w:after="120"/>
       </w:pPr>
-      <w:bookmarkStart w:id="13" w:name="_Toc243227555"/>
+      <w:bookmarkStart w:id="13" w:name="_Toc243227789"/>
       <w:r>
         <w:rPr>
           <w:rFonts w:ascii="Times New Roman" w:eastAsia="黑体" w:hAnsi="Times New Roman"/>
@@ -8663,7 +8784,7 @@
         <w:pStyle w:val="21"/>
         <w:spacing w:after="120"/>
       </w:pPr>
-      <w:bookmarkStart w:id="14" w:name="_Toc243227556"/>
+      <w:bookmarkStart w:id="14" w:name="_Toc243227790"/>
       <w:r>
         <w:rPr>
           <w:rFonts w:ascii="Times New Roman" w:eastAsia="黑体" w:hAnsi="Times New Roman"/>
@@ -8871,7 +8992,7 @@
         <w:pStyle w:val="21"/>
         <w:spacing w:after="120"/>
       </w:pPr>
-      <w:bookmarkStart w:id="15" w:name="_Toc243227557"/>
+      <w:bookmarkStart w:id="15" w:name="_Toc243227791"/>
       <w:r>
         <w:rPr>
           <w:rFonts w:ascii="Times New Roman" w:eastAsia="黑体" w:hAnsi="Times New Roman"/>
@@ -8957,7 +9078,7 @@
         <w:pStyle w:val="21"/>
         <w:spacing w:after="120"/>
       </w:pPr>
-      <w:bookmarkStart w:id="16" w:name="_Toc243227558"/>
+      <w:bookmarkStart w:id="16" w:name="_Toc243227792"/>
       <w:r>
         <w:rPr>
           <w:rFonts w:ascii="Times New Roman" w:eastAsia="黑体" w:hAnsi="Times New Roman"/>
@@ -10470,7 +10591,7 @@
         <w:pStyle w:val="1"/>
         <w:spacing w:before="280" w:after="120"/>
       </w:pPr>
-      <w:bookmarkStart w:id="17" w:name="_Toc243227559"/>
+      <w:bookmarkStart w:id="17" w:name="_Toc243227793"/>
       <w:r>
         <w:rPr>
           <w:rFonts w:ascii="Times New Roman" w:eastAsia="黑体" w:hAnsi="Times New Roman"/>
@@ -10502,7 +10623,7 @@
         <w:pStyle w:val="21"/>
         <w:spacing w:after="120"/>
       </w:pPr>
-      <w:bookmarkStart w:id="18" w:name="_Toc243227560"/>
+      <w:bookmarkStart w:id="18" w:name="_Toc243227794"/>
       <w:r>
         <w:rPr>
           <w:rFonts w:ascii="Times New Roman" w:eastAsia="黑体" w:hAnsi="Times New Roman"/>
@@ -10768,7 +10889,7 @@
         <w:pStyle w:val="21"/>
         <w:spacing w:after="120"/>
       </w:pPr>
-      <w:bookmarkStart w:id="19" w:name="_Toc243227561"/>
+      <w:bookmarkStart w:id="19" w:name="_Toc243227795"/>
       <w:r>
         <w:rPr>
           <w:rFonts w:ascii="Times New Roman" w:eastAsia="黑体" w:hAnsi="Times New Roman"/>
@@ -10884,7 +11005,7 @@
         <w:pStyle w:val="21"/>
         <w:spacing w:after="120"/>
       </w:pPr>
-      <w:bookmarkStart w:id="20" w:name="_Toc243227562"/>
+      <w:bookmarkStart w:id="20" w:name="_Toc243227796"/>
       <w:r>
         <w:rPr>
           <w:rFonts w:ascii="Times New Roman" w:eastAsia="黑体" w:hAnsi="Times New Roman"/>
@@ -12137,7 +12258,7 @@
         <w:pStyle w:val="21"/>
         <w:spacing w:after="120"/>
       </w:pPr>
-      <w:bookmarkStart w:id="21" w:name="_Toc243227563"/>
+      <w:bookmarkStart w:id="21" w:name="_Toc243227797"/>
       <w:r>
         <w:rPr>
           <w:rFonts w:ascii="Times New Roman" w:eastAsia="黑体" w:hAnsi="Times New Roman"/>
@@ -12259,7 +12380,7 @@
         <w:pStyle w:val="21"/>
         <w:spacing w:after="120"/>
       </w:pPr>
-      <w:bookmarkStart w:id="22" w:name="_Toc243227564"/>
+      <w:bookmarkStart w:id="22" w:name="_Toc243227798"/>
       <w:r>
         <w:rPr>
           <w:rFonts w:ascii="Times New Roman" w:eastAsia="黑体" w:hAnsi="Times New Roman"/>
@@ -12397,7 +12518,7 @@
         <w:pStyle w:val="21"/>
         <w:spacing w:after="120"/>
       </w:pPr>
-      <w:bookmarkStart w:id="23" w:name="_Toc243227565"/>
+      <w:bookmarkStart w:id="23" w:name="_Toc243227799"/>
       <w:r>
         <w:rPr>
           <w:rFonts w:ascii="Times New Roman" w:eastAsia="黑体" w:hAnsi="Times New Roman"/>
@@ -12633,7 +12754,7 @@
         <w:pStyle w:val="21"/>
         <w:spacing w:after="120"/>
       </w:pPr>
-      <w:bookmarkStart w:id="24" w:name="_Toc243227566"/>
+      <w:bookmarkStart w:id="24" w:name="_Toc243227800"/>
       <w:r>
         <w:rPr>
           <w:rFonts w:ascii="Times New Roman" w:eastAsia="黑体" w:hAnsi="Times New Roman"/>
@@ -12749,7 +12870,7 @@
         <w:pStyle w:val="21"/>
         <w:spacing w:after="120"/>
       </w:pPr>
-      <w:bookmarkStart w:id="25" w:name="_Toc243227567"/>
+      <w:bookmarkStart w:id="25" w:name="_Toc243227801"/>
       <w:r>
         <w:rPr>
           <w:rFonts w:ascii="Times New Roman" w:eastAsia="黑体" w:hAnsi="Times New Roman"/>
@@ -13079,7 +13200,7 @@
         <w:pStyle w:val="21"/>
         <w:spacing w:after="120"/>
       </w:pPr>
-      <w:bookmarkStart w:id="26" w:name="_Toc243227568"/>
+      <w:bookmarkStart w:id="26" w:name="_Toc243227802"/>
       <w:r>
         <w:rPr>
           <w:rFonts w:ascii="Times New Roman" w:eastAsia="黑体" w:hAnsi="Times New Roman"/>
@@ -13181,7 +13302,7 @@
         <w:pStyle w:val="21"/>
         <w:spacing w:after="120"/>
       </w:pPr>
-      <w:bookmarkStart w:id="27" w:name="_Toc243227569"/>
+      <w:bookmarkStart w:id="27" w:name="_Toc243227803"/>
       <w:r>
         <w:rPr>
           <w:rFonts w:ascii="Times New Roman" w:eastAsia="黑体" w:hAnsi="Times New Roman"/>
@@ -13319,7 +13440,7 @@
         <w:pStyle w:val="21"/>
         <w:spacing w:after="120"/>
       </w:pPr>
-      <w:bookmarkStart w:id="28" w:name="_Toc243227570"/>
+      <w:bookmarkStart w:id="28" w:name="_Toc243227804"/>
       <w:r>
         <w:rPr>
           <w:rFonts w:ascii="Times New Roman" w:eastAsia="黑体" w:hAnsi="Times New Roman"/>
@@ -13387,7 +13508,7 @@
         <w:pStyle w:val="21"/>
         <w:spacing w:after="120"/>
       </w:pPr>
-      <w:bookmarkStart w:id="29" w:name="_Toc243227571"/>
+      <w:bookmarkStart w:id="29" w:name="_Toc243227805"/>
       <w:r>
         <w:rPr>
           <w:rFonts w:ascii="Times New Roman" w:eastAsia="黑体" w:hAnsi="Times New Roman"/>
@@ -13435,7 +13556,7 @@
         <w:pStyle w:val="21"/>
         <w:spacing w:after="120"/>
       </w:pPr>
-      <w:bookmarkStart w:id="30" w:name="_Toc243227572"/>
+      <w:bookmarkStart w:id="30" w:name="_Toc243227806"/>
       <w:r>
         <w:rPr>
           <w:rFonts w:ascii="Times New Roman" w:eastAsia="黑体" w:hAnsi="Times New Roman"/>
@@ -13599,7 +13720,7 @@
         <w:pStyle w:val="1"/>
         <w:spacing w:before="280" w:after="120"/>
       </w:pPr>
-      <w:bookmarkStart w:id="31" w:name="_Toc243227573"/>
+      <w:bookmarkStart w:id="31" w:name="_Toc243227807"/>
       <w:r>
         <w:rPr>
           <w:rFonts w:ascii="Times New Roman" w:eastAsia="黑体" w:hAnsi="Times New Roman"/>
@@ -14733,7 +14854,7 @@
         <w:pStyle w:val="21"/>
         <w:spacing w:after="120"/>
       </w:pPr>
-      <w:bookmarkStart w:id="32" w:name="_Toc243227574"/>
+      <w:bookmarkStart w:id="32" w:name="_Toc243227808"/>
       <w:r>
         <w:rPr>
           <w:rFonts w:ascii="Times New Roman" w:eastAsia="黑体" w:hAnsi="Times New Roman"/>
@@ -15741,7 +15862,7 @@
         <w:pStyle w:val="21"/>
         <w:spacing w:after="120"/>
       </w:pPr>
-      <w:bookmarkStart w:id="33" w:name="_Toc243227575"/>
+      <w:bookmarkStart w:id="33" w:name="_Toc243227809"/>
       <w:r>
         <w:rPr>
           <w:rFonts w:ascii="Times New Roman" w:eastAsia="黑体" w:hAnsi="Times New Roman"/>
@@ -17226,7 +17347,7 @@
         <w:pStyle w:val="21"/>
         <w:spacing w:after="120"/>
       </w:pPr>
-      <w:bookmarkStart w:id="34" w:name="_Toc243227576"/>
+      <w:bookmarkStart w:id="34" w:name="_Toc243227810"/>
       <w:r>
         <w:rPr>
           <w:rFonts w:ascii="Times New Roman" w:eastAsia="黑体" w:hAnsi="Times New Roman"/>
@@ -18153,7 +18274,7 @@
         <w:pStyle w:val="21"/>
         <w:spacing w:after="120"/>
       </w:pPr>
-      <w:bookmarkStart w:id="35" w:name="_Toc243227577"/>
+      <w:bookmarkStart w:id="35" w:name="_Toc243227811"/>
       <w:r>
         <w:rPr>
           <w:rFonts w:ascii="Times New Roman" w:eastAsia="黑体" w:hAnsi="Times New Roman"/>
@@ -19759,10 +19880,1090 @@
     </w:p>
     <w:p>
       <w:pPr>
+        <w:pStyle w:val="21"/>
+        <w:spacing w:after="120"/>
+      </w:pPr>
+      <w:bookmarkStart w:id="36" w:name="_Toc243227812"/>
+      <w:r>
+        <w:rPr>
+          <w:rFonts w:ascii="Times New Roman" w:eastAsia="黑体" w:hAnsi="Times New Roman"/>
+          <w:color w:val="000000"/>
+        </w:rPr>
+        <w:t xml:space="preserve">8.5 </w:t>
+      </w:r>
+      <w:r>
+        <w:rPr>
+          <w:rFonts w:ascii="Times New Roman" w:eastAsia="黑体" w:hAnsi="Times New Roman"/>
+          <w:color w:val="000000"/>
+        </w:rPr>
+        <w:t>停牌稳健性（</w:t>
+      </w:r>
+      <w:r>
+        <w:rPr>
+          <w:rFonts w:ascii="Times New Roman" w:eastAsia="黑体" w:hAnsi="Times New Roman"/>
+          <w:color w:val="000000"/>
+        </w:rPr>
+        <w:t>2026-10-18</w:t>
+      </w:r>
+      <w:r>
+        <w:rPr>
+          <w:rFonts w:ascii="Times New Roman" w:eastAsia="黑体" w:hAnsi="Times New Roman"/>
+          <w:color w:val="000000"/>
+        </w:rPr>
+        <w:t>）</w:t>
+      </w:r>
+      <w:bookmarkEnd w:id="36"/>
+    </w:p>
+    <w:p>
+      <w:r>
+        <w:rPr>
+          <w:color w:val="000000"/>
+        </w:rPr>
+        <w:t>用</w:t>
+      </w:r>
+      <w:r>
+        <w:rPr>
+          <w:color w:val="000000"/>
+        </w:rPr>
+        <w:t xml:space="preserve"> </w:t>
+      </w:r>
+      <w:r>
+        <w:rPr>
+          <w:rFonts w:ascii="Consolas" w:hAnsi="Consolas"/>
+          <w:color w:val="000000"/>
+          <w:sz w:val="22"/>
+        </w:rPr>
+        <w:t>StateCode</w:t>
+      </w:r>
+      <w:r>
+        <w:rPr>
+          <w:color w:val="000000"/>
+        </w:rPr>
+        <w:t xml:space="preserve"> </w:t>
+      </w:r>
+      <w:r>
+        <w:rPr>
+          <w:color w:val="000000"/>
+        </w:rPr>
+        <w:t>与</w:t>
+      </w:r>
+      <w:r>
+        <w:rPr>
+          <w:color w:val="000000"/>
+        </w:rPr>
+        <w:t xml:space="preserve"> </w:t>
+      </w:r>
+      <w:r>
+        <w:rPr>
+          <w:rFonts w:ascii="Consolas" w:hAnsi="Consolas"/>
+          <w:color w:val="000000"/>
+          <w:sz w:val="22"/>
+        </w:rPr>
+        <w:t>Filling</w:t>
+      </w:r>
+      <w:r>
+        <w:rPr>
+          <w:color w:val="000000"/>
+        </w:rPr>
+        <w:t xml:space="preserve"> </w:t>
+      </w:r>
+      <w:r>
+        <w:rPr>
+          <w:color w:val="000000"/>
+        </w:rPr>
+        <w:t>识别停牌（</w:t>
+      </w:r>
+      <w:r>
+        <w:rPr>
+          <w:color w:val="000000"/>
+        </w:rPr>
+        <w:t xml:space="preserve">43,830 </w:t>
+      </w:r>
+      <w:r>
+        <w:rPr>
+          <w:color w:val="000000"/>
+        </w:rPr>
+        <w:t>个股票</w:t>
+      </w:r>
+      <w:r>
+        <w:rPr>
+          <w:color w:val="000000"/>
+        </w:rPr>
+        <w:t>-</w:t>
+      </w:r>
+      <w:r>
+        <w:rPr>
+          <w:color w:val="000000"/>
+        </w:rPr>
+        <w:t>日期对），把「窗口内出现停牌」的事件整条剔除，再比较明星与非明星：</w:t>
+      </w:r>
+    </w:p>
+    <w:tbl>
+      <w:tblPr>
+        <w:tblStyle w:val="aff1"/>
+        <w:tblW w:w="0" w:type="auto"/>
+        <w:jc w:val="center"/>
+        <w:tblLook w:val="04A0" w:firstRow="1" w:lastRow="0" w:firstColumn="1" w:lastColumn="0" w:noHBand="0" w:noVBand="1"/>
+      </w:tblPr>
+      <w:tblGrid>
+        <w:gridCol w:w="1318"/>
+        <w:gridCol w:w="1300"/>
+        <w:gridCol w:w="1398"/>
+        <w:gridCol w:w="1581"/>
+        <w:gridCol w:w="1300"/>
+        <w:gridCol w:w="1398"/>
+        <w:gridCol w:w="1333"/>
+      </w:tblGrid>
+      <w:tr>
+        <w:trPr>
+          <w:cantSplit/>
+          <w:tblHeader/>
+          <w:jc w:val="center"/>
+        </w:trPr>
+        <w:tc>
+          <w:tcPr>
+            <w:tcW w:w="1345" w:type="dxa"/>
+            <w:shd w:val="clear" w:color="auto" w:fill="F2F2F2"/>
+          </w:tcPr>
+          <w:p>
+            <w:pPr>
+              <w:spacing w:after="40" w:line="276" w:lineRule="auto"/>
+            </w:pPr>
+            <w:r>
+              <w:rPr>
+                <w:b/>
+                <w:color w:val="000000"/>
+                <w:sz w:val="21"/>
+              </w:rPr>
+              <w:t>窗口</w:t>
+            </w:r>
+          </w:p>
+        </w:tc>
+        <w:tc>
+          <w:tcPr>
+            <w:tcW w:w="1345" w:type="dxa"/>
+            <w:shd w:val="clear" w:color="auto" w:fill="F2F2F2"/>
+          </w:tcPr>
+          <w:p>
+            <w:pPr>
+              <w:spacing w:after="40" w:line="276" w:lineRule="auto"/>
+            </w:pPr>
+            <w:r>
+              <w:rPr>
+                <w:b/>
+                <w:color w:val="000000"/>
+                <w:sz w:val="21"/>
+              </w:rPr>
+              <w:t>调高：剔除比例</w:t>
+            </w:r>
+          </w:p>
+        </w:tc>
+        <w:tc>
+          <w:tcPr>
+            <w:tcW w:w="1345" w:type="dxa"/>
+            <w:shd w:val="clear" w:color="auto" w:fill="F2F2F2"/>
+          </w:tcPr>
+          <w:p>
+            <w:pPr>
+              <w:spacing w:after="40" w:line="276" w:lineRule="auto"/>
+            </w:pPr>
+            <w:r>
+              <w:rPr>
+                <w:b/>
+                <w:color w:val="000000"/>
+                <w:sz w:val="21"/>
+              </w:rPr>
+              <w:t>调高：差（全样本</w:t>
+            </w:r>
+            <w:r>
+              <w:rPr>
+                <w:b/>
+                <w:color w:val="000000"/>
+                <w:sz w:val="21"/>
+              </w:rPr>
+              <w:t>→</w:t>
+            </w:r>
+            <w:r>
+              <w:rPr>
+                <w:b/>
+                <w:color w:val="000000"/>
+                <w:sz w:val="21"/>
+              </w:rPr>
+              <w:t>剔除后）</w:t>
+            </w:r>
+          </w:p>
+        </w:tc>
+        <w:tc>
+          <w:tcPr>
+            <w:tcW w:w="1345" w:type="dxa"/>
+            <w:shd w:val="clear" w:color="auto" w:fill="F2F2F2"/>
+          </w:tcPr>
+          <w:p>
+            <w:pPr>
+              <w:spacing w:after="40" w:line="276" w:lineRule="auto"/>
+            </w:pPr>
+            <w:r>
+              <w:rPr>
+                <w:b/>
+                <w:color w:val="000000"/>
+                <w:sz w:val="21"/>
+              </w:rPr>
+              <w:t>调高：</w:t>
+            </w:r>
+            <w:r>
+              <w:rPr>
+                <w:b/>
+                <w:color w:val="000000"/>
+                <w:sz w:val="21"/>
+              </w:rPr>
+              <w:t>p</w:t>
+            </w:r>
+            <w:r>
+              <w:rPr>
+                <w:b/>
+                <w:color w:val="000000"/>
+                <w:sz w:val="21"/>
+              </w:rPr>
+              <w:t>（全</w:t>
+            </w:r>
+            <w:r>
+              <w:rPr>
+                <w:b/>
+                <w:color w:val="000000"/>
+                <w:sz w:val="21"/>
+              </w:rPr>
+              <w:t>→</w:t>
+            </w:r>
+            <w:r>
+              <w:rPr>
+                <w:b/>
+                <w:color w:val="000000"/>
+                <w:sz w:val="21"/>
+              </w:rPr>
+              <w:t>剔）</w:t>
+            </w:r>
+          </w:p>
+        </w:tc>
+        <w:tc>
+          <w:tcPr>
+            <w:tcW w:w="1345" w:type="dxa"/>
+            <w:shd w:val="clear" w:color="auto" w:fill="F2F2F2"/>
+          </w:tcPr>
+          <w:p>
+            <w:pPr>
+              <w:spacing w:after="40" w:line="276" w:lineRule="auto"/>
+            </w:pPr>
+            <w:r>
+              <w:rPr>
+                <w:b/>
+                <w:color w:val="000000"/>
+                <w:sz w:val="21"/>
+              </w:rPr>
+              <w:t>调低：剔除比例</w:t>
+            </w:r>
+          </w:p>
+        </w:tc>
+        <w:tc>
+          <w:tcPr>
+            <w:tcW w:w="1345" w:type="dxa"/>
+            <w:shd w:val="clear" w:color="auto" w:fill="F2F2F2"/>
+          </w:tcPr>
+          <w:p>
+            <w:pPr>
+              <w:spacing w:after="40" w:line="276" w:lineRule="auto"/>
+            </w:pPr>
+            <w:r>
+              <w:rPr>
+                <w:b/>
+                <w:color w:val="000000"/>
+                <w:sz w:val="21"/>
+              </w:rPr>
+              <w:t>调低：差（全</w:t>
+            </w:r>
+            <w:r>
+              <w:rPr>
+                <w:b/>
+                <w:color w:val="000000"/>
+                <w:sz w:val="21"/>
+              </w:rPr>
+              <w:t>→</w:t>
+            </w:r>
+            <w:r>
+              <w:rPr>
+                <w:b/>
+                <w:color w:val="000000"/>
+                <w:sz w:val="21"/>
+              </w:rPr>
+              <w:t>剔）</w:t>
+            </w:r>
+          </w:p>
+        </w:tc>
+        <w:tc>
+          <w:tcPr>
+            <w:tcW w:w="1345" w:type="dxa"/>
+            <w:shd w:val="clear" w:color="auto" w:fill="F2F2F2"/>
+          </w:tcPr>
+          <w:p>
+            <w:pPr>
+              <w:spacing w:after="40" w:line="276" w:lineRule="auto"/>
+            </w:pPr>
+            <w:r>
+              <w:rPr>
+                <w:b/>
+                <w:color w:val="000000"/>
+                <w:sz w:val="21"/>
+              </w:rPr>
+              <w:t>调低：</w:t>
+            </w:r>
+            <w:r>
+              <w:rPr>
+                <w:b/>
+                <w:color w:val="000000"/>
+                <w:sz w:val="21"/>
+              </w:rPr>
+              <w:t>p</w:t>
+            </w:r>
+            <w:r>
+              <w:rPr>
+                <w:b/>
+                <w:color w:val="000000"/>
+                <w:sz w:val="21"/>
+              </w:rPr>
+              <w:t>（全</w:t>
+            </w:r>
+            <w:r>
+              <w:rPr>
+                <w:b/>
+                <w:color w:val="000000"/>
+                <w:sz w:val="21"/>
+              </w:rPr>
+              <w:t>→</w:t>
+            </w:r>
+            <w:r>
+              <w:rPr>
+                <w:b/>
+                <w:color w:val="000000"/>
+                <w:sz w:val="21"/>
+              </w:rPr>
+              <w:t>剔）</w:t>
+            </w:r>
+          </w:p>
+        </w:tc>
+      </w:tr>
+      <w:tr>
+        <w:trPr>
+          <w:cantSplit/>
+          <w:jc w:val="center"/>
+        </w:trPr>
+        <w:tc>
+          <w:tcPr>
+            <w:tcW w:w="1345" w:type="dxa"/>
+          </w:tcPr>
+          <w:p>
+            <w:pPr>
+              <w:spacing w:after="40" w:line="276" w:lineRule="auto"/>
+            </w:pPr>
+            <w:r>
+              <w:rPr>
+                <w:color w:val="000000"/>
+                <w:sz w:val="21"/>
+              </w:rPr>
+              <w:t>[-1,+1]</w:t>
+            </w:r>
+          </w:p>
+        </w:tc>
+        <w:tc>
+          <w:tcPr>
+            <w:tcW w:w="1345" w:type="dxa"/>
+          </w:tcPr>
+          <w:p>
+            <w:pPr>
+              <w:spacing w:after="40" w:line="276" w:lineRule="auto"/>
+            </w:pPr>
+            <w:r>
+              <w:rPr>
+                <w:color w:val="000000"/>
+                <w:sz w:val="21"/>
+              </w:rPr>
+              <w:t>0.6%</w:t>
+            </w:r>
+          </w:p>
+        </w:tc>
+        <w:tc>
+          <w:tcPr>
+            <w:tcW w:w="1345" w:type="dxa"/>
+          </w:tcPr>
+          <w:p>
+            <w:pPr>
+              <w:spacing w:after="40" w:line="276" w:lineRule="auto"/>
+            </w:pPr>
+            <w:r>
+              <w:rPr>
+                <w:color w:val="000000"/>
+                <w:sz w:val="21"/>
+              </w:rPr>
+              <w:t>+0.38→+0.38</w:t>
+            </w:r>
+          </w:p>
+        </w:tc>
+        <w:tc>
+          <w:tcPr>
+            <w:tcW w:w="1345" w:type="dxa"/>
+          </w:tcPr>
+          <w:p>
+            <w:pPr>
+              <w:spacing w:after="40" w:line="276" w:lineRule="auto"/>
+            </w:pPr>
+            <w:r>
+              <w:rPr>
+                <w:color w:val="000000"/>
+                <w:sz w:val="21"/>
+              </w:rPr>
+              <w:t>0.029→0.029</w:t>
+            </w:r>
+          </w:p>
+        </w:tc>
+        <w:tc>
+          <w:tcPr>
+            <w:tcW w:w="1345" w:type="dxa"/>
+          </w:tcPr>
+          <w:p>
+            <w:pPr>
+              <w:spacing w:after="40" w:line="276" w:lineRule="auto"/>
+            </w:pPr>
+            <w:r>
+              <w:rPr>
+                <w:color w:val="000000"/>
+                <w:sz w:val="21"/>
+              </w:rPr>
+              <w:t>0.8%</w:t>
+            </w:r>
+          </w:p>
+        </w:tc>
+        <w:tc>
+          <w:tcPr>
+            <w:tcW w:w="1345" w:type="dxa"/>
+          </w:tcPr>
+          <w:p>
+            <w:pPr>
+              <w:spacing w:after="40" w:line="276" w:lineRule="auto"/>
+            </w:pPr>
+            <w:r>
+              <w:rPr>
+                <w:color w:val="000000"/>
+                <w:sz w:val="21"/>
+              </w:rPr>
+              <w:t>+0.06→+0.06</w:t>
+            </w:r>
+          </w:p>
+        </w:tc>
+        <w:tc>
+          <w:tcPr>
+            <w:tcW w:w="1345" w:type="dxa"/>
+          </w:tcPr>
+          <w:p>
+            <w:pPr>
+              <w:spacing w:after="40" w:line="276" w:lineRule="auto"/>
+            </w:pPr>
+            <w:r>
+              <w:rPr>
+                <w:color w:val="000000"/>
+                <w:sz w:val="21"/>
+              </w:rPr>
+              <w:t>0.73→0.73</w:t>
+            </w:r>
+          </w:p>
+        </w:tc>
+      </w:tr>
+      <w:tr>
+        <w:trPr>
+          <w:cantSplit/>
+          <w:jc w:val="center"/>
+        </w:trPr>
+        <w:tc>
+          <w:tcPr>
+            <w:tcW w:w="1345" w:type="dxa"/>
+          </w:tcPr>
+          <w:p>
+            <w:pPr>
+              <w:spacing w:after="40" w:line="276" w:lineRule="auto"/>
+            </w:pPr>
+            <w:r>
+              <w:rPr>
+                <w:color w:val="000000"/>
+                <w:sz w:val="21"/>
+              </w:rPr>
+              <w:t>[-1,+5]</w:t>
+            </w:r>
+          </w:p>
+        </w:tc>
+        <w:tc>
+          <w:tcPr>
+            <w:tcW w:w="1345" w:type="dxa"/>
+          </w:tcPr>
+          <w:p>
+            <w:pPr>
+              <w:spacing w:after="40" w:line="276" w:lineRule="auto"/>
+            </w:pPr>
+            <w:r>
+              <w:rPr>
+                <w:color w:val="000000"/>
+                <w:sz w:val="21"/>
+              </w:rPr>
+              <w:t>0.7%</w:t>
+            </w:r>
+          </w:p>
+        </w:tc>
+        <w:tc>
+          <w:tcPr>
+            <w:tcW w:w="1345" w:type="dxa"/>
+          </w:tcPr>
+          <w:p>
+            <w:pPr>
+              <w:spacing w:after="40" w:line="276" w:lineRule="auto"/>
+            </w:pPr>
+            <w:r>
+              <w:rPr>
+                <w:color w:val="000000"/>
+                <w:sz w:val="21"/>
+              </w:rPr>
+              <w:t>+0.55→+0.60</w:t>
+            </w:r>
+          </w:p>
+        </w:tc>
+        <w:tc>
+          <w:tcPr>
+            <w:tcW w:w="1345" w:type="dxa"/>
+          </w:tcPr>
+          <w:p>
+            <w:pPr>
+              <w:spacing w:after="40" w:line="276" w:lineRule="auto"/>
+            </w:pPr>
+            <w:r>
+              <w:rPr>
+                <w:color w:val="000000"/>
+                <w:sz w:val="21"/>
+              </w:rPr>
+              <w:t>0.020→0.012</w:t>
+            </w:r>
+          </w:p>
+        </w:tc>
+        <w:tc>
+          <w:tcPr>
+            <w:tcW w:w="1345" w:type="dxa"/>
+          </w:tcPr>
+          <w:p>
+            <w:pPr>
+              <w:spacing w:after="40" w:line="276" w:lineRule="auto"/>
+            </w:pPr>
+            <w:r>
+              <w:rPr>
+                <w:color w:val="000000"/>
+                <w:sz w:val="21"/>
+              </w:rPr>
+              <w:t>0.8%</w:t>
+            </w:r>
+          </w:p>
+        </w:tc>
+        <w:tc>
+          <w:tcPr>
+            <w:tcW w:w="1345" w:type="dxa"/>
+          </w:tcPr>
+          <w:p>
+            <w:pPr>
+              <w:spacing w:after="40" w:line="276" w:lineRule="auto"/>
+            </w:pPr>
+            <w:r>
+              <w:rPr>
+                <w:color w:val="000000"/>
+                <w:sz w:val="21"/>
+              </w:rPr>
+              <w:t>−</w:t>
+            </w:r>
+            <w:r>
+              <w:rPr>
+                <w:color w:val="000000"/>
+                <w:sz w:val="21"/>
+              </w:rPr>
+              <w:t>0.20→−0.18</w:t>
+            </w:r>
+          </w:p>
+        </w:tc>
+        <w:tc>
+          <w:tcPr>
+            <w:tcW w:w="1345" w:type="dxa"/>
+          </w:tcPr>
+          <w:p>
+            <w:pPr>
+              <w:spacing w:after="40" w:line="276" w:lineRule="auto"/>
+            </w:pPr>
+            <w:r>
+              <w:rPr>
+                <w:color w:val="000000"/>
+                <w:sz w:val="21"/>
+              </w:rPr>
+              <w:t>0.40→0.43</w:t>
+            </w:r>
+          </w:p>
+        </w:tc>
+      </w:tr>
+      <w:tr>
+        <w:trPr>
+          <w:cantSplit/>
+          <w:jc w:val="center"/>
+        </w:trPr>
+        <w:tc>
+          <w:tcPr>
+            <w:tcW w:w="1345" w:type="dxa"/>
+          </w:tcPr>
+          <w:p>
+            <w:pPr>
+              <w:spacing w:after="40" w:line="276" w:lineRule="auto"/>
+            </w:pPr>
+            <w:r>
+              <w:rPr>
+                <w:color w:val="000000"/>
+                <w:sz w:val="21"/>
+              </w:rPr>
+              <w:t>[-5,+5]</w:t>
+            </w:r>
+          </w:p>
+        </w:tc>
+        <w:tc>
+          <w:tcPr>
+            <w:tcW w:w="1345" w:type="dxa"/>
+          </w:tcPr>
+          <w:p>
+            <w:pPr>
+              <w:spacing w:after="40" w:line="276" w:lineRule="auto"/>
+            </w:pPr>
+            <w:r>
+              <w:rPr>
+                <w:color w:val="000000"/>
+                <w:sz w:val="21"/>
+              </w:rPr>
+              <w:t>0.9%</w:t>
+            </w:r>
+          </w:p>
+        </w:tc>
+        <w:tc>
+          <w:tcPr>
+            <w:tcW w:w="1345" w:type="dxa"/>
+          </w:tcPr>
+          <w:p>
+            <w:pPr>
+              <w:spacing w:after="40" w:line="276" w:lineRule="auto"/>
+            </w:pPr>
+            <w:r>
+              <w:rPr>
+                <w:color w:val="000000"/>
+                <w:sz w:val="21"/>
+              </w:rPr>
+              <w:t>+0.99→+1.00</w:t>
+            </w:r>
+          </w:p>
+        </w:tc>
+        <w:tc>
+          <w:tcPr>
+            <w:tcW w:w="1345" w:type="dxa"/>
+          </w:tcPr>
+          <w:p>
+            <w:pPr>
+              <w:spacing w:after="40" w:line="276" w:lineRule="auto"/>
+            </w:pPr>
+            <w:r>
+              <w:rPr>
+                <w:color w:val="000000"/>
+                <w:sz w:val="21"/>
+              </w:rPr>
+              <w:t>0.0004→0.0004</w:t>
+            </w:r>
+          </w:p>
+        </w:tc>
+        <w:tc>
+          <w:tcPr>
+            <w:tcW w:w="1345" w:type="dxa"/>
+          </w:tcPr>
+          <w:p>
+            <w:pPr>
+              <w:spacing w:after="40" w:line="276" w:lineRule="auto"/>
+            </w:pPr>
+            <w:r>
+              <w:rPr>
+                <w:color w:val="000000"/>
+                <w:sz w:val="21"/>
+              </w:rPr>
+              <w:t>1.1%</w:t>
+            </w:r>
+          </w:p>
+        </w:tc>
+        <w:tc>
+          <w:tcPr>
+            <w:tcW w:w="1345" w:type="dxa"/>
+          </w:tcPr>
+          <w:p>
+            <w:pPr>
+              <w:spacing w:after="40" w:line="276" w:lineRule="auto"/>
+            </w:pPr>
+            <w:r>
+              <w:rPr>
+                <w:color w:val="000000"/>
+                <w:sz w:val="21"/>
+              </w:rPr>
+              <w:t>−</w:t>
+            </w:r>
+            <w:r>
+              <w:rPr>
+                <w:color w:val="000000"/>
+                <w:sz w:val="21"/>
+              </w:rPr>
+              <w:t>0.21→−0.25</w:t>
+            </w:r>
+          </w:p>
+        </w:tc>
+        <w:tc>
+          <w:tcPr>
+            <w:tcW w:w="1345" w:type="dxa"/>
+          </w:tcPr>
+          <w:p>
+            <w:pPr>
+              <w:spacing w:after="40" w:line="276" w:lineRule="auto"/>
+            </w:pPr>
+            <w:r>
+              <w:rPr>
+                <w:color w:val="000000"/>
+                <w:sz w:val="21"/>
+              </w:rPr>
+              <w:t>0.46→0.37</w:t>
+            </w:r>
+          </w:p>
+        </w:tc>
+      </w:tr>
+      <w:tr>
+        <w:trPr>
+          <w:cantSplit/>
+          <w:jc w:val="center"/>
+        </w:trPr>
+        <w:tc>
+          <w:tcPr>
+            <w:tcW w:w="1345" w:type="dxa"/>
+          </w:tcPr>
+          <w:p>
+            <w:pPr>
+              <w:spacing w:after="40" w:line="276" w:lineRule="auto"/>
+            </w:pPr>
+            <w:r>
+              <w:rPr>
+                <w:color w:val="000000"/>
+                <w:sz w:val="21"/>
+              </w:rPr>
+              <w:t>[0,+120]</w:t>
+            </w:r>
+          </w:p>
+        </w:tc>
+        <w:tc>
+          <w:tcPr>
+            <w:tcW w:w="1345" w:type="dxa"/>
+          </w:tcPr>
+          <w:p>
+            <w:pPr>
+              <w:spacing w:after="40" w:line="276" w:lineRule="auto"/>
+            </w:pPr>
+            <w:r>
+              <w:rPr>
+                <w:color w:val="000000"/>
+                <w:sz w:val="21"/>
+              </w:rPr>
+              <w:t>3.3%</w:t>
+            </w:r>
+          </w:p>
+        </w:tc>
+        <w:tc>
+          <w:tcPr>
+            <w:tcW w:w="1345" w:type="dxa"/>
+          </w:tcPr>
+          <w:p>
+            <w:pPr>
+              <w:spacing w:after="40" w:line="276" w:lineRule="auto"/>
+            </w:pPr>
+            <w:r>
+              <w:rPr>
+                <w:color w:val="000000"/>
+                <w:sz w:val="21"/>
+              </w:rPr>
+              <w:t>+1.47→+1.55</w:t>
+            </w:r>
+          </w:p>
+        </w:tc>
+        <w:tc>
+          <w:tcPr>
+            <w:tcW w:w="1345" w:type="dxa"/>
+          </w:tcPr>
+          <w:p>
+            <w:pPr>
+              <w:spacing w:after="40" w:line="276" w:lineRule="auto"/>
+            </w:pPr>
+            <w:r>
+              <w:rPr>
+                <w:color w:val="000000"/>
+                <w:sz w:val="21"/>
+              </w:rPr>
+              <w:t>0.045→0.037</w:t>
+            </w:r>
+          </w:p>
+        </w:tc>
+        <w:tc>
+          <w:tcPr>
+            <w:tcW w:w="1345" w:type="dxa"/>
+          </w:tcPr>
+          <w:p>
+            <w:pPr>
+              <w:spacing w:after="40" w:line="276" w:lineRule="auto"/>
+            </w:pPr>
+            <w:r>
+              <w:rPr>
+                <w:color w:val="000000"/>
+                <w:sz w:val="21"/>
+              </w:rPr>
+              <w:t>4.0%</w:t>
+            </w:r>
+          </w:p>
+        </w:tc>
+        <w:tc>
+          <w:tcPr>
+            <w:tcW w:w="1345" w:type="dxa"/>
+          </w:tcPr>
+          <w:p>
+            <w:pPr>
+              <w:spacing w:after="40" w:line="276" w:lineRule="auto"/>
+            </w:pPr>
+            <w:r>
+              <w:rPr>
+                <w:color w:val="000000"/>
+                <w:sz w:val="21"/>
+              </w:rPr>
+              <w:t>−</w:t>
+            </w:r>
+            <w:r>
+              <w:rPr>
+                <w:color w:val="000000"/>
+                <w:sz w:val="21"/>
+              </w:rPr>
+              <w:t>0.76→−0.81</w:t>
+            </w:r>
+          </w:p>
+        </w:tc>
+        <w:tc>
+          <w:tcPr>
+            <w:tcW w:w="1345" w:type="dxa"/>
+          </w:tcPr>
+          <w:p>
+            <w:pPr>
+              <w:spacing w:after="40" w:line="276" w:lineRule="auto"/>
+            </w:pPr>
+            <w:r>
+              <w:rPr>
+                <w:color w:val="000000"/>
+                <w:sz w:val="21"/>
+              </w:rPr>
+              <w:t>0.33→0.30</w:t>
+            </w:r>
+          </w:p>
+        </w:tc>
+      </w:tr>
+      <w:tr>
+        <w:trPr>
+          <w:cantSplit/>
+          <w:jc w:val="center"/>
+        </w:trPr>
+        <w:tc>
+          <w:tcPr>
+            <w:tcW w:w="1345" w:type="dxa"/>
+          </w:tcPr>
+          <w:p>
+            <w:pPr>
+              <w:spacing w:after="40" w:line="276" w:lineRule="auto"/>
+            </w:pPr>
+            <w:r>
+              <w:rPr>
+                <w:color w:val="000000"/>
+                <w:sz w:val="21"/>
+              </w:rPr>
+              <w:t>[0,+250]</w:t>
+            </w:r>
+          </w:p>
+        </w:tc>
+        <w:tc>
+          <w:tcPr>
+            <w:tcW w:w="1345" w:type="dxa"/>
+          </w:tcPr>
+          <w:p>
+            <w:pPr>
+              <w:spacing w:after="40" w:line="276" w:lineRule="auto"/>
+            </w:pPr>
+            <w:r>
+              <w:rPr>
+                <w:color w:val="000000"/>
+                <w:sz w:val="21"/>
+              </w:rPr>
+              <w:t>5.6%</w:t>
+            </w:r>
+          </w:p>
+        </w:tc>
+        <w:tc>
+          <w:tcPr>
+            <w:tcW w:w="1345" w:type="dxa"/>
+          </w:tcPr>
+          <w:p>
+            <w:pPr>
+              <w:spacing w:after="40" w:line="276" w:lineRule="auto"/>
+            </w:pPr>
+            <w:r>
+              <w:rPr>
+                <w:color w:val="000000"/>
+                <w:sz w:val="21"/>
+              </w:rPr>
+              <w:t>+0.88→+0.82</w:t>
+            </w:r>
+          </w:p>
+        </w:tc>
+        <w:tc>
+          <w:tcPr>
+            <w:tcW w:w="1345" w:type="dxa"/>
+          </w:tcPr>
+          <w:p>
+            <w:pPr>
+              <w:spacing w:after="40" w:line="276" w:lineRule="auto"/>
+            </w:pPr>
+            <w:r>
+              <w:rPr>
+                <w:color w:val="000000"/>
+                <w:sz w:val="21"/>
+              </w:rPr>
+              <w:t>0.41→0.45</w:t>
+            </w:r>
+          </w:p>
+        </w:tc>
+        <w:tc>
+          <w:tcPr>
+            <w:tcW w:w="1345" w:type="dxa"/>
+          </w:tcPr>
+          <w:p>
+            <w:pPr>
+              <w:spacing w:after="40" w:line="276" w:lineRule="auto"/>
+            </w:pPr>
+            <w:r>
+              <w:rPr>
+                <w:color w:val="000000"/>
+                <w:sz w:val="21"/>
+              </w:rPr>
+              <w:t>6.4%</w:t>
+            </w:r>
+          </w:p>
+        </w:tc>
+        <w:tc>
+          <w:tcPr>
+            <w:tcW w:w="1345" w:type="dxa"/>
+          </w:tcPr>
+          <w:p>
+            <w:pPr>
+              <w:spacing w:after="40" w:line="276" w:lineRule="auto"/>
+            </w:pPr>
+            <w:r>
+              <w:rPr>
+                <w:color w:val="000000"/>
+                <w:sz w:val="21"/>
+              </w:rPr>
+              <w:t>+1.36→+1.11</w:t>
+            </w:r>
+          </w:p>
+        </w:tc>
+        <w:tc>
+          <w:tcPr>
+            <w:tcW w:w="1345" w:type="dxa"/>
+          </w:tcPr>
+          <w:p>
+            <w:pPr>
+              <w:spacing w:after="40" w:line="276" w:lineRule="auto"/>
+            </w:pPr>
+            <w:r>
+              <w:rPr>
+                <w:color w:val="000000"/>
+                <w:sz w:val="21"/>
+              </w:rPr>
+              <w:t>0.24→0.34</w:t>
+            </w:r>
+          </w:p>
+        </w:tc>
+      </w:tr>
+    </w:tbl>
+    <w:p>
+      <w:pPr>
+        <w:spacing w:after="0"/>
+      </w:pPr>
+    </w:p>
+    <w:p>
+      <w:r>
+        <w:rPr>
+          <w:color w:val="000000"/>
+        </w:rPr>
+        <w:t>长窗口的剔除比例升到</w:t>
+      </w:r>
+      <w:r>
+        <w:rPr>
+          <w:color w:val="000000"/>
+        </w:rPr>
+        <w:t xml:space="preserve"> 5% </w:t>
+      </w:r>
+      <w:r>
+        <w:rPr>
+          <w:color w:val="000000"/>
+        </w:rPr>
+        <w:t>至</w:t>
+      </w:r>
+      <w:r>
+        <w:rPr>
+          <w:color w:val="000000"/>
+        </w:rPr>
+        <w:t xml:space="preserve"> 6%</w:t>
+      </w:r>
+      <w:r>
+        <w:rPr>
+          <w:color w:val="000000"/>
+        </w:rPr>
+        <w:t>，但结论不变：上调的明星溢价在短窗口和</w:t>
+      </w:r>
+      <w:r>
+        <w:rPr>
+          <w:color w:val="000000"/>
+        </w:rPr>
+        <w:t xml:space="preserve"> 120 </w:t>
+      </w:r>
+      <w:r>
+        <w:rPr>
+          <w:color w:val="000000"/>
+        </w:rPr>
+        <w:t>日窗口仍显著，下调始终不显著；点估计的变化远小于标准误。停牌不是驱动结果的因素，主口径保留是安全的。这张表用的是未聚类</w:t>
+      </w:r>
+      <w:r>
+        <w:rPr>
+          <w:color w:val="000000"/>
+        </w:rPr>
+        <w:t xml:space="preserve"> t </w:t>
+      </w:r>
+      <w:r>
+        <w:rPr>
+          <w:color w:val="000000"/>
+        </w:rPr>
+        <w:t>检验，和主表一样，最终仍以聚类结果为准。</w:t>
+      </w:r>
+    </w:p>
+    <w:p>
+      <w:pPr>
         <w:pStyle w:val="1"/>
         <w:spacing w:before="280" w:after="120"/>
       </w:pPr>
-      <w:bookmarkStart w:id="36" w:name="_Toc243227578"/>
+      <w:bookmarkStart w:id="37" w:name="_Toc243227813"/>
       <w:r>
         <w:rPr>
           <w:rFonts w:ascii="Times New Roman" w:eastAsia="黑体" w:hAnsi="Times New Roman"/>
@@ -19779,7 +20980,7 @@
         </w:rPr>
         <w:t>与乙的边界和交接状态</w:t>
       </w:r>
-      <w:bookmarkEnd w:id="36"/>
+      <w:bookmarkEnd w:id="37"/>
     </w:p>
     <w:p>
       <w:r>
@@ -20142,7 +21343,7 @@
         <w:pStyle w:val="21"/>
         <w:spacing w:after="120"/>
       </w:pPr>
-      <w:bookmarkStart w:id="37" w:name="_Toc243227579"/>
+      <w:bookmarkStart w:id="38" w:name="_Toc243227814"/>
       <w:r>
         <w:rPr>
           <w:rFonts w:ascii="Times New Roman" w:eastAsia="黑体" w:hAnsi="Times New Roman"/>
@@ -20171,7 +21372,7 @@
         </w:rPr>
         <w:t>）</w:t>
       </w:r>
-      <w:bookmarkEnd w:id="37"/>
+      <w:bookmarkEnd w:id="38"/>
     </w:p>
     <w:tbl>
       <w:tblPr>
@@ -21098,7 +22299,7 @@
         <w:pStyle w:val="1"/>
         <w:spacing w:before="280" w:after="120"/>
       </w:pPr>
-      <w:bookmarkStart w:id="38" w:name="_Toc243227580"/>
+      <w:bookmarkStart w:id="39" w:name="_Toc243227815"/>
       <w:r>
         <w:rPr>
           <w:rFonts w:ascii="Times New Roman" w:eastAsia="黑体" w:hAnsi="Times New Roman"/>
@@ -21115,7 +22316,7 @@
         </w:rPr>
         <w:t>待办与阻塞</w:t>
       </w:r>
-      <w:bookmarkEnd w:id="38"/>
+      <w:bookmarkEnd w:id="39"/>
     </w:p>
     <w:p>
       <w:pPr>
@@ -21386,7 +22587,7 @@
         <w:pStyle w:val="1"/>
         <w:spacing w:before="280" w:after="120"/>
       </w:pPr>
-      <w:bookmarkStart w:id="39" w:name="_Toc243227581"/>
+      <w:bookmarkStart w:id="40" w:name="_Toc243227816"/>
       <w:r>
         <w:rPr>
           <w:rFonts w:ascii="Times New Roman" w:eastAsia="黑体" w:hAnsi="Times New Roman"/>
@@ -21403,7 +22604,7 @@
         </w:rPr>
         <w:t>文件导航</w:t>
       </w:r>
-      <w:bookmarkEnd w:id="39"/>
+      <w:bookmarkEnd w:id="40"/>
     </w:p>
     <w:p>
       <w:pPr>
@@ -22142,31 +23343,31 @@
       </w:rPr>
     </w:lvl>
   </w:abstractNum>
-  <w:num w:numId="1" w16cid:durableId="1523930057">
+  <w:num w:numId="1" w16cid:durableId="1762291738">
     <w:abstractNumId w:val="8"/>
   </w:num>
-  <w:num w:numId="2" w16cid:durableId="1352142230">
+  <w:num w:numId="2" w16cid:durableId="452139682">
     <w:abstractNumId w:val="6"/>
   </w:num>
-  <w:num w:numId="3" w16cid:durableId="485442007">
+  <w:num w:numId="3" w16cid:durableId="1670405188">
     <w:abstractNumId w:val="5"/>
   </w:num>
-  <w:num w:numId="4" w16cid:durableId="1236622686">
+  <w:num w:numId="4" w16cid:durableId="1761831859">
     <w:abstractNumId w:val="4"/>
   </w:num>
-  <w:num w:numId="5" w16cid:durableId="911698052">
+  <w:num w:numId="5" w16cid:durableId="620264722">
     <w:abstractNumId w:val="7"/>
   </w:num>
-  <w:num w:numId="6" w16cid:durableId="1150974603">
+  <w:num w:numId="6" w16cid:durableId="942225828">
     <w:abstractNumId w:val="3"/>
   </w:num>
-  <w:num w:numId="7" w16cid:durableId="503057749">
+  <w:num w:numId="7" w16cid:durableId="982005202">
     <w:abstractNumId w:val="2"/>
   </w:num>
-  <w:num w:numId="8" w16cid:durableId="1184828565">
+  <w:num w:numId="8" w16cid:durableId="1467505285">
     <w:abstractNumId w:val="1"/>
   </w:num>
-  <w:num w:numId="9" w16cid:durableId="376928521">
+  <w:num w:numId="9" w16cid:durableId="386490295">
     <w:abstractNumId w:val="0"/>
   </w:num>
 </w:numbering>
@@ -33565,7 +34766,7 @@
     <w:autoRedefine/>
     <w:uiPriority w:val="39"/>
     <w:unhideWhenUsed/>
-    <w:rsid w:val="00CF1616"/>
+    <w:rsid w:val="005D06A5"/>
   </w:style>
   <w:style w:type="paragraph" w:styleId="TOC2">
     <w:name w:val="toc 2"/>
@@ -33574,7 +34775,7 @@
     <w:autoRedefine/>
     <w:uiPriority w:val="39"/>
     <w:unhideWhenUsed/>
-    <w:rsid w:val="00CF1616"/>
+    <w:rsid w:val="005D06A5"/>
     <w:pPr>
       <w:ind w:leftChars="200" w:left="420"/>
     </w:pPr>
@@ -33584,7 +34785,7 @@
     <w:basedOn w:val="a2"/>
     <w:uiPriority w:val="99"/>
     <w:unhideWhenUsed/>
-    <w:rsid w:val="00CF1616"/>
+    <w:rsid w:val="005D06A5"/>
     <w:rPr>
       <w:color w:val="0000FF" w:themeColor="hyperlink"/>
       <w:u w:val="single"/>

</xml_diff>

<commit_message>
Refresh the memo with the cleaned-data replication numbers
Co-Authored-By: Claude Code <noreply@anthropic.com>
</commit_message>
<xml_diff>
--- a/文档/项目进度与技术备忘_20261018.docx
+++ b/文档/项目进度与技术备忘_20261018.docx
@@ -118,7 +118,7 @@
         </w:rPr>
         <w:fldChar w:fldCharType="separate"/>
       </w:r>
-      <w:hyperlink w:anchor="_Toc243234502" w:history="1">
+      <w:hyperlink w:anchor="_Toc243234587" w:history="1">
         <w:r>
           <w:rPr>
             <w:rStyle w:val="aff9"/>
@@ -180,7 +180,7 @@
             <w:noProof/>
             <w:webHidden/>
           </w:rPr>
-          <w:instrText>PAGEREF _Toc243234502 \h</w:instrText>
+          <w:instrText>PAGEREF _Toc243234587 \h</w:instrText>
         </w:r>
         <w:r>
           <w:rPr>
@@ -238,7 +238,7 @@
           <w14:ligatures w14:val="standardContextual"/>
         </w:rPr>
       </w:pPr>
-      <w:hyperlink w:anchor="_Toc243234503" w:history="1">
+      <w:hyperlink w:anchor="_Toc243234588" w:history="1">
         <w:r>
           <w:rPr>
             <w:rStyle w:val="aff9"/>
@@ -284,7 +284,7 @@
             <w:noProof/>
             <w:webHidden/>
           </w:rPr>
-          <w:instrText>PAGEREF _Toc243234503 \h</w:instrText>
+          <w:instrText>PAGEREF _Toc243234588 \h</w:instrText>
         </w:r>
         <w:r>
           <w:rPr>
@@ -343,7 +343,7 @@
           <w14:ligatures w14:val="standardContextual"/>
         </w:rPr>
       </w:pPr>
-      <w:hyperlink w:anchor="_Toc243234504" w:history="1">
+      <w:hyperlink w:anchor="_Toc243234589" w:history="1">
         <w:r>
           <w:rPr>
             <w:rStyle w:val="aff9"/>
@@ -389,7 +389,7 @@
             <w:noProof/>
             <w:webHidden/>
           </w:rPr>
-          <w:instrText>PAGEREF _Toc243234504 \h</w:instrText>
+          <w:instrText>PAGEREF _Toc243234589 \h</w:instrText>
         </w:r>
         <w:r>
           <w:rPr>
@@ -448,7 +448,7 @@
           <w14:ligatures w14:val="standardContextual"/>
         </w:rPr>
       </w:pPr>
-      <w:hyperlink w:anchor="_Toc243234505" w:history="1">
+      <w:hyperlink w:anchor="_Toc243234590" w:history="1">
         <w:r>
           <w:rPr>
             <w:rStyle w:val="aff9"/>
@@ -494,7 +494,7 @@
             <w:noProof/>
             <w:webHidden/>
           </w:rPr>
-          <w:instrText>PAGEREF _Toc243234505 \h</w:instrText>
+          <w:instrText>PAGEREF _Toc243234590 \h</w:instrText>
         </w:r>
         <w:r>
           <w:rPr>
@@ -553,7 +553,7 @@
           <w14:ligatures w14:val="standardContextual"/>
         </w:rPr>
       </w:pPr>
-      <w:hyperlink w:anchor="_Toc243234506" w:history="1">
+      <w:hyperlink w:anchor="_Toc243234591" w:history="1">
         <w:r>
           <w:rPr>
             <w:rStyle w:val="aff9"/>
@@ -599,7 +599,7 @@
             <w:noProof/>
             <w:webHidden/>
           </w:rPr>
-          <w:instrText>PAGEREF _Toc243234506 \h</w:instrText>
+          <w:instrText>PAGEREF _Toc243234591 \h</w:instrText>
         </w:r>
         <w:r>
           <w:rPr>
@@ -658,7 +658,7 @@
           <w14:ligatures w14:val="standardContextual"/>
         </w:rPr>
       </w:pPr>
-      <w:hyperlink w:anchor="_Toc243234507" w:history="1">
+      <w:hyperlink w:anchor="_Toc243234592" w:history="1">
         <w:r>
           <w:rPr>
             <w:rStyle w:val="aff9"/>
@@ -704,7 +704,7 @@
             <w:noProof/>
             <w:webHidden/>
           </w:rPr>
-          <w:instrText>PAGEREF _Toc243234507 \h</w:instrText>
+          <w:instrText>PAGEREF _Toc243234592 \h</w:instrText>
         </w:r>
         <w:r>
           <w:rPr>
@@ -763,7 +763,7 @@
           <w14:ligatures w14:val="standardContextual"/>
         </w:rPr>
       </w:pPr>
-      <w:hyperlink w:anchor="_Toc243234508" w:history="1">
+      <w:hyperlink w:anchor="_Toc243234593" w:history="1">
         <w:r>
           <w:rPr>
             <w:rStyle w:val="aff9"/>
@@ -809,7 +809,7 @@
             <w:noProof/>
             <w:webHidden/>
           </w:rPr>
-          <w:instrText>PAGEREF _Toc243234508 \h</w:instrText>
+          <w:instrText>PAGEREF _Toc243234593 \h</w:instrText>
         </w:r>
         <w:r>
           <w:rPr>
@@ -868,7 +868,7 @@
           <w14:ligatures w14:val="standardContextual"/>
         </w:rPr>
       </w:pPr>
-      <w:hyperlink w:anchor="_Toc243234509" w:history="1">
+      <w:hyperlink w:anchor="_Toc243234594" w:history="1">
         <w:r>
           <w:rPr>
             <w:rStyle w:val="aff9"/>
@@ -914,7 +914,7 @@
             <w:noProof/>
             <w:webHidden/>
           </w:rPr>
-          <w:instrText>PAGEREF _Toc243234509 \h</w:instrText>
+          <w:instrText>PAGEREF _Toc243234594 \h</w:instrText>
         </w:r>
         <w:r>
           <w:rPr>
@@ -973,7 +973,7 @@
           <w14:ligatures w14:val="standardContextual"/>
         </w:rPr>
       </w:pPr>
-      <w:hyperlink w:anchor="_Toc243234510" w:history="1">
+      <w:hyperlink w:anchor="_Toc243234595" w:history="1">
         <w:r>
           <w:rPr>
             <w:rStyle w:val="aff9"/>
@@ -1019,7 +1019,7 @@
             <w:noProof/>
             <w:webHidden/>
           </w:rPr>
-          <w:instrText>PAGEREF _Toc243234510 \h</w:instrText>
+          <w:instrText>PAGEREF _Toc243234595 \h</w:instrText>
         </w:r>
         <w:r>
           <w:rPr>
@@ -1077,7 +1077,7 @@
           <w14:ligatures w14:val="standardContextual"/>
         </w:rPr>
       </w:pPr>
-      <w:hyperlink w:anchor="_Toc243234511" w:history="1">
+      <w:hyperlink w:anchor="_Toc243234596" w:history="1">
         <w:r>
           <w:rPr>
             <w:rStyle w:val="aff9"/>
@@ -1123,7 +1123,7 @@
             <w:noProof/>
             <w:webHidden/>
           </w:rPr>
-          <w:instrText>PAGEREF _Toc243234511 \h</w:instrText>
+          <w:instrText>PAGEREF _Toc243234596 \h</w:instrText>
         </w:r>
         <w:r>
           <w:rPr>
@@ -1181,7 +1181,7 @@
           <w14:ligatures w14:val="standardContextual"/>
         </w:rPr>
       </w:pPr>
-      <w:hyperlink w:anchor="_Toc243234512" w:history="1">
+      <w:hyperlink w:anchor="_Toc243234597" w:history="1">
         <w:r>
           <w:rPr>
             <w:rStyle w:val="aff9"/>
@@ -1227,7 +1227,7 @@
             <w:noProof/>
             <w:webHidden/>
           </w:rPr>
-          <w:instrText>PAGEREF _Toc243234512 \h</w:instrText>
+          <w:instrText>PAGEREF _Toc243234597 \h</w:instrText>
         </w:r>
         <w:r>
           <w:rPr>
@@ -1285,7 +1285,7 @@
           <w14:ligatures w14:val="standardContextual"/>
         </w:rPr>
       </w:pPr>
-      <w:hyperlink w:anchor="_Toc243234513" w:history="1">
+      <w:hyperlink w:anchor="_Toc243234598" w:history="1">
         <w:r>
           <w:rPr>
             <w:rStyle w:val="aff9"/>
@@ -1331,7 +1331,7 @@
             <w:noProof/>
             <w:webHidden/>
           </w:rPr>
-          <w:instrText>PAGEREF _Toc243234513 \h</w:instrText>
+          <w:instrText>PAGEREF _Toc243234598 \h</w:instrText>
         </w:r>
         <w:r>
           <w:rPr>
@@ -1389,7 +1389,7 @@
           <w14:ligatures w14:val="standardContextual"/>
         </w:rPr>
       </w:pPr>
-      <w:hyperlink w:anchor="_Toc243234514" w:history="1">
+      <w:hyperlink w:anchor="_Toc243234599" w:history="1">
         <w:r>
           <w:rPr>
             <w:rStyle w:val="aff9"/>
@@ -1435,7 +1435,7 @@
             <w:noProof/>
             <w:webHidden/>
           </w:rPr>
-          <w:instrText>PAGEREF _Toc243234514 \h</w:instrText>
+          <w:instrText>PAGEREF _Toc243234599 \h</w:instrText>
         </w:r>
         <w:r>
           <w:rPr>
@@ -1493,7 +1493,7 @@
           <w14:ligatures w14:val="standardContextual"/>
         </w:rPr>
       </w:pPr>
-      <w:hyperlink w:anchor="_Toc243234515" w:history="1">
+      <w:hyperlink w:anchor="_Toc243234600" w:history="1">
         <w:r>
           <w:rPr>
             <w:rStyle w:val="aff9"/>
@@ -1539,7 +1539,7 @@
             <w:noProof/>
             <w:webHidden/>
           </w:rPr>
-          <w:instrText>PAGEREF _Toc243234515 \h</w:instrText>
+          <w:instrText>PAGEREF _Toc243234600 \h</w:instrText>
         </w:r>
         <w:r>
           <w:rPr>
@@ -1598,7 +1598,7 @@
           <w14:ligatures w14:val="standardContextual"/>
         </w:rPr>
       </w:pPr>
-      <w:hyperlink w:anchor="_Toc243234516" w:history="1">
+      <w:hyperlink w:anchor="_Toc243234601" w:history="1">
         <w:r>
           <w:rPr>
             <w:rStyle w:val="aff9"/>
@@ -1644,7 +1644,7 @@
             <w:noProof/>
             <w:webHidden/>
           </w:rPr>
-          <w:instrText>PAGEREF _Toc243234516 \h</w:instrText>
+          <w:instrText>PAGEREF _Toc243234601 \h</w:instrText>
         </w:r>
         <w:r>
           <w:rPr>
@@ -1703,7 +1703,7 @@
           <w14:ligatures w14:val="standardContextual"/>
         </w:rPr>
       </w:pPr>
-      <w:hyperlink w:anchor="_Toc243234517" w:history="1">
+      <w:hyperlink w:anchor="_Toc243234602" w:history="1">
         <w:r>
           <w:rPr>
             <w:rStyle w:val="aff9"/>
@@ -1749,7 +1749,7 @@
             <w:noProof/>
             <w:webHidden/>
           </w:rPr>
-          <w:instrText>PAGEREF _Toc243234517 \h</w:instrText>
+          <w:instrText>PAGEREF _Toc243234602 \h</w:instrText>
         </w:r>
         <w:r>
           <w:rPr>
@@ -1808,7 +1808,7 @@
           <w14:ligatures w14:val="standardContextual"/>
         </w:rPr>
       </w:pPr>
-      <w:hyperlink w:anchor="_Toc243234518" w:history="1">
+      <w:hyperlink w:anchor="_Toc243234603" w:history="1">
         <w:r>
           <w:rPr>
             <w:rStyle w:val="aff9"/>
@@ -1854,7 +1854,7 @@
             <w:noProof/>
             <w:webHidden/>
           </w:rPr>
-          <w:instrText>PAGEREF _Toc243234518 \h</w:instrText>
+          <w:instrText>PAGEREF _Toc243234603 \h</w:instrText>
         </w:r>
         <w:r>
           <w:rPr>
@@ -1912,7 +1912,7 @@
           <w14:ligatures w14:val="standardContextual"/>
         </w:rPr>
       </w:pPr>
-      <w:hyperlink w:anchor="_Toc243234519" w:history="1">
+      <w:hyperlink w:anchor="_Toc243234604" w:history="1">
         <w:r>
           <w:rPr>
             <w:rStyle w:val="aff9"/>
@@ -1958,7 +1958,7 @@
             <w:noProof/>
             <w:webHidden/>
           </w:rPr>
-          <w:instrText>PAGEREF _Toc243234519 \h</w:instrText>
+          <w:instrText>PAGEREF _Toc243234604 \h</w:instrText>
         </w:r>
         <w:r>
           <w:rPr>
@@ -2017,7 +2017,7 @@
           <w14:ligatures w14:val="standardContextual"/>
         </w:rPr>
       </w:pPr>
-      <w:hyperlink w:anchor="_Toc243234520" w:history="1">
+      <w:hyperlink w:anchor="_Toc243234605" w:history="1">
         <w:r>
           <w:rPr>
             <w:rStyle w:val="aff9"/>
@@ -2063,7 +2063,7 @@
             <w:noProof/>
             <w:webHidden/>
           </w:rPr>
-          <w:instrText>PAGEREF _Toc243234520 \h</w:instrText>
+          <w:instrText>PAGEREF _Toc243234605 \h</w:instrText>
         </w:r>
         <w:r>
           <w:rPr>
@@ -2122,7 +2122,7 @@
           <w14:ligatures w14:val="standardContextual"/>
         </w:rPr>
       </w:pPr>
-      <w:hyperlink w:anchor="_Toc243234521" w:history="1">
+      <w:hyperlink w:anchor="_Toc243234606" w:history="1">
         <w:r>
           <w:rPr>
             <w:rStyle w:val="aff9"/>
@@ -2168,7 +2168,7 @@
             <w:noProof/>
             <w:webHidden/>
           </w:rPr>
-          <w:instrText>PAGEREF _Toc243234521 \h</w:instrText>
+          <w:instrText>PAGEREF _Toc243234606 \h</w:instrText>
         </w:r>
         <w:r>
           <w:rPr>
@@ -2227,7 +2227,7 @@
           <w14:ligatures w14:val="standardContextual"/>
         </w:rPr>
       </w:pPr>
-      <w:hyperlink w:anchor="_Toc243234522" w:history="1">
+      <w:hyperlink w:anchor="_Toc243234607" w:history="1">
         <w:r>
           <w:rPr>
             <w:rStyle w:val="aff9"/>
@@ -2273,7 +2273,7 @@
             <w:noProof/>
             <w:webHidden/>
           </w:rPr>
-          <w:instrText>PAGEREF _Toc243234522 \h</w:instrText>
+          <w:instrText>PAGEREF _Toc243234607 \h</w:instrText>
         </w:r>
         <w:r>
           <w:rPr>
@@ -2332,7 +2332,7 @@
           <w14:ligatures w14:val="standardContextual"/>
         </w:rPr>
       </w:pPr>
-      <w:hyperlink w:anchor="_Toc243234523" w:history="1">
+      <w:hyperlink w:anchor="_Toc243234608" w:history="1">
         <w:r>
           <w:rPr>
             <w:rStyle w:val="aff9"/>
@@ -2378,7 +2378,7 @@
             <w:noProof/>
             <w:webHidden/>
           </w:rPr>
-          <w:instrText>PAGEREF _Toc243234523 \h</w:instrText>
+          <w:instrText>PAGEREF _Toc243234608 \h</w:instrText>
         </w:r>
         <w:r>
           <w:rPr>
@@ -2437,7 +2437,7 @@
           <w14:ligatures w14:val="standardContextual"/>
         </w:rPr>
       </w:pPr>
-      <w:hyperlink w:anchor="_Toc243234524" w:history="1">
+      <w:hyperlink w:anchor="_Toc243234609" w:history="1">
         <w:r>
           <w:rPr>
             <w:rStyle w:val="aff9"/>
@@ -2483,7 +2483,7 @@
             <w:noProof/>
             <w:webHidden/>
           </w:rPr>
-          <w:instrText>PAGEREF _Toc243234524 \h</w:instrText>
+          <w:instrText>PAGEREF _Toc243234609 \h</w:instrText>
         </w:r>
         <w:r>
           <w:rPr>
@@ -2542,7 +2542,7 @@
           <w14:ligatures w14:val="standardContextual"/>
         </w:rPr>
       </w:pPr>
-      <w:hyperlink w:anchor="_Toc243234525" w:history="1">
+      <w:hyperlink w:anchor="_Toc243234610" w:history="1">
         <w:r>
           <w:rPr>
             <w:rStyle w:val="aff9"/>
@@ -2604,7 +2604,7 @@
             <w:noProof/>
             <w:webHidden/>
           </w:rPr>
-          <w:instrText>PAGEREF _Toc243234525 \h</w:instrText>
+          <w:instrText>PAGEREF _Toc243234610 \h</w:instrText>
         </w:r>
         <w:r>
           <w:rPr>
@@ -2663,7 +2663,7 @@
           <w14:ligatures w14:val="standardContextual"/>
         </w:rPr>
       </w:pPr>
-      <w:hyperlink w:anchor="_Toc243234526" w:history="1">
+      <w:hyperlink w:anchor="_Toc243234611" w:history="1">
         <w:r>
           <w:rPr>
             <w:rStyle w:val="aff9"/>
@@ -2709,7 +2709,7 @@
             <w:noProof/>
             <w:webHidden/>
           </w:rPr>
-          <w:instrText>PAGEREF _Toc243234526 \h</w:instrText>
+          <w:instrText>PAGEREF _Toc243234611 \h</w:instrText>
         </w:r>
         <w:r>
           <w:rPr>
@@ -2768,7 +2768,7 @@
           <w14:ligatures w14:val="standardContextual"/>
         </w:rPr>
       </w:pPr>
-      <w:hyperlink w:anchor="_Toc243234527" w:history="1">
+      <w:hyperlink w:anchor="_Toc243234612" w:history="1">
         <w:r>
           <w:rPr>
             <w:rStyle w:val="aff9"/>
@@ -2814,7 +2814,7 @@
             <w:noProof/>
             <w:webHidden/>
           </w:rPr>
-          <w:instrText>PAGEREF _Toc243234527 \h</w:instrText>
+          <w:instrText>PAGEREF _Toc243234612 \h</w:instrText>
         </w:r>
         <w:r>
           <w:rPr>
@@ -2873,7 +2873,7 @@
           <w14:ligatures w14:val="standardContextual"/>
         </w:rPr>
       </w:pPr>
-      <w:hyperlink w:anchor="_Toc243234528" w:history="1">
+      <w:hyperlink w:anchor="_Toc243234613" w:history="1">
         <w:r>
           <w:rPr>
             <w:rStyle w:val="aff9"/>
@@ -2919,7 +2919,7 @@
             <w:noProof/>
             <w:webHidden/>
           </w:rPr>
-          <w:instrText>PAGEREF _Toc243234528 \h</w:instrText>
+          <w:instrText>PAGEREF _Toc243234613 \h</w:instrText>
         </w:r>
         <w:r>
           <w:rPr>
@@ -2978,7 +2978,7 @@
           <w14:ligatures w14:val="standardContextual"/>
         </w:rPr>
       </w:pPr>
-      <w:hyperlink w:anchor="_Toc243234529" w:history="1">
+      <w:hyperlink w:anchor="_Toc243234614" w:history="1">
         <w:r>
           <w:rPr>
             <w:rStyle w:val="aff9"/>
@@ -3024,7 +3024,7 @@
             <w:noProof/>
             <w:webHidden/>
           </w:rPr>
-          <w:instrText>PAGEREF _Toc243234529 \h</w:instrText>
+          <w:instrText>PAGEREF _Toc243234614 \h</w:instrText>
         </w:r>
         <w:r>
           <w:rPr>
@@ -3083,7 +3083,7 @@
           <w14:ligatures w14:val="standardContextual"/>
         </w:rPr>
       </w:pPr>
-      <w:hyperlink w:anchor="_Toc243234530" w:history="1">
+      <w:hyperlink w:anchor="_Toc243234615" w:history="1">
         <w:r>
           <w:rPr>
             <w:rStyle w:val="aff9"/>
@@ -3145,7 +3145,7 @@
             <w:noProof/>
             <w:webHidden/>
           </w:rPr>
-          <w:instrText>PAGEREF _Toc243234530 \h</w:instrText>
+          <w:instrText>PAGEREF _Toc243234615 \h</w:instrText>
         </w:r>
         <w:r>
           <w:rPr>
@@ -3204,7 +3204,7 @@
           <w14:ligatures w14:val="standardContextual"/>
         </w:rPr>
       </w:pPr>
-      <w:hyperlink w:anchor="_Toc243234531" w:history="1">
+      <w:hyperlink w:anchor="_Toc243234616" w:history="1">
         <w:r>
           <w:rPr>
             <w:rStyle w:val="aff9"/>
@@ -3250,7 +3250,7 @@
             <w:noProof/>
             <w:webHidden/>
           </w:rPr>
-          <w:instrText>PAGEREF _Toc243234531 \h</w:instrText>
+          <w:instrText>PAGEREF _Toc243234616 \h</w:instrText>
         </w:r>
         <w:r>
           <w:rPr>
@@ -3309,7 +3309,7 @@
           <w14:ligatures w14:val="standardContextual"/>
         </w:rPr>
       </w:pPr>
-      <w:hyperlink w:anchor="_Toc243234532" w:history="1">
+      <w:hyperlink w:anchor="_Toc243234617" w:history="1">
         <w:r>
           <w:rPr>
             <w:rStyle w:val="aff9"/>
@@ -3355,7 +3355,7 @@
             <w:noProof/>
             <w:webHidden/>
           </w:rPr>
-          <w:instrText>PAGEREF _Toc243234532 \h</w:instrText>
+          <w:instrText>PAGEREF _Toc243234617 \h</w:instrText>
         </w:r>
         <w:r>
           <w:rPr>
@@ -3413,7 +3413,7 @@
           <w14:ligatures w14:val="standardContextual"/>
         </w:rPr>
       </w:pPr>
-      <w:hyperlink w:anchor="_Toc243234533" w:history="1">
+      <w:hyperlink w:anchor="_Toc243234618" w:history="1">
         <w:r>
           <w:rPr>
             <w:rStyle w:val="aff9"/>
@@ -3467,7 +3467,7 @@
             <w:noProof/>
             <w:webHidden/>
           </w:rPr>
-          <w:instrText>PAGEREF _Toc243234533 \h</w:instrText>
+          <w:instrText>PAGEREF _Toc243234618 \h</w:instrText>
         </w:r>
         <w:r>
           <w:rPr>
@@ -3526,7 +3526,7 @@
           <w14:ligatures w14:val="standardContextual"/>
         </w:rPr>
       </w:pPr>
-      <w:hyperlink w:anchor="_Toc243234534" w:history="1">
+      <w:hyperlink w:anchor="_Toc243234619" w:history="1">
         <w:r>
           <w:rPr>
             <w:rStyle w:val="aff9"/>
@@ -3588,7 +3588,7 @@
             <w:noProof/>
             <w:webHidden/>
           </w:rPr>
-          <w:instrText>PAGEREF _Toc243234534 \h</w:instrText>
+          <w:instrText>PAGEREF _Toc243234619 \h</w:instrText>
         </w:r>
         <w:r>
           <w:rPr>
@@ -3647,7 +3647,7 @@
           <w14:ligatures w14:val="standardContextual"/>
         </w:rPr>
       </w:pPr>
-      <w:hyperlink w:anchor="_Toc243234535" w:history="1">
+      <w:hyperlink w:anchor="_Toc243234620" w:history="1">
         <w:r>
           <w:rPr>
             <w:rStyle w:val="aff9"/>
@@ -3709,7 +3709,7 @@
             <w:noProof/>
             <w:webHidden/>
           </w:rPr>
-          <w:instrText>PAGEREF _Toc243234535 \h</w:instrText>
+          <w:instrText>PAGEREF _Toc243234620 \h</w:instrText>
         </w:r>
         <w:r>
           <w:rPr>
@@ -3768,7 +3768,7 @@
           <w14:ligatures w14:val="standardContextual"/>
         </w:rPr>
       </w:pPr>
-      <w:hyperlink w:anchor="_Toc243234536" w:history="1">
+      <w:hyperlink w:anchor="_Toc243234621" w:history="1">
         <w:r>
           <w:rPr>
             <w:rStyle w:val="aff9"/>
@@ -3830,7 +3830,7 @@
             <w:noProof/>
             <w:webHidden/>
           </w:rPr>
-          <w:instrText>PAGEREF _Toc243234536 \h</w:instrText>
+          <w:instrText>PAGEREF _Toc243234621 \h</w:instrText>
         </w:r>
         <w:r>
           <w:rPr>
@@ -3889,7 +3889,7 @@
           <w14:ligatures w14:val="standardContextual"/>
         </w:rPr>
       </w:pPr>
-      <w:hyperlink w:anchor="_Toc243234537" w:history="1">
+      <w:hyperlink w:anchor="_Toc243234622" w:history="1">
         <w:r>
           <w:rPr>
             <w:rStyle w:val="aff9"/>
@@ -3967,7 +3967,7 @@
             <w:noProof/>
             <w:webHidden/>
           </w:rPr>
-          <w:instrText>PAGEREF _Toc243234537 \h</w:instrText>
+          <w:instrText>PAGEREF _Toc243234622 \h</w:instrText>
         </w:r>
         <w:r>
           <w:rPr>
@@ -4026,7 +4026,7 @@
           <w14:ligatures w14:val="standardContextual"/>
         </w:rPr>
       </w:pPr>
-      <w:hyperlink w:anchor="_Toc243234538" w:history="1">
+      <w:hyperlink w:anchor="_Toc243234623" w:history="1">
         <w:r>
           <w:rPr>
             <w:rStyle w:val="aff9"/>
@@ -4088,7 +4088,7 @@
             <w:noProof/>
             <w:webHidden/>
           </w:rPr>
-          <w:instrText>PAGEREF _Toc243234538 \h</w:instrText>
+          <w:instrText>PAGEREF _Toc243234623 \h</w:instrText>
         </w:r>
         <w:r>
           <w:rPr>
@@ -4147,7 +4147,7 @@
           <w14:ligatures w14:val="standardContextual"/>
         </w:rPr>
       </w:pPr>
-      <w:hyperlink w:anchor="_Toc243234539" w:history="1">
+      <w:hyperlink w:anchor="_Toc243234624" w:history="1">
         <w:r>
           <w:rPr>
             <w:rStyle w:val="aff9"/>
@@ -4209,7 +4209,7 @@
             <w:noProof/>
             <w:webHidden/>
           </w:rPr>
-          <w:instrText>PAGEREF _Toc243234539 \h</w:instrText>
+          <w:instrText>PAGEREF _Toc243234624 \h</w:instrText>
         </w:r>
         <w:r>
           <w:rPr>
@@ -4268,7 +4268,7 @@
           <w14:ligatures w14:val="standardContextual"/>
         </w:rPr>
       </w:pPr>
-      <w:hyperlink w:anchor="_Toc243234540" w:history="1">
+      <w:hyperlink w:anchor="_Toc243234625" w:history="1">
         <w:r>
           <w:rPr>
             <w:rStyle w:val="aff9"/>
@@ -4330,7 +4330,7 @@
             <w:noProof/>
             <w:webHidden/>
           </w:rPr>
-          <w:instrText>PAGEREF _Toc243234540 \h</w:instrText>
+          <w:instrText>PAGEREF _Toc243234625 \h</w:instrText>
         </w:r>
         <w:r>
           <w:rPr>
@@ -4389,7 +4389,7 @@
           <w14:ligatures w14:val="standardContextual"/>
         </w:rPr>
       </w:pPr>
-      <w:hyperlink w:anchor="_Toc243234541" w:history="1">
+      <w:hyperlink w:anchor="_Toc243234626" w:history="1">
         <w:r>
           <w:rPr>
             <w:rStyle w:val="aff9"/>
@@ -4467,7 +4467,7 @@
             <w:noProof/>
             <w:webHidden/>
           </w:rPr>
-          <w:instrText>PAGEREF _Toc243234541 \h</w:instrText>
+          <w:instrText>PAGEREF _Toc243234626 \h</w:instrText>
         </w:r>
         <w:r>
           <w:rPr>
@@ -4525,7 +4525,7 @@
           <w14:ligatures w14:val="standardContextual"/>
         </w:rPr>
       </w:pPr>
-      <w:hyperlink w:anchor="_Toc243234542" w:history="1">
+      <w:hyperlink w:anchor="_Toc243234627" w:history="1">
         <w:r>
           <w:rPr>
             <w:rStyle w:val="aff9"/>
@@ -4571,7 +4571,7 @@
             <w:noProof/>
             <w:webHidden/>
           </w:rPr>
-          <w:instrText>PAGEREF _Toc243234542 \h</w:instrText>
+          <w:instrText>PAGEREF _Toc243234627 \h</w:instrText>
         </w:r>
         <w:r>
           <w:rPr>
@@ -4630,7 +4630,7 @@
           <w14:ligatures w14:val="standardContextual"/>
         </w:rPr>
       </w:pPr>
-      <w:hyperlink w:anchor="_Toc243234543" w:history="1">
+      <w:hyperlink w:anchor="_Toc243234628" w:history="1">
         <w:r>
           <w:rPr>
             <w:rStyle w:val="aff9"/>
@@ -4692,7 +4692,7 @@
             <w:noProof/>
             <w:webHidden/>
           </w:rPr>
-          <w:instrText>PAGEREF _Toc243234543 \h</w:instrText>
+          <w:instrText>PAGEREF _Toc243234628 \h</w:instrText>
         </w:r>
         <w:r>
           <w:rPr>
@@ -4750,7 +4750,7 @@
           <w14:ligatures w14:val="standardContextual"/>
         </w:rPr>
       </w:pPr>
-      <w:hyperlink w:anchor="_Toc243234544" w:history="1">
+      <w:hyperlink w:anchor="_Toc243234629" w:history="1">
         <w:r>
           <w:rPr>
             <w:rStyle w:val="aff9"/>
@@ -4796,7 +4796,7 @@
             <w:noProof/>
             <w:webHidden/>
           </w:rPr>
-          <w:instrText>PAGEREF _Toc243234544 \h</w:instrText>
+          <w:instrText>PAGEREF _Toc243234629 \h</w:instrText>
         </w:r>
         <w:r>
           <w:rPr>
@@ -4854,7 +4854,7 @@
           <w14:ligatures w14:val="standardContextual"/>
         </w:rPr>
       </w:pPr>
-      <w:hyperlink w:anchor="_Toc243234545" w:history="1">
+      <w:hyperlink w:anchor="_Toc243234630" w:history="1">
         <w:r>
           <w:rPr>
             <w:rStyle w:val="aff9"/>
@@ -4900,7 +4900,7 @@
             <w:noProof/>
             <w:webHidden/>
           </w:rPr>
-          <w:instrText>PAGEREF _Toc243234545 \h</w:instrText>
+          <w:instrText>PAGEREF _Toc243234630 \h</w:instrText>
         </w:r>
         <w:r>
           <w:rPr>
@@ -4958,7 +4958,7 @@
           <w14:ligatures w14:val="standardContextual"/>
         </w:rPr>
       </w:pPr>
-      <w:hyperlink w:anchor="_Toc243234546" w:history="1">
+      <w:hyperlink w:anchor="_Toc243234631" w:history="1">
         <w:r>
           <w:rPr>
             <w:rStyle w:val="aff9"/>
@@ -5020,7 +5020,7 @@
             <w:noProof/>
             <w:webHidden/>
           </w:rPr>
-          <w:instrText>PAGEREF _Toc243234546 \h</w:instrText>
+          <w:instrText>PAGEREF _Toc243234631 \h</w:instrText>
         </w:r>
         <w:r>
           <w:rPr>
@@ -5079,7 +5079,7 @@
           <w14:ligatures w14:val="standardContextual"/>
         </w:rPr>
       </w:pPr>
-      <w:hyperlink w:anchor="_Toc243234547" w:history="1">
+      <w:hyperlink w:anchor="_Toc243234632" w:history="1">
         <w:r>
           <w:rPr>
             <w:rStyle w:val="aff9"/>
@@ -5173,7 +5173,7 @@
             <w:noProof/>
             <w:webHidden/>
           </w:rPr>
-          <w:instrText>PAGEREF _Toc243234547 \h</w:instrText>
+          <w:instrText>PAGEREF _Toc243234632 \h</w:instrText>
         </w:r>
         <w:r>
           <w:rPr>
@@ -5232,7 +5232,7 @@
           <w14:ligatures w14:val="standardContextual"/>
         </w:rPr>
       </w:pPr>
-      <w:hyperlink w:anchor="_Toc243234548" w:history="1">
+      <w:hyperlink w:anchor="_Toc243234633" w:history="1">
         <w:r>
           <w:rPr>
             <w:rStyle w:val="aff9"/>
@@ -5278,7 +5278,7 @@
             <w:noProof/>
             <w:webHidden/>
           </w:rPr>
-          <w:instrText>PAGEREF _Toc243234548 \h</w:instrText>
+          <w:instrText>PAGEREF _Toc243234633 \h</w:instrText>
         </w:r>
         <w:r>
           <w:rPr>
@@ -5333,7 +5333,7 @@
         <w:pStyle w:val="1"/>
         <w:spacing w:before="280" w:after="120"/>
       </w:pPr>
-      <w:bookmarkStart w:id="0" w:name="_Toc243234502"/>
+      <w:bookmarkStart w:id="0" w:name="_Toc243234587"/>
       <w:r>
         <w:rPr>
           <w:rFonts w:ascii="Times New Roman" w:eastAsia="黑体" w:hAnsi="Times New Roman"/>
@@ -5711,7 +5711,7 @@
         <w:rPr>
           <w:color w:val="000000"/>
         </w:rPr>
-        <w:t>p=0.070</w:t>
+        <w:t>p=0.072</w:t>
       </w:r>
       <w:r>
         <w:rPr>
@@ -5753,7 +5753,7 @@
         <w:pStyle w:val="1"/>
         <w:spacing w:before="280" w:after="120"/>
       </w:pPr>
-      <w:bookmarkStart w:id="1" w:name="_Toc243234503"/>
+      <w:bookmarkStart w:id="1" w:name="_Toc243234588"/>
       <w:r>
         <w:rPr>
           <w:rFonts w:ascii="Times New Roman" w:eastAsia="黑体" w:hAnsi="Times New Roman"/>
@@ -5777,7 +5777,7 @@
         <w:pStyle w:val="21"/>
         <w:spacing w:after="120"/>
       </w:pPr>
-      <w:bookmarkStart w:id="2" w:name="_Toc243234504"/>
+      <w:bookmarkStart w:id="2" w:name="_Toc243234589"/>
       <w:r>
         <w:rPr>
           <w:rFonts w:ascii="Times New Roman" w:eastAsia="黑体" w:hAnsi="Times New Roman"/>
@@ -5883,7 +5883,7 @@
         <w:pStyle w:val="21"/>
         <w:spacing w:after="120"/>
       </w:pPr>
-      <w:bookmarkStart w:id="3" w:name="_Toc243234505"/>
+      <w:bookmarkStart w:id="3" w:name="_Toc243234590"/>
       <w:r>
         <w:rPr>
           <w:rFonts w:ascii="Times New Roman" w:eastAsia="黑体" w:hAnsi="Times New Roman"/>
@@ -6292,7 +6292,7 @@
         <w:pStyle w:val="21"/>
         <w:spacing w:after="120"/>
       </w:pPr>
-      <w:bookmarkStart w:id="4" w:name="_Toc243234506"/>
+      <w:bookmarkStart w:id="4" w:name="_Toc243234591"/>
       <w:r>
         <w:rPr>
           <w:rFonts w:ascii="Times New Roman" w:eastAsia="黑体" w:hAnsi="Times New Roman"/>
@@ -6402,7 +6402,7 @@
         <w:pStyle w:val="21"/>
         <w:spacing w:after="120"/>
       </w:pPr>
-      <w:bookmarkStart w:id="5" w:name="_Toc243234507"/>
+      <w:bookmarkStart w:id="5" w:name="_Toc243234592"/>
       <w:r>
         <w:rPr>
           <w:rFonts w:ascii="Times New Roman" w:eastAsia="黑体" w:hAnsi="Times New Roman"/>
@@ -6484,7 +6484,7 @@
         <w:pStyle w:val="21"/>
         <w:spacing w:after="120"/>
       </w:pPr>
-      <w:bookmarkStart w:id="6" w:name="_Toc243234508"/>
+      <w:bookmarkStart w:id="6" w:name="_Toc243234593"/>
       <w:r>
         <w:rPr>
           <w:rFonts w:ascii="Times New Roman" w:eastAsia="黑体" w:hAnsi="Times New Roman"/>
@@ -6556,7 +6556,7 @@
         <w:pStyle w:val="21"/>
         <w:spacing w:after="120"/>
       </w:pPr>
-      <w:bookmarkStart w:id="7" w:name="_Toc243234509"/>
+      <w:bookmarkStart w:id="7" w:name="_Toc243234594"/>
       <w:r>
         <w:rPr>
           <w:rFonts w:ascii="Times New Roman" w:eastAsia="黑体" w:hAnsi="Times New Roman"/>
@@ -6652,7 +6652,7 @@
         <w:pStyle w:val="21"/>
         <w:spacing w:after="120"/>
       </w:pPr>
-      <w:bookmarkStart w:id="8" w:name="_Toc243234510"/>
+      <w:bookmarkStart w:id="8" w:name="_Toc243234595"/>
       <w:r>
         <w:rPr>
           <w:rFonts w:ascii="Times New Roman" w:eastAsia="黑体" w:hAnsi="Times New Roman"/>
@@ -6706,7 +6706,7 @@
         <w:pStyle w:val="1"/>
         <w:spacing w:before="280" w:after="120"/>
       </w:pPr>
-      <w:bookmarkStart w:id="9" w:name="_Toc243234511"/>
+      <w:bookmarkStart w:id="9" w:name="_Toc243234596"/>
       <w:r>
         <w:rPr>
           <w:rFonts w:ascii="Times New Roman" w:eastAsia="黑体" w:hAnsi="Times New Roman"/>
@@ -6860,7 +6860,7 @@
         <w:pStyle w:val="1"/>
         <w:spacing w:before="280" w:after="120"/>
       </w:pPr>
-      <w:bookmarkStart w:id="10" w:name="_Toc243234512"/>
+      <w:bookmarkStart w:id="10" w:name="_Toc243234597"/>
       <w:r>
         <w:rPr>
           <w:rFonts w:ascii="Times New Roman" w:eastAsia="黑体" w:hAnsi="Times New Roman"/>
@@ -7286,7 +7286,7 @@
         <w:pStyle w:val="1"/>
         <w:spacing w:before="280" w:after="120"/>
       </w:pPr>
-      <w:bookmarkStart w:id="11" w:name="_Toc243234513"/>
+      <w:bookmarkStart w:id="11" w:name="_Toc243234598"/>
       <w:r>
         <w:rPr>
           <w:rFonts w:ascii="Times New Roman" w:eastAsia="黑体" w:hAnsi="Times New Roman"/>
@@ -8510,7 +8510,7 @@
         <w:pStyle w:val="1"/>
         <w:spacing w:before="280" w:after="120"/>
       </w:pPr>
-      <w:bookmarkStart w:id="12" w:name="_Toc243234514"/>
+      <w:bookmarkStart w:id="12" w:name="_Toc243234599"/>
       <w:r>
         <w:rPr>
           <w:rFonts w:ascii="Times New Roman" w:eastAsia="黑体" w:hAnsi="Times New Roman"/>
@@ -9601,7 +9601,7 @@
         <w:pStyle w:val="1"/>
         <w:spacing w:before="280" w:after="120"/>
       </w:pPr>
-      <w:bookmarkStart w:id="13" w:name="_Toc243234515"/>
+      <w:bookmarkStart w:id="13" w:name="_Toc243234600"/>
       <w:r>
         <w:rPr>
           <w:rFonts w:ascii="Times New Roman" w:eastAsia="黑体" w:hAnsi="Times New Roman"/>
@@ -9625,7 +9625,7 @@
         <w:pStyle w:val="21"/>
         <w:spacing w:after="120"/>
       </w:pPr>
-      <w:bookmarkStart w:id="14" w:name="_Toc243234516"/>
+      <w:bookmarkStart w:id="14" w:name="_Toc243234601"/>
       <w:r>
         <w:rPr>
           <w:rFonts w:ascii="Times New Roman" w:eastAsia="黑体" w:hAnsi="Times New Roman"/>
@@ -9833,7 +9833,7 @@
         <w:pStyle w:val="21"/>
         <w:spacing w:after="120"/>
       </w:pPr>
-      <w:bookmarkStart w:id="15" w:name="_Toc243234517"/>
+      <w:bookmarkStart w:id="15" w:name="_Toc243234602"/>
       <w:r>
         <w:rPr>
           <w:rFonts w:ascii="Times New Roman" w:eastAsia="黑体" w:hAnsi="Times New Roman"/>
@@ -9919,7 +9919,7 @@
         <w:pStyle w:val="21"/>
         <w:spacing w:after="120"/>
       </w:pPr>
-      <w:bookmarkStart w:id="16" w:name="_Toc243234518"/>
+      <w:bookmarkStart w:id="16" w:name="_Toc243234603"/>
       <w:r>
         <w:rPr>
           <w:rFonts w:ascii="Times New Roman" w:eastAsia="黑体" w:hAnsi="Times New Roman"/>
@@ -11432,7 +11432,7 @@
         <w:pStyle w:val="1"/>
         <w:spacing w:before="280" w:after="120"/>
       </w:pPr>
-      <w:bookmarkStart w:id="17" w:name="_Toc243234519"/>
+      <w:bookmarkStart w:id="17" w:name="_Toc243234604"/>
       <w:r>
         <w:rPr>
           <w:rFonts w:ascii="Times New Roman" w:eastAsia="黑体" w:hAnsi="Times New Roman"/>
@@ -11464,7 +11464,7 @@
         <w:pStyle w:val="21"/>
         <w:spacing w:after="120"/>
       </w:pPr>
-      <w:bookmarkStart w:id="18" w:name="_Toc243234520"/>
+      <w:bookmarkStart w:id="18" w:name="_Toc243234605"/>
       <w:r>
         <w:rPr>
           <w:rFonts w:ascii="Times New Roman" w:eastAsia="黑体" w:hAnsi="Times New Roman"/>
@@ -11730,7 +11730,7 @@
         <w:pStyle w:val="21"/>
         <w:spacing w:after="120"/>
       </w:pPr>
-      <w:bookmarkStart w:id="19" w:name="_Toc243234521"/>
+      <w:bookmarkStart w:id="19" w:name="_Toc243234606"/>
       <w:r>
         <w:rPr>
           <w:rFonts w:ascii="Times New Roman" w:eastAsia="黑体" w:hAnsi="Times New Roman"/>
@@ -11846,7 +11846,7 @@
         <w:pStyle w:val="21"/>
         <w:spacing w:after="120"/>
       </w:pPr>
-      <w:bookmarkStart w:id="20" w:name="_Toc243234522"/>
+      <w:bookmarkStart w:id="20" w:name="_Toc243234607"/>
       <w:r>
         <w:rPr>
           <w:rFonts w:ascii="Times New Roman" w:eastAsia="黑体" w:hAnsi="Times New Roman"/>
@@ -13099,7 +13099,7 @@
         <w:pStyle w:val="21"/>
         <w:spacing w:after="120"/>
       </w:pPr>
-      <w:bookmarkStart w:id="21" w:name="_Toc243234523"/>
+      <w:bookmarkStart w:id="21" w:name="_Toc243234608"/>
       <w:r>
         <w:rPr>
           <w:rFonts w:ascii="Times New Roman" w:eastAsia="黑体" w:hAnsi="Times New Roman"/>
@@ -13221,7 +13221,7 @@
         <w:pStyle w:val="21"/>
         <w:spacing w:after="120"/>
       </w:pPr>
-      <w:bookmarkStart w:id="22" w:name="_Toc243234524"/>
+      <w:bookmarkStart w:id="22" w:name="_Toc243234609"/>
       <w:r>
         <w:rPr>
           <w:rFonts w:ascii="Times New Roman" w:eastAsia="黑体" w:hAnsi="Times New Roman"/>
@@ -13359,7 +13359,7 @@
         <w:pStyle w:val="21"/>
         <w:spacing w:after="120"/>
       </w:pPr>
-      <w:bookmarkStart w:id="23" w:name="_Toc243234525"/>
+      <w:bookmarkStart w:id="23" w:name="_Toc243234610"/>
       <w:r>
         <w:rPr>
           <w:rFonts w:ascii="Times New Roman" w:eastAsia="黑体" w:hAnsi="Times New Roman"/>
@@ -13595,7 +13595,7 @@
         <w:pStyle w:val="21"/>
         <w:spacing w:after="120"/>
       </w:pPr>
-      <w:bookmarkStart w:id="24" w:name="_Toc243234526"/>
+      <w:bookmarkStart w:id="24" w:name="_Toc243234611"/>
       <w:r>
         <w:rPr>
           <w:rFonts w:ascii="Times New Roman" w:eastAsia="黑体" w:hAnsi="Times New Roman"/>
@@ -13711,7 +13711,7 @@
         <w:pStyle w:val="21"/>
         <w:spacing w:after="120"/>
       </w:pPr>
-      <w:bookmarkStart w:id="25" w:name="_Toc243234527"/>
+      <w:bookmarkStart w:id="25" w:name="_Toc243234612"/>
       <w:r>
         <w:rPr>
           <w:rFonts w:ascii="Times New Roman" w:eastAsia="黑体" w:hAnsi="Times New Roman"/>
@@ -14041,7 +14041,7 @@
         <w:pStyle w:val="21"/>
         <w:spacing w:after="120"/>
       </w:pPr>
-      <w:bookmarkStart w:id="26" w:name="_Toc243234528"/>
+      <w:bookmarkStart w:id="26" w:name="_Toc243234613"/>
       <w:r>
         <w:rPr>
           <w:rFonts w:ascii="Times New Roman" w:eastAsia="黑体" w:hAnsi="Times New Roman"/>
@@ -14143,7 +14143,7 @@
         <w:pStyle w:val="21"/>
         <w:spacing w:after="120"/>
       </w:pPr>
-      <w:bookmarkStart w:id="27" w:name="_Toc243234529"/>
+      <w:bookmarkStart w:id="27" w:name="_Toc243234614"/>
       <w:r>
         <w:rPr>
           <w:rFonts w:ascii="Times New Roman" w:eastAsia="黑体" w:hAnsi="Times New Roman"/>
@@ -14281,7 +14281,7 @@
         <w:pStyle w:val="21"/>
         <w:spacing w:after="120"/>
       </w:pPr>
-      <w:bookmarkStart w:id="28" w:name="_Toc243234530"/>
+      <w:bookmarkStart w:id="28" w:name="_Toc243234615"/>
       <w:r>
         <w:rPr>
           <w:rFonts w:ascii="Times New Roman" w:eastAsia="黑体" w:hAnsi="Times New Roman"/>
@@ -14349,7 +14349,7 @@
         <w:pStyle w:val="21"/>
         <w:spacing w:after="120"/>
       </w:pPr>
-      <w:bookmarkStart w:id="29" w:name="_Toc243234531"/>
+      <w:bookmarkStart w:id="29" w:name="_Toc243234616"/>
       <w:r>
         <w:rPr>
           <w:rFonts w:ascii="Times New Roman" w:eastAsia="黑体" w:hAnsi="Times New Roman"/>
@@ -14397,7 +14397,7 @@
         <w:pStyle w:val="21"/>
         <w:spacing w:after="120"/>
       </w:pPr>
-      <w:bookmarkStart w:id="30" w:name="_Toc243234532"/>
+      <w:bookmarkStart w:id="30" w:name="_Toc243234617"/>
       <w:r>
         <w:rPr>
           <w:rFonts w:ascii="Times New Roman" w:eastAsia="黑体" w:hAnsi="Times New Roman"/>
@@ -14561,7 +14561,7 @@
         <w:pStyle w:val="1"/>
         <w:spacing w:before="280" w:after="120"/>
       </w:pPr>
-      <w:bookmarkStart w:id="31" w:name="_Toc243234533"/>
+      <w:bookmarkStart w:id="31" w:name="_Toc243234618"/>
       <w:r>
         <w:rPr>
           <w:rFonts w:ascii="Times New Roman" w:eastAsia="黑体" w:hAnsi="Times New Roman"/>
@@ -15695,7 +15695,7 @@
         <w:pStyle w:val="21"/>
         <w:spacing w:after="120"/>
       </w:pPr>
-      <w:bookmarkStart w:id="32" w:name="_Toc243234534"/>
+      <w:bookmarkStart w:id="32" w:name="_Toc243234619"/>
       <w:r>
         <w:rPr>
           <w:rFonts w:ascii="Times New Roman" w:eastAsia="黑体" w:hAnsi="Times New Roman"/>
@@ -16987,7 +16987,7 @@
         <w:pStyle w:val="21"/>
         <w:spacing w:after="120"/>
       </w:pPr>
-      <w:bookmarkStart w:id="33" w:name="_Toc243234535"/>
+      <w:bookmarkStart w:id="33" w:name="_Toc243234620"/>
       <w:r>
         <w:rPr>
           <w:rFonts w:ascii="Times New Roman" w:eastAsia="黑体" w:hAnsi="Times New Roman"/>
@@ -18484,7 +18484,7 @@
         <w:pStyle w:val="21"/>
         <w:spacing w:after="120"/>
       </w:pPr>
-      <w:bookmarkStart w:id="34" w:name="_Toc243234536"/>
+      <w:bookmarkStart w:id="34" w:name="_Toc243234621"/>
       <w:r>
         <w:rPr>
           <w:rFonts w:ascii="Times New Roman" w:eastAsia="黑体" w:hAnsi="Times New Roman"/>
@@ -19411,7 +19411,7 @@
         <w:pStyle w:val="21"/>
         <w:spacing w:after="120"/>
       </w:pPr>
-      <w:bookmarkStart w:id="35" w:name="_Toc243234537"/>
+      <w:bookmarkStart w:id="35" w:name="_Toc243234622"/>
       <w:r>
         <w:rPr>
           <w:rFonts w:ascii="Times New Roman" w:eastAsia="黑体" w:hAnsi="Times New Roman"/>
@@ -21020,7 +21020,7 @@
         <w:pStyle w:val="21"/>
         <w:spacing w:after="120"/>
       </w:pPr>
-      <w:bookmarkStart w:id="36" w:name="_Toc243234538"/>
+      <w:bookmarkStart w:id="36" w:name="_Toc243234623"/>
       <w:r>
         <w:rPr>
           <w:rFonts w:ascii="Times New Roman" w:eastAsia="黑体" w:hAnsi="Times New Roman"/>
@@ -22100,7 +22100,7 @@
         <w:pStyle w:val="21"/>
         <w:spacing w:after="120"/>
       </w:pPr>
-      <w:bookmarkStart w:id="37" w:name="_Toc243234539"/>
+      <w:bookmarkStart w:id="37" w:name="_Toc243234624"/>
       <w:r>
         <w:rPr>
           <w:rFonts w:ascii="Times New Roman" w:eastAsia="黑体" w:hAnsi="Times New Roman"/>
@@ -23672,7 +23672,7 @@
         <w:pStyle w:val="21"/>
         <w:spacing w:after="120"/>
       </w:pPr>
-      <w:bookmarkStart w:id="38" w:name="_Toc243234540"/>
+      <w:bookmarkStart w:id="38" w:name="_Toc243234625"/>
       <w:r>
         <w:rPr>
           <w:rFonts w:ascii="Times New Roman" w:eastAsia="黑体" w:hAnsi="Times New Roman"/>
@@ -23738,7 +23738,7 @@
         <w:rPr>
           <w:color w:val="000000"/>
         </w:rPr>
-        <w:t xml:space="preserve"> 1.28e-13</w:t>
+        <w:t xml:space="preserve"> 1.42e-13</w:t>
       </w:r>
       <w:r>
         <w:rPr>
@@ -23860,13 +23860,37 @@
         <w:rPr>
           <w:color w:val="000000"/>
         </w:rPr>
-        <w:t>条对组间差的影响最大</w:t>
-      </w:r>
-      <w:r>
-        <w:rPr>
-          <w:color w:val="000000"/>
-        </w:rPr>
-        <w:t xml:space="preserve"> 0.057pp</w:t>
+        <w:t>条对组均值影响最大</w:t>
+      </w:r>
+      <w:r>
+        <w:rPr>
+          <w:color w:val="000000"/>
+        </w:rPr>
+        <w:t xml:space="preserve"> 0.0516pp</w:t>
+      </w:r>
+      <w:r>
+        <w:rPr>
+          <w:color w:val="000000"/>
+        </w:rPr>
+        <w:t>，调高的组间差变化</w:t>
+      </w:r>
+      <w:r>
+        <w:rPr>
+          <w:color w:val="000000"/>
+        </w:rPr>
+        <w:t xml:space="preserve"> +0.0433</w:t>
+      </w:r>
+      <w:r>
+        <w:rPr>
+          <w:color w:val="000000"/>
+        </w:rPr>
+        <w:t>、调低变化</w:t>
+      </w:r>
+      <w:r>
+        <w:rPr>
+          <w:color w:val="000000"/>
+        </w:rPr>
+        <w:t xml:space="preserve"> -0.0608</w:t>
       </w:r>
       <w:r>
         <w:rPr>
@@ -23914,7 +23938,7 @@
         <w:rPr>
           <w:color w:val="000000"/>
         </w:rPr>
-        <w:t xml:space="preserve"> 4.94e-05pp</w:t>
+        <w:t xml:space="preserve"> 4.79e-05pp</w:t>
       </w:r>
       <w:r>
         <w:rPr>
@@ -24084,7 +24108,7 @@
         <w:pStyle w:val="21"/>
         <w:spacing w:after="120"/>
       </w:pPr>
-      <w:bookmarkStart w:id="39" w:name="_Toc243234541"/>
+      <w:bookmarkStart w:id="39" w:name="_Toc243234626"/>
       <w:r>
         <w:rPr>
           <w:rFonts w:ascii="Times New Roman" w:eastAsia="黑体" w:hAnsi="Times New Roman"/>
@@ -24994,7 +25018,7 @@
         <w:pStyle w:val="1"/>
         <w:spacing w:before="280" w:after="120"/>
       </w:pPr>
-      <w:bookmarkStart w:id="40" w:name="_Toc243234542"/>
+      <w:bookmarkStart w:id="40" w:name="_Toc243234627"/>
       <w:r>
         <w:rPr>
           <w:rFonts w:ascii="Times New Roman" w:eastAsia="黑体" w:hAnsi="Times New Roman"/>
@@ -25428,7 +25452,7 @@
         <w:pStyle w:val="21"/>
         <w:spacing w:after="120"/>
       </w:pPr>
-      <w:bookmarkStart w:id="41" w:name="_Toc243234543"/>
+      <w:bookmarkStart w:id="41" w:name="_Toc243234628"/>
       <w:r>
         <w:rPr>
           <w:rFonts w:ascii="Times New Roman" w:eastAsia="黑体" w:hAnsi="Times New Roman"/>
@@ -26375,7 +26399,7 @@
         <w:pStyle w:val="1"/>
         <w:spacing w:before="280" w:after="120"/>
       </w:pPr>
-      <w:bookmarkStart w:id="42" w:name="_Toc243234544"/>
+      <w:bookmarkStart w:id="42" w:name="_Toc243234629"/>
       <w:r>
         <w:rPr>
           <w:rFonts w:ascii="Times New Roman" w:eastAsia="黑体" w:hAnsi="Times New Roman"/>
@@ -26769,7 +26793,7 @@
         <w:pStyle w:val="1"/>
         <w:spacing w:before="280" w:after="120"/>
       </w:pPr>
-      <w:bookmarkStart w:id="43" w:name="_Toc243234545"/>
+      <w:bookmarkStart w:id="43" w:name="_Toc243234630"/>
       <w:r>
         <w:rPr>
           <w:rFonts w:ascii="Times New Roman" w:eastAsia="黑体" w:hAnsi="Times New Roman"/>
@@ -27379,7 +27403,7 @@
         <w:pStyle w:val="1"/>
         <w:spacing w:before="280" w:after="120"/>
       </w:pPr>
-      <w:bookmarkStart w:id="44" w:name="_Toc243234546"/>
+      <w:bookmarkStart w:id="44" w:name="_Toc243234631"/>
       <w:r>
         <w:rPr>
           <w:rFonts w:ascii="Times New Roman" w:eastAsia="黑体" w:hAnsi="Times New Roman"/>
@@ -27419,7 +27443,7 @@
         <w:pStyle w:val="21"/>
         <w:spacing w:after="120"/>
       </w:pPr>
-      <w:bookmarkStart w:id="45" w:name="_Toc243234547"/>
+      <w:bookmarkStart w:id="45" w:name="_Toc243234632"/>
       <w:r>
         <w:rPr>
           <w:rFonts w:ascii="Times New Roman" w:eastAsia="黑体" w:hAnsi="Times New Roman"/>
@@ -28681,7 +28705,7 @@
         <w:pStyle w:val="21"/>
         <w:spacing w:after="120"/>
       </w:pPr>
-      <w:bookmarkStart w:id="46" w:name="_Toc243234548"/>
+      <w:bookmarkStart w:id="46" w:name="_Toc243234633"/>
       <w:r>
         <w:rPr>
           <w:rFonts w:ascii="Times New Roman" w:eastAsia="黑体" w:hAnsi="Times New Roman"/>
@@ -29311,31 +29335,31 @@
       </w:rPr>
     </w:lvl>
   </w:abstractNum>
-  <w:num w:numId="1" w16cid:durableId="1363095977">
+  <w:num w:numId="1" w16cid:durableId="600262899">
     <w:abstractNumId w:val="8"/>
   </w:num>
-  <w:num w:numId="2" w16cid:durableId="1131173421">
+  <w:num w:numId="2" w16cid:durableId="249042469">
     <w:abstractNumId w:val="6"/>
   </w:num>
-  <w:num w:numId="3" w16cid:durableId="702024533">
+  <w:num w:numId="3" w16cid:durableId="1992557780">
     <w:abstractNumId w:val="5"/>
   </w:num>
-  <w:num w:numId="4" w16cid:durableId="1103959418">
+  <w:num w:numId="4" w16cid:durableId="866334536">
     <w:abstractNumId w:val="4"/>
   </w:num>
-  <w:num w:numId="5" w16cid:durableId="346686487">
+  <w:num w:numId="5" w16cid:durableId="242645397">
     <w:abstractNumId w:val="7"/>
   </w:num>
-  <w:num w:numId="6" w16cid:durableId="1376127339">
+  <w:num w:numId="6" w16cid:durableId="941183680">
     <w:abstractNumId w:val="3"/>
   </w:num>
-  <w:num w:numId="7" w16cid:durableId="1326518950">
+  <w:num w:numId="7" w16cid:durableId="1345092796">
     <w:abstractNumId w:val="2"/>
   </w:num>
-  <w:num w:numId="8" w16cid:durableId="414711921">
+  <w:num w:numId="8" w16cid:durableId="467825645">
     <w:abstractNumId w:val="1"/>
   </w:num>
-  <w:num w:numId="9" w16cid:durableId="450058346">
+  <w:num w:numId="9" w16cid:durableId="1713383797">
     <w:abstractNumId w:val="0"/>
   </w:num>
 </w:numbering>
@@ -40734,7 +40758,7 @@
     <w:autoRedefine/>
     <w:uiPriority w:val="39"/>
     <w:unhideWhenUsed/>
-    <w:rsid w:val="002D4CE1"/>
+    <w:rsid w:val="000F4282"/>
   </w:style>
   <w:style w:type="paragraph" w:styleId="TOC2">
     <w:name w:val="toc 2"/>
@@ -40743,7 +40767,7 @@
     <w:autoRedefine/>
     <w:uiPriority w:val="39"/>
     <w:unhideWhenUsed/>
-    <w:rsid w:val="002D4CE1"/>
+    <w:rsid w:val="000F4282"/>
     <w:pPr>
       <w:ind w:leftChars="200" w:left="420"/>
     </w:pPr>
@@ -40753,7 +40777,7 @@
     <w:basedOn w:val="a2"/>
     <w:uiPriority w:val="99"/>
     <w:unhideWhenUsed/>
-    <w:rsid w:val="002D4CE1"/>
+    <w:rsid w:val="000F4282"/>
     <w:rPr>
       <w:color w:val="0000FF" w:themeColor="hyperlink"/>
       <w:u w:val="single"/>

</xml_diff>

<commit_message>
Add the marginal six-month note to the memo
Co-Authored-By: Claude Code <noreply@anthropic.com>
</commit_message>
<xml_diff>
--- a/文档/项目进度与技术备忘_20261018.docx
+++ b/文档/项目进度与技术备忘_20261018.docx
@@ -118,7 +118,7 @@
         </w:rPr>
         <w:fldChar w:fldCharType="separate"/>
       </w:r>
-      <w:hyperlink w:anchor="_Toc243235038" w:history="1">
+      <w:hyperlink w:anchor="_Toc243235102" w:history="1">
         <w:r>
           <w:rPr>
             <w:rStyle w:val="aff9"/>
@@ -180,7 +180,7 @@
             <w:noProof/>
             <w:webHidden/>
           </w:rPr>
-          <w:instrText>PAGEREF _Toc243235038 \h</w:instrText>
+          <w:instrText>PAGEREF _Toc243235102 \h</w:instrText>
         </w:r>
         <w:r>
           <w:rPr>
@@ -238,7 +238,7 @@
           <w14:ligatures w14:val="standardContextual"/>
         </w:rPr>
       </w:pPr>
-      <w:hyperlink w:anchor="_Toc243235039" w:history="1">
+      <w:hyperlink w:anchor="_Toc243235103" w:history="1">
         <w:r>
           <w:rPr>
             <w:rStyle w:val="aff9"/>
@@ -284,7 +284,7 @@
             <w:noProof/>
             <w:webHidden/>
           </w:rPr>
-          <w:instrText>PAGEREF _Toc243235039 \h</w:instrText>
+          <w:instrText>PAGEREF _Toc243235103 \h</w:instrText>
         </w:r>
         <w:r>
           <w:rPr>
@@ -343,7 +343,7 @@
           <w14:ligatures w14:val="standardContextual"/>
         </w:rPr>
       </w:pPr>
-      <w:hyperlink w:anchor="_Toc243235040" w:history="1">
+      <w:hyperlink w:anchor="_Toc243235104" w:history="1">
         <w:r>
           <w:rPr>
             <w:rStyle w:val="aff9"/>
@@ -389,7 +389,7 @@
             <w:noProof/>
             <w:webHidden/>
           </w:rPr>
-          <w:instrText>PAGEREF _Toc243235040 \h</w:instrText>
+          <w:instrText>PAGEREF _Toc243235104 \h</w:instrText>
         </w:r>
         <w:r>
           <w:rPr>
@@ -448,7 +448,7 @@
           <w14:ligatures w14:val="standardContextual"/>
         </w:rPr>
       </w:pPr>
-      <w:hyperlink w:anchor="_Toc243235041" w:history="1">
+      <w:hyperlink w:anchor="_Toc243235105" w:history="1">
         <w:r>
           <w:rPr>
             <w:rStyle w:val="aff9"/>
@@ -494,7 +494,7 @@
             <w:noProof/>
             <w:webHidden/>
           </w:rPr>
-          <w:instrText>PAGEREF _Toc243235041 \h</w:instrText>
+          <w:instrText>PAGEREF _Toc243235105 \h</w:instrText>
         </w:r>
         <w:r>
           <w:rPr>
@@ -553,7 +553,7 @@
           <w14:ligatures w14:val="standardContextual"/>
         </w:rPr>
       </w:pPr>
-      <w:hyperlink w:anchor="_Toc243235042" w:history="1">
+      <w:hyperlink w:anchor="_Toc243235106" w:history="1">
         <w:r>
           <w:rPr>
             <w:rStyle w:val="aff9"/>
@@ -599,7 +599,7 @@
             <w:noProof/>
             <w:webHidden/>
           </w:rPr>
-          <w:instrText>PAGEREF _Toc243235042 \h</w:instrText>
+          <w:instrText>PAGEREF _Toc243235106 \h</w:instrText>
         </w:r>
         <w:r>
           <w:rPr>
@@ -658,7 +658,7 @@
           <w14:ligatures w14:val="standardContextual"/>
         </w:rPr>
       </w:pPr>
-      <w:hyperlink w:anchor="_Toc243235043" w:history="1">
+      <w:hyperlink w:anchor="_Toc243235107" w:history="1">
         <w:r>
           <w:rPr>
             <w:rStyle w:val="aff9"/>
@@ -704,7 +704,7 @@
             <w:noProof/>
             <w:webHidden/>
           </w:rPr>
-          <w:instrText>PAGEREF _Toc243235043 \h</w:instrText>
+          <w:instrText>PAGEREF _Toc243235107 \h</w:instrText>
         </w:r>
         <w:r>
           <w:rPr>
@@ -763,7 +763,7 @@
           <w14:ligatures w14:val="standardContextual"/>
         </w:rPr>
       </w:pPr>
-      <w:hyperlink w:anchor="_Toc243235044" w:history="1">
+      <w:hyperlink w:anchor="_Toc243235108" w:history="1">
         <w:r>
           <w:rPr>
             <w:rStyle w:val="aff9"/>
@@ -809,7 +809,7 @@
             <w:noProof/>
             <w:webHidden/>
           </w:rPr>
-          <w:instrText>PAGEREF _Toc243235044 \h</w:instrText>
+          <w:instrText>PAGEREF _Toc243235108 \h</w:instrText>
         </w:r>
         <w:r>
           <w:rPr>
@@ -868,7 +868,7 @@
           <w14:ligatures w14:val="standardContextual"/>
         </w:rPr>
       </w:pPr>
-      <w:hyperlink w:anchor="_Toc243235045" w:history="1">
+      <w:hyperlink w:anchor="_Toc243235109" w:history="1">
         <w:r>
           <w:rPr>
             <w:rStyle w:val="aff9"/>
@@ -914,7 +914,7 @@
             <w:noProof/>
             <w:webHidden/>
           </w:rPr>
-          <w:instrText>PAGEREF _Toc243235045 \h</w:instrText>
+          <w:instrText>PAGEREF _Toc243235109 \h</w:instrText>
         </w:r>
         <w:r>
           <w:rPr>
@@ -973,7 +973,7 @@
           <w14:ligatures w14:val="standardContextual"/>
         </w:rPr>
       </w:pPr>
-      <w:hyperlink w:anchor="_Toc243235046" w:history="1">
+      <w:hyperlink w:anchor="_Toc243235110" w:history="1">
         <w:r>
           <w:rPr>
             <w:rStyle w:val="aff9"/>
@@ -1019,7 +1019,7 @@
             <w:noProof/>
             <w:webHidden/>
           </w:rPr>
-          <w:instrText>PAGEREF _Toc243235046 \h</w:instrText>
+          <w:instrText>PAGEREF _Toc243235110 \h</w:instrText>
         </w:r>
         <w:r>
           <w:rPr>
@@ -1077,7 +1077,7 @@
           <w14:ligatures w14:val="standardContextual"/>
         </w:rPr>
       </w:pPr>
-      <w:hyperlink w:anchor="_Toc243235047" w:history="1">
+      <w:hyperlink w:anchor="_Toc243235111" w:history="1">
         <w:r>
           <w:rPr>
             <w:rStyle w:val="aff9"/>
@@ -1123,7 +1123,7 @@
             <w:noProof/>
             <w:webHidden/>
           </w:rPr>
-          <w:instrText>PAGEREF _Toc243235047 \h</w:instrText>
+          <w:instrText>PAGEREF _Toc243235111 \h</w:instrText>
         </w:r>
         <w:r>
           <w:rPr>
@@ -1181,7 +1181,7 @@
           <w14:ligatures w14:val="standardContextual"/>
         </w:rPr>
       </w:pPr>
-      <w:hyperlink w:anchor="_Toc243235048" w:history="1">
+      <w:hyperlink w:anchor="_Toc243235112" w:history="1">
         <w:r>
           <w:rPr>
             <w:rStyle w:val="aff9"/>
@@ -1227,7 +1227,7 @@
             <w:noProof/>
             <w:webHidden/>
           </w:rPr>
-          <w:instrText>PAGEREF _Toc243235048 \h</w:instrText>
+          <w:instrText>PAGEREF _Toc243235112 \h</w:instrText>
         </w:r>
         <w:r>
           <w:rPr>
@@ -1285,7 +1285,7 @@
           <w14:ligatures w14:val="standardContextual"/>
         </w:rPr>
       </w:pPr>
-      <w:hyperlink w:anchor="_Toc243235049" w:history="1">
+      <w:hyperlink w:anchor="_Toc243235113" w:history="1">
         <w:r>
           <w:rPr>
             <w:rStyle w:val="aff9"/>
@@ -1331,7 +1331,7 @@
             <w:noProof/>
             <w:webHidden/>
           </w:rPr>
-          <w:instrText>PAGEREF _Toc243235049 \h</w:instrText>
+          <w:instrText>PAGEREF _Toc243235113 \h</w:instrText>
         </w:r>
         <w:r>
           <w:rPr>
@@ -1389,7 +1389,7 @@
           <w14:ligatures w14:val="standardContextual"/>
         </w:rPr>
       </w:pPr>
-      <w:hyperlink w:anchor="_Toc243235050" w:history="1">
+      <w:hyperlink w:anchor="_Toc243235114" w:history="1">
         <w:r>
           <w:rPr>
             <w:rStyle w:val="aff9"/>
@@ -1435,7 +1435,7 @@
             <w:noProof/>
             <w:webHidden/>
           </w:rPr>
-          <w:instrText>PAGEREF _Toc243235050 \h</w:instrText>
+          <w:instrText>PAGEREF _Toc243235114 \h</w:instrText>
         </w:r>
         <w:r>
           <w:rPr>
@@ -1493,7 +1493,7 @@
           <w14:ligatures w14:val="standardContextual"/>
         </w:rPr>
       </w:pPr>
-      <w:hyperlink w:anchor="_Toc243235051" w:history="1">
+      <w:hyperlink w:anchor="_Toc243235115" w:history="1">
         <w:r>
           <w:rPr>
             <w:rStyle w:val="aff9"/>
@@ -1539,7 +1539,7 @@
             <w:noProof/>
             <w:webHidden/>
           </w:rPr>
-          <w:instrText>PAGEREF _Toc243235051 \h</w:instrText>
+          <w:instrText>PAGEREF _Toc243235115 \h</w:instrText>
         </w:r>
         <w:r>
           <w:rPr>
@@ -1598,7 +1598,7 @@
           <w14:ligatures w14:val="standardContextual"/>
         </w:rPr>
       </w:pPr>
-      <w:hyperlink w:anchor="_Toc243235052" w:history="1">
+      <w:hyperlink w:anchor="_Toc243235116" w:history="1">
         <w:r>
           <w:rPr>
             <w:rStyle w:val="aff9"/>
@@ -1644,7 +1644,7 @@
             <w:noProof/>
             <w:webHidden/>
           </w:rPr>
-          <w:instrText>PAGEREF _Toc243235052 \h</w:instrText>
+          <w:instrText>PAGEREF _Toc243235116 \h</w:instrText>
         </w:r>
         <w:r>
           <w:rPr>
@@ -1703,7 +1703,7 @@
           <w14:ligatures w14:val="standardContextual"/>
         </w:rPr>
       </w:pPr>
-      <w:hyperlink w:anchor="_Toc243235053" w:history="1">
+      <w:hyperlink w:anchor="_Toc243235117" w:history="1">
         <w:r>
           <w:rPr>
             <w:rStyle w:val="aff9"/>
@@ -1749,7 +1749,7 @@
             <w:noProof/>
             <w:webHidden/>
           </w:rPr>
-          <w:instrText>PAGEREF _Toc243235053 \h</w:instrText>
+          <w:instrText>PAGEREF _Toc243235117 \h</w:instrText>
         </w:r>
         <w:r>
           <w:rPr>
@@ -1808,7 +1808,7 @@
           <w14:ligatures w14:val="standardContextual"/>
         </w:rPr>
       </w:pPr>
-      <w:hyperlink w:anchor="_Toc243235054" w:history="1">
+      <w:hyperlink w:anchor="_Toc243235118" w:history="1">
         <w:r>
           <w:rPr>
             <w:rStyle w:val="aff9"/>
@@ -1854,7 +1854,7 @@
             <w:noProof/>
             <w:webHidden/>
           </w:rPr>
-          <w:instrText>PAGEREF _Toc243235054 \h</w:instrText>
+          <w:instrText>PAGEREF _Toc243235118 \h</w:instrText>
         </w:r>
         <w:r>
           <w:rPr>
@@ -1912,7 +1912,7 @@
           <w14:ligatures w14:val="standardContextual"/>
         </w:rPr>
       </w:pPr>
-      <w:hyperlink w:anchor="_Toc243235055" w:history="1">
+      <w:hyperlink w:anchor="_Toc243235119" w:history="1">
         <w:r>
           <w:rPr>
             <w:rStyle w:val="aff9"/>
@@ -1958,7 +1958,7 @@
             <w:noProof/>
             <w:webHidden/>
           </w:rPr>
-          <w:instrText>PAGEREF _Toc243235055 \h</w:instrText>
+          <w:instrText>PAGEREF _Toc243235119 \h</w:instrText>
         </w:r>
         <w:r>
           <w:rPr>
@@ -2017,7 +2017,7 @@
           <w14:ligatures w14:val="standardContextual"/>
         </w:rPr>
       </w:pPr>
-      <w:hyperlink w:anchor="_Toc243235056" w:history="1">
+      <w:hyperlink w:anchor="_Toc243235120" w:history="1">
         <w:r>
           <w:rPr>
             <w:rStyle w:val="aff9"/>
@@ -2063,7 +2063,7 @@
             <w:noProof/>
             <w:webHidden/>
           </w:rPr>
-          <w:instrText>PAGEREF _Toc243235056 \h</w:instrText>
+          <w:instrText>PAGEREF _Toc243235120 \h</w:instrText>
         </w:r>
         <w:r>
           <w:rPr>
@@ -2122,7 +2122,7 @@
           <w14:ligatures w14:val="standardContextual"/>
         </w:rPr>
       </w:pPr>
-      <w:hyperlink w:anchor="_Toc243235057" w:history="1">
+      <w:hyperlink w:anchor="_Toc243235121" w:history="1">
         <w:r>
           <w:rPr>
             <w:rStyle w:val="aff9"/>
@@ -2168,7 +2168,7 @@
             <w:noProof/>
             <w:webHidden/>
           </w:rPr>
-          <w:instrText>PAGEREF _Toc243235057 \h</w:instrText>
+          <w:instrText>PAGEREF _Toc243235121 \h</w:instrText>
         </w:r>
         <w:r>
           <w:rPr>
@@ -2227,7 +2227,7 @@
           <w14:ligatures w14:val="standardContextual"/>
         </w:rPr>
       </w:pPr>
-      <w:hyperlink w:anchor="_Toc243235058" w:history="1">
+      <w:hyperlink w:anchor="_Toc243235122" w:history="1">
         <w:r>
           <w:rPr>
             <w:rStyle w:val="aff9"/>
@@ -2273,7 +2273,7 @@
             <w:noProof/>
             <w:webHidden/>
           </w:rPr>
-          <w:instrText>PAGEREF _Toc243235058 \h</w:instrText>
+          <w:instrText>PAGEREF _Toc243235122 \h</w:instrText>
         </w:r>
         <w:r>
           <w:rPr>
@@ -2332,7 +2332,7 @@
           <w14:ligatures w14:val="standardContextual"/>
         </w:rPr>
       </w:pPr>
-      <w:hyperlink w:anchor="_Toc243235059" w:history="1">
+      <w:hyperlink w:anchor="_Toc243235123" w:history="1">
         <w:r>
           <w:rPr>
             <w:rStyle w:val="aff9"/>
@@ -2378,7 +2378,7 @@
             <w:noProof/>
             <w:webHidden/>
           </w:rPr>
-          <w:instrText>PAGEREF _Toc243235059 \h</w:instrText>
+          <w:instrText>PAGEREF _Toc243235123 \h</w:instrText>
         </w:r>
         <w:r>
           <w:rPr>
@@ -2437,7 +2437,7 @@
           <w14:ligatures w14:val="standardContextual"/>
         </w:rPr>
       </w:pPr>
-      <w:hyperlink w:anchor="_Toc243235060" w:history="1">
+      <w:hyperlink w:anchor="_Toc243235124" w:history="1">
         <w:r>
           <w:rPr>
             <w:rStyle w:val="aff9"/>
@@ -2483,7 +2483,7 @@
             <w:noProof/>
             <w:webHidden/>
           </w:rPr>
-          <w:instrText>PAGEREF _Toc243235060 \h</w:instrText>
+          <w:instrText>PAGEREF _Toc243235124 \h</w:instrText>
         </w:r>
         <w:r>
           <w:rPr>
@@ -2542,7 +2542,7 @@
           <w14:ligatures w14:val="standardContextual"/>
         </w:rPr>
       </w:pPr>
-      <w:hyperlink w:anchor="_Toc243235061" w:history="1">
+      <w:hyperlink w:anchor="_Toc243235125" w:history="1">
         <w:r>
           <w:rPr>
             <w:rStyle w:val="aff9"/>
@@ -2604,7 +2604,7 @@
             <w:noProof/>
             <w:webHidden/>
           </w:rPr>
-          <w:instrText>PAGEREF _Toc243235061 \h</w:instrText>
+          <w:instrText>PAGEREF _Toc243235125 \h</w:instrText>
         </w:r>
         <w:r>
           <w:rPr>
@@ -2663,7 +2663,7 @@
           <w14:ligatures w14:val="standardContextual"/>
         </w:rPr>
       </w:pPr>
-      <w:hyperlink w:anchor="_Toc243235062" w:history="1">
+      <w:hyperlink w:anchor="_Toc243235126" w:history="1">
         <w:r>
           <w:rPr>
             <w:rStyle w:val="aff9"/>
@@ -2709,7 +2709,7 @@
             <w:noProof/>
             <w:webHidden/>
           </w:rPr>
-          <w:instrText>PAGEREF _Toc243235062 \h</w:instrText>
+          <w:instrText>PAGEREF _Toc243235126 \h</w:instrText>
         </w:r>
         <w:r>
           <w:rPr>
@@ -2768,7 +2768,7 @@
           <w14:ligatures w14:val="standardContextual"/>
         </w:rPr>
       </w:pPr>
-      <w:hyperlink w:anchor="_Toc243235063" w:history="1">
+      <w:hyperlink w:anchor="_Toc243235127" w:history="1">
         <w:r>
           <w:rPr>
             <w:rStyle w:val="aff9"/>
@@ -2814,7 +2814,7 @@
             <w:noProof/>
             <w:webHidden/>
           </w:rPr>
-          <w:instrText>PAGEREF _Toc243235063 \h</w:instrText>
+          <w:instrText>PAGEREF _Toc243235127 \h</w:instrText>
         </w:r>
         <w:r>
           <w:rPr>
@@ -2873,7 +2873,7 @@
           <w14:ligatures w14:val="standardContextual"/>
         </w:rPr>
       </w:pPr>
-      <w:hyperlink w:anchor="_Toc243235064" w:history="1">
+      <w:hyperlink w:anchor="_Toc243235128" w:history="1">
         <w:r>
           <w:rPr>
             <w:rStyle w:val="aff9"/>
@@ -2919,7 +2919,7 @@
             <w:noProof/>
             <w:webHidden/>
           </w:rPr>
-          <w:instrText>PAGEREF _Toc243235064 \h</w:instrText>
+          <w:instrText>PAGEREF _Toc243235128 \h</w:instrText>
         </w:r>
         <w:r>
           <w:rPr>
@@ -2978,7 +2978,7 @@
           <w14:ligatures w14:val="standardContextual"/>
         </w:rPr>
       </w:pPr>
-      <w:hyperlink w:anchor="_Toc243235065" w:history="1">
+      <w:hyperlink w:anchor="_Toc243235129" w:history="1">
         <w:r>
           <w:rPr>
             <w:rStyle w:val="aff9"/>
@@ -3024,7 +3024,7 @@
             <w:noProof/>
             <w:webHidden/>
           </w:rPr>
-          <w:instrText>PAGEREF _Toc243235065 \h</w:instrText>
+          <w:instrText>PAGEREF _Toc243235129 \h</w:instrText>
         </w:r>
         <w:r>
           <w:rPr>
@@ -3083,7 +3083,7 @@
           <w14:ligatures w14:val="standardContextual"/>
         </w:rPr>
       </w:pPr>
-      <w:hyperlink w:anchor="_Toc243235066" w:history="1">
+      <w:hyperlink w:anchor="_Toc243235130" w:history="1">
         <w:r>
           <w:rPr>
             <w:rStyle w:val="aff9"/>
@@ -3145,7 +3145,7 @@
             <w:noProof/>
             <w:webHidden/>
           </w:rPr>
-          <w:instrText>PAGEREF _Toc243235066 \h</w:instrText>
+          <w:instrText>PAGEREF _Toc243235130 \h</w:instrText>
         </w:r>
         <w:r>
           <w:rPr>
@@ -3204,7 +3204,7 @@
           <w14:ligatures w14:val="standardContextual"/>
         </w:rPr>
       </w:pPr>
-      <w:hyperlink w:anchor="_Toc243235067" w:history="1">
+      <w:hyperlink w:anchor="_Toc243235131" w:history="1">
         <w:r>
           <w:rPr>
             <w:rStyle w:val="aff9"/>
@@ -3250,7 +3250,7 @@
             <w:noProof/>
             <w:webHidden/>
           </w:rPr>
-          <w:instrText>PAGEREF _Toc243235067 \h</w:instrText>
+          <w:instrText>PAGEREF _Toc243235131 \h</w:instrText>
         </w:r>
         <w:r>
           <w:rPr>
@@ -3309,7 +3309,7 @@
           <w14:ligatures w14:val="standardContextual"/>
         </w:rPr>
       </w:pPr>
-      <w:hyperlink w:anchor="_Toc243235068" w:history="1">
+      <w:hyperlink w:anchor="_Toc243235132" w:history="1">
         <w:r>
           <w:rPr>
             <w:rStyle w:val="aff9"/>
@@ -3355,7 +3355,7 @@
             <w:noProof/>
             <w:webHidden/>
           </w:rPr>
-          <w:instrText>PAGEREF _Toc243235068 \h</w:instrText>
+          <w:instrText>PAGEREF _Toc243235132 \h</w:instrText>
         </w:r>
         <w:r>
           <w:rPr>
@@ -3413,7 +3413,7 @@
           <w14:ligatures w14:val="standardContextual"/>
         </w:rPr>
       </w:pPr>
-      <w:hyperlink w:anchor="_Toc243235069" w:history="1">
+      <w:hyperlink w:anchor="_Toc243235133" w:history="1">
         <w:r>
           <w:rPr>
             <w:rStyle w:val="aff9"/>
@@ -3467,7 +3467,7 @@
             <w:noProof/>
             <w:webHidden/>
           </w:rPr>
-          <w:instrText>PAGEREF _Toc243235069 \h</w:instrText>
+          <w:instrText>PAGEREF _Toc243235133 \h</w:instrText>
         </w:r>
         <w:r>
           <w:rPr>
@@ -3526,7 +3526,7 @@
           <w14:ligatures w14:val="standardContextual"/>
         </w:rPr>
       </w:pPr>
-      <w:hyperlink w:anchor="_Toc243235070" w:history="1">
+      <w:hyperlink w:anchor="_Toc243235134" w:history="1">
         <w:r>
           <w:rPr>
             <w:rStyle w:val="aff9"/>
@@ -3588,7 +3588,7 @@
             <w:noProof/>
             <w:webHidden/>
           </w:rPr>
-          <w:instrText>PAGEREF _Toc243235070 \h</w:instrText>
+          <w:instrText>PAGEREF _Toc243235134 \h</w:instrText>
         </w:r>
         <w:r>
           <w:rPr>
@@ -3647,7 +3647,7 @@
           <w14:ligatures w14:val="standardContextual"/>
         </w:rPr>
       </w:pPr>
-      <w:hyperlink w:anchor="_Toc243235071" w:history="1">
+      <w:hyperlink w:anchor="_Toc243235135" w:history="1">
         <w:r>
           <w:rPr>
             <w:rStyle w:val="aff9"/>
@@ -3709,7 +3709,7 @@
             <w:noProof/>
             <w:webHidden/>
           </w:rPr>
-          <w:instrText>PAGEREF _Toc243235071 \h</w:instrText>
+          <w:instrText>PAGEREF _Toc243235135 \h</w:instrText>
         </w:r>
         <w:r>
           <w:rPr>
@@ -3768,7 +3768,7 @@
           <w14:ligatures w14:val="standardContextual"/>
         </w:rPr>
       </w:pPr>
-      <w:hyperlink w:anchor="_Toc243235072" w:history="1">
+      <w:hyperlink w:anchor="_Toc243235136" w:history="1">
         <w:r>
           <w:rPr>
             <w:rStyle w:val="aff9"/>
@@ -3830,7 +3830,7 @@
             <w:noProof/>
             <w:webHidden/>
           </w:rPr>
-          <w:instrText>PAGEREF _Toc243235072 \h</w:instrText>
+          <w:instrText>PAGEREF _Toc243235136 \h</w:instrText>
         </w:r>
         <w:r>
           <w:rPr>
@@ -3889,7 +3889,7 @@
           <w14:ligatures w14:val="standardContextual"/>
         </w:rPr>
       </w:pPr>
-      <w:hyperlink w:anchor="_Toc243235073" w:history="1">
+      <w:hyperlink w:anchor="_Toc243235137" w:history="1">
         <w:r>
           <w:rPr>
             <w:rStyle w:val="aff9"/>
@@ -3967,7 +3967,7 @@
             <w:noProof/>
             <w:webHidden/>
           </w:rPr>
-          <w:instrText>PAGEREF _Toc243235073 \h</w:instrText>
+          <w:instrText>PAGEREF _Toc243235137 \h</w:instrText>
         </w:r>
         <w:r>
           <w:rPr>
@@ -4026,7 +4026,7 @@
           <w14:ligatures w14:val="standardContextual"/>
         </w:rPr>
       </w:pPr>
-      <w:hyperlink w:anchor="_Toc243235074" w:history="1">
+      <w:hyperlink w:anchor="_Toc243235138" w:history="1">
         <w:r>
           <w:rPr>
             <w:rStyle w:val="aff9"/>
@@ -4088,7 +4088,7 @@
             <w:noProof/>
             <w:webHidden/>
           </w:rPr>
-          <w:instrText>PAGEREF _Toc243235074 \h</w:instrText>
+          <w:instrText>PAGEREF _Toc243235138 \h</w:instrText>
         </w:r>
         <w:r>
           <w:rPr>
@@ -4147,7 +4147,7 @@
           <w14:ligatures w14:val="standardContextual"/>
         </w:rPr>
       </w:pPr>
-      <w:hyperlink w:anchor="_Toc243235075" w:history="1">
+      <w:hyperlink w:anchor="_Toc243235139" w:history="1">
         <w:r>
           <w:rPr>
             <w:rStyle w:val="aff9"/>
@@ -4209,7 +4209,7 @@
             <w:noProof/>
             <w:webHidden/>
           </w:rPr>
-          <w:instrText>PAGEREF _Toc243235075 \h</w:instrText>
+          <w:instrText>PAGEREF _Toc243235139 \h</w:instrText>
         </w:r>
         <w:r>
           <w:rPr>
@@ -4268,7 +4268,7 @@
           <w14:ligatures w14:val="standardContextual"/>
         </w:rPr>
       </w:pPr>
-      <w:hyperlink w:anchor="_Toc243235076" w:history="1">
+      <w:hyperlink w:anchor="_Toc243235140" w:history="1">
         <w:r>
           <w:rPr>
             <w:rStyle w:val="aff9"/>
@@ -4330,7 +4330,7 @@
             <w:noProof/>
             <w:webHidden/>
           </w:rPr>
-          <w:instrText>PAGEREF _Toc243235076 \h</w:instrText>
+          <w:instrText>PAGEREF _Toc243235140 \h</w:instrText>
         </w:r>
         <w:r>
           <w:rPr>
@@ -4389,7 +4389,7 @@
           <w14:ligatures w14:val="standardContextual"/>
         </w:rPr>
       </w:pPr>
-      <w:hyperlink w:anchor="_Toc243235077" w:history="1">
+      <w:hyperlink w:anchor="_Toc243235141" w:history="1">
         <w:r>
           <w:rPr>
             <w:rStyle w:val="aff9"/>
@@ -4467,7 +4467,7 @@
             <w:noProof/>
             <w:webHidden/>
           </w:rPr>
-          <w:instrText>PAGEREF _Toc243235077 \h</w:instrText>
+          <w:instrText>PAGEREF _Toc243235141 \h</w:instrText>
         </w:r>
         <w:r>
           <w:rPr>
@@ -4525,7 +4525,7 @@
           <w14:ligatures w14:val="standardContextual"/>
         </w:rPr>
       </w:pPr>
-      <w:hyperlink w:anchor="_Toc243235078" w:history="1">
+      <w:hyperlink w:anchor="_Toc243235142" w:history="1">
         <w:r>
           <w:rPr>
             <w:rStyle w:val="aff9"/>
@@ -4571,7 +4571,7 @@
             <w:noProof/>
             <w:webHidden/>
           </w:rPr>
-          <w:instrText>PAGEREF _Toc243235078 \h</w:instrText>
+          <w:instrText>PAGEREF _Toc243235142 \h</w:instrText>
         </w:r>
         <w:r>
           <w:rPr>
@@ -4630,7 +4630,7 @@
           <w14:ligatures w14:val="standardContextual"/>
         </w:rPr>
       </w:pPr>
-      <w:hyperlink w:anchor="_Toc243235079" w:history="1">
+      <w:hyperlink w:anchor="_Toc243235143" w:history="1">
         <w:r>
           <w:rPr>
             <w:rStyle w:val="aff9"/>
@@ -4692,7 +4692,7 @@
             <w:noProof/>
             <w:webHidden/>
           </w:rPr>
-          <w:instrText>PAGEREF _Toc243235079 \h</w:instrText>
+          <w:instrText>PAGEREF _Toc243235143 \h</w:instrText>
         </w:r>
         <w:r>
           <w:rPr>
@@ -4750,7 +4750,7 @@
           <w14:ligatures w14:val="standardContextual"/>
         </w:rPr>
       </w:pPr>
-      <w:hyperlink w:anchor="_Toc243235080" w:history="1">
+      <w:hyperlink w:anchor="_Toc243235144" w:history="1">
         <w:r>
           <w:rPr>
             <w:rStyle w:val="aff9"/>
@@ -4796,7 +4796,7 @@
             <w:noProof/>
             <w:webHidden/>
           </w:rPr>
-          <w:instrText>PAGEREF _Toc243235080 \h</w:instrText>
+          <w:instrText>PAGEREF _Toc243235144 \h</w:instrText>
         </w:r>
         <w:r>
           <w:rPr>
@@ -4854,7 +4854,7 @@
           <w14:ligatures w14:val="standardContextual"/>
         </w:rPr>
       </w:pPr>
-      <w:hyperlink w:anchor="_Toc243235081" w:history="1">
+      <w:hyperlink w:anchor="_Toc243235145" w:history="1">
         <w:r>
           <w:rPr>
             <w:rStyle w:val="aff9"/>
@@ -4900,7 +4900,7 @@
             <w:noProof/>
             <w:webHidden/>
           </w:rPr>
-          <w:instrText>PAGEREF _Toc243235081 \h</w:instrText>
+          <w:instrText>PAGEREF _Toc243235145 \h</w:instrText>
         </w:r>
         <w:r>
           <w:rPr>
@@ -4958,7 +4958,7 @@
           <w14:ligatures w14:val="standardContextual"/>
         </w:rPr>
       </w:pPr>
-      <w:hyperlink w:anchor="_Toc243235082" w:history="1">
+      <w:hyperlink w:anchor="_Toc243235146" w:history="1">
         <w:r>
           <w:rPr>
             <w:rStyle w:val="aff9"/>
@@ -5020,7 +5020,7 @@
             <w:noProof/>
             <w:webHidden/>
           </w:rPr>
-          <w:instrText>PAGEREF _Toc243235082 \h</w:instrText>
+          <w:instrText>PAGEREF _Toc243235146 \h</w:instrText>
         </w:r>
         <w:r>
           <w:rPr>
@@ -5079,7 +5079,7 @@
           <w14:ligatures w14:val="standardContextual"/>
         </w:rPr>
       </w:pPr>
-      <w:hyperlink w:anchor="_Toc243235083" w:history="1">
+      <w:hyperlink w:anchor="_Toc243235147" w:history="1">
         <w:r>
           <w:rPr>
             <w:rStyle w:val="aff9"/>
@@ -5173,7 +5173,7 @@
             <w:noProof/>
             <w:webHidden/>
           </w:rPr>
-          <w:instrText>PAGEREF _Toc243235083 \h</w:instrText>
+          <w:instrText>PAGEREF _Toc243235147 \h</w:instrText>
         </w:r>
         <w:r>
           <w:rPr>
@@ -5232,7 +5232,7 @@
           <w14:ligatures w14:val="standardContextual"/>
         </w:rPr>
       </w:pPr>
-      <w:hyperlink w:anchor="_Toc243235084" w:history="1">
+      <w:hyperlink w:anchor="_Toc243235148" w:history="1">
         <w:r>
           <w:rPr>
             <w:rStyle w:val="aff9"/>
@@ -5278,7 +5278,7 @@
             <w:noProof/>
             <w:webHidden/>
           </w:rPr>
-          <w:instrText>PAGEREF _Toc243235084 \h</w:instrText>
+          <w:instrText>PAGEREF _Toc243235148 \h</w:instrText>
         </w:r>
         <w:r>
           <w:rPr>
@@ -5333,7 +5333,7 @@
         <w:pStyle w:val="1"/>
         <w:spacing w:before="280" w:after="120"/>
       </w:pPr>
-      <w:bookmarkStart w:id="0" w:name="_Toc243235038"/>
+      <w:bookmarkStart w:id="0" w:name="_Toc243235102"/>
       <w:r>
         <w:rPr>
           <w:rFonts w:ascii="Times New Roman" w:eastAsia="黑体" w:hAnsi="Times New Roman"/>
@@ -5753,7 +5753,7 @@
         <w:pStyle w:val="1"/>
         <w:spacing w:before="280" w:after="120"/>
       </w:pPr>
-      <w:bookmarkStart w:id="1" w:name="_Toc243235039"/>
+      <w:bookmarkStart w:id="1" w:name="_Toc243235103"/>
       <w:r>
         <w:rPr>
           <w:rFonts w:ascii="Times New Roman" w:eastAsia="黑体" w:hAnsi="Times New Roman"/>
@@ -5777,7 +5777,7 @@
         <w:pStyle w:val="21"/>
         <w:spacing w:after="120"/>
       </w:pPr>
-      <w:bookmarkStart w:id="2" w:name="_Toc243235040"/>
+      <w:bookmarkStart w:id="2" w:name="_Toc243235104"/>
       <w:r>
         <w:rPr>
           <w:rFonts w:ascii="Times New Roman" w:eastAsia="黑体" w:hAnsi="Times New Roman"/>
@@ -5883,7 +5883,7 @@
         <w:pStyle w:val="21"/>
         <w:spacing w:after="120"/>
       </w:pPr>
-      <w:bookmarkStart w:id="3" w:name="_Toc243235041"/>
+      <w:bookmarkStart w:id="3" w:name="_Toc243235105"/>
       <w:r>
         <w:rPr>
           <w:rFonts w:ascii="Times New Roman" w:eastAsia="黑体" w:hAnsi="Times New Roman"/>
@@ -6292,7 +6292,7 @@
         <w:pStyle w:val="21"/>
         <w:spacing w:after="120"/>
       </w:pPr>
-      <w:bookmarkStart w:id="4" w:name="_Toc243235042"/>
+      <w:bookmarkStart w:id="4" w:name="_Toc243235106"/>
       <w:r>
         <w:rPr>
           <w:rFonts w:ascii="Times New Roman" w:eastAsia="黑体" w:hAnsi="Times New Roman"/>
@@ -6402,7 +6402,7 @@
         <w:pStyle w:val="21"/>
         <w:spacing w:after="120"/>
       </w:pPr>
-      <w:bookmarkStart w:id="5" w:name="_Toc243235043"/>
+      <w:bookmarkStart w:id="5" w:name="_Toc243235107"/>
       <w:r>
         <w:rPr>
           <w:rFonts w:ascii="Times New Roman" w:eastAsia="黑体" w:hAnsi="Times New Roman"/>
@@ -6484,7 +6484,7 @@
         <w:pStyle w:val="21"/>
         <w:spacing w:after="120"/>
       </w:pPr>
-      <w:bookmarkStart w:id="6" w:name="_Toc243235044"/>
+      <w:bookmarkStart w:id="6" w:name="_Toc243235108"/>
       <w:r>
         <w:rPr>
           <w:rFonts w:ascii="Times New Roman" w:eastAsia="黑体" w:hAnsi="Times New Roman"/>
@@ -6556,7 +6556,7 @@
         <w:pStyle w:val="21"/>
         <w:spacing w:after="120"/>
       </w:pPr>
-      <w:bookmarkStart w:id="7" w:name="_Toc243235045"/>
+      <w:bookmarkStart w:id="7" w:name="_Toc243235109"/>
       <w:r>
         <w:rPr>
           <w:rFonts w:ascii="Times New Roman" w:eastAsia="黑体" w:hAnsi="Times New Roman"/>
@@ -6652,7 +6652,7 @@
         <w:pStyle w:val="21"/>
         <w:spacing w:after="120"/>
       </w:pPr>
-      <w:bookmarkStart w:id="8" w:name="_Toc243235046"/>
+      <w:bookmarkStart w:id="8" w:name="_Toc243235110"/>
       <w:r>
         <w:rPr>
           <w:rFonts w:ascii="Times New Roman" w:eastAsia="黑体" w:hAnsi="Times New Roman"/>
@@ -6706,7 +6706,7 @@
         <w:pStyle w:val="1"/>
         <w:spacing w:before="280" w:after="120"/>
       </w:pPr>
-      <w:bookmarkStart w:id="9" w:name="_Toc243235047"/>
+      <w:bookmarkStart w:id="9" w:name="_Toc243235111"/>
       <w:r>
         <w:rPr>
           <w:rFonts w:ascii="Times New Roman" w:eastAsia="黑体" w:hAnsi="Times New Roman"/>
@@ -6860,7 +6860,7 @@
         <w:pStyle w:val="1"/>
         <w:spacing w:before="280" w:after="120"/>
       </w:pPr>
-      <w:bookmarkStart w:id="10" w:name="_Toc243235048"/>
+      <w:bookmarkStart w:id="10" w:name="_Toc243235112"/>
       <w:r>
         <w:rPr>
           <w:rFonts w:ascii="Times New Roman" w:eastAsia="黑体" w:hAnsi="Times New Roman"/>
@@ -7286,7 +7286,7 @@
         <w:pStyle w:val="1"/>
         <w:spacing w:before="280" w:after="120"/>
       </w:pPr>
-      <w:bookmarkStart w:id="11" w:name="_Toc243235049"/>
+      <w:bookmarkStart w:id="11" w:name="_Toc243235113"/>
       <w:r>
         <w:rPr>
           <w:rFonts w:ascii="Times New Roman" w:eastAsia="黑体" w:hAnsi="Times New Roman"/>
@@ -8510,7 +8510,7 @@
         <w:pStyle w:val="1"/>
         <w:spacing w:before="280" w:after="120"/>
       </w:pPr>
-      <w:bookmarkStart w:id="12" w:name="_Toc243235050"/>
+      <w:bookmarkStart w:id="12" w:name="_Toc243235114"/>
       <w:r>
         <w:rPr>
           <w:rFonts w:ascii="Times New Roman" w:eastAsia="黑体" w:hAnsi="Times New Roman"/>
@@ -9601,7 +9601,7 @@
         <w:pStyle w:val="1"/>
         <w:spacing w:before="280" w:after="120"/>
       </w:pPr>
-      <w:bookmarkStart w:id="13" w:name="_Toc243235051"/>
+      <w:bookmarkStart w:id="13" w:name="_Toc243235115"/>
       <w:r>
         <w:rPr>
           <w:rFonts w:ascii="Times New Roman" w:eastAsia="黑体" w:hAnsi="Times New Roman"/>
@@ -9625,7 +9625,7 @@
         <w:pStyle w:val="21"/>
         <w:spacing w:after="120"/>
       </w:pPr>
-      <w:bookmarkStart w:id="14" w:name="_Toc243235052"/>
+      <w:bookmarkStart w:id="14" w:name="_Toc243235116"/>
       <w:r>
         <w:rPr>
           <w:rFonts w:ascii="Times New Roman" w:eastAsia="黑体" w:hAnsi="Times New Roman"/>
@@ -9833,7 +9833,7 @@
         <w:pStyle w:val="21"/>
         <w:spacing w:after="120"/>
       </w:pPr>
-      <w:bookmarkStart w:id="15" w:name="_Toc243235053"/>
+      <w:bookmarkStart w:id="15" w:name="_Toc243235117"/>
       <w:r>
         <w:rPr>
           <w:rFonts w:ascii="Times New Roman" w:eastAsia="黑体" w:hAnsi="Times New Roman"/>
@@ -9919,7 +9919,7 @@
         <w:pStyle w:val="21"/>
         <w:spacing w:after="120"/>
       </w:pPr>
-      <w:bookmarkStart w:id="16" w:name="_Toc243235054"/>
+      <w:bookmarkStart w:id="16" w:name="_Toc243235118"/>
       <w:r>
         <w:rPr>
           <w:rFonts w:ascii="Times New Roman" w:eastAsia="黑体" w:hAnsi="Times New Roman"/>
@@ -11432,7 +11432,7 @@
         <w:pStyle w:val="1"/>
         <w:spacing w:before="280" w:after="120"/>
       </w:pPr>
-      <w:bookmarkStart w:id="17" w:name="_Toc243235055"/>
+      <w:bookmarkStart w:id="17" w:name="_Toc243235119"/>
       <w:r>
         <w:rPr>
           <w:rFonts w:ascii="Times New Roman" w:eastAsia="黑体" w:hAnsi="Times New Roman"/>
@@ -11464,7 +11464,7 @@
         <w:pStyle w:val="21"/>
         <w:spacing w:after="120"/>
       </w:pPr>
-      <w:bookmarkStart w:id="18" w:name="_Toc243235056"/>
+      <w:bookmarkStart w:id="18" w:name="_Toc243235120"/>
       <w:r>
         <w:rPr>
           <w:rFonts w:ascii="Times New Roman" w:eastAsia="黑体" w:hAnsi="Times New Roman"/>
@@ -11730,7 +11730,7 @@
         <w:pStyle w:val="21"/>
         <w:spacing w:after="120"/>
       </w:pPr>
-      <w:bookmarkStart w:id="19" w:name="_Toc243235057"/>
+      <w:bookmarkStart w:id="19" w:name="_Toc243235121"/>
       <w:r>
         <w:rPr>
           <w:rFonts w:ascii="Times New Roman" w:eastAsia="黑体" w:hAnsi="Times New Roman"/>
@@ -11846,7 +11846,7 @@
         <w:pStyle w:val="21"/>
         <w:spacing w:after="120"/>
       </w:pPr>
-      <w:bookmarkStart w:id="20" w:name="_Toc243235058"/>
+      <w:bookmarkStart w:id="20" w:name="_Toc243235122"/>
       <w:r>
         <w:rPr>
           <w:rFonts w:ascii="Times New Roman" w:eastAsia="黑体" w:hAnsi="Times New Roman"/>
@@ -13099,7 +13099,7 @@
         <w:pStyle w:val="21"/>
         <w:spacing w:after="120"/>
       </w:pPr>
-      <w:bookmarkStart w:id="21" w:name="_Toc243235059"/>
+      <w:bookmarkStart w:id="21" w:name="_Toc243235123"/>
       <w:r>
         <w:rPr>
           <w:rFonts w:ascii="Times New Roman" w:eastAsia="黑体" w:hAnsi="Times New Roman"/>
@@ -13221,7 +13221,7 @@
         <w:pStyle w:val="21"/>
         <w:spacing w:after="120"/>
       </w:pPr>
-      <w:bookmarkStart w:id="22" w:name="_Toc243235060"/>
+      <w:bookmarkStart w:id="22" w:name="_Toc243235124"/>
       <w:r>
         <w:rPr>
           <w:rFonts w:ascii="Times New Roman" w:eastAsia="黑体" w:hAnsi="Times New Roman"/>
@@ -13359,7 +13359,7 @@
         <w:pStyle w:val="21"/>
         <w:spacing w:after="120"/>
       </w:pPr>
-      <w:bookmarkStart w:id="23" w:name="_Toc243235061"/>
+      <w:bookmarkStart w:id="23" w:name="_Toc243235125"/>
       <w:r>
         <w:rPr>
           <w:rFonts w:ascii="Times New Roman" w:eastAsia="黑体" w:hAnsi="Times New Roman"/>
@@ -13595,7 +13595,7 @@
         <w:pStyle w:val="21"/>
         <w:spacing w:after="120"/>
       </w:pPr>
-      <w:bookmarkStart w:id="24" w:name="_Toc243235062"/>
+      <w:bookmarkStart w:id="24" w:name="_Toc243235126"/>
       <w:r>
         <w:rPr>
           <w:rFonts w:ascii="Times New Roman" w:eastAsia="黑体" w:hAnsi="Times New Roman"/>
@@ -13711,7 +13711,7 @@
         <w:pStyle w:val="21"/>
         <w:spacing w:after="120"/>
       </w:pPr>
-      <w:bookmarkStart w:id="25" w:name="_Toc243235063"/>
+      <w:bookmarkStart w:id="25" w:name="_Toc243235127"/>
       <w:r>
         <w:rPr>
           <w:rFonts w:ascii="Times New Roman" w:eastAsia="黑体" w:hAnsi="Times New Roman"/>
@@ -14041,7 +14041,7 @@
         <w:pStyle w:val="21"/>
         <w:spacing w:after="120"/>
       </w:pPr>
-      <w:bookmarkStart w:id="26" w:name="_Toc243235064"/>
+      <w:bookmarkStart w:id="26" w:name="_Toc243235128"/>
       <w:r>
         <w:rPr>
           <w:rFonts w:ascii="Times New Roman" w:eastAsia="黑体" w:hAnsi="Times New Roman"/>
@@ -14143,7 +14143,7 @@
         <w:pStyle w:val="21"/>
         <w:spacing w:after="120"/>
       </w:pPr>
-      <w:bookmarkStart w:id="27" w:name="_Toc243235065"/>
+      <w:bookmarkStart w:id="27" w:name="_Toc243235129"/>
       <w:r>
         <w:rPr>
           <w:rFonts w:ascii="Times New Roman" w:eastAsia="黑体" w:hAnsi="Times New Roman"/>
@@ -14281,7 +14281,7 @@
         <w:pStyle w:val="21"/>
         <w:spacing w:after="120"/>
       </w:pPr>
-      <w:bookmarkStart w:id="28" w:name="_Toc243235066"/>
+      <w:bookmarkStart w:id="28" w:name="_Toc243235130"/>
       <w:r>
         <w:rPr>
           <w:rFonts w:ascii="Times New Roman" w:eastAsia="黑体" w:hAnsi="Times New Roman"/>
@@ -14349,7 +14349,7 @@
         <w:pStyle w:val="21"/>
         <w:spacing w:after="120"/>
       </w:pPr>
-      <w:bookmarkStart w:id="29" w:name="_Toc243235067"/>
+      <w:bookmarkStart w:id="29" w:name="_Toc243235131"/>
       <w:r>
         <w:rPr>
           <w:rFonts w:ascii="Times New Roman" w:eastAsia="黑体" w:hAnsi="Times New Roman"/>
@@ -14397,7 +14397,7 @@
         <w:pStyle w:val="21"/>
         <w:spacing w:after="120"/>
       </w:pPr>
-      <w:bookmarkStart w:id="30" w:name="_Toc243235068"/>
+      <w:bookmarkStart w:id="30" w:name="_Toc243235132"/>
       <w:r>
         <w:rPr>
           <w:rFonts w:ascii="Times New Roman" w:eastAsia="黑体" w:hAnsi="Times New Roman"/>
@@ -14561,7 +14561,7 @@
         <w:pStyle w:val="1"/>
         <w:spacing w:before="280" w:after="120"/>
       </w:pPr>
-      <w:bookmarkStart w:id="31" w:name="_Toc243235069"/>
+      <w:bookmarkStart w:id="31" w:name="_Toc243235133"/>
       <w:r>
         <w:rPr>
           <w:rFonts w:ascii="Times New Roman" w:eastAsia="黑体" w:hAnsi="Times New Roman"/>
@@ -15695,7 +15695,7 @@
         <w:pStyle w:val="21"/>
         <w:spacing w:after="120"/>
       </w:pPr>
-      <w:bookmarkStart w:id="32" w:name="_Toc243235070"/>
+      <w:bookmarkStart w:id="32" w:name="_Toc243235134"/>
       <w:r>
         <w:rPr>
           <w:rFonts w:ascii="Times New Roman" w:eastAsia="黑体" w:hAnsi="Times New Roman"/>
@@ -16987,7 +16987,7 @@
         <w:pStyle w:val="21"/>
         <w:spacing w:after="120"/>
       </w:pPr>
-      <w:bookmarkStart w:id="33" w:name="_Toc243235071"/>
+      <w:bookmarkStart w:id="33" w:name="_Toc243235135"/>
       <w:r>
         <w:rPr>
           <w:rFonts w:ascii="Times New Roman" w:eastAsia="黑体" w:hAnsi="Times New Roman"/>
@@ -18484,7 +18484,7 @@
         <w:pStyle w:val="21"/>
         <w:spacing w:after="120"/>
       </w:pPr>
-      <w:bookmarkStart w:id="34" w:name="_Toc243235072"/>
+      <w:bookmarkStart w:id="34" w:name="_Toc243235136"/>
       <w:r>
         <w:rPr>
           <w:rFonts w:ascii="Times New Roman" w:eastAsia="黑体" w:hAnsi="Times New Roman"/>
@@ -19411,7 +19411,7 @@
         <w:pStyle w:val="21"/>
         <w:spacing w:after="120"/>
       </w:pPr>
-      <w:bookmarkStart w:id="35" w:name="_Toc243235073"/>
+      <w:bookmarkStart w:id="35" w:name="_Toc243235137"/>
       <w:r>
         <w:rPr>
           <w:rFonts w:ascii="Times New Roman" w:eastAsia="黑体" w:hAnsi="Times New Roman"/>
@@ -21020,7 +21020,7 @@
         <w:pStyle w:val="21"/>
         <w:spacing w:after="120"/>
       </w:pPr>
-      <w:bookmarkStart w:id="36" w:name="_Toc243235074"/>
+      <w:bookmarkStart w:id="36" w:name="_Toc243235138"/>
       <w:r>
         <w:rPr>
           <w:rFonts w:ascii="Times New Roman" w:eastAsia="黑体" w:hAnsi="Times New Roman"/>
@@ -22100,7 +22100,7 @@
         <w:pStyle w:val="21"/>
         <w:spacing w:after="120"/>
       </w:pPr>
-      <w:bookmarkStart w:id="37" w:name="_Toc243235075"/>
+      <w:bookmarkStart w:id="37" w:name="_Toc243235139"/>
       <w:r>
         <w:rPr>
           <w:rFonts w:ascii="Times New Roman" w:eastAsia="黑体" w:hAnsi="Times New Roman"/>
@@ -23496,7 +23496,43 @@
         <w:rPr>
           <w:color w:val="000000"/>
         </w:rPr>
-        <w:t>值相近或更小。一个例外要注明：</w:t>
+        <w:t>值相近或更小。两个例外要注明：</w:t>
+      </w:r>
+      <w:r>
+        <w:rPr>
+          <w:color w:val="000000"/>
+        </w:rPr>
+        <w:t xml:space="preserve">126 </w:t>
+      </w:r>
+      <w:r>
+        <w:rPr>
+          <w:color w:val="000000"/>
+        </w:rPr>
+        <w:t>日调高聚类</w:t>
+      </w:r>
+      <w:r>
+        <w:rPr>
+          <w:color w:val="000000"/>
+        </w:rPr>
+        <w:t xml:space="preserve"> p=0.050</w:t>
+      </w:r>
+      <w:r>
+        <w:rPr>
+          <w:color w:val="000000"/>
+        </w:rPr>
+        <w:t>，刚好在</w:t>
+      </w:r>
+      <w:r>
+        <w:rPr>
+          <w:color w:val="000000"/>
+        </w:rPr>
+        <w:t xml:space="preserve"> 5% </w:t>
+      </w:r>
+      <w:r>
+        <w:rPr>
+          <w:color w:val="000000"/>
+        </w:rPr>
+        <w:t>边界，不能当作强结果；</w:t>
       </w:r>
       <w:r>
         <w:rPr>
@@ -23520,7 +23556,7 @@
         <w:rPr>
           <w:color w:val="000000"/>
         </w:rPr>
-        <w:t>，不显著；缩尾后</w:t>
+        <w:t>，不显著，缩尾后</w:t>
       </w:r>
       <w:r>
         <w:rPr>
@@ -23532,7 +23568,7 @@
         <w:rPr>
           <w:color w:val="000000"/>
         </w:rPr>
-        <w:t>，正文引用时说明依赖缩尾。</w:t>
+        <w:t>。正文引用时要说明。</w:t>
       </w:r>
     </w:p>
     <w:p>
@@ -23672,7 +23708,7 @@
         <w:pStyle w:val="21"/>
         <w:spacing w:after="120"/>
       </w:pPr>
-      <w:bookmarkStart w:id="38" w:name="_Toc243235076"/>
+      <w:bookmarkStart w:id="38" w:name="_Toc243235140"/>
       <w:r>
         <w:rPr>
           <w:rFonts w:ascii="Times New Roman" w:eastAsia="黑体" w:hAnsi="Times New Roman"/>
@@ -24108,7 +24144,7 @@
         <w:pStyle w:val="21"/>
         <w:spacing w:after="120"/>
       </w:pPr>
-      <w:bookmarkStart w:id="39" w:name="_Toc243235077"/>
+      <w:bookmarkStart w:id="39" w:name="_Toc243235141"/>
       <w:r>
         <w:rPr>
           <w:rFonts w:ascii="Times New Roman" w:eastAsia="黑体" w:hAnsi="Times New Roman"/>
@@ -25018,7 +25054,7 @@
         <w:pStyle w:val="1"/>
         <w:spacing w:before="280" w:after="120"/>
       </w:pPr>
-      <w:bookmarkStart w:id="40" w:name="_Toc243235078"/>
+      <w:bookmarkStart w:id="40" w:name="_Toc243235142"/>
       <w:r>
         <w:rPr>
           <w:rFonts w:ascii="Times New Roman" w:eastAsia="黑体" w:hAnsi="Times New Roman"/>
@@ -25452,7 +25488,7 @@
         <w:pStyle w:val="21"/>
         <w:spacing w:after="120"/>
       </w:pPr>
-      <w:bookmarkStart w:id="41" w:name="_Toc243235079"/>
+      <w:bookmarkStart w:id="41" w:name="_Toc243235143"/>
       <w:r>
         <w:rPr>
           <w:rFonts w:ascii="Times New Roman" w:eastAsia="黑体" w:hAnsi="Times New Roman"/>
@@ -26399,7 +26435,7 @@
         <w:pStyle w:val="1"/>
         <w:spacing w:before="280" w:after="120"/>
       </w:pPr>
-      <w:bookmarkStart w:id="42" w:name="_Toc243235080"/>
+      <w:bookmarkStart w:id="42" w:name="_Toc243235144"/>
       <w:r>
         <w:rPr>
           <w:rFonts w:ascii="Times New Roman" w:eastAsia="黑体" w:hAnsi="Times New Roman"/>
@@ -26793,7 +26829,7 @@
         <w:pStyle w:val="1"/>
         <w:spacing w:before="280" w:after="120"/>
       </w:pPr>
-      <w:bookmarkStart w:id="43" w:name="_Toc243235081"/>
+      <w:bookmarkStart w:id="43" w:name="_Toc243235145"/>
       <w:r>
         <w:rPr>
           <w:rFonts w:ascii="Times New Roman" w:eastAsia="黑体" w:hAnsi="Times New Roman"/>
@@ -27403,7 +27439,7 @@
         <w:pStyle w:val="1"/>
         <w:spacing w:before="280" w:after="120"/>
       </w:pPr>
-      <w:bookmarkStart w:id="44" w:name="_Toc243235082"/>
+      <w:bookmarkStart w:id="44" w:name="_Toc243235146"/>
       <w:r>
         <w:rPr>
           <w:rFonts w:ascii="Times New Roman" w:eastAsia="黑体" w:hAnsi="Times New Roman"/>
@@ -27443,7 +27479,7 @@
         <w:pStyle w:val="21"/>
         <w:spacing w:after="120"/>
       </w:pPr>
-      <w:bookmarkStart w:id="45" w:name="_Toc243235083"/>
+      <w:bookmarkStart w:id="45" w:name="_Toc243235147"/>
       <w:r>
         <w:rPr>
           <w:rFonts w:ascii="Times New Roman" w:eastAsia="黑体" w:hAnsi="Times New Roman"/>
@@ -28705,7 +28741,7 @@
         <w:pStyle w:val="21"/>
         <w:spacing w:after="120"/>
       </w:pPr>
-      <w:bookmarkStart w:id="46" w:name="_Toc243235084"/>
+      <w:bookmarkStart w:id="46" w:name="_Toc243235148"/>
       <w:r>
         <w:rPr>
           <w:rFonts w:ascii="Times New Roman" w:eastAsia="黑体" w:hAnsi="Times New Roman"/>
@@ -29335,31 +29371,31 @@
       </w:rPr>
     </w:lvl>
   </w:abstractNum>
-  <w:num w:numId="1" w16cid:durableId="1214999742">
+  <w:num w:numId="1" w16cid:durableId="311328693">
     <w:abstractNumId w:val="8"/>
   </w:num>
-  <w:num w:numId="2" w16cid:durableId="1360356186">
+  <w:num w:numId="2" w16cid:durableId="1590504593">
     <w:abstractNumId w:val="6"/>
   </w:num>
-  <w:num w:numId="3" w16cid:durableId="1891106963">
+  <w:num w:numId="3" w16cid:durableId="1481653101">
     <w:abstractNumId w:val="5"/>
   </w:num>
-  <w:num w:numId="4" w16cid:durableId="1322007677">
+  <w:num w:numId="4" w16cid:durableId="1347051161">
     <w:abstractNumId w:val="4"/>
   </w:num>
-  <w:num w:numId="5" w16cid:durableId="1585605794">
+  <w:num w:numId="5" w16cid:durableId="85853718">
     <w:abstractNumId w:val="7"/>
   </w:num>
-  <w:num w:numId="6" w16cid:durableId="1731536758">
+  <w:num w:numId="6" w16cid:durableId="143201251">
     <w:abstractNumId w:val="3"/>
   </w:num>
-  <w:num w:numId="7" w16cid:durableId="1328248060">
+  <w:num w:numId="7" w16cid:durableId="2087610930">
     <w:abstractNumId w:val="2"/>
   </w:num>
-  <w:num w:numId="8" w16cid:durableId="717978439">
+  <w:num w:numId="8" w16cid:durableId="394624409">
     <w:abstractNumId w:val="1"/>
   </w:num>
-  <w:num w:numId="9" w16cid:durableId="738404522">
+  <w:num w:numId="9" w16cid:durableId="1422868485">
     <w:abstractNumId w:val="0"/>
   </w:num>
 </w:numbering>
@@ -40758,7 +40794,7 @@
     <w:autoRedefine/>
     <w:uiPriority w:val="39"/>
     <w:unhideWhenUsed/>
-    <w:rsid w:val="00E81BD2"/>
+    <w:rsid w:val="00D77D24"/>
   </w:style>
   <w:style w:type="paragraph" w:styleId="TOC2">
     <w:name w:val="toc 2"/>
@@ -40767,7 +40803,7 @@
     <w:autoRedefine/>
     <w:uiPriority w:val="39"/>
     <w:unhideWhenUsed/>
-    <w:rsid w:val="00E81BD2"/>
+    <w:rsid w:val="00D77D24"/>
     <w:pPr>
       <w:ind w:leftChars="200" w:left="420"/>
     </w:pPr>
@@ -40777,7 +40813,7 @@
     <w:basedOn w:val="a2"/>
     <w:uiPriority w:val="99"/>
     <w:unhideWhenUsed/>
-    <w:rsid w:val="00E81BD2"/>
+    <w:rsid w:val="00D77D24"/>
     <w:rPr>
       <w:color w:val="0000FF" w:themeColor="hyperlink"/>
       <w:u w:val="single"/>

</xml_diff>

<commit_message>
Close the StateCode/Filling item as a documented project decision
The 43,830 overlapping rows are treated as suspension/no-trade rows based on the
trading-day pattern, carried-forward prices, long runs, and the fact that the cleaned
file removes exactly those rows. A different vendor definition would only change the
robustness exclusion set, not the main results.

Co-Authored-By: Claude Code <noreply@anthropic.com>
</commit_message>
<xml_diff>
--- a/文档/项目进度与技术备忘_20261018.docx
+++ b/文档/项目进度与技术备忘_20261018.docx
@@ -118,7 +118,7 @@
         </w:rPr>
         <w:fldChar w:fldCharType="separate"/>
       </w:r>
-      <w:hyperlink w:anchor="_Toc243235102" w:history="1">
+      <w:hyperlink w:anchor="_Toc243235331" w:history="1">
         <w:r>
           <w:rPr>
             <w:rStyle w:val="aff9"/>
@@ -180,7 +180,7 @@
             <w:noProof/>
             <w:webHidden/>
           </w:rPr>
-          <w:instrText>PAGEREF _Toc243235102 \h</w:instrText>
+          <w:instrText>PAGEREF _Toc243235331 \h</w:instrText>
         </w:r>
         <w:r>
           <w:rPr>
@@ -238,7 +238,7 @@
           <w14:ligatures w14:val="standardContextual"/>
         </w:rPr>
       </w:pPr>
-      <w:hyperlink w:anchor="_Toc243235103" w:history="1">
+      <w:hyperlink w:anchor="_Toc243235332" w:history="1">
         <w:r>
           <w:rPr>
             <w:rStyle w:val="aff9"/>
@@ -284,7 +284,7 @@
             <w:noProof/>
             <w:webHidden/>
           </w:rPr>
-          <w:instrText>PAGEREF _Toc243235103 \h</w:instrText>
+          <w:instrText>PAGEREF _Toc243235332 \h</w:instrText>
         </w:r>
         <w:r>
           <w:rPr>
@@ -343,7 +343,7 @@
           <w14:ligatures w14:val="standardContextual"/>
         </w:rPr>
       </w:pPr>
-      <w:hyperlink w:anchor="_Toc243235104" w:history="1">
+      <w:hyperlink w:anchor="_Toc243235333" w:history="1">
         <w:r>
           <w:rPr>
             <w:rStyle w:val="aff9"/>
@@ -389,7 +389,7 @@
             <w:noProof/>
             <w:webHidden/>
           </w:rPr>
-          <w:instrText>PAGEREF _Toc243235104 \h</w:instrText>
+          <w:instrText>PAGEREF _Toc243235333 \h</w:instrText>
         </w:r>
         <w:r>
           <w:rPr>
@@ -448,7 +448,7 @@
           <w14:ligatures w14:val="standardContextual"/>
         </w:rPr>
       </w:pPr>
-      <w:hyperlink w:anchor="_Toc243235105" w:history="1">
+      <w:hyperlink w:anchor="_Toc243235334" w:history="1">
         <w:r>
           <w:rPr>
             <w:rStyle w:val="aff9"/>
@@ -494,7 +494,7 @@
             <w:noProof/>
             <w:webHidden/>
           </w:rPr>
-          <w:instrText>PAGEREF _Toc243235105 \h</w:instrText>
+          <w:instrText>PAGEREF _Toc243235334 \h</w:instrText>
         </w:r>
         <w:r>
           <w:rPr>
@@ -553,7 +553,7 @@
           <w14:ligatures w14:val="standardContextual"/>
         </w:rPr>
       </w:pPr>
-      <w:hyperlink w:anchor="_Toc243235106" w:history="1">
+      <w:hyperlink w:anchor="_Toc243235335" w:history="1">
         <w:r>
           <w:rPr>
             <w:rStyle w:val="aff9"/>
@@ -599,7 +599,7 @@
             <w:noProof/>
             <w:webHidden/>
           </w:rPr>
-          <w:instrText>PAGEREF _Toc243235106 \h</w:instrText>
+          <w:instrText>PAGEREF _Toc243235335 \h</w:instrText>
         </w:r>
         <w:r>
           <w:rPr>
@@ -658,7 +658,7 @@
           <w14:ligatures w14:val="standardContextual"/>
         </w:rPr>
       </w:pPr>
-      <w:hyperlink w:anchor="_Toc243235107" w:history="1">
+      <w:hyperlink w:anchor="_Toc243235336" w:history="1">
         <w:r>
           <w:rPr>
             <w:rStyle w:val="aff9"/>
@@ -704,7 +704,7 @@
             <w:noProof/>
             <w:webHidden/>
           </w:rPr>
-          <w:instrText>PAGEREF _Toc243235107 \h</w:instrText>
+          <w:instrText>PAGEREF _Toc243235336 \h</w:instrText>
         </w:r>
         <w:r>
           <w:rPr>
@@ -763,7 +763,7 @@
           <w14:ligatures w14:val="standardContextual"/>
         </w:rPr>
       </w:pPr>
-      <w:hyperlink w:anchor="_Toc243235108" w:history="1">
+      <w:hyperlink w:anchor="_Toc243235337" w:history="1">
         <w:r>
           <w:rPr>
             <w:rStyle w:val="aff9"/>
@@ -809,7 +809,7 @@
             <w:noProof/>
             <w:webHidden/>
           </w:rPr>
-          <w:instrText>PAGEREF _Toc243235108 \h</w:instrText>
+          <w:instrText>PAGEREF _Toc243235337 \h</w:instrText>
         </w:r>
         <w:r>
           <w:rPr>
@@ -868,7 +868,7 @@
           <w14:ligatures w14:val="standardContextual"/>
         </w:rPr>
       </w:pPr>
-      <w:hyperlink w:anchor="_Toc243235109" w:history="1">
+      <w:hyperlink w:anchor="_Toc243235338" w:history="1">
         <w:r>
           <w:rPr>
             <w:rStyle w:val="aff9"/>
@@ -914,7 +914,7 @@
             <w:noProof/>
             <w:webHidden/>
           </w:rPr>
-          <w:instrText>PAGEREF _Toc243235109 \h</w:instrText>
+          <w:instrText>PAGEREF _Toc243235338 \h</w:instrText>
         </w:r>
         <w:r>
           <w:rPr>
@@ -973,7 +973,7 @@
           <w14:ligatures w14:val="standardContextual"/>
         </w:rPr>
       </w:pPr>
-      <w:hyperlink w:anchor="_Toc243235110" w:history="1">
+      <w:hyperlink w:anchor="_Toc243235339" w:history="1">
         <w:r>
           <w:rPr>
             <w:rStyle w:val="aff9"/>
@@ -1019,7 +1019,7 @@
             <w:noProof/>
             <w:webHidden/>
           </w:rPr>
-          <w:instrText>PAGEREF _Toc243235110 \h</w:instrText>
+          <w:instrText>PAGEREF _Toc243235339 \h</w:instrText>
         </w:r>
         <w:r>
           <w:rPr>
@@ -1077,7 +1077,7 @@
           <w14:ligatures w14:val="standardContextual"/>
         </w:rPr>
       </w:pPr>
-      <w:hyperlink w:anchor="_Toc243235111" w:history="1">
+      <w:hyperlink w:anchor="_Toc243235340" w:history="1">
         <w:r>
           <w:rPr>
             <w:rStyle w:val="aff9"/>
@@ -1123,7 +1123,7 @@
             <w:noProof/>
             <w:webHidden/>
           </w:rPr>
-          <w:instrText>PAGEREF _Toc243235111 \h</w:instrText>
+          <w:instrText>PAGEREF _Toc243235340 \h</w:instrText>
         </w:r>
         <w:r>
           <w:rPr>
@@ -1181,7 +1181,7 @@
           <w14:ligatures w14:val="standardContextual"/>
         </w:rPr>
       </w:pPr>
-      <w:hyperlink w:anchor="_Toc243235112" w:history="1">
+      <w:hyperlink w:anchor="_Toc243235341" w:history="1">
         <w:r>
           <w:rPr>
             <w:rStyle w:val="aff9"/>
@@ -1227,7 +1227,7 @@
             <w:noProof/>
             <w:webHidden/>
           </w:rPr>
-          <w:instrText>PAGEREF _Toc243235112 \h</w:instrText>
+          <w:instrText>PAGEREF _Toc243235341 \h</w:instrText>
         </w:r>
         <w:r>
           <w:rPr>
@@ -1285,7 +1285,7 @@
           <w14:ligatures w14:val="standardContextual"/>
         </w:rPr>
       </w:pPr>
-      <w:hyperlink w:anchor="_Toc243235113" w:history="1">
+      <w:hyperlink w:anchor="_Toc243235342" w:history="1">
         <w:r>
           <w:rPr>
             <w:rStyle w:val="aff9"/>
@@ -1331,7 +1331,7 @@
             <w:noProof/>
             <w:webHidden/>
           </w:rPr>
-          <w:instrText>PAGEREF _Toc243235113 \h</w:instrText>
+          <w:instrText>PAGEREF _Toc243235342 \h</w:instrText>
         </w:r>
         <w:r>
           <w:rPr>
@@ -1389,7 +1389,7 @@
           <w14:ligatures w14:val="standardContextual"/>
         </w:rPr>
       </w:pPr>
-      <w:hyperlink w:anchor="_Toc243235114" w:history="1">
+      <w:hyperlink w:anchor="_Toc243235343" w:history="1">
         <w:r>
           <w:rPr>
             <w:rStyle w:val="aff9"/>
@@ -1435,7 +1435,7 @@
             <w:noProof/>
             <w:webHidden/>
           </w:rPr>
-          <w:instrText>PAGEREF _Toc243235114 \h</w:instrText>
+          <w:instrText>PAGEREF _Toc243235343 \h</w:instrText>
         </w:r>
         <w:r>
           <w:rPr>
@@ -1493,7 +1493,7 @@
           <w14:ligatures w14:val="standardContextual"/>
         </w:rPr>
       </w:pPr>
-      <w:hyperlink w:anchor="_Toc243235115" w:history="1">
+      <w:hyperlink w:anchor="_Toc243235344" w:history="1">
         <w:r>
           <w:rPr>
             <w:rStyle w:val="aff9"/>
@@ -1539,7 +1539,7 @@
             <w:noProof/>
             <w:webHidden/>
           </w:rPr>
-          <w:instrText>PAGEREF _Toc243235115 \h</w:instrText>
+          <w:instrText>PAGEREF _Toc243235344 \h</w:instrText>
         </w:r>
         <w:r>
           <w:rPr>
@@ -1598,7 +1598,7 @@
           <w14:ligatures w14:val="standardContextual"/>
         </w:rPr>
       </w:pPr>
-      <w:hyperlink w:anchor="_Toc243235116" w:history="1">
+      <w:hyperlink w:anchor="_Toc243235345" w:history="1">
         <w:r>
           <w:rPr>
             <w:rStyle w:val="aff9"/>
@@ -1644,7 +1644,7 @@
             <w:noProof/>
             <w:webHidden/>
           </w:rPr>
-          <w:instrText>PAGEREF _Toc243235116 \h</w:instrText>
+          <w:instrText>PAGEREF _Toc243235345 \h</w:instrText>
         </w:r>
         <w:r>
           <w:rPr>
@@ -1703,7 +1703,7 @@
           <w14:ligatures w14:val="standardContextual"/>
         </w:rPr>
       </w:pPr>
-      <w:hyperlink w:anchor="_Toc243235117" w:history="1">
+      <w:hyperlink w:anchor="_Toc243235346" w:history="1">
         <w:r>
           <w:rPr>
             <w:rStyle w:val="aff9"/>
@@ -1749,7 +1749,7 @@
             <w:noProof/>
             <w:webHidden/>
           </w:rPr>
-          <w:instrText>PAGEREF _Toc243235117 \h</w:instrText>
+          <w:instrText>PAGEREF _Toc243235346 \h</w:instrText>
         </w:r>
         <w:r>
           <w:rPr>
@@ -1808,7 +1808,7 @@
           <w14:ligatures w14:val="standardContextual"/>
         </w:rPr>
       </w:pPr>
-      <w:hyperlink w:anchor="_Toc243235118" w:history="1">
+      <w:hyperlink w:anchor="_Toc243235347" w:history="1">
         <w:r>
           <w:rPr>
             <w:rStyle w:val="aff9"/>
@@ -1854,7 +1854,7 @@
             <w:noProof/>
             <w:webHidden/>
           </w:rPr>
-          <w:instrText>PAGEREF _Toc243235118 \h</w:instrText>
+          <w:instrText>PAGEREF _Toc243235347 \h</w:instrText>
         </w:r>
         <w:r>
           <w:rPr>
@@ -1912,7 +1912,7 @@
           <w14:ligatures w14:val="standardContextual"/>
         </w:rPr>
       </w:pPr>
-      <w:hyperlink w:anchor="_Toc243235119" w:history="1">
+      <w:hyperlink w:anchor="_Toc243235348" w:history="1">
         <w:r>
           <w:rPr>
             <w:rStyle w:val="aff9"/>
@@ -1958,7 +1958,7 @@
             <w:noProof/>
             <w:webHidden/>
           </w:rPr>
-          <w:instrText>PAGEREF _Toc243235119 \h</w:instrText>
+          <w:instrText>PAGEREF _Toc243235348 \h</w:instrText>
         </w:r>
         <w:r>
           <w:rPr>
@@ -2017,7 +2017,7 @@
           <w14:ligatures w14:val="standardContextual"/>
         </w:rPr>
       </w:pPr>
-      <w:hyperlink w:anchor="_Toc243235120" w:history="1">
+      <w:hyperlink w:anchor="_Toc243235349" w:history="1">
         <w:r>
           <w:rPr>
             <w:rStyle w:val="aff9"/>
@@ -2063,7 +2063,7 @@
             <w:noProof/>
             <w:webHidden/>
           </w:rPr>
-          <w:instrText>PAGEREF _Toc243235120 \h</w:instrText>
+          <w:instrText>PAGEREF _Toc243235349 \h</w:instrText>
         </w:r>
         <w:r>
           <w:rPr>
@@ -2122,7 +2122,7 @@
           <w14:ligatures w14:val="standardContextual"/>
         </w:rPr>
       </w:pPr>
-      <w:hyperlink w:anchor="_Toc243235121" w:history="1">
+      <w:hyperlink w:anchor="_Toc243235350" w:history="1">
         <w:r>
           <w:rPr>
             <w:rStyle w:val="aff9"/>
@@ -2168,7 +2168,7 @@
             <w:noProof/>
             <w:webHidden/>
           </w:rPr>
-          <w:instrText>PAGEREF _Toc243235121 \h</w:instrText>
+          <w:instrText>PAGEREF _Toc243235350 \h</w:instrText>
         </w:r>
         <w:r>
           <w:rPr>
@@ -2227,7 +2227,7 @@
           <w14:ligatures w14:val="standardContextual"/>
         </w:rPr>
       </w:pPr>
-      <w:hyperlink w:anchor="_Toc243235122" w:history="1">
+      <w:hyperlink w:anchor="_Toc243235351" w:history="1">
         <w:r>
           <w:rPr>
             <w:rStyle w:val="aff9"/>
@@ -2273,7 +2273,7 @@
             <w:noProof/>
             <w:webHidden/>
           </w:rPr>
-          <w:instrText>PAGEREF _Toc243235122 \h</w:instrText>
+          <w:instrText>PAGEREF _Toc243235351 \h</w:instrText>
         </w:r>
         <w:r>
           <w:rPr>
@@ -2332,7 +2332,7 @@
           <w14:ligatures w14:val="standardContextual"/>
         </w:rPr>
       </w:pPr>
-      <w:hyperlink w:anchor="_Toc243235123" w:history="1">
+      <w:hyperlink w:anchor="_Toc243235352" w:history="1">
         <w:r>
           <w:rPr>
             <w:rStyle w:val="aff9"/>
@@ -2378,7 +2378,7 @@
             <w:noProof/>
             <w:webHidden/>
           </w:rPr>
-          <w:instrText>PAGEREF _Toc243235123 \h</w:instrText>
+          <w:instrText>PAGEREF _Toc243235352 \h</w:instrText>
         </w:r>
         <w:r>
           <w:rPr>
@@ -2437,7 +2437,7 @@
           <w14:ligatures w14:val="standardContextual"/>
         </w:rPr>
       </w:pPr>
-      <w:hyperlink w:anchor="_Toc243235124" w:history="1">
+      <w:hyperlink w:anchor="_Toc243235353" w:history="1">
         <w:r>
           <w:rPr>
             <w:rStyle w:val="aff9"/>
@@ -2483,7 +2483,7 @@
             <w:noProof/>
             <w:webHidden/>
           </w:rPr>
-          <w:instrText>PAGEREF _Toc243235124 \h</w:instrText>
+          <w:instrText>PAGEREF _Toc243235353 \h</w:instrText>
         </w:r>
         <w:r>
           <w:rPr>
@@ -2542,7 +2542,7 @@
           <w14:ligatures w14:val="standardContextual"/>
         </w:rPr>
       </w:pPr>
-      <w:hyperlink w:anchor="_Toc243235125" w:history="1">
+      <w:hyperlink w:anchor="_Toc243235354" w:history="1">
         <w:r>
           <w:rPr>
             <w:rStyle w:val="aff9"/>
@@ -2604,7 +2604,7 @@
             <w:noProof/>
             <w:webHidden/>
           </w:rPr>
-          <w:instrText>PAGEREF _Toc243235125 \h</w:instrText>
+          <w:instrText>PAGEREF _Toc243235354 \h</w:instrText>
         </w:r>
         <w:r>
           <w:rPr>
@@ -2663,7 +2663,7 @@
           <w14:ligatures w14:val="standardContextual"/>
         </w:rPr>
       </w:pPr>
-      <w:hyperlink w:anchor="_Toc243235126" w:history="1">
+      <w:hyperlink w:anchor="_Toc243235355" w:history="1">
         <w:r>
           <w:rPr>
             <w:rStyle w:val="aff9"/>
@@ -2709,7 +2709,7 @@
             <w:noProof/>
             <w:webHidden/>
           </w:rPr>
-          <w:instrText>PAGEREF _Toc243235126 \h</w:instrText>
+          <w:instrText>PAGEREF _Toc243235355 \h</w:instrText>
         </w:r>
         <w:r>
           <w:rPr>
@@ -2768,7 +2768,7 @@
           <w14:ligatures w14:val="standardContextual"/>
         </w:rPr>
       </w:pPr>
-      <w:hyperlink w:anchor="_Toc243235127" w:history="1">
+      <w:hyperlink w:anchor="_Toc243235356" w:history="1">
         <w:r>
           <w:rPr>
             <w:rStyle w:val="aff9"/>
@@ -2814,7 +2814,7 @@
             <w:noProof/>
             <w:webHidden/>
           </w:rPr>
-          <w:instrText>PAGEREF _Toc243235127 \h</w:instrText>
+          <w:instrText>PAGEREF _Toc243235356 \h</w:instrText>
         </w:r>
         <w:r>
           <w:rPr>
@@ -2873,7 +2873,7 @@
           <w14:ligatures w14:val="standardContextual"/>
         </w:rPr>
       </w:pPr>
-      <w:hyperlink w:anchor="_Toc243235128" w:history="1">
+      <w:hyperlink w:anchor="_Toc243235357" w:history="1">
         <w:r>
           <w:rPr>
             <w:rStyle w:val="aff9"/>
@@ -2919,7 +2919,7 @@
             <w:noProof/>
             <w:webHidden/>
           </w:rPr>
-          <w:instrText>PAGEREF _Toc243235128 \h</w:instrText>
+          <w:instrText>PAGEREF _Toc243235357 \h</w:instrText>
         </w:r>
         <w:r>
           <w:rPr>
@@ -2978,7 +2978,7 @@
           <w14:ligatures w14:val="standardContextual"/>
         </w:rPr>
       </w:pPr>
-      <w:hyperlink w:anchor="_Toc243235129" w:history="1">
+      <w:hyperlink w:anchor="_Toc243235358" w:history="1">
         <w:r>
           <w:rPr>
             <w:rStyle w:val="aff9"/>
@@ -3024,7 +3024,7 @@
             <w:noProof/>
             <w:webHidden/>
           </w:rPr>
-          <w:instrText>PAGEREF _Toc243235129 \h</w:instrText>
+          <w:instrText>PAGEREF _Toc243235358 \h</w:instrText>
         </w:r>
         <w:r>
           <w:rPr>
@@ -3083,7 +3083,7 @@
           <w14:ligatures w14:val="standardContextual"/>
         </w:rPr>
       </w:pPr>
-      <w:hyperlink w:anchor="_Toc243235130" w:history="1">
+      <w:hyperlink w:anchor="_Toc243235359" w:history="1">
         <w:r>
           <w:rPr>
             <w:rStyle w:val="aff9"/>
@@ -3145,7 +3145,7 @@
             <w:noProof/>
             <w:webHidden/>
           </w:rPr>
-          <w:instrText>PAGEREF _Toc243235130 \h</w:instrText>
+          <w:instrText>PAGEREF _Toc243235359 \h</w:instrText>
         </w:r>
         <w:r>
           <w:rPr>
@@ -3204,7 +3204,7 @@
           <w14:ligatures w14:val="standardContextual"/>
         </w:rPr>
       </w:pPr>
-      <w:hyperlink w:anchor="_Toc243235131" w:history="1">
+      <w:hyperlink w:anchor="_Toc243235360" w:history="1">
         <w:r>
           <w:rPr>
             <w:rStyle w:val="aff9"/>
@@ -3250,7 +3250,7 @@
             <w:noProof/>
             <w:webHidden/>
           </w:rPr>
-          <w:instrText>PAGEREF _Toc243235131 \h</w:instrText>
+          <w:instrText>PAGEREF _Toc243235360 \h</w:instrText>
         </w:r>
         <w:r>
           <w:rPr>
@@ -3309,7 +3309,7 @@
           <w14:ligatures w14:val="standardContextual"/>
         </w:rPr>
       </w:pPr>
-      <w:hyperlink w:anchor="_Toc243235132" w:history="1">
+      <w:hyperlink w:anchor="_Toc243235361" w:history="1">
         <w:r>
           <w:rPr>
             <w:rStyle w:val="aff9"/>
@@ -3355,7 +3355,7 @@
             <w:noProof/>
             <w:webHidden/>
           </w:rPr>
-          <w:instrText>PAGEREF _Toc243235132 \h</w:instrText>
+          <w:instrText>PAGEREF _Toc243235361 \h</w:instrText>
         </w:r>
         <w:r>
           <w:rPr>
@@ -3413,7 +3413,7 @@
           <w14:ligatures w14:val="standardContextual"/>
         </w:rPr>
       </w:pPr>
-      <w:hyperlink w:anchor="_Toc243235133" w:history="1">
+      <w:hyperlink w:anchor="_Toc243235362" w:history="1">
         <w:r>
           <w:rPr>
             <w:rStyle w:val="aff9"/>
@@ -3467,7 +3467,7 @@
             <w:noProof/>
             <w:webHidden/>
           </w:rPr>
-          <w:instrText>PAGEREF _Toc243235133 \h</w:instrText>
+          <w:instrText>PAGEREF _Toc243235362 \h</w:instrText>
         </w:r>
         <w:r>
           <w:rPr>
@@ -3526,7 +3526,7 @@
           <w14:ligatures w14:val="standardContextual"/>
         </w:rPr>
       </w:pPr>
-      <w:hyperlink w:anchor="_Toc243235134" w:history="1">
+      <w:hyperlink w:anchor="_Toc243235363" w:history="1">
         <w:r>
           <w:rPr>
             <w:rStyle w:val="aff9"/>
@@ -3588,7 +3588,7 @@
             <w:noProof/>
             <w:webHidden/>
           </w:rPr>
-          <w:instrText>PAGEREF _Toc243235134 \h</w:instrText>
+          <w:instrText>PAGEREF _Toc243235363 \h</w:instrText>
         </w:r>
         <w:r>
           <w:rPr>
@@ -3647,7 +3647,7 @@
           <w14:ligatures w14:val="standardContextual"/>
         </w:rPr>
       </w:pPr>
-      <w:hyperlink w:anchor="_Toc243235135" w:history="1">
+      <w:hyperlink w:anchor="_Toc243235364" w:history="1">
         <w:r>
           <w:rPr>
             <w:rStyle w:val="aff9"/>
@@ -3709,7 +3709,7 @@
             <w:noProof/>
             <w:webHidden/>
           </w:rPr>
-          <w:instrText>PAGEREF _Toc243235135 \h</w:instrText>
+          <w:instrText>PAGEREF _Toc243235364 \h</w:instrText>
         </w:r>
         <w:r>
           <w:rPr>
@@ -3768,7 +3768,7 @@
           <w14:ligatures w14:val="standardContextual"/>
         </w:rPr>
       </w:pPr>
-      <w:hyperlink w:anchor="_Toc243235136" w:history="1">
+      <w:hyperlink w:anchor="_Toc243235365" w:history="1">
         <w:r>
           <w:rPr>
             <w:rStyle w:val="aff9"/>
@@ -3830,7 +3830,7 @@
             <w:noProof/>
             <w:webHidden/>
           </w:rPr>
-          <w:instrText>PAGEREF _Toc243235136 \h</w:instrText>
+          <w:instrText>PAGEREF _Toc243235365 \h</w:instrText>
         </w:r>
         <w:r>
           <w:rPr>
@@ -3889,7 +3889,7 @@
           <w14:ligatures w14:val="standardContextual"/>
         </w:rPr>
       </w:pPr>
-      <w:hyperlink w:anchor="_Toc243235137" w:history="1">
+      <w:hyperlink w:anchor="_Toc243235366" w:history="1">
         <w:r>
           <w:rPr>
             <w:rStyle w:val="aff9"/>
@@ -3967,7 +3967,7 @@
             <w:noProof/>
             <w:webHidden/>
           </w:rPr>
-          <w:instrText>PAGEREF _Toc243235137 \h</w:instrText>
+          <w:instrText>PAGEREF _Toc243235366 \h</w:instrText>
         </w:r>
         <w:r>
           <w:rPr>
@@ -4026,7 +4026,7 @@
           <w14:ligatures w14:val="standardContextual"/>
         </w:rPr>
       </w:pPr>
-      <w:hyperlink w:anchor="_Toc243235138" w:history="1">
+      <w:hyperlink w:anchor="_Toc243235367" w:history="1">
         <w:r>
           <w:rPr>
             <w:rStyle w:val="aff9"/>
@@ -4088,7 +4088,7 @@
             <w:noProof/>
             <w:webHidden/>
           </w:rPr>
-          <w:instrText>PAGEREF _Toc243235138 \h</w:instrText>
+          <w:instrText>PAGEREF _Toc243235367 \h</w:instrText>
         </w:r>
         <w:r>
           <w:rPr>
@@ -4147,7 +4147,7 @@
           <w14:ligatures w14:val="standardContextual"/>
         </w:rPr>
       </w:pPr>
-      <w:hyperlink w:anchor="_Toc243235139" w:history="1">
+      <w:hyperlink w:anchor="_Toc243235368" w:history="1">
         <w:r>
           <w:rPr>
             <w:rStyle w:val="aff9"/>
@@ -4209,7 +4209,7 @@
             <w:noProof/>
             <w:webHidden/>
           </w:rPr>
-          <w:instrText>PAGEREF _Toc243235139 \h</w:instrText>
+          <w:instrText>PAGEREF _Toc243235368 \h</w:instrText>
         </w:r>
         <w:r>
           <w:rPr>
@@ -4268,7 +4268,7 @@
           <w14:ligatures w14:val="standardContextual"/>
         </w:rPr>
       </w:pPr>
-      <w:hyperlink w:anchor="_Toc243235140" w:history="1">
+      <w:hyperlink w:anchor="_Toc243235369" w:history="1">
         <w:r>
           <w:rPr>
             <w:rStyle w:val="aff9"/>
@@ -4330,7 +4330,7 @@
             <w:noProof/>
             <w:webHidden/>
           </w:rPr>
-          <w:instrText>PAGEREF _Toc243235140 \h</w:instrText>
+          <w:instrText>PAGEREF _Toc243235369 \h</w:instrText>
         </w:r>
         <w:r>
           <w:rPr>
@@ -4389,7 +4389,7 @@
           <w14:ligatures w14:val="standardContextual"/>
         </w:rPr>
       </w:pPr>
-      <w:hyperlink w:anchor="_Toc243235141" w:history="1">
+      <w:hyperlink w:anchor="_Toc243235370" w:history="1">
         <w:r>
           <w:rPr>
             <w:rStyle w:val="aff9"/>
@@ -4467,7 +4467,7 @@
             <w:noProof/>
             <w:webHidden/>
           </w:rPr>
-          <w:instrText>PAGEREF _Toc243235141 \h</w:instrText>
+          <w:instrText>PAGEREF _Toc243235370 \h</w:instrText>
         </w:r>
         <w:r>
           <w:rPr>
@@ -4525,7 +4525,7 @@
           <w14:ligatures w14:val="standardContextual"/>
         </w:rPr>
       </w:pPr>
-      <w:hyperlink w:anchor="_Toc243235142" w:history="1">
+      <w:hyperlink w:anchor="_Toc243235371" w:history="1">
         <w:r>
           <w:rPr>
             <w:rStyle w:val="aff9"/>
@@ -4571,7 +4571,7 @@
             <w:noProof/>
             <w:webHidden/>
           </w:rPr>
-          <w:instrText>PAGEREF _Toc243235142 \h</w:instrText>
+          <w:instrText>PAGEREF _Toc243235371 \h</w:instrText>
         </w:r>
         <w:r>
           <w:rPr>
@@ -4630,7 +4630,7 @@
           <w14:ligatures w14:val="standardContextual"/>
         </w:rPr>
       </w:pPr>
-      <w:hyperlink w:anchor="_Toc243235143" w:history="1">
+      <w:hyperlink w:anchor="_Toc243235372" w:history="1">
         <w:r>
           <w:rPr>
             <w:rStyle w:val="aff9"/>
@@ -4692,7 +4692,7 @@
             <w:noProof/>
             <w:webHidden/>
           </w:rPr>
-          <w:instrText>PAGEREF _Toc243235143 \h</w:instrText>
+          <w:instrText>PAGEREF _Toc243235372 \h</w:instrText>
         </w:r>
         <w:r>
           <w:rPr>
@@ -4750,7 +4750,7 @@
           <w14:ligatures w14:val="standardContextual"/>
         </w:rPr>
       </w:pPr>
-      <w:hyperlink w:anchor="_Toc243235144" w:history="1">
+      <w:hyperlink w:anchor="_Toc243235373" w:history="1">
         <w:r>
           <w:rPr>
             <w:rStyle w:val="aff9"/>
@@ -4796,7 +4796,7 @@
             <w:noProof/>
             <w:webHidden/>
           </w:rPr>
-          <w:instrText>PAGEREF _Toc243235144 \h</w:instrText>
+          <w:instrText>PAGEREF _Toc243235373 \h</w:instrText>
         </w:r>
         <w:r>
           <w:rPr>
@@ -4854,7 +4854,7 @@
           <w14:ligatures w14:val="standardContextual"/>
         </w:rPr>
       </w:pPr>
-      <w:hyperlink w:anchor="_Toc243235145" w:history="1">
+      <w:hyperlink w:anchor="_Toc243235374" w:history="1">
         <w:r>
           <w:rPr>
             <w:rStyle w:val="aff9"/>
@@ -4900,7 +4900,7 @@
             <w:noProof/>
             <w:webHidden/>
           </w:rPr>
-          <w:instrText>PAGEREF _Toc243235145 \h</w:instrText>
+          <w:instrText>PAGEREF _Toc243235374 \h</w:instrText>
         </w:r>
         <w:r>
           <w:rPr>
@@ -4958,7 +4958,7 @@
           <w14:ligatures w14:val="standardContextual"/>
         </w:rPr>
       </w:pPr>
-      <w:hyperlink w:anchor="_Toc243235146" w:history="1">
+      <w:hyperlink w:anchor="_Toc243235375" w:history="1">
         <w:r>
           <w:rPr>
             <w:rStyle w:val="aff9"/>
@@ -5020,7 +5020,7 @@
             <w:noProof/>
             <w:webHidden/>
           </w:rPr>
-          <w:instrText>PAGEREF _Toc243235146 \h</w:instrText>
+          <w:instrText>PAGEREF _Toc243235375 \h</w:instrText>
         </w:r>
         <w:r>
           <w:rPr>
@@ -5079,7 +5079,7 @@
           <w14:ligatures w14:val="standardContextual"/>
         </w:rPr>
       </w:pPr>
-      <w:hyperlink w:anchor="_Toc243235147" w:history="1">
+      <w:hyperlink w:anchor="_Toc243235376" w:history="1">
         <w:r>
           <w:rPr>
             <w:rStyle w:val="aff9"/>
@@ -5173,7 +5173,7 @@
             <w:noProof/>
             <w:webHidden/>
           </w:rPr>
-          <w:instrText>PAGEREF _Toc243235147 \h</w:instrText>
+          <w:instrText>PAGEREF _Toc243235376 \h</w:instrText>
         </w:r>
         <w:r>
           <w:rPr>
@@ -5232,7 +5232,7 @@
           <w14:ligatures w14:val="standardContextual"/>
         </w:rPr>
       </w:pPr>
-      <w:hyperlink w:anchor="_Toc243235148" w:history="1">
+      <w:hyperlink w:anchor="_Toc243235377" w:history="1">
         <w:r>
           <w:rPr>
             <w:rStyle w:val="aff9"/>
@@ -5278,7 +5278,7 @@
             <w:noProof/>
             <w:webHidden/>
           </w:rPr>
-          <w:instrText>PAGEREF _Toc243235148 \h</w:instrText>
+          <w:instrText>PAGEREF _Toc243235377 \h</w:instrText>
         </w:r>
         <w:r>
           <w:rPr>
@@ -5333,7 +5333,7 @@
         <w:pStyle w:val="1"/>
         <w:spacing w:before="280" w:after="120"/>
       </w:pPr>
-      <w:bookmarkStart w:id="0" w:name="_Toc243235102"/>
+      <w:bookmarkStart w:id="0" w:name="_Toc243235331"/>
       <w:r>
         <w:rPr>
           <w:rFonts w:ascii="Times New Roman" w:eastAsia="黑体" w:hAnsi="Times New Roman"/>
@@ -5753,7 +5753,7 @@
         <w:pStyle w:val="1"/>
         <w:spacing w:before="280" w:after="120"/>
       </w:pPr>
-      <w:bookmarkStart w:id="1" w:name="_Toc243235103"/>
+      <w:bookmarkStart w:id="1" w:name="_Toc243235332"/>
       <w:r>
         <w:rPr>
           <w:rFonts w:ascii="Times New Roman" w:eastAsia="黑体" w:hAnsi="Times New Roman"/>
@@ -5777,7 +5777,7 @@
         <w:pStyle w:val="21"/>
         <w:spacing w:after="120"/>
       </w:pPr>
-      <w:bookmarkStart w:id="2" w:name="_Toc243235104"/>
+      <w:bookmarkStart w:id="2" w:name="_Toc243235333"/>
       <w:r>
         <w:rPr>
           <w:rFonts w:ascii="Times New Roman" w:eastAsia="黑体" w:hAnsi="Times New Roman"/>
@@ -5883,7 +5883,7 @@
         <w:pStyle w:val="21"/>
         <w:spacing w:after="120"/>
       </w:pPr>
-      <w:bookmarkStart w:id="3" w:name="_Toc243235105"/>
+      <w:bookmarkStart w:id="3" w:name="_Toc243235334"/>
       <w:r>
         <w:rPr>
           <w:rFonts w:ascii="Times New Roman" w:eastAsia="黑体" w:hAnsi="Times New Roman"/>
@@ -6292,7 +6292,7 @@
         <w:pStyle w:val="21"/>
         <w:spacing w:after="120"/>
       </w:pPr>
-      <w:bookmarkStart w:id="4" w:name="_Toc243235106"/>
+      <w:bookmarkStart w:id="4" w:name="_Toc243235335"/>
       <w:r>
         <w:rPr>
           <w:rFonts w:ascii="Times New Roman" w:eastAsia="黑体" w:hAnsi="Times New Roman"/>
@@ -6402,7 +6402,7 @@
         <w:pStyle w:val="21"/>
         <w:spacing w:after="120"/>
       </w:pPr>
-      <w:bookmarkStart w:id="5" w:name="_Toc243235107"/>
+      <w:bookmarkStart w:id="5" w:name="_Toc243235336"/>
       <w:r>
         <w:rPr>
           <w:rFonts w:ascii="Times New Roman" w:eastAsia="黑体" w:hAnsi="Times New Roman"/>
@@ -6484,7 +6484,7 @@
         <w:pStyle w:val="21"/>
         <w:spacing w:after="120"/>
       </w:pPr>
-      <w:bookmarkStart w:id="6" w:name="_Toc243235108"/>
+      <w:bookmarkStart w:id="6" w:name="_Toc243235337"/>
       <w:r>
         <w:rPr>
           <w:rFonts w:ascii="Times New Roman" w:eastAsia="黑体" w:hAnsi="Times New Roman"/>
@@ -6556,7 +6556,7 @@
         <w:pStyle w:val="21"/>
         <w:spacing w:after="120"/>
       </w:pPr>
-      <w:bookmarkStart w:id="7" w:name="_Toc243235109"/>
+      <w:bookmarkStart w:id="7" w:name="_Toc243235338"/>
       <w:r>
         <w:rPr>
           <w:rFonts w:ascii="Times New Roman" w:eastAsia="黑体" w:hAnsi="Times New Roman"/>
@@ -6652,7 +6652,7 @@
         <w:pStyle w:val="21"/>
         <w:spacing w:after="120"/>
       </w:pPr>
-      <w:bookmarkStart w:id="8" w:name="_Toc243235110"/>
+      <w:bookmarkStart w:id="8" w:name="_Toc243235339"/>
       <w:r>
         <w:rPr>
           <w:rFonts w:ascii="Times New Roman" w:eastAsia="黑体" w:hAnsi="Times New Roman"/>
@@ -6706,7 +6706,7 @@
         <w:pStyle w:val="1"/>
         <w:spacing w:before="280" w:after="120"/>
       </w:pPr>
-      <w:bookmarkStart w:id="9" w:name="_Toc243235111"/>
+      <w:bookmarkStart w:id="9" w:name="_Toc243235340"/>
       <w:r>
         <w:rPr>
           <w:rFonts w:ascii="Times New Roman" w:eastAsia="黑体" w:hAnsi="Times New Roman"/>
@@ -6860,7 +6860,7 @@
         <w:pStyle w:val="1"/>
         <w:spacing w:before="280" w:after="120"/>
       </w:pPr>
-      <w:bookmarkStart w:id="10" w:name="_Toc243235112"/>
+      <w:bookmarkStart w:id="10" w:name="_Toc243235341"/>
       <w:r>
         <w:rPr>
           <w:rFonts w:ascii="Times New Roman" w:eastAsia="黑体" w:hAnsi="Times New Roman"/>
@@ -7286,7 +7286,7 @@
         <w:pStyle w:val="1"/>
         <w:spacing w:before="280" w:after="120"/>
       </w:pPr>
-      <w:bookmarkStart w:id="11" w:name="_Toc243235113"/>
+      <w:bookmarkStart w:id="11" w:name="_Toc243235342"/>
       <w:r>
         <w:rPr>
           <w:rFonts w:ascii="Times New Roman" w:eastAsia="黑体" w:hAnsi="Times New Roman"/>
@@ -8510,7 +8510,7 @@
         <w:pStyle w:val="1"/>
         <w:spacing w:before="280" w:after="120"/>
       </w:pPr>
-      <w:bookmarkStart w:id="12" w:name="_Toc243235114"/>
+      <w:bookmarkStart w:id="12" w:name="_Toc243235343"/>
       <w:r>
         <w:rPr>
           <w:rFonts w:ascii="Times New Roman" w:eastAsia="黑体" w:hAnsi="Times New Roman"/>
@@ -9601,7 +9601,7 @@
         <w:pStyle w:val="1"/>
         <w:spacing w:before="280" w:after="120"/>
       </w:pPr>
-      <w:bookmarkStart w:id="13" w:name="_Toc243235115"/>
+      <w:bookmarkStart w:id="13" w:name="_Toc243235344"/>
       <w:r>
         <w:rPr>
           <w:rFonts w:ascii="Times New Roman" w:eastAsia="黑体" w:hAnsi="Times New Roman"/>
@@ -9625,7 +9625,7 @@
         <w:pStyle w:val="21"/>
         <w:spacing w:after="120"/>
       </w:pPr>
-      <w:bookmarkStart w:id="14" w:name="_Toc243235116"/>
+      <w:bookmarkStart w:id="14" w:name="_Toc243235345"/>
       <w:r>
         <w:rPr>
           <w:rFonts w:ascii="Times New Roman" w:eastAsia="黑体" w:hAnsi="Times New Roman"/>
@@ -9833,7 +9833,7 @@
         <w:pStyle w:val="21"/>
         <w:spacing w:after="120"/>
       </w:pPr>
-      <w:bookmarkStart w:id="15" w:name="_Toc243235117"/>
+      <w:bookmarkStart w:id="15" w:name="_Toc243235346"/>
       <w:r>
         <w:rPr>
           <w:rFonts w:ascii="Times New Roman" w:eastAsia="黑体" w:hAnsi="Times New Roman"/>
@@ -9919,7 +9919,7 @@
         <w:pStyle w:val="21"/>
         <w:spacing w:after="120"/>
       </w:pPr>
-      <w:bookmarkStart w:id="16" w:name="_Toc243235118"/>
+      <w:bookmarkStart w:id="16" w:name="_Toc243235347"/>
       <w:r>
         <w:rPr>
           <w:rFonts w:ascii="Times New Roman" w:eastAsia="黑体" w:hAnsi="Times New Roman"/>
@@ -11432,7 +11432,7 @@
         <w:pStyle w:val="1"/>
         <w:spacing w:before="280" w:after="120"/>
       </w:pPr>
-      <w:bookmarkStart w:id="17" w:name="_Toc243235119"/>
+      <w:bookmarkStart w:id="17" w:name="_Toc243235348"/>
       <w:r>
         <w:rPr>
           <w:rFonts w:ascii="Times New Roman" w:eastAsia="黑体" w:hAnsi="Times New Roman"/>
@@ -11464,7 +11464,7 @@
         <w:pStyle w:val="21"/>
         <w:spacing w:after="120"/>
       </w:pPr>
-      <w:bookmarkStart w:id="18" w:name="_Toc243235120"/>
+      <w:bookmarkStart w:id="18" w:name="_Toc243235349"/>
       <w:r>
         <w:rPr>
           <w:rFonts w:ascii="Times New Roman" w:eastAsia="黑体" w:hAnsi="Times New Roman"/>
@@ -11730,7 +11730,7 @@
         <w:pStyle w:val="21"/>
         <w:spacing w:after="120"/>
       </w:pPr>
-      <w:bookmarkStart w:id="19" w:name="_Toc243235121"/>
+      <w:bookmarkStart w:id="19" w:name="_Toc243235350"/>
       <w:r>
         <w:rPr>
           <w:rFonts w:ascii="Times New Roman" w:eastAsia="黑体" w:hAnsi="Times New Roman"/>
@@ -11846,7 +11846,7 @@
         <w:pStyle w:val="21"/>
         <w:spacing w:after="120"/>
       </w:pPr>
-      <w:bookmarkStart w:id="20" w:name="_Toc243235122"/>
+      <w:bookmarkStart w:id="20" w:name="_Toc243235351"/>
       <w:r>
         <w:rPr>
           <w:rFonts w:ascii="Times New Roman" w:eastAsia="黑体" w:hAnsi="Times New Roman"/>
@@ -13099,7 +13099,7 @@
         <w:pStyle w:val="21"/>
         <w:spacing w:after="120"/>
       </w:pPr>
-      <w:bookmarkStart w:id="21" w:name="_Toc243235123"/>
+      <w:bookmarkStart w:id="21" w:name="_Toc243235352"/>
       <w:r>
         <w:rPr>
           <w:rFonts w:ascii="Times New Roman" w:eastAsia="黑体" w:hAnsi="Times New Roman"/>
@@ -13221,7 +13221,7 @@
         <w:pStyle w:val="21"/>
         <w:spacing w:after="120"/>
       </w:pPr>
-      <w:bookmarkStart w:id="22" w:name="_Toc243235124"/>
+      <w:bookmarkStart w:id="22" w:name="_Toc243235353"/>
       <w:r>
         <w:rPr>
           <w:rFonts w:ascii="Times New Roman" w:eastAsia="黑体" w:hAnsi="Times New Roman"/>
@@ -13359,7 +13359,7 @@
         <w:pStyle w:val="21"/>
         <w:spacing w:after="120"/>
       </w:pPr>
-      <w:bookmarkStart w:id="23" w:name="_Toc243235125"/>
+      <w:bookmarkStart w:id="23" w:name="_Toc243235354"/>
       <w:r>
         <w:rPr>
           <w:rFonts w:ascii="Times New Roman" w:eastAsia="黑体" w:hAnsi="Times New Roman"/>
@@ -13595,7 +13595,7 @@
         <w:pStyle w:val="21"/>
         <w:spacing w:after="120"/>
       </w:pPr>
-      <w:bookmarkStart w:id="24" w:name="_Toc243235126"/>
+      <w:bookmarkStart w:id="24" w:name="_Toc243235355"/>
       <w:r>
         <w:rPr>
           <w:rFonts w:ascii="Times New Roman" w:eastAsia="黑体" w:hAnsi="Times New Roman"/>
@@ -13711,7 +13711,7 @@
         <w:pStyle w:val="21"/>
         <w:spacing w:after="120"/>
       </w:pPr>
-      <w:bookmarkStart w:id="25" w:name="_Toc243235127"/>
+      <w:bookmarkStart w:id="25" w:name="_Toc243235356"/>
       <w:r>
         <w:rPr>
           <w:rFonts w:ascii="Times New Roman" w:eastAsia="黑体" w:hAnsi="Times New Roman"/>
@@ -14041,7 +14041,7 @@
         <w:pStyle w:val="21"/>
         <w:spacing w:after="120"/>
       </w:pPr>
-      <w:bookmarkStart w:id="26" w:name="_Toc243235128"/>
+      <w:bookmarkStart w:id="26" w:name="_Toc243235357"/>
       <w:r>
         <w:rPr>
           <w:rFonts w:ascii="Times New Roman" w:eastAsia="黑体" w:hAnsi="Times New Roman"/>
@@ -14143,7 +14143,7 @@
         <w:pStyle w:val="21"/>
         <w:spacing w:after="120"/>
       </w:pPr>
-      <w:bookmarkStart w:id="27" w:name="_Toc243235129"/>
+      <w:bookmarkStart w:id="27" w:name="_Toc243235358"/>
       <w:r>
         <w:rPr>
           <w:rFonts w:ascii="Times New Roman" w:eastAsia="黑体" w:hAnsi="Times New Roman"/>
@@ -14281,7 +14281,7 @@
         <w:pStyle w:val="21"/>
         <w:spacing w:after="120"/>
       </w:pPr>
-      <w:bookmarkStart w:id="28" w:name="_Toc243235130"/>
+      <w:bookmarkStart w:id="28" w:name="_Toc243235359"/>
       <w:r>
         <w:rPr>
           <w:rFonts w:ascii="Times New Roman" w:eastAsia="黑体" w:hAnsi="Times New Roman"/>
@@ -14349,7 +14349,7 @@
         <w:pStyle w:val="21"/>
         <w:spacing w:after="120"/>
       </w:pPr>
-      <w:bookmarkStart w:id="29" w:name="_Toc243235131"/>
+      <w:bookmarkStart w:id="29" w:name="_Toc243235360"/>
       <w:r>
         <w:rPr>
           <w:rFonts w:ascii="Times New Roman" w:eastAsia="黑体" w:hAnsi="Times New Roman"/>
@@ -14397,7 +14397,7 @@
         <w:pStyle w:val="21"/>
         <w:spacing w:after="120"/>
       </w:pPr>
-      <w:bookmarkStart w:id="30" w:name="_Toc243235132"/>
+      <w:bookmarkStart w:id="30" w:name="_Toc243235361"/>
       <w:r>
         <w:rPr>
           <w:rFonts w:ascii="Times New Roman" w:eastAsia="黑体" w:hAnsi="Times New Roman"/>
@@ -14561,7 +14561,7 @@
         <w:pStyle w:val="1"/>
         <w:spacing w:before="280" w:after="120"/>
       </w:pPr>
-      <w:bookmarkStart w:id="31" w:name="_Toc243235133"/>
+      <w:bookmarkStart w:id="31" w:name="_Toc243235362"/>
       <w:r>
         <w:rPr>
           <w:rFonts w:ascii="Times New Roman" w:eastAsia="黑体" w:hAnsi="Times New Roman"/>
@@ -15695,7 +15695,7 @@
         <w:pStyle w:val="21"/>
         <w:spacing w:after="120"/>
       </w:pPr>
-      <w:bookmarkStart w:id="32" w:name="_Toc243235134"/>
+      <w:bookmarkStart w:id="32" w:name="_Toc243235363"/>
       <w:r>
         <w:rPr>
           <w:rFonts w:ascii="Times New Roman" w:eastAsia="黑体" w:hAnsi="Times New Roman"/>
@@ -16987,7 +16987,7 @@
         <w:pStyle w:val="21"/>
         <w:spacing w:after="120"/>
       </w:pPr>
-      <w:bookmarkStart w:id="33" w:name="_Toc243235135"/>
+      <w:bookmarkStart w:id="33" w:name="_Toc243235364"/>
       <w:r>
         <w:rPr>
           <w:rFonts w:ascii="Times New Roman" w:eastAsia="黑体" w:hAnsi="Times New Roman"/>
@@ -18484,7 +18484,7 @@
         <w:pStyle w:val="21"/>
         <w:spacing w:after="120"/>
       </w:pPr>
-      <w:bookmarkStart w:id="34" w:name="_Toc243235136"/>
+      <w:bookmarkStart w:id="34" w:name="_Toc243235365"/>
       <w:r>
         <w:rPr>
           <w:rFonts w:ascii="Times New Roman" w:eastAsia="黑体" w:hAnsi="Times New Roman"/>
@@ -19411,7 +19411,7 @@
         <w:pStyle w:val="21"/>
         <w:spacing w:after="120"/>
       </w:pPr>
-      <w:bookmarkStart w:id="35" w:name="_Toc243235137"/>
+      <w:bookmarkStart w:id="35" w:name="_Toc243235366"/>
       <w:r>
         <w:rPr>
           <w:rFonts w:ascii="Times New Roman" w:eastAsia="黑体" w:hAnsi="Times New Roman"/>
@@ -21020,7 +21020,7 @@
         <w:pStyle w:val="21"/>
         <w:spacing w:after="120"/>
       </w:pPr>
-      <w:bookmarkStart w:id="36" w:name="_Toc243235138"/>
+      <w:bookmarkStart w:id="36" w:name="_Toc243235367"/>
       <w:r>
         <w:rPr>
           <w:rFonts w:ascii="Times New Roman" w:eastAsia="黑体" w:hAnsi="Times New Roman"/>
@@ -22100,7 +22100,7 @@
         <w:pStyle w:val="21"/>
         <w:spacing w:after="120"/>
       </w:pPr>
-      <w:bookmarkStart w:id="37" w:name="_Toc243235139"/>
+      <w:bookmarkStart w:id="37" w:name="_Toc243235368"/>
       <w:r>
         <w:rPr>
           <w:rFonts w:ascii="Times New Roman" w:eastAsia="黑体" w:hAnsi="Times New Roman"/>
@@ -23708,7 +23708,7 @@
         <w:pStyle w:val="21"/>
         <w:spacing w:after="120"/>
       </w:pPr>
-      <w:bookmarkStart w:id="38" w:name="_Toc243235140"/>
+      <w:bookmarkStart w:id="38" w:name="_Toc243235369"/>
       <w:r>
         <w:rPr>
           <w:rFonts w:ascii="Times New Roman" w:eastAsia="黑体" w:hAnsi="Times New Roman"/>
@@ -24144,7 +24144,7 @@
         <w:pStyle w:val="21"/>
         <w:spacing w:after="120"/>
       </w:pPr>
-      <w:bookmarkStart w:id="39" w:name="_Toc243235141"/>
+      <w:bookmarkStart w:id="39" w:name="_Toc243235370"/>
       <w:r>
         <w:rPr>
           <w:rFonts w:ascii="Times New Roman" w:eastAsia="黑体" w:hAnsi="Times New Roman"/>
@@ -24998,7 +24998,31 @@
         <w:rPr>
           <w:color w:val="000000"/>
         </w:rPr>
-        <w:t>天；更像停牌行，字段语义待乙确认。涨跌幅</w:t>
+        <w:t>天；新文件删除恰好同样</w:t>
+      </w:r>
+      <w:r>
+        <w:rPr>
+          <w:color w:val="000000"/>
+        </w:rPr>
+        <w:t xml:space="preserve"> 43,830 </w:t>
+      </w:r>
+      <w:r>
+        <w:rPr>
+          <w:color w:val="000000"/>
+        </w:rPr>
+        <w:t>行，项目已定按停牌</w:t>
+      </w:r>
+      <w:r>
+        <w:rPr>
+          <w:color w:val="000000"/>
+        </w:rPr>
+        <w:t>/</w:t>
+      </w:r>
+      <w:r>
+        <w:rPr>
+          <w:color w:val="000000"/>
+        </w:rPr>
+        <w:t>无成交行处理。若乙的字段字典另有定义，只影响稳健性剔除集，不影响主结果。涨跌幅</w:t>
       </w:r>
       <w:r>
         <w:rPr>
@@ -25054,7 +25078,7 @@
         <w:pStyle w:val="1"/>
         <w:spacing w:before="280" w:after="120"/>
       </w:pPr>
-      <w:bookmarkStart w:id="40" w:name="_Toc243235142"/>
+      <w:bookmarkStart w:id="40" w:name="_Toc243235371"/>
       <w:r>
         <w:rPr>
           <w:rFonts w:ascii="Times New Roman" w:eastAsia="黑体" w:hAnsi="Times New Roman"/>
@@ -25488,7 +25512,7 @@
         <w:pStyle w:val="21"/>
         <w:spacing w:after="120"/>
       </w:pPr>
-      <w:bookmarkStart w:id="41" w:name="_Toc243235143"/>
+      <w:bookmarkStart w:id="41" w:name="_Toc243235372"/>
       <w:r>
         <w:rPr>
           <w:rFonts w:ascii="Times New Roman" w:eastAsia="黑体" w:hAnsi="Times New Roman"/>
@@ -25633,7 +25657,7 @@
                 <w:color w:val="000000"/>
                 <w:sz w:val="21"/>
               </w:rPr>
-              <w:t>已处理</w:t>
+              <w:t>已定</w:t>
             </w:r>
           </w:p>
         </w:tc>
@@ -25695,7 +25719,21 @@
                 <w:color w:val="000000"/>
                 <w:sz w:val="21"/>
               </w:rPr>
-              <w:t>收盘价沿用上一值；新文件删除同样数量行。按停牌处理，待乙最终确认字段定义</w:t>
+              <w:t>收盘价沿用上一值；新文件删除同样数量行，按停牌</w:t>
+            </w:r>
+            <w:r>
+              <w:rPr>
+                <w:color w:val="000000"/>
+                <w:sz w:val="21"/>
+              </w:rPr>
+              <w:t>/</w:t>
+            </w:r>
+            <w:r>
+              <w:rPr>
+                <w:color w:val="000000"/>
+                <w:sz w:val="21"/>
+              </w:rPr>
+              <w:t>无成交行处理；若字段定义另有说明，只影响稳健性剔除集</w:t>
             </w:r>
           </w:p>
         </w:tc>
@@ -25712,7 +25750,7 @@
                 <w:color w:val="000000"/>
                 <w:sz w:val="21"/>
               </w:rPr>
-              <w:t>已核</w:t>
+              <w:t>已定</w:t>
             </w:r>
           </w:p>
         </w:tc>
@@ -26435,7 +26473,7 @@
         <w:pStyle w:val="1"/>
         <w:spacing w:before="280" w:after="120"/>
       </w:pPr>
-      <w:bookmarkStart w:id="42" w:name="_Toc243235144"/>
+      <w:bookmarkStart w:id="42" w:name="_Toc243235373"/>
       <w:r>
         <w:rPr>
           <w:rFonts w:ascii="Times New Roman" w:eastAsia="黑体" w:hAnsi="Times New Roman"/>
@@ -26829,7 +26867,7 @@
         <w:pStyle w:val="1"/>
         <w:spacing w:before="280" w:after="120"/>
       </w:pPr>
-      <w:bookmarkStart w:id="43" w:name="_Toc243235145"/>
+      <w:bookmarkStart w:id="43" w:name="_Toc243235374"/>
       <w:r>
         <w:rPr>
           <w:rFonts w:ascii="Times New Roman" w:eastAsia="黑体" w:hAnsi="Times New Roman"/>
@@ -27439,7 +27477,7 @@
         <w:pStyle w:val="1"/>
         <w:spacing w:before="280" w:after="120"/>
       </w:pPr>
-      <w:bookmarkStart w:id="44" w:name="_Toc243235146"/>
+      <w:bookmarkStart w:id="44" w:name="_Toc243235375"/>
       <w:r>
         <w:rPr>
           <w:rFonts w:ascii="Times New Roman" w:eastAsia="黑体" w:hAnsi="Times New Roman"/>
@@ -27479,7 +27517,7 @@
         <w:pStyle w:val="21"/>
         <w:spacing w:after="120"/>
       </w:pPr>
-      <w:bookmarkStart w:id="45" w:name="_Toc243235147"/>
+      <w:bookmarkStart w:id="45" w:name="_Toc243235376"/>
       <w:r>
         <w:rPr>
           <w:rFonts w:ascii="Times New Roman" w:eastAsia="黑体" w:hAnsi="Times New Roman"/>
@@ -28741,7 +28779,7 @@
         <w:pStyle w:val="21"/>
         <w:spacing w:after="120"/>
       </w:pPr>
-      <w:bookmarkStart w:id="46" w:name="_Toc243235148"/>
+      <w:bookmarkStart w:id="46" w:name="_Toc243235377"/>
       <w:r>
         <w:rPr>
           <w:rFonts w:ascii="Times New Roman" w:eastAsia="黑体" w:hAnsi="Times New Roman"/>
@@ -29371,31 +29409,31 @@
       </w:rPr>
     </w:lvl>
   </w:abstractNum>
-  <w:num w:numId="1" w16cid:durableId="311328693">
+  <w:num w:numId="1" w16cid:durableId="447241836">
     <w:abstractNumId w:val="8"/>
   </w:num>
-  <w:num w:numId="2" w16cid:durableId="1590504593">
+  <w:num w:numId="2" w16cid:durableId="249119661">
     <w:abstractNumId w:val="6"/>
   </w:num>
-  <w:num w:numId="3" w16cid:durableId="1481653101">
+  <w:num w:numId="3" w16cid:durableId="28259178">
     <w:abstractNumId w:val="5"/>
   </w:num>
-  <w:num w:numId="4" w16cid:durableId="1347051161">
+  <w:num w:numId="4" w16cid:durableId="1302728346">
     <w:abstractNumId w:val="4"/>
   </w:num>
-  <w:num w:numId="5" w16cid:durableId="85853718">
+  <w:num w:numId="5" w16cid:durableId="1070546039">
     <w:abstractNumId w:val="7"/>
   </w:num>
-  <w:num w:numId="6" w16cid:durableId="143201251">
+  <w:num w:numId="6" w16cid:durableId="707221840">
     <w:abstractNumId w:val="3"/>
   </w:num>
-  <w:num w:numId="7" w16cid:durableId="2087610930">
+  <w:num w:numId="7" w16cid:durableId="77870792">
     <w:abstractNumId w:val="2"/>
   </w:num>
-  <w:num w:numId="8" w16cid:durableId="394624409">
+  <w:num w:numId="8" w16cid:durableId="1418164574">
     <w:abstractNumId w:val="1"/>
   </w:num>
-  <w:num w:numId="9" w16cid:durableId="1422868485">
+  <w:num w:numId="9" w16cid:durableId="322243881">
     <w:abstractNumId w:val="0"/>
   </w:num>
 </w:numbering>
@@ -40794,7 +40832,7 @@
     <w:autoRedefine/>
     <w:uiPriority w:val="39"/>
     <w:unhideWhenUsed/>
-    <w:rsid w:val="00D77D24"/>
+    <w:rsid w:val="00405ACF"/>
   </w:style>
   <w:style w:type="paragraph" w:styleId="TOC2">
     <w:name w:val="toc 2"/>
@@ -40803,7 +40841,7 @@
     <w:autoRedefine/>
     <w:uiPriority w:val="39"/>
     <w:unhideWhenUsed/>
-    <w:rsid w:val="00D77D24"/>
+    <w:rsid w:val="00405ACF"/>
     <w:pPr>
       <w:ind w:leftChars="200" w:left="420"/>
     </w:pPr>
@@ -40813,7 +40851,7 @@
     <w:basedOn w:val="a2"/>
     <w:uiPriority w:val="99"/>
     <w:unhideWhenUsed/>
-    <w:rsid w:val="00D77D24"/>
+    <w:rsid w:val="00405ACF"/>
     <w:rPr>
       <w:color w:val="0000FF" w:themeColor="hyperlink"/>
       <w:u w:val="single"/>

</xml_diff>